<commit_message>
Ajout de la description des var pheno dans notes
</commit_message>
<xml_diff>
--- a/doc/Notes.docx
+++ b/doc/Notes.docx
@@ -415,14 +415,12 @@
         </w:rPr>
         <w:t xml:space="preserve"> est la phase de croissance du colza entre la germination et l'étape ou la plante </w:t>
       </w:r>
-      <w:proofErr w:type="spellStart"/>
       <w:r>
         <w:rPr>
           <w:rFonts w:cstheme="minorHAnsi"/>
         </w:rPr>
         <w:t>a</w:t>
       </w:r>
-      <w:proofErr w:type="spellEnd"/>
       <w:r>
         <w:rPr>
           <w:rFonts w:cstheme="minorHAnsi"/>
@@ -580,9 +578,835 @@
     </w:p>
     <w:p>
       <w:pPr>
+        <w:pStyle w:val="Sansinterligne"/>
+      </w:pPr>
+      <w:r>
+        <w:t xml:space="preserve">Les données de </w:t>
+      </w:r>
+      <w:proofErr w:type="spellStart"/>
+      <w:r>
+        <w:t>pheno</w:t>
+      </w:r>
+      <w:r>
+        <w:t>type</w:t>
+      </w:r>
+      <w:proofErr w:type="spellEnd"/>
+      <w:r>
+        <w:t xml:space="preserve"> contien</w:t>
+      </w:r>
+      <w:r>
+        <w:t>nent</w:t>
+      </w:r>
+      <w:r>
+        <w:t xml:space="preserve"> une variable qualitative "</w:t>
+      </w:r>
+      <w:proofErr w:type="spellStart"/>
+      <w:r>
+        <w:t>variety</w:t>
+      </w:r>
+      <w:proofErr w:type="spellEnd"/>
+      <w:r>
+        <w:t xml:space="preserve">" et 23 </w:t>
+      </w:r>
+      <w:proofErr w:type="spellStart"/>
+      <w:r>
+        <w:t>varibales</w:t>
+      </w:r>
+      <w:proofErr w:type="spellEnd"/>
+      <w:r>
+        <w:t xml:space="preserve"> </w:t>
+      </w:r>
+      <w:r>
+        <w:t>quantitatives :</w:t>
+      </w:r>
+    </w:p>
+    <w:p>
+      <w:pPr>
+        <w:pStyle w:val="Sansinterligne"/>
+      </w:pPr>
+    </w:p>
+    <w:p>
+      <w:pPr>
+        <w:pStyle w:val="Sansinterligne"/>
+        <w:rPr>
+          <w:u w:val="single"/>
+        </w:rPr>
+      </w:pPr>
+      <w:r>
+        <w:rPr>
+          <w:u w:val="single"/>
+        </w:rPr>
+        <w:t>Traits physiologiques</w:t>
+      </w:r>
+    </w:p>
+    <w:p>
+      <w:pPr>
+        <w:pStyle w:val="Sansinterligne"/>
+        <w:numPr>
+          <w:ilvl w:val="0"/>
+          <w:numId w:val="3"/>
+        </w:numPr>
+      </w:pPr>
+      <w:r>
+        <w:t>LA</w:t>
+      </w:r>
+      <w:r>
+        <w:t> </w:t>
+      </w:r>
+      <w:r>
+        <w:t>(</w:t>
+      </w:r>
+      <w:proofErr w:type="spellStart"/>
+      <w:r>
+        <w:t>Leaf</w:t>
+      </w:r>
+      <w:proofErr w:type="spellEnd"/>
+      <w:r>
+        <w:t xml:space="preserve"> Area</w:t>
+      </w:r>
+      <w:r>
+        <w:t>) :</w:t>
+      </w:r>
+      <w:r>
+        <w:t xml:space="preserve"> surface foliaire en cm</w:t>
+      </w:r>
+      <w:r>
+        <w:rPr>
+          <w:vertAlign w:val="superscript"/>
+        </w:rPr>
+        <w:t>-2</w:t>
+      </w:r>
+    </w:p>
+    <w:p>
+      <w:pPr>
+        <w:pStyle w:val="Sansinterligne"/>
+        <w:numPr>
+          <w:ilvl w:val="0"/>
+          <w:numId w:val="3"/>
+        </w:numPr>
+      </w:pPr>
+      <w:r>
+        <w:t>TDW</w:t>
+      </w:r>
+      <w:r>
+        <w:t xml:space="preserve"> (</w:t>
+      </w:r>
+      <w:r>
+        <w:t xml:space="preserve">Total Dry </w:t>
+      </w:r>
+      <w:proofErr w:type="spellStart"/>
+      <w:r>
+        <w:t>Weight</w:t>
+      </w:r>
+      <w:proofErr w:type="spellEnd"/>
+      <w:r>
+        <w:t>) :</w:t>
+      </w:r>
+      <w:r>
+        <w:t xml:space="preserve"> </w:t>
+      </w:r>
+      <w:r>
+        <w:t>Masse s</w:t>
+      </w:r>
+      <w:r>
+        <w:t>è</w:t>
+      </w:r>
+      <w:r>
+        <w:t xml:space="preserve">che de la plante totale </w:t>
+      </w:r>
+      <w:r>
+        <w:t>en g/plante</w:t>
+      </w:r>
+    </w:p>
+    <w:p>
+      <w:pPr>
+        <w:pStyle w:val="Sansinterligne"/>
+        <w:numPr>
+          <w:ilvl w:val="0"/>
+          <w:numId w:val="3"/>
+        </w:numPr>
+      </w:pPr>
+      <w:r>
+        <w:t>ADW</w:t>
+      </w:r>
+      <w:r>
+        <w:t xml:space="preserve"> (</w:t>
+      </w:r>
+      <w:proofErr w:type="spellStart"/>
+      <w:r>
+        <w:t>Aerial</w:t>
+      </w:r>
+      <w:proofErr w:type="spellEnd"/>
+      <w:r>
+        <w:t xml:space="preserve"> Dry </w:t>
+      </w:r>
+      <w:proofErr w:type="spellStart"/>
+      <w:r>
+        <w:t>Weigh</w:t>
+      </w:r>
+      <w:proofErr w:type="spellEnd"/>
+      <w:r>
+        <w:t>) :</w:t>
+      </w:r>
+      <w:r>
+        <w:t xml:space="preserve"> </w:t>
+      </w:r>
+      <w:r>
+        <w:t>Masse s</w:t>
+      </w:r>
+      <w:r>
+        <w:t>è</w:t>
+      </w:r>
+      <w:r>
+        <w:t xml:space="preserve">che de la </w:t>
+      </w:r>
+      <w:r>
+        <w:t xml:space="preserve">partie aérienne de la </w:t>
+      </w:r>
+      <w:r>
+        <w:t>plante</w:t>
+      </w:r>
+      <w:r>
+        <w:t xml:space="preserve"> </w:t>
+      </w:r>
+      <w:r>
+        <w:t>en g/plante</w:t>
+      </w:r>
+    </w:p>
+    <w:p>
+      <w:pPr>
+        <w:pStyle w:val="Sansinterligne"/>
+        <w:numPr>
+          <w:ilvl w:val="0"/>
+          <w:numId w:val="3"/>
+        </w:numPr>
+      </w:pPr>
+      <w:r>
+        <w:lastRenderedPageBreak/>
+        <w:t>RDW</w:t>
+      </w:r>
+      <w:r>
+        <w:t xml:space="preserve"> (</w:t>
+      </w:r>
+      <w:r>
+        <w:t>Root</w:t>
+      </w:r>
+      <w:r>
+        <w:t xml:space="preserve"> Dry </w:t>
+      </w:r>
+      <w:proofErr w:type="spellStart"/>
+      <w:r>
+        <w:t>Weigh</w:t>
+      </w:r>
+      <w:proofErr w:type="spellEnd"/>
+      <w:r>
+        <w:t>) :</w:t>
+      </w:r>
+      <w:r>
+        <w:t xml:space="preserve"> </w:t>
+      </w:r>
+      <w:r>
+        <w:t>Masse s</w:t>
+      </w:r>
+      <w:r>
+        <w:t>è</w:t>
+      </w:r>
+      <w:r>
+        <w:t xml:space="preserve">che </w:t>
+      </w:r>
+      <w:r>
+        <w:t>des racines</w:t>
+      </w:r>
+      <w:r>
+        <w:t xml:space="preserve"> en g/plante</w:t>
+      </w:r>
+    </w:p>
+    <w:p>
+      <w:pPr>
+        <w:pStyle w:val="Sansinterligne"/>
+        <w:numPr>
+          <w:ilvl w:val="0"/>
+          <w:numId w:val="3"/>
+        </w:numPr>
+      </w:pPr>
+      <w:r>
+        <w:t>LWR</w:t>
+      </w:r>
+      <w:r>
+        <w:t xml:space="preserve"> (</w:t>
+      </w:r>
+      <w:proofErr w:type="spellStart"/>
+      <w:r>
+        <w:t>Leaf</w:t>
+      </w:r>
+      <w:proofErr w:type="spellEnd"/>
+      <w:r>
+        <w:t xml:space="preserve"> </w:t>
+      </w:r>
+      <w:proofErr w:type="spellStart"/>
+      <w:r>
+        <w:t>Weight</w:t>
+      </w:r>
+      <w:proofErr w:type="spellEnd"/>
+      <w:r>
+        <w:t xml:space="preserve"> Ratio</w:t>
+      </w:r>
+      <w:r>
+        <w:t>) :</w:t>
+      </w:r>
+      <w:r>
+        <w:t xml:space="preserve"> </w:t>
+      </w:r>
+      <w:r>
+        <w:t>Ratio entre la l</w:t>
+      </w:r>
+      <w:r>
+        <w:t>ongueur</w:t>
+      </w:r>
+      <w:r>
+        <w:t xml:space="preserve"> et la </w:t>
+      </w:r>
+      <w:r>
+        <w:t>largeur</w:t>
+      </w:r>
+      <w:r>
+        <w:t xml:space="preserve"> d’une feuille</w:t>
+      </w:r>
+    </w:p>
+    <w:p>
+      <w:pPr>
+        <w:pStyle w:val="Sansinterligne"/>
+        <w:numPr>
+          <w:ilvl w:val="0"/>
+          <w:numId w:val="3"/>
+        </w:numPr>
+      </w:pPr>
+      <w:r>
+        <w:t>LAR</w:t>
+      </w:r>
+      <w:r>
+        <w:t> </w:t>
+      </w:r>
+      <w:r>
+        <w:t>(</w:t>
+      </w:r>
+      <w:proofErr w:type="spellStart"/>
+      <w:r>
+        <w:t>Leaf</w:t>
+      </w:r>
+      <w:proofErr w:type="spellEnd"/>
+      <w:r>
+        <w:t xml:space="preserve"> </w:t>
+      </w:r>
+      <w:r>
+        <w:t>A</w:t>
+      </w:r>
+      <w:r>
+        <w:t>rea</w:t>
+      </w:r>
+      <w:r>
+        <w:t xml:space="preserve"> </w:t>
+      </w:r>
+      <w:r>
+        <w:t>R</w:t>
+      </w:r>
+      <w:r>
+        <w:t>atio</w:t>
+      </w:r>
+      <w:r>
+        <w:t>) :</w:t>
+      </w:r>
+      <w:r>
+        <w:t xml:space="preserve"> </w:t>
+      </w:r>
+      <w:r>
+        <w:t>C</w:t>
+      </w:r>
+      <w:r>
+        <w:t xml:space="preserve">orrespond </w:t>
+      </w:r>
+      <w:r>
+        <w:t xml:space="preserve">au rapport entre la surface foliaire LA et la masse sèche de la plante totale TDW en </w:t>
+      </w:r>
+      <w:r>
+        <w:t>cm².g</w:t>
+      </w:r>
+      <w:r>
+        <w:rPr>
+          <w:vertAlign w:val="superscript"/>
+        </w:rPr>
+        <w:t>‐1</w:t>
+      </w:r>
+    </w:p>
+    <w:p>
+      <w:pPr>
+        <w:pStyle w:val="Sansinterligne"/>
+        <w:numPr>
+          <w:ilvl w:val="0"/>
+          <w:numId w:val="3"/>
+        </w:numPr>
+      </w:pPr>
+      <w:r>
+        <w:t>SLA</w:t>
+      </w:r>
+      <w:r>
+        <w:t xml:space="preserve"> (</w:t>
+      </w:r>
+      <w:proofErr w:type="spellStart"/>
+      <w:r>
+        <w:t>Specific</w:t>
+      </w:r>
+      <w:proofErr w:type="spellEnd"/>
+      <w:r>
+        <w:t xml:space="preserve"> </w:t>
+      </w:r>
+      <w:proofErr w:type="spellStart"/>
+      <w:r>
+        <w:t>Leaf</w:t>
+      </w:r>
+      <w:proofErr w:type="spellEnd"/>
+      <w:r>
+        <w:t xml:space="preserve"> Area</w:t>
+      </w:r>
+      <w:r>
+        <w:t>) :</w:t>
+      </w:r>
+      <w:r>
+        <w:t xml:space="preserve"> </w:t>
+      </w:r>
+      <w:r>
+        <w:t>R</w:t>
+      </w:r>
+      <w:r>
+        <w:t>apport entre la surface foliaire et la masse sèche des feuilles</w:t>
+      </w:r>
+      <w:r>
+        <w:t xml:space="preserve"> en </w:t>
+      </w:r>
+      <w:r>
+        <w:t>cm².g</w:t>
+      </w:r>
+      <w:r>
+        <w:rPr>
+          <w:vertAlign w:val="superscript"/>
+        </w:rPr>
+        <w:t>‐1</w:t>
+      </w:r>
+      <w:r>
+        <w:cr/>
+      </w:r>
+      <w:r>
+        <w:t>SR</w:t>
+      </w:r>
+      <w:r>
+        <w:t> </w:t>
+      </w:r>
+      <w:r>
+        <w:t>(</w:t>
+      </w:r>
+      <w:r>
+        <w:t>Shoot</w:t>
+      </w:r>
+      <w:r>
+        <w:t>-</w:t>
+      </w:r>
+      <w:r>
+        <w:t>Root Ratio</w:t>
+      </w:r>
+      <w:r>
+        <w:t>) :</w:t>
+      </w:r>
+      <w:r>
+        <w:t xml:space="preserve"> Rapport entre </w:t>
+      </w:r>
+      <w:r>
+        <w:t>la masse sèche aérienne ADW et la masse sèche de racine RDW</w:t>
+      </w:r>
+    </w:p>
+    <w:p>
+      <w:pPr>
+        <w:pStyle w:val="Sansinterligne"/>
+        <w:numPr>
+          <w:ilvl w:val="0"/>
+          <w:numId w:val="3"/>
+        </w:numPr>
+      </w:pPr>
+      <w:r>
+        <w:t>SNQ</w:t>
+      </w:r>
+      <w:r>
+        <w:t> </w:t>
+      </w:r>
+      <w:r>
+        <w:t>(</w:t>
+      </w:r>
+      <w:r>
+        <w:t xml:space="preserve">Shoot </w:t>
+      </w:r>
+      <w:proofErr w:type="spellStart"/>
+      <w:r>
+        <w:t>Nitrogen</w:t>
+      </w:r>
+      <w:proofErr w:type="spellEnd"/>
+      <w:r>
+        <w:t xml:space="preserve"> </w:t>
+      </w:r>
+      <w:proofErr w:type="spellStart"/>
+      <w:r>
+        <w:t>Quantity</w:t>
+      </w:r>
+      <w:proofErr w:type="spellEnd"/>
+      <w:r>
+        <w:t>) :</w:t>
+      </w:r>
+      <w:r>
+        <w:t xml:space="preserve"> </w:t>
+      </w:r>
+      <w:r>
+        <w:t>Q</w:t>
+      </w:r>
+      <w:r>
+        <w:t>ua</w:t>
+      </w:r>
+      <w:r>
+        <w:t>ntité d’azote dans les parties aérienne en g</w:t>
+      </w:r>
+    </w:p>
+    <w:p>
+      <w:pPr>
+        <w:pStyle w:val="Sansinterligne"/>
+        <w:numPr>
+          <w:ilvl w:val="0"/>
+          <w:numId w:val="3"/>
+        </w:numPr>
+      </w:pPr>
+      <w:r>
+        <w:t>LASNQ</w:t>
+      </w:r>
+      <w:r>
+        <w:t> </w:t>
+      </w:r>
+      <w:r>
+        <w:t>(</w:t>
+      </w:r>
+      <w:proofErr w:type="spellStart"/>
+      <w:r>
+        <w:t>Leaf</w:t>
+      </w:r>
+      <w:proofErr w:type="spellEnd"/>
+      <w:r>
+        <w:t xml:space="preserve"> Area</w:t>
+      </w:r>
+      <w:r>
+        <w:t>-</w:t>
+      </w:r>
+      <w:r>
+        <w:t xml:space="preserve">Shoot </w:t>
+      </w:r>
+      <w:proofErr w:type="spellStart"/>
+      <w:r>
+        <w:t>Nitrogen</w:t>
+      </w:r>
+      <w:proofErr w:type="spellEnd"/>
+      <w:r>
+        <w:t xml:space="preserve"> </w:t>
+      </w:r>
+      <w:proofErr w:type="spellStart"/>
+      <w:r>
+        <w:t>Quantity</w:t>
+      </w:r>
+      <w:proofErr w:type="spellEnd"/>
+      <w:r>
+        <w:t>) :</w:t>
+      </w:r>
+      <w:r>
+        <w:t xml:space="preserve"> </w:t>
+      </w:r>
+      <w:r>
+        <w:t>Rapport entre la su</w:t>
+      </w:r>
+      <w:r>
+        <w:t xml:space="preserve">rface foliaire LA et la </w:t>
+      </w:r>
+      <w:r>
+        <w:t>qua</w:t>
+      </w:r>
+      <w:r>
+        <w:t>ntité d’azote dans les parties aérienne</w:t>
+      </w:r>
+      <w:r>
+        <w:t xml:space="preserve"> SNQ en </w:t>
+      </w:r>
+      <w:r>
+        <w:t>cm².g</w:t>
+      </w:r>
+      <w:r>
+        <w:rPr>
+          <w:vertAlign w:val="superscript"/>
+        </w:rPr>
+        <w:t>‐1</w:t>
+      </w:r>
+    </w:p>
+    <w:p>
+      <w:pPr>
+        <w:pStyle w:val="Sansinterligne"/>
+        <w:numPr>
+          <w:ilvl w:val="0"/>
+          <w:numId w:val="3"/>
+        </w:numPr>
+      </w:pPr>
+      <w:r>
+        <w:t>TNQ</w:t>
+      </w:r>
+      <w:r>
+        <w:t> </w:t>
+      </w:r>
+      <w:r>
+        <w:t>(</w:t>
+      </w:r>
+      <w:r>
+        <w:t xml:space="preserve">Total </w:t>
+      </w:r>
+      <w:proofErr w:type="spellStart"/>
+      <w:r>
+        <w:t>Nitrogen</w:t>
+      </w:r>
+      <w:proofErr w:type="spellEnd"/>
+      <w:r>
+        <w:t xml:space="preserve"> </w:t>
+      </w:r>
+      <w:proofErr w:type="spellStart"/>
+      <w:r>
+        <w:t>Quantity</w:t>
+      </w:r>
+      <w:proofErr w:type="spellEnd"/>
+      <w:r>
+        <w:t>) :</w:t>
+      </w:r>
+      <w:r>
+        <w:t xml:space="preserve"> Quantité totale d’azote dans la plante</w:t>
+      </w:r>
+      <w:r>
+        <w:t xml:space="preserve"> en g</w:t>
+      </w:r>
+    </w:p>
+    <w:p>
+      <w:pPr>
+        <w:pStyle w:val="Sansinterligne"/>
+        <w:numPr>
+          <w:ilvl w:val="0"/>
+          <w:numId w:val="3"/>
+        </w:numPr>
+      </w:pPr>
+      <w:r>
+        <w:t>SNU</w:t>
+      </w:r>
+      <w:r>
+        <w:t> </w:t>
+      </w:r>
+      <w:r>
+        <w:t>(P</w:t>
+      </w:r>
+      <w:r>
+        <w:t>lant-</w:t>
+      </w:r>
+      <w:proofErr w:type="spellStart"/>
+      <w:r>
+        <w:t>Specific</w:t>
+      </w:r>
+      <w:proofErr w:type="spellEnd"/>
+      <w:r>
+        <w:t xml:space="preserve"> N </w:t>
+      </w:r>
+      <w:proofErr w:type="spellStart"/>
+      <w:r>
+        <w:t>Uptake</w:t>
+      </w:r>
+      <w:proofErr w:type="spellEnd"/>
+      <w:r>
+        <w:t>) :</w:t>
+      </w:r>
+      <w:r>
+        <w:t xml:space="preserve"> </w:t>
+      </w:r>
+      <w:r>
+        <w:t>C</w:t>
+      </w:r>
+      <w:r>
+        <w:t>orrespond à la pente de</w:t>
+      </w:r>
+      <w:r>
+        <w:t xml:space="preserve"> la régression entre la quantité d’azote totale dans la plante et la masse sèche de racine</w:t>
+      </w:r>
+    </w:p>
+    <w:p>
+      <w:pPr>
+        <w:pStyle w:val="Sansinterligne"/>
+        <w:numPr>
+          <w:ilvl w:val="0"/>
+          <w:numId w:val="3"/>
+        </w:numPr>
+      </w:pPr>
+      <w:proofErr w:type="spellStart"/>
+      <w:r>
+        <w:t>NUtE_tot</w:t>
+      </w:r>
+      <w:proofErr w:type="spellEnd"/>
+      <w:r>
+        <w:t xml:space="preserve"> : </w:t>
+      </w:r>
+      <w:r>
+        <w:t>Ratio entre le</w:t>
+      </w:r>
+      <w:r>
+        <w:t>s apports et les sorties d’azote pour l’ensemble de la plante</w:t>
+      </w:r>
+    </w:p>
+    <w:p>
+      <w:pPr>
+        <w:pStyle w:val="Sansinterligne"/>
+        <w:numPr>
+          <w:ilvl w:val="0"/>
+          <w:numId w:val="3"/>
+        </w:numPr>
+      </w:pPr>
+      <w:proofErr w:type="spellStart"/>
+      <w:r>
+        <w:t>NUtE_</w:t>
+      </w:r>
+      <w:proofErr w:type="gramStart"/>
+      <w:r>
+        <w:t>aer</w:t>
+      </w:r>
+      <w:proofErr w:type="spellEnd"/>
+      <w:r>
+        <w:t>:</w:t>
+      </w:r>
+      <w:proofErr w:type="gramEnd"/>
+      <w:r>
+        <w:t xml:space="preserve"> </w:t>
+      </w:r>
+      <w:r>
+        <w:t>Ratio entre le</w:t>
+      </w:r>
+      <w:r>
+        <w:t xml:space="preserve">s apports et les sorties d’azote pour </w:t>
+      </w:r>
+      <w:r>
+        <w:t>les parties aériennes de la plante</w:t>
+      </w:r>
+    </w:p>
+    <w:p>
+      <w:pPr>
+        <w:pStyle w:val="Sansinterligne"/>
+      </w:pPr>
+    </w:p>
+    <w:p>
+      <w:pPr>
+        <w:pStyle w:val="Sansinterligne"/>
+        <w:rPr>
+          <w:u w:val="single"/>
+        </w:rPr>
+      </w:pPr>
+      <w:r>
+        <w:rPr>
+          <w:u w:val="single"/>
+        </w:rPr>
+        <w:t>Traits développementaux </w:t>
+      </w:r>
+    </w:p>
+    <w:p>
+      <w:pPr>
+        <w:pStyle w:val="Sansinterligne"/>
+        <w:numPr>
+          <w:ilvl w:val="0"/>
+          <w:numId w:val="4"/>
+        </w:numPr>
+      </w:pPr>
+      <w:proofErr w:type="spellStart"/>
+      <w:r>
+        <w:t>AUC_L</w:t>
+      </w:r>
+      <w:r>
+        <w:t>a</w:t>
+      </w:r>
+      <w:r>
+        <w:t>_L</w:t>
+      </w:r>
+      <w:r>
+        <w:t>b</w:t>
+      </w:r>
+      <w:proofErr w:type="spellEnd"/>
+      <w:r>
+        <w:t> :</w:t>
+      </w:r>
+      <w:r>
+        <w:t xml:space="preserve"> Aire sous la courbe entre l</w:t>
+      </w:r>
+      <w:r>
+        <w:t>’émergence des</w:t>
+      </w:r>
+      <w:r>
+        <w:t xml:space="preserve"> feuilles a et b</w:t>
+      </w:r>
+    </w:p>
+    <w:p>
+      <w:pPr>
+        <w:pStyle w:val="Sansinterligne"/>
+        <w:numPr>
+          <w:ilvl w:val="0"/>
+          <w:numId w:val="4"/>
+        </w:numPr>
+      </w:pPr>
+      <w:proofErr w:type="spellStart"/>
+      <w:r>
+        <w:t>Sp_L</w:t>
+      </w:r>
+      <w:r>
+        <w:t>a</w:t>
+      </w:r>
+      <w:r>
+        <w:t>_L</w:t>
+      </w:r>
+      <w:r>
+        <w:t>b</w:t>
+      </w:r>
+      <w:proofErr w:type="spellEnd"/>
+      <w:r>
+        <w:t> : Vitesse de développement entre les feuilles a et b</w:t>
+      </w:r>
+    </w:p>
+    <w:p>
+      <w:pPr>
+        <w:pStyle w:val="Sansinterligne"/>
+        <w:numPr>
+          <w:ilvl w:val="0"/>
+          <w:numId w:val="4"/>
+        </w:numPr>
+      </w:pPr>
+      <w:r>
+        <w:t>SCA</w:t>
+      </w:r>
+      <w:r>
+        <w:t xml:space="preserve"> : Résultat d’analyse des correspondances simple </w:t>
+      </w:r>
+    </w:p>
+    <w:p>
+      <w:pPr>
+        <w:pStyle w:val="Sansinterligne"/>
+      </w:pPr>
+    </w:p>
+    <w:p>
+      <w:pPr>
         <w:pStyle w:val="Titre4"/>
-      </w:pPr>
-      <w:r>
+        <w:rPr>
+          <w:lang w:val="en-US"/>
+        </w:rPr>
+      </w:pPr>
+      <w:r>
+        <w:rPr>
+          <w:lang w:val="en-US"/>
+        </w:rPr>
         <w:t>ACP/AFM</w:t>
       </w:r>
     </w:p>
@@ -677,19 +1501,7 @@
         <w:rPr>
           <w:rFonts w:cstheme="minorHAnsi"/>
         </w:rPr>
-        <w:t xml:space="preserve"> sur 50 nœuds par spectre. Ceci nous permet d’obtenir une variable fonctionnelle qui expliquent chaque spectre avec 50 coefficients. Nous avons ensuite </w:t>
-      </w:r>
-      <w:r>
-        <w:rPr>
-          <w:rFonts w:cstheme="minorHAnsi"/>
-        </w:rPr>
-        <w:t>réalisé</w:t>
-      </w:r>
-      <w:r>
-        <w:rPr>
-          <w:rFonts w:cstheme="minorHAnsi"/>
-        </w:rPr>
-        <w:t xml:space="preserve"> une régression linéaire avec les coefficients en variables explicative pour expliquer par exemple </w:t>
+        <w:t xml:space="preserve"> sur 50 nœuds par spectre. Ceci nous permet d’obtenir une variable fonctionnelle qui expliquent chaque spectre avec 50 coefficients. Nous avons ensuite réalisé une régression linéaire avec les coefficients en variables explicative pour expliquer par exemple </w:t>
       </w:r>
       <w:proofErr w:type="gramStart"/>
       <w:r>
@@ -738,6 +1550,7 @@
         <w:pStyle w:val="Titre3"/>
       </w:pPr>
       <w:r>
+        <w:lastRenderedPageBreak/>
         <w:t>ACP fonctionnelle</w:t>
       </w:r>
     </w:p>
@@ -1125,6 +1938,7 @@
         <w:rPr>
           <w:rFonts w:cstheme="minorHAnsi"/>
         </w:rPr>
+        <w:lastRenderedPageBreak/>
         <w:t xml:space="preserve">L'amélioration des technologies d'acquisition de données permettent aujourd'hui de collecter des données de manière quasi continue. Les observations ne sont plus des valeurs ponctuelles mais peuvent être considérées comme des fonctions continues. Des observations de telles variables sont </w:t>
       </w:r>
       <w:r>
@@ -1676,6 +2490,7 @@
         <w:rPr>
           <w:rFonts w:cstheme="minorHAnsi"/>
         </w:rPr>
+        <w:lastRenderedPageBreak/>
         <w:t xml:space="preserve">70-75 stage = </w:t>
       </w:r>
       <w:r>
@@ -2025,6 +2840,119 @@
 <file path=word/numbering.xml><?xml version="1.0" encoding="utf-8"?>
 <w:numbering xmlns:wpc="http://schemas.microsoft.com/office/word/2010/wordprocessingCanvas" xmlns:cx="http://schemas.microsoft.com/office/drawing/2014/chartex" xmlns:cx1="http://schemas.microsoft.com/office/drawing/2015/9/8/chartex" xmlns:cx2="http://schemas.microsoft.com/office/drawing/2015/10/21/chartex" xmlns:cx3="http://schemas.microsoft.com/office/drawing/2016/5/9/chartex" xmlns:cx4="http://schemas.microsoft.com/office/drawing/2016/5/10/chartex" xmlns:cx5="http://schemas.microsoft.com/office/drawing/2016/5/11/chartex" xmlns:cx6="http://schemas.microsoft.com/office/drawing/2016/5/12/chartex" xmlns:cx7="http://schemas.microsoft.com/office/drawing/2016/5/13/chartex" xmlns:cx8="http://schemas.microsoft.com/office/drawing/2016/5/14/chartex" xmlns:mc="http://schemas.openxmlformats.org/markup-compatibility/2006" xmlns:aink="http://schemas.microsoft.com/office/drawing/2016/ink" xmlns:am3d="http://schemas.microsoft.com/office/drawing/2017/model3d" xmlns:o="urn:schemas-microsoft-com:office:office" xmlns:oel="http://schemas.microsoft.com/office/2019/extlst" xmlns:r="http://schemas.openxmlformats.org/officeDocument/2006/relationships" xmlns:m="http://schemas.openxmlformats.org/officeDocument/2006/math" xmlns:v="urn:schemas-microsoft-com:vml" xmlns:wp14="http://schemas.microsoft.com/office/word/2010/wordprocessingDrawing" xmlns:wp="http://schemas.openxmlformats.org/drawingml/2006/wordprocessingDrawing" xmlns:w10="urn:schemas-microsoft-com:office:word" xmlns:w="http://schemas.openxmlformats.org/wordprocessingml/2006/main" xmlns:w14="http://schemas.microsoft.com/office/word/2010/wordml" xmlns:w15="http://schemas.microsoft.com/office/word/2012/wordml" xmlns:w16cex="http://schemas.microsoft.com/office/word/2018/wordml/cex" xmlns:w16cid="http://schemas.microsoft.com/office/word/2016/wordml/cid" xmlns:w16="http://schemas.microsoft.com/office/word/2018/wordml" xmlns:w16du="http://schemas.microsoft.com/office/word/2023/wordml/word16du" xmlns:w16sdtdh="http://schemas.microsoft.com/office/word/2020/wordml/sdtdatahash" xmlns:w16sdtfl="http://schemas.microsoft.com/office/word/2024/wordml/sdtformatlock" xmlns:w16se="http://schemas.microsoft.com/office/word/2015/wordml/symex" xmlns:wpg="http://schemas.microsoft.com/office/word/2010/wordprocessingGroup" xmlns:wpi="http://schemas.microsoft.com/office/word/2010/wordprocessingInk" xmlns:wne="http://schemas.microsoft.com/office/word/2006/wordml" xmlns:wps="http://schemas.microsoft.com/office/word/2010/wordprocessingShape" mc:Ignorable="w14 w15 w16se w16cid w16 w16cex w16sdtdh w16sdtfl w16du wp14">
   <w:abstractNum w:abstractNumId="0" w15:restartNumberingAfterBreak="0">
+    <w:nsid w:val="10640D22"/>
+    <w:multiLevelType w:val="hybridMultilevel"/>
+    <w:tmpl w:val="EB940B6C"/>
+    <w:lvl w:ilvl="0" w:tplc="040C0001">
+      <w:start w:val="1"/>
+      <w:numFmt w:val="bullet"/>
+      <w:lvlText w:val=""/>
+      <w:lvlJc w:val="left"/>
+      <w:pPr>
+        <w:ind w:left="720" w:hanging="360"/>
+      </w:pPr>
+      <w:rPr>
+        <w:rFonts w:ascii="Symbol" w:hAnsi="Symbol" w:hint="default"/>
+      </w:rPr>
+    </w:lvl>
+    <w:lvl w:ilvl="1" w:tplc="040C0003" w:tentative="1">
+      <w:start w:val="1"/>
+      <w:numFmt w:val="bullet"/>
+      <w:lvlText w:val="o"/>
+      <w:lvlJc w:val="left"/>
+      <w:pPr>
+        <w:ind w:left="1440" w:hanging="360"/>
+      </w:pPr>
+      <w:rPr>
+        <w:rFonts w:ascii="Courier New" w:hAnsi="Courier New" w:cs="Courier New" w:hint="default"/>
+      </w:rPr>
+    </w:lvl>
+    <w:lvl w:ilvl="2" w:tplc="040C0005" w:tentative="1">
+      <w:start w:val="1"/>
+      <w:numFmt w:val="bullet"/>
+      <w:lvlText w:val=""/>
+      <w:lvlJc w:val="left"/>
+      <w:pPr>
+        <w:ind w:left="2160" w:hanging="360"/>
+      </w:pPr>
+      <w:rPr>
+        <w:rFonts w:ascii="Wingdings" w:hAnsi="Wingdings" w:hint="default"/>
+      </w:rPr>
+    </w:lvl>
+    <w:lvl w:ilvl="3" w:tplc="040C0001" w:tentative="1">
+      <w:start w:val="1"/>
+      <w:numFmt w:val="bullet"/>
+      <w:lvlText w:val=""/>
+      <w:lvlJc w:val="left"/>
+      <w:pPr>
+        <w:ind w:left="2880" w:hanging="360"/>
+      </w:pPr>
+      <w:rPr>
+        <w:rFonts w:ascii="Symbol" w:hAnsi="Symbol" w:hint="default"/>
+      </w:rPr>
+    </w:lvl>
+    <w:lvl w:ilvl="4" w:tplc="040C0003" w:tentative="1">
+      <w:start w:val="1"/>
+      <w:numFmt w:val="bullet"/>
+      <w:lvlText w:val="o"/>
+      <w:lvlJc w:val="left"/>
+      <w:pPr>
+        <w:ind w:left="3600" w:hanging="360"/>
+      </w:pPr>
+      <w:rPr>
+        <w:rFonts w:ascii="Courier New" w:hAnsi="Courier New" w:cs="Courier New" w:hint="default"/>
+      </w:rPr>
+    </w:lvl>
+    <w:lvl w:ilvl="5" w:tplc="040C0005" w:tentative="1">
+      <w:start w:val="1"/>
+      <w:numFmt w:val="bullet"/>
+      <w:lvlText w:val=""/>
+      <w:lvlJc w:val="left"/>
+      <w:pPr>
+        <w:ind w:left="4320" w:hanging="360"/>
+      </w:pPr>
+      <w:rPr>
+        <w:rFonts w:ascii="Wingdings" w:hAnsi="Wingdings" w:hint="default"/>
+      </w:rPr>
+    </w:lvl>
+    <w:lvl w:ilvl="6" w:tplc="040C0001" w:tentative="1">
+      <w:start w:val="1"/>
+      <w:numFmt w:val="bullet"/>
+      <w:lvlText w:val=""/>
+      <w:lvlJc w:val="left"/>
+      <w:pPr>
+        <w:ind w:left="5040" w:hanging="360"/>
+      </w:pPr>
+      <w:rPr>
+        <w:rFonts w:ascii="Symbol" w:hAnsi="Symbol" w:hint="default"/>
+      </w:rPr>
+    </w:lvl>
+    <w:lvl w:ilvl="7" w:tplc="040C0003" w:tentative="1">
+      <w:start w:val="1"/>
+      <w:numFmt w:val="bullet"/>
+      <w:lvlText w:val="o"/>
+      <w:lvlJc w:val="left"/>
+      <w:pPr>
+        <w:ind w:left="5760" w:hanging="360"/>
+      </w:pPr>
+      <w:rPr>
+        <w:rFonts w:ascii="Courier New" w:hAnsi="Courier New" w:cs="Courier New" w:hint="default"/>
+      </w:rPr>
+    </w:lvl>
+    <w:lvl w:ilvl="8" w:tplc="040C0005" w:tentative="1">
+      <w:start w:val="1"/>
+      <w:numFmt w:val="bullet"/>
+      <w:lvlText w:val=""/>
+      <w:lvlJc w:val="left"/>
+      <w:pPr>
+        <w:ind w:left="6480" w:hanging="360"/>
+      </w:pPr>
+      <w:rPr>
+        <w:rFonts w:ascii="Wingdings" w:hAnsi="Wingdings" w:hint="default"/>
+      </w:rPr>
+    </w:lvl>
+  </w:abstractNum>
+  <w:abstractNum w:abstractNumId="1" w15:restartNumberingAfterBreak="0">
     <w:nsid w:val="15547E0A"/>
     <w:multiLevelType w:val="hybridMultilevel"/>
     <w:tmpl w:val="03DC6A4C"/>
@@ -2136,7 +3064,120 @@
       </w:rPr>
     </w:lvl>
   </w:abstractNum>
-  <w:abstractNum w:abstractNumId="1" w15:restartNumberingAfterBreak="0">
+  <w:abstractNum w:abstractNumId="2" w15:restartNumberingAfterBreak="0">
+    <w:nsid w:val="73363AE9"/>
+    <w:multiLevelType w:val="hybridMultilevel"/>
+    <w:tmpl w:val="658AFA96"/>
+    <w:lvl w:ilvl="0" w:tplc="040C0001">
+      <w:start w:val="1"/>
+      <w:numFmt w:val="bullet"/>
+      <w:lvlText w:val=""/>
+      <w:lvlJc w:val="left"/>
+      <w:pPr>
+        <w:ind w:left="720" w:hanging="360"/>
+      </w:pPr>
+      <w:rPr>
+        <w:rFonts w:ascii="Symbol" w:hAnsi="Symbol" w:hint="default"/>
+      </w:rPr>
+    </w:lvl>
+    <w:lvl w:ilvl="1" w:tplc="040C0003" w:tentative="1">
+      <w:start w:val="1"/>
+      <w:numFmt w:val="bullet"/>
+      <w:lvlText w:val="o"/>
+      <w:lvlJc w:val="left"/>
+      <w:pPr>
+        <w:ind w:left="1440" w:hanging="360"/>
+      </w:pPr>
+      <w:rPr>
+        <w:rFonts w:ascii="Courier New" w:hAnsi="Courier New" w:cs="Courier New" w:hint="default"/>
+      </w:rPr>
+    </w:lvl>
+    <w:lvl w:ilvl="2" w:tplc="040C0005" w:tentative="1">
+      <w:start w:val="1"/>
+      <w:numFmt w:val="bullet"/>
+      <w:lvlText w:val=""/>
+      <w:lvlJc w:val="left"/>
+      <w:pPr>
+        <w:ind w:left="2160" w:hanging="360"/>
+      </w:pPr>
+      <w:rPr>
+        <w:rFonts w:ascii="Wingdings" w:hAnsi="Wingdings" w:hint="default"/>
+      </w:rPr>
+    </w:lvl>
+    <w:lvl w:ilvl="3" w:tplc="040C0001" w:tentative="1">
+      <w:start w:val="1"/>
+      <w:numFmt w:val="bullet"/>
+      <w:lvlText w:val=""/>
+      <w:lvlJc w:val="left"/>
+      <w:pPr>
+        <w:ind w:left="2880" w:hanging="360"/>
+      </w:pPr>
+      <w:rPr>
+        <w:rFonts w:ascii="Symbol" w:hAnsi="Symbol" w:hint="default"/>
+      </w:rPr>
+    </w:lvl>
+    <w:lvl w:ilvl="4" w:tplc="040C0003" w:tentative="1">
+      <w:start w:val="1"/>
+      <w:numFmt w:val="bullet"/>
+      <w:lvlText w:val="o"/>
+      <w:lvlJc w:val="left"/>
+      <w:pPr>
+        <w:ind w:left="3600" w:hanging="360"/>
+      </w:pPr>
+      <w:rPr>
+        <w:rFonts w:ascii="Courier New" w:hAnsi="Courier New" w:cs="Courier New" w:hint="default"/>
+      </w:rPr>
+    </w:lvl>
+    <w:lvl w:ilvl="5" w:tplc="040C0005" w:tentative="1">
+      <w:start w:val="1"/>
+      <w:numFmt w:val="bullet"/>
+      <w:lvlText w:val=""/>
+      <w:lvlJc w:val="left"/>
+      <w:pPr>
+        <w:ind w:left="4320" w:hanging="360"/>
+      </w:pPr>
+      <w:rPr>
+        <w:rFonts w:ascii="Wingdings" w:hAnsi="Wingdings" w:hint="default"/>
+      </w:rPr>
+    </w:lvl>
+    <w:lvl w:ilvl="6" w:tplc="040C0001" w:tentative="1">
+      <w:start w:val="1"/>
+      <w:numFmt w:val="bullet"/>
+      <w:lvlText w:val=""/>
+      <w:lvlJc w:val="left"/>
+      <w:pPr>
+        <w:ind w:left="5040" w:hanging="360"/>
+      </w:pPr>
+      <w:rPr>
+        <w:rFonts w:ascii="Symbol" w:hAnsi="Symbol" w:hint="default"/>
+      </w:rPr>
+    </w:lvl>
+    <w:lvl w:ilvl="7" w:tplc="040C0003" w:tentative="1">
+      <w:start w:val="1"/>
+      <w:numFmt w:val="bullet"/>
+      <w:lvlText w:val="o"/>
+      <w:lvlJc w:val="left"/>
+      <w:pPr>
+        <w:ind w:left="5760" w:hanging="360"/>
+      </w:pPr>
+      <w:rPr>
+        <w:rFonts w:ascii="Courier New" w:hAnsi="Courier New" w:cs="Courier New" w:hint="default"/>
+      </w:rPr>
+    </w:lvl>
+    <w:lvl w:ilvl="8" w:tplc="040C0005" w:tentative="1">
+      <w:start w:val="1"/>
+      <w:numFmt w:val="bullet"/>
+      <w:lvlText w:val=""/>
+      <w:lvlJc w:val="left"/>
+      <w:pPr>
+        <w:ind w:left="6480" w:hanging="360"/>
+      </w:pPr>
+      <w:rPr>
+        <w:rFonts w:ascii="Wingdings" w:hAnsi="Wingdings" w:hint="default"/>
+      </w:rPr>
+    </w:lvl>
+  </w:abstractNum>
+  <w:abstractNum w:abstractNumId="3" w15:restartNumberingAfterBreak="0">
     <w:nsid w:val="78866E53"/>
     <w:multiLevelType w:val="hybridMultilevel"/>
     <w:tmpl w:val="D376EF92"/>
@@ -2249,10 +3290,16 @@
     </w:lvl>
   </w:abstractNum>
   <w:num w:numId="1" w16cid:durableId="442846978">
+    <w:abstractNumId w:val="3"/>
+  </w:num>
+  <w:num w:numId="2" w16cid:durableId="1562013530">
     <w:abstractNumId w:val="1"/>
   </w:num>
-  <w:num w:numId="2" w16cid:durableId="1562013530">
+  <w:num w:numId="3" w16cid:durableId="1155562814">
     <w:abstractNumId w:val="0"/>
+  </w:num>
+  <w:num w:numId="4" w16cid:durableId="588125985">
+    <w:abstractNumId w:val="2"/>
   </w:num>
 </w:numbering>
 </file>
@@ -3167,6 +4214,15 @@
       <w:spacing w:val="5"/>
     </w:rPr>
   </w:style>
+  <w:style w:type="paragraph" w:styleId="Sansinterligne">
+    <w:name w:val="No Spacing"/>
+    <w:uiPriority w:val="1"/>
+    <w:qFormat/>
+    <w:rsid w:val="000401AA"/>
+    <w:pPr>
+      <w:spacing w:after="0" w:line="240" w:lineRule="auto"/>
+    </w:pPr>
+  </w:style>
 </w:styles>
 </file>
 

</xml_diff>

<commit_message>
code exploration des var reponse et mise a jours des notes sur cette exploration
</commit_message>
<xml_diff>
--- a/doc/Notes.docx
+++ b/doc/Notes.docx
@@ -583,14 +583,9 @@
       <w:r>
         <w:t xml:space="preserve">Les données de </w:t>
       </w:r>
-      <w:proofErr w:type="spellStart"/>
-      <w:r>
-        <w:t>pheno</w:t>
-      </w:r>
-      <w:r>
-        <w:t>type</w:t>
-      </w:r>
-      <w:proofErr w:type="spellEnd"/>
+      <w:r>
+        <w:t>phénotype</w:t>
+      </w:r>
       <w:r>
         <w:t xml:space="preserve"> contien</w:t>
       </w:r>
@@ -993,34 +988,10 @@
         <w:t>‐1</w:t>
       </w:r>
       <w:r>
-        <w:cr/>
-      </w:r>
-      <w:r>
-        <w:t>SR</w:t>
-      </w:r>
-      <w:r>
-        <w:t> </w:t>
-      </w:r>
-      <w:r>
-        <w:t>(</w:t>
-      </w:r>
-      <w:r>
-        <w:t>Shoot</w:t>
-      </w:r>
-      <w:r>
-        <w:t>-</w:t>
-      </w:r>
-      <w:r>
-        <w:t>Root Ratio</w:t>
-      </w:r>
-      <w:r>
-        <w:t>) :</w:t>
-      </w:r>
-      <w:r>
-        <w:t xml:space="preserve"> Rapport entre </w:t>
-      </w:r>
-      <w:r>
-        <w:t>la masse sèche aérienne ADW et la masse sèche de racine RDW</w:t>
+        <w:rPr>
+          <w:vertAlign w:val="superscript"/>
+        </w:rPr>
+        <w:t xml:space="preserve"> </w:t>
       </w:r>
     </w:p>
     <w:p>
@@ -1032,44 +1003,19 @@
         </w:numPr>
       </w:pPr>
       <w:r>
-        <w:t>SNQ</w:t>
-      </w:r>
-      <w:r>
-        <w:t> </w:t>
-      </w:r>
-      <w:r>
-        <w:t>(</w:t>
-      </w:r>
-      <w:r>
-        <w:t xml:space="preserve">Shoot </w:t>
-      </w:r>
-      <w:proofErr w:type="spellStart"/>
-      <w:r>
-        <w:t>Nitrogen</w:t>
-      </w:r>
-      <w:proofErr w:type="spellEnd"/>
-      <w:r>
-        <w:t xml:space="preserve"> </w:t>
-      </w:r>
-      <w:proofErr w:type="spellStart"/>
-      <w:r>
-        <w:t>Quantity</w:t>
-      </w:r>
-      <w:proofErr w:type="spellEnd"/>
-      <w:r>
-        <w:t>) :</w:t>
-      </w:r>
-      <w:r>
-        <w:t xml:space="preserve"> </w:t>
-      </w:r>
-      <w:r>
-        <w:t>Q</w:t>
-      </w:r>
-      <w:r>
-        <w:t>ua</w:t>
-      </w:r>
-      <w:r>
-        <w:t>ntité d’azote dans les parties aérienne en g</w:t>
+        <w:t>SR (</w:t>
+      </w:r>
+      <w:r>
+        <w:t>Shoot</w:t>
+      </w:r>
+      <w:r>
+        <w:t>-</w:t>
+      </w:r>
+      <w:r>
+        <w:t>Root Ratio</w:t>
+      </w:r>
+      <w:r>
+        <w:t>) : Rapport entre la masse sèche aérienne ADW et la masse sèche de racine RDW.</w:t>
       </w:r>
     </w:p>
     <w:p>
@@ -1081,7 +1027,7 @@
         </w:numPr>
       </w:pPr>
       <w:r>
-        <w:t>LASNQ</w:t>
+        <w:t>SNQ</w:t>
       </w:r>
       <w:r>
         <w:t> </w:t>
@@ -1089,17 +1035,6 @@
       <w:r>
         <w:t>(</w:t>
       </w:r>
-      <w:proofErr w:type="spellStart"/>
-      <w:r>
-        <w:t>Leaf</w:t>
-      </w:r>
-      <w:proofErr w:type="spellEnd"/>
-      <w:r>
-        <w:t xml:space="preserve"> Area</w:t>
-      </w:r>
-      <w:r>
-        <w:t>-</w:t>
-      </w:r>
       <w:r>
         <w:t xml:space="preserve">Shoot </w:t>
       </w:r>
@@ -1123,28 +1058,13 @@
         <w:t xml:space="preserve"> </w:t>
       </w:r>
       <w:r>
-        <w:t>Rapport entre la su</w:t>
-      </w:r>
-      <w:r>
-        <w:t xml:space="preserve">rface foliaire LA et la </w:t>
-      </w:r>
-      <w:r>
-        <w:t>qua</w:t>
-      </w:r>
-      <w:r>
-        <w:t>ntité d’azote dans les parties aérienne</w:t>
-      </w:r>
-      <w:r>
-        <w:t xml:space="preserve"> SNQ en </w:t>
-      </w:r>
-      <w:r>
-        <w:t>cm².g</w:t>
-      </w:r>
-      <w:r>
-        <w:rPr>
-          <w:vertAlign w:val="superscript"/>
-        </w:rPr>
-        <w:t>‐1</w:t>
+        <w:t>Q</w:t>
+      </w:r>
+      <w:r>
+        <w:t>ua</w:t>
+      </w:r>
+      <w:r>
+        <w:t>ntité d’azote dans les parties aérienne en g</w:t>
       </w:r>
     </w:p>
     <w:p>
@@ -1156,7 +1076,7 @@
         </w:numPr>
       </w:pPr>
       <w:r>
-        <w:t>TNQ</w:t>
+        <w:t>LASNQ</w:t>
       </w:r>
       <w:r>
         <w:t> </w:t>
@@ -1164,8 +1084,19 @@
       <w:r>
         <w:t>(</w:t>
       </w:r>
-      <w:r>
-        <w:t xml:space="preserve">Total </w:t>
+      <w:proofErr w:type="spellStart"/>
+      <w:r>
+        <w:t>Leaf</w:t>
+      </w:r>
+      <w:proofErr w:type="spellEnd"/>
+      <w:r>
+        <w:t xml:space="preserve"> Area</w:t>
+      </w:r>
+      <w:r>
+        <w:t>-</w:t>
+      </w:r>
+      <w:r>
+        <w:t xml:space="preserve">Shoot </w:t>
       </w:r>
       <w:proofErr w:type="spellStart"/>
       <w:r>
@@ -1184,10 +1115,31 @@
         <w:t>) :</w:t>
       </w:r>
       <w:r>
-        <w:t xml:space="preserve"> Quantité totale d’azote dans la plante</w:t>
-      </w:r>
-      <w:r>
-        <w:t xml:space="preserve"> en g</w:t>
+        <w:t xml:space="preserve"> </w:t>
+      </w:r>
+      <w:r>
+        <w:t>Rapport entre la su</w:t>
+      </w:r>
+      <w:r>
+        <w:t xml:space="preserve">rface foliaire LA et la </w:t>
+      </w:r>
+      <w:r>
+        <w:t>qua</w:t>
+      </w:r>
+      <w:r>
+        <w:t>ntité d’azote dans les parties aérienne</w:t>
+      </w:r>
+      <w:r>
+        <w:t xml:space="preserve"> SNQ en </w:t>
+      </w:r>
+      <w:r>
+        <w:t>cm².g</w:t>
+      </w:r>
+      <w:r>
+        <w:rPr>
+          <w:vertAlign w:val="superscript"/>
+        </w:rPr>
+        <w:t>‐1</w:t>
       </w:r>
     </w:p>
     <w:p>
@@ -1199,44 +1151,38 @@
         </w:numPr>
       </w:pPr>
       <w:r>
-        <w:t>SNU</w:t>
+        <w:t>TNQ</w:t>
       </w:r>
       <w:r>
         <w:t> </w:t>
       </w:r>
       <w:r>
-        <w:t>(P</w:t>
-      </w:r>
-      <w:r>
-        <w:t>lant-</w:t>
-      </w:r>
-      <w:proofErr w:type="spellStart"/>
-      <w:r>
-        <w:t>Specific</w:t>
-      </w:r>
-      <w:proofErr w:type="spellEnd"/>
-      <w:r>
-        <w:t xml:space="preserve"> N </w:t>
-      </w:r>
-      <w:proofErr w:type="spellStart"/>
-      <w:r>
-        <w:t>Uptake</w:t>
+        <w:t>(</w:t>
+      </w:r>
+      <w:r>
+        <w:t xml:space="preserve">Total </w:t>
+      </w:r>
+      <w:proofErr w:type="spellStart"/>
+      <w:r>
+        <w:t>Nitrogen</w:t>
+      </w:r>
+      <w:proofErr w:type="spellEnd"/>
+      <w:r>
+        <w:t xml:space="preserve"> </w:t>
+      </w:r>
+      <w:proofErr w:type="spellStart"/>
+      <w:r>
+        <w:t>Quantity</w:t>
       </w:r>
       <w:proofErr w:type="spellEnd"/>
       <w:r>
         <w:t>) :</w:t>
       </w:r>
       <w:r>
-        <w:t xml:space="preserve"> </w:t>
-      </w:r>
-      <w:r>
-        <w:t>C</w:t>
-      </w:r>
-      <w:r>
-        <w:t>orrespond à la pente de</w:t>
-      </w:r>
-      <w:r>
-        <w:t xml:space="preserve"> la régression entre la quantité d’azote totale dans la plante et la masse sèche de racine</w:t>
+        <w:t xml:space="preserve"> Quantité totale d’azote dans la plante</w:t>
+      </w:r>
+      <w:r>
+        <w:t xml:space="preserve"> en g</w:t>
       </w:r>
     </w:p>
     <w:p>
@@ -1247,19 +1193,45 @@
           <w:numId w:val="3"/>
         </w:numPr>
       </w:pPr>
-      <w:proofErr w:type="spellStart"/>
-      <w:r>
-        <w:t>NUtE_tot</w:t>
-      </w:r>
-      <w:proofErr w:type="spellEnd"/>
-      <w:r>
-        <w:t xml:space="preserve"> : </w:t>
-      </w:r>
-      <w:r>
-        <w:t>Ratio entre le</w:t>
-      </w:r>
-      <w:r>
-        <w:t>s apports et les sorties d’azote pour l’ensemble de la plante</w:t>
+      <w:r>
+        <w:t>SNU</w:t>
+      </w:r>
+      <w:r>
+        <w:t> </w:t>
+      </w:r>
+      <w:r>
+        <w:t>(P</w:t>
+      </w:r>
+      <w:r>
+        <w:t>lant-</w:t>
+      </w:r>
+      <w:proofErr w:type="spellStart"/>
+      <w:r>
+        <w:t>Specific</w:t>
+      </w:r>
+      <w:proofErr w:type="spellEnd"/>
+      <w:r>
+        <w:t xml:space="preserve"> N </w:t>
+      </w:r>
+      <w:proofErr w:type="spellStart"/>
+      <w:r>
+        <w:t>Uptake</w:t>
+      </w:r>
+      <w:proofErr w:type="spellEnd"/>
+      <w:r>
+        <w:t>) :</w:t>
+      </w:r>
+      <w:r>
+        <w:t xml:space="preserve"> </w:t>
+      </w:r>
+      <w:r>
+        <w:t>C</w:t>
+      </w:r>
+      <w:r>
+        <w:t>orrespond à la pente de</w:t>
+      </w:r>
+      <w:r>
+        <w:t xml:space="preserve"> la régression entre la quantité d’azote totale dans la plante et la masse sèche de racine</w:t>
       </w:r>
     </w:p>
     <w:p>
@@ -1272,6 +1244,29 @@
       </w:pPr>
       <w:proofErr w:type="spellStart"/>
       <w:r>
+        <w:t>NUtE_tot</w:t>
+      </w:r>
+      <w:proofErr w:type="spellEnd"/>
+      <w:r>
+        <w:t xml:space="preserve"> : </w:t>
+      </w:r>
+      <w:r>
+        <w:t>Ratio entre le</w:t>
+      </w:r>
+      <w:r>
+        <w:t>s apports et les sorties d’azote pour l’ensemble de la plante</w:t>
+      </w:r>
+    </w:p>
+    <w:p>
+      <w:pPr>
+        <w:pStyle w:val="Sansinterligne"/>
+        <w:numPr>
+          <w:ilvl w:val="0"/>
+          <w:numId w:val="3"/>
+        </w:numPr>
+      </w:pPr>
+      <w:proofErr w:type="spellStart"/>
+      <w:r>
         <w:t>NUtE_</w:t>
       </w:r>
       <w:proofErr w:type="gramStart"/>
@@ -1341,7 +1336,13 @@
         <w:t> :</w:t>
       </w:r>
       <w:r>
-        <w:t xml:space="preserve"> Aire sous la courbe entre l</w:t>
+        <w:t xml:space="preserve"> Aire sous la courbe </w:t>
+      </w:r>
+      <w:r>
+        <w:t xml:space="preserve">décrivant la surface foliaire au cours du temps </w:t>
+      </w:r>
+      <w:r>
+        <w:t>entre l</w:t>
       </w:r>
       <w:r>
         <w:t>’émergence des</w:t>
@@ -1412,15 +1413,325 @@
     </w:p>
     <w:p>
       <w:pPr>
-        <w:pStyle w:val="Paragraphedeliste"/>
-        <w:numPr>
-          <w:ilvl w:val="0"/>
-          <w:numId w:val="2"/>
-        </w:numPr>
-      </w:pPr>
-      <w:r>
-        <w:t>Réaliser une potentielle classification des phénotypes par « genre » pour faire une AFM</w:t>
-      </w:r>
+        <w:pStyle w:val="Sansinterligne"/>
+        <w:rPr>
+          <w:u w:val="single"/>
+        </w:rPr>
+      </w:pPr>
+      <w:r>
+        <w:rPr>
+          <w:u w:val="single"/>
+        </w:rPr>
+        <w:t>AFM</w:t>
+      </w:r>
+    </w:p>
+    <w:p>
+      <w:pPr>
+        <w:pStyle w:val="Sansinterligne"/>
+        <w:jc w:val="both"/>
+      </w:pPr>
+      <w:r>
+        <w:t xml:space="preserve">Une analyse factorielle </w:t>
+      </w:r>
+      <w:r>
+        <w:t>a été réalisée pour</w:t>
+      </w:r>
+      <w:r>
+        <w:t xml:space="preserve"> voir les ressemblances entre variétés pour l'ensemble des variables et de voir la relation en les variables.</w:t>
+      </w:r>
+      <w:r>
+        <w:t xml:space="preserve"> Plus précisément, </w:t>
+      </w:r>
+      <w:r>
+        <w:t>une</w:t>
+      </w:r>
+      <w:r>
+        <w:t xml:space="preserve"> </w:t>
+      </w:r>
+      <w:r>
+        <w:t xml:space="preserve">AFM </w:t>
+      </w:r>
+      <w:r>
+        <w:t>a été réalisée en considérant les groupes de variables</w:t>
+      </w:r>
+      <w:proofErr w:type="gramStart"/>
+      <w:r>
+        <w:t xml:space="preserve"> «</w:t>
+      </w:r>
+      <w:r>
+        <w:t>Traits</w:t>
+      </w:r>
+      <w:proofErr w:type="gramEnd"/>
+      <w:r>
+        <w:t xml:space="preserve"> physiologiques</w:t>
+      </w:r>
+      <w:r>
+        <w:t> » et « </w:t>
+      </w:r>
+      <w:r>
+        <w:t>Traits développementaux</w:t>
+      </w:r>
+      <w:r>
+        <w:t xml:space="preserve"> ». Le but est </w:t>
+      </w:r>
+      <w:r>
+        <w:t>de voir les différences ou ressemblances entre les deux groupes de variables</w:t>
+      </w:r>
+      <w:r>
+        <w:t xml:space="preserve"> du point de vue des variables et des individus. </w:t>
+      </w:r>
+    </w:p>
+    <w:p>
+      <w:pPr>
+        <w:pStyle w:val="Sansinterligne"/>
+        <w:jc w:val="both"/>
+      </w:pPr>
+    </w:p>
+    <w:p>
+      <w:pPr>
+        <w:pStyle w:val="Sansinterligne"/>
+        <w:jc w:val="both"/>
+      </w:pPr>
+      <w:r>
+        <w:t>Le p</w:t>
+      </w:r>
+      <w:r>
+        <w:t>lan 1,2 </w:t>
+      </w:r>
+      <w:r>
+        <w:t>explique 41% de la variabilité</w:t>
+      </w:r>
+    </w:p>
+    <w:p>
+      <w:pPr>
+        <w:pStyle w:val="Sansinterligne"/>
+        <w:jc w:val="both"/>
+      </w:pPr>
+    </w:p>
+    <w:p>
+      <w:pPr>
+        <w:pStyle w:val="Sansinterligne"/>
+        <w:jc w:val="both"/>
+      </w:pPr>
+      <w:r>
+        <w:t>Concernant les variables :</w:t>
+      </w:r>
+    </w:p>
+    <w:p>
+      <w:pPr>
+        <w:pStyle w:val="Sansinterligne"/>
+        <w:jc w:val="both"/>
+      </w:pPr>
+      <w:r>
+        <w:t>Sur le plan 1-2, l</w:t>
+      </w:r>
+      <w:r>
+        <w:t xml:space="preserve">es deux groupes de variables sont localisés sur deux bissectrices différentes sur le graphe des variables. </w:t>
+      </w:r>
+      <w:r>
+        <w:t xml:space="preserve">La bissectrice du groupe « traits physiologique » permet de voir une forte corrélation entre les variables SNQ, TNQ, RDW, TDW, ADW et </w:t>
+      </w:r>
+      <w:r>
+        <w:t>anti corrélé à la</w:t>
+      </w:r>
+      <w:r>
+        <w:t xml:space="preserve"> variables </w:t>
+      </w:r>
+      <w:proofErr w:type="gramStart"/>
+      <w:r>
+        <w:t>LA</w:t>
+      </w:r>
+      <w:proofErr w:type="gramEnd"/>
+      <w:r>
+        <w:t xml:space="preserve">. </w:t>
+      </w:r>
+      <w:r>
+        <w:t xml:space="preserve">La bissectrice du groupe « traits développementaux » </w:t>
+      </w:r>
+      <w:r>
+        <w:t xml:space="preserve">montre une forte corrélation entre les variables </w:t>
+      </w:r>
+      <w:proofErr w:type="spellStart"/>
+      <w:r>
+        <w:t>Sp</w:t>
+      </w:r>
+      <w:proofErr w:type="spellEnd"/>
+      <w:r>
+        <w:t xml:space="preserve"> et AUC_L3_L4 et anti corrélé avec AUC_L1_L4. </w:t>
+      </w:r>
+    </w:p>
+    <w:p>
+      <w:pPr>
+        <w:pStyle w:val="Sansinterligne"/>
+        <w:jc w:val="both"/>
+      </w:pPr>
+    </w:p>
+    <w:p>
+      <w:pPr>
+        <w:pStyle w:val="Sansinterligne"/>
+        <w:jc w:val="both"/>
+      </w:pPr>
+      <w:r>
+        <w:t xml:space="preserve">Sur le plan 3-4, on observe une forte corrélation entre les variables SR, LWR et SNU. </w:t>
+      </w:r>
+    </w:p>
+    <w:p>
+      <w:pPr>
+        <w:pStyle w:val="Sansinterligne"/>
+        <w:jc w:val="both"/>
+      </w:pPr>
+    </w:p>
+    <w:p>
+      <w:pPr>
+        <w:pStyle w:val="Sansinterligne"/>
+        <w:jc w:val="both"/>
+      </w:pPr>
+      <w:r>
+        <w:t xml:space="preserve">Concernant les </w:t>
+      </w:r>
+      <w:r>
+        <w:t>individus</w:t>
+      </w:r>
+      <w:r>
+        <w:t> :</w:t>
+      </w:r>
+    </w:p>
+    <w:p>
+      <w:pPr>
+        <w:pStyle w:val="Sansinterligne"/>
+        <w:jc w:val="both"/>
+      </w:pPr>
+      <w:r>
+        <w:t xml:space="preserve">Les individus ayant de fortes coordonnées sur les axes correspondent à des individus prenant des valeurs </w:t>
+      </w:r>
+      <w:r>
+        <w:t>sur un des</w:t>
+      </w:r>
+      <w:r>
+        <w:t xml:space="preserve"> groupes de variables </w:t>
+      </w:r>
+      <w:r>
+        <w:t>« traits physiologique »</w:t>
+      </w:r>
+      <w:r>
+        <w:t xml:space="preserve"> </w:t>
+      </w:r>
+      <w:r>
+        <w:t>ou</w:t>
+      </w:r>
+      <w:r>
+        <w:t xml:space="preserve"> </w:t>
+      </w:r>
+      <w:r>
+        <w:t xml:space="preserve">« traits </w:t>
+      </w:r>
+      <w:r>
+        <w:lastRenderedPageBreak/>
+        <w:t>développementaux »</w:t>
+      </w:r>
+      <w:r>
+        <w:t xml:space="preserve">. </w:t>
+      </w:r>
+      <w:r>
+        <w:t xml:space="preserve"> Ces individus ont donc des traits physiologiques ou développementaux particulier. </w:t>
+      </w:r>
+    </w:p>
+    <w:p>
+      <w:pPr>
+        <w:pStyle w:val="Sansinterligne"/>
+        <w:jc w:val="both"/>
+      </w:pPr>
+    </w:p>
+    <w:p>
+      <w:pPr>
+        <w:pStyle w:val="Sansinterligne"/>
+        <w:jc w:val="both"/>
+      </w:pPr>
+      <w:r>
+        <w:t>Par exemple</w:t>
+      </w:r>
+      <w:r>
+        <w:t> :</w:t>
+      </w:r>
+    </w:p>
+    <w:p>
+      <w:pPr>
+        <w:pStyle w:val="Sansinterligne"/>
+        <w:jc w:val="both"/>
+      </w:pPr>
+      <w:r>
+        <w:t>L</w:t>
+      </w:r>
+      <w:r>
+        <w:t xml:space="preserve">a variété </w:t>
+      </w:r>
+      <w:proofErr w:type="spellStart"/>
+      <w:r>
+        <w:t>Navig</w:t>
+      </w:r>
+      <w:proofErr w:type="spellEnd"/>
+      <w:r>
+        <w:t xml:space="preserve"> 176 </w:t>
+      </w:r>
+      <w:r>
+        <w:t xml:space="preserve">prend des valeurs soit très forte, soit très petite sur les variables des </w:t>
+      </w:r>
+      <w:r>
+        <w:t>traits physiologique </w:t>
+      </w:r>
+      <w:r>
+        <w:t xml:space="preserve">et des valeurs moyennes sur les variables des </w:t>
+      </w:r>
+      <w:r>
+        <w:t>traits développementaux</w:t>
+      </w:r>
+      <w:r>
+        <w:t xml:space="preserve">. </w:t>
+      </w:r>
+    </w:p>
+    <w:p>
+      <w:pPr>
+        <w:pStyle w:val="Sansinterligne"/>
+        <w:jc w:val="both"/>
+        <w:rPr>
+          <w:u w:val="single"/>
+        </w:rPr>
+      </w:pPr>
+    </w:p>
+    <w:p>
+      <w:pPr>
+        <w:pStyle w:val="Sansinterligne"/>
+        <w:jc w:val="both"/>
+      </w:pPr>
+      <w:r>
+        <w:t>L</w:t>
+      </w:r>
+      <w:r>
+        <w:t xml:space="preserve">a variété </w:t>
+      </w:r>
+      <w:proofErr w:type="spellStart"/>
+      <w:r>
+        <w:t>Navig</w:t>
+      </w:r>
+      <w:proofErr w:type="spellEnd"/>
+      <w:r>
+        <w:t xml:space="preserve"> 159 </w:t>
+      </w:r>
+      <w:r>
+        <w:t>prend des valeurs soit très forte, soit très petite sur les variables des traits développementaux et des valeurs moyennes sur les variables des traits</w:t>
+      </w:r>
+      <w:r>
+        <w:t xml:space="preserve"> </w:t>
+      </w:r>
+      <w:r>
+        <w:t>physiologique.</w:t>
+      </w:r>
+    </w:p>
+    <w:p>
+      <w:pPr>
+        <w:pStyle w:val="Sansinterligne"/>
+        <w:jc w:val="both"/>
+      </w:pPr>
     </w:p>
     <w:p>
       <w:pPr>
@@ -1550,7 +1861,6 @@
         <w:pStyle w:val="Titre3"/>
       </w:pPr>
       <w:r>
-        <w:lastRenderedPageBreak/>
         <w:t>ACP fonctionnelle</w:t>
       </w:r>
     </w:p>
@@ -1682,6 +1992,7 @@
         <w:pStyle w:val="Titre2"/>
       </w:pPr>
       <w:r>
+        <w:lastRenderedPageBreak/>
         <w:t>Bibliographie</w:t>
       </w:r>
     </w:p>
@@ -1938,7 +2249,6 @@
         <w:rPr>
           <w:rFonts w:cstheme="minorHAnsi"/>
         </w:rPr>
-        <w:lastRenderedPageBreak/>
         <w:t xml:space="preserve">L'amélioration des technologies d'acquisition de données permettent aujourd'hui de collecter des données de manière quasi continue. Les observations ne sont plus des valeurs ponctuelles mais peuvent être considérées comme des fonctions continues. Des observations de telles variables sont </w:t>
       </w:r>
       <w:r>
@@ -2180,6 +2490,7 @@
         <w:rPr>
           <w:rFonts w:cstheme="minorHAnsi"/>
         </w:rPr>
+        <w:lastRenderedPageBreak/>
         <w:br/>
       </w:r>
       <w:proofErr w:type="spellStart"/>
@@ -2490,7 +2801,6 @@
         <w:rPr>
           <w:rFonts w:cstheme="minorHAnsi"/>
         </w:rPr>
-        <w:lastRenderedPageBreak/>
         <w:t xml:space="preserve">70-75 stage = </w:t>
       </w:r>
       <w:r>
@@ -2679,6 +2989,7 @@
         <w:rPr>
           <w:rFonts w:cstheme="minorHAnsi"/>
         </w:rPr>
+        <w:lastRenderedPageBreak/>
         <w:br/>
       </w:r>
       <w:proofErr w:type="spellStart"/>
@@ -2842,7 +3153,7 @@
   <w:abstractNum w:abstractNumId="0" w15:restartNumberingAfterBreak="0">
     <w:nsid w:val="10640D22"/>
     <w:multiLevelType w:val="hybridMultilevel"/>
-    <w:tmpl w:val="EB940B6C"/>
+    <w:tmpl w:val="88AA6936"/>
     <w:lvl w:ilvl="0" w:tplc="040C0001">
       <w:start w:val="1"/>
       <w:numFmt w:val="bullet"/>

</xml_diff>

<commit_message>
Update "these_results" : Add NIRS PCA Update "Notes" : Add comment on methode
</commit_message>
<xml_diff>
--- a/doc/Notes.docx
+++ b/doc/Notes.docx
@@ -128,28 +128,7 @@
         <w:rPr>
           <w:rFonts w:cstheme="minorHAnsi"/>
         </w:rPr>
-        <w:t xml:space="preserve">est d’utiliser des données issues de spectres proches infrarouges (NIRS pour Near </w:t>
-      </w:r>
-      <w:proofErr w:type="spellStart"/>
-      <w:r>
-        <w:rPr>
-          <w:rFonts w:cstheme="minorHAnsi"/>
-        </w:rPr>
-        <w:t>InfraRed</w:t>
-      </w:r>
-      <w:proofErr w:type="spellEnd"/>
-      <w:r>
-        <w:rPr>
-          <w:rFonts w:cstheme="minorHAnsi"/>
-        </w:rPr>
-        <w:t xml:space="preserve">  </w:t>
-      </w:r>
-      <w:proofErr w:type="spellStart"/>
-      <w:r>
-        <w:rPr>
-          <w:rFonts w:cstheme="minorHAnsi"/>
-        </w:rPr>
-        <w:t>Spectrocsop</w:t>
+        <w:t>est d’utiliser des données issues de spectres proches infrarouges (NIRS pour Near InfraRed  Spectrocsop</w:t>
       </w:r>
       <w:r>
         <w:rPr>
@@ -157,7 +136,6 @@
         </w:rPr>
         <w:t>y</w:t>
       </w:r>
-      <w:proofErr w:type="spellEnd"/>
       <w:r>
         <w:rPr>
           <w:rFonts w:cstheme="minorHAnsi"/>
@@ -231,21 +209,7 @@
         <w:rPr>
           <w:rFonts w:cstheme="minorHAnsi"/>
         </w:rPr>
-        <w:t xml:space="preserve">a thèse M. </w:t>
-      </w:r>
-      <w:proofErr w:type="spellStart"/>
-      <w:r>
-        <w:rPr>
-          <w:rFonts w:cstheme="minorHAnsi"/>
-        </w:rPr>
-        <w:t>Laurençon</w:t>
-      </w:r>
-      <w:proofErr w:type="spellEnd"/>
-      <w:r>
-        <w:rPr>
-          <w:rFonts w:cstheme="minorHAnsi"/>
-        </w:rPr>
-        <w:t xml:space="preserve"> se focalise sur la prédiction </w:t>
+        <w:t xml:space="preserve">a thèse M. Laurençon se focalise sur la prédiction </w:t>
       </w:r>
       <w:r>
         <w:rPr>
@@ -476,21 +440,7 @@
         <w:rPr>
           <w:rFonts w:cstheme="minorHAnsi"/>
         </w:rPr>
-        <w:t xml:space="preserve">Dans son approche statistique, M. </w:t>
-      </w:r>
-      <w:proofErr w:type="spellStart"/>
-      <w:r>
-        <w:rPr>
-          <w:rFonts w:cstheme="minorHAnsi"/>
-        </w:rPr>
-        <w:t>Laurençon</w:t>
-      </w:r>
-      <w:proofErr w:type="spellEnd"/>
-      <w:r>
-        <w:rPr>
-          <w:rFonts w:cstheme="minorHAnsi"/>
-        </w:rPr>
-        <w:t xml:space="preserve"> n’utilise pas du tout de données fonctionnelles, et nous nous proposons donc de les implémenter sur ces données NIRS et de phénotype de colza. Nous allons explorer plusieurs méthodes d’analyse de données fonctionnelles pour faire le lien entre le phénotype et le génotype via ces spectres NIRS. </w:t>
+        <w:t xml:space="preserve">Dans son approche statistique, M. Laurençon n’utilise pas du tout de données fonctionnelles, et nous nous proposons donc de les implémenter sur ces données NIRS et de phénotype de colza. Nous allons explorer plusieurs méthodes d’analyse de données fonctionnelles pour faire le lien entre le phénotype et le génotype via ces spectres NIRS. </w:t>
       </w:r>
     </w:p>
     <w:p>
@@ -506,6 +456,60 @@
         <w:pStyle w:val="Titre3"/>
       </w:pPr>
       <w:r>
+        <w:t>Génotypes</w:t>
+      </w:r>
+    </w:p>
+    <w:p>
+      <w:r>
+        <w:t xml:space="preserve">Les plantes utilisées pour cette thèse sont issues de 4 types de génotypes différents. Le type </w:t>
+      </w:r>
+      <w:r>
+        <w:rPr>
+          <w:b/>
+          <w:bCs/>
+        </w:rPr>
+        <w:t>WORS</w:t>
+      </w:r>
+      <w:r>
+        <w:t xml:space="preserve"> regroupe les 133 génotypes de colza oléagineux d’hiver. Le type </w:t>
+      </w:r>
+      <w:r>
+        <w:rPr>
+          <w:b/>
+          <w:bCs/>
+        </w:rPr>
+        <w:t>WFR</w:t>
+      </w:r>
+      <w:r>
+        <w:t xml:space="preserve"> regroupe les 13 génotypes de colza fourragers d’hiver. Le type </w:t>
+      </w:r>
+      <w:r>
+        <w:rPr>
+          <w:b/>
+          <w:bCs/>
+        </w:rPr>
+        <w:t>SOSR</w:t>
+      </w:r>
+      <w:r>
+        <w:t xml:space="preserve"> regroupe les 85 génotypes de colza oléagineux de printemps, et le type </w:t>
+      </w:r>
+      <w:r>
+        <w:rPr>
+          <w:b/>
+          <w:bCs/>
+        </w:rPr>
+        <w:t>Swede</w:t>
+      </w:r>
+      <w:r>
+        <w:t xml:space="preserve"> comprend 2 génotypes de rutabaga. Les rutabagas ont été introduits dans l’expérimentation afin d’augmenter la diversité génétique dans l’expérimentation. En effet, tout comme le colza, le rutabaga fait partie de l’espèce Brassica, et il est intéressant d’étudier son phénotype puisqu’il partage une grande part de son génotype avec le colza.</w:t>
+      </w:r>
+    </w:p>
+    <w:p>
+      <w:pPr>
+        <w:pStyle w:val="Titre3"/>
+      </w:pPr>
+      <w:r>
+        <w:lastRenderedPageBreak/>
         <w:t>Données NIRS</w:t>
       </w:r>
     </w:p>
@@ -515,6 +519,41 @@
       </w:pPr>
       <w:r>
         <w:t>Création des expérimentations</w:t>
+      </w:r>
+    </w:p>
+    <w:p>
+      <w:pPr>
+        <w:ind w:firstLine="708"/>
+      </w:pPr>
+      <w:r>
+        <w:t xml:space="preserve">Les spectres ont été obtenus de trois manières différentes : </w:t>
+      </w:r>
+    </w:p>
+    <w:p>
+      <w:pPr>
+        <w:pStyle w:val="Paragraphedeliste"/>
+        <w:numPr>
+          <w:ilvl w:val="0"/>
+          <w:numId w:val="5"/>
+        </w:numPr>
+      </w:pPr>
+      <w:r>
+        <w:t>Soit à partir de graines séchées et broyées</w:t>
+      </w:r>
+    </w:p>
+    <w:p>
+      <w:pPr>
+        <w:pStyle w:val="Paragraphedeliste"/>
+        <w:numPr>
+          <w:ilvl w:val="0"/>
+          <w:numId w:val="5"/>
+        </w:numPr>
+      </w:pPr>
+      <w:r>
+        <w:t>Soit à partir de feuilles. Les graines ont été plantées dans des caissons sur trois expérimentations différentes. A chaque fois, un caisson contient 4 génotypes, et chaque partie du caisson correspondant à un génotype contient 4 plantes (pour avoir des répétitions). Il y a eu 3 expérimentations. La première consiste à un phénotypage des génotype SOSR et Swede qui ont été planté en mars. Pour éviter un effet de l’orientation du tunnel, il y a eu deux répétitions de cette expérimentation en inversant les bacs de place. Les génotypes WOSR et WFR ont été planté en août puis en septembre (faisant office de seconde répétition)</w:t>
+      </w:r>
+      <w:r>
+        <w:t>. On a ensuite réalisé nos mesures phénotypiques sur ces plantes, mesuré leurs valeurs de réflectance en spectre infrarouge sur les feuilles fraiches, puis elles ont été séchée et réduite en poudre pour une mesure de l’absorbance en spectre proche infrarouge par spectrométrie</w:t>
       </w:r>
     </w:p>
     <w:p>
@@ -534,15 +573,7 @@
         </w:numPr>
       </w:pPr>
       <w:r>
-        <w:t>Centrage réduction (</w:t>
-      </w:r>
-      <w:proofErr w:type="spellStart"/>
-      <w:r>
-        <w:t>snv</w:t>
-      </w:r>
-      <w:proofErr w:type="spellEnd"/>
-      <w:r>
-        <w:t> ?)</w:t>
+        <w:t>Centrage réduction (snv ?)</w:t>
       </w:r>
     </w:p>
     <w:p>
@@ -556,13 +587,8 @@
       <w:r>
         <w:t xml:space="preserve">Lissage de </w:t>
       </w:r>
-      <w:proofErr w:type="spellStart"/>
-      <w:r>
-        <w:t>Savitzky</w:t>
-      </w:r>
-      <w:proofErr w:type="spellEnd"/>
-      <w:r>
-        <w:t>-Golay</w:t>
+      <w:r>
+        <w:t>Savitzky-Golay</w:t>
       </w:r>
     </w:p>
     <w:p>
@@ -587,32 +613,7 @@
         <w:t>phénotype</w:t>
       </w:r>
       <w:r>
-        <w:t xml:space="preserve"> contien</w:t>
-      </w:r>
-      <w:r>
-        <w:t>nent</w:t>
-      </w:r>
-      <w:r>
-        <w:t xml:space="preserve"> une variable qualitative "</w:t>
-      </w:r>
-      <w:proofErr w:type="spellStart"/>
-      <w:r>
-        <w:t>variety</w:t>
-      </w:r>
-      <w:proofErr w:type="spellEnd"/>
-      <w:r>
-        <w:t xml:space="preserve">" et 23 </w:t>
-      </w:r>
-      <w:proofErr w:type="spellStart"/>
-      <w:r>
-        <w:t>varibales</w:t>
-      </w:r>
-      <w:proofErr w:type="spellEnd"/>
-      <w:r>
-        <w:t xml:space="preserve"> </w:t>
-      </w:r>
-      <w:r>
-        <w:t>quantitatives :</w:t>
+        <w:t xml:space="preserve"> contiennent une variable qualitative "variety" et 23 varibales quantitatives :</w:t>
       </w:r>
     </w:p>
     <w:p>
@@ -651,13 +652,8 @@
       <w:r>
         <w:t>(</w:t>
       </w:r>
-      <w:proofErr w:type="spellStart"/>
-      <w:r>
-        <w:t>Leaf</w:t>
-      </w:r>
-      <w:proofErr w:type="spellEnd"/>
-      <w:r>
-        <w:t xml:space="preserve"> Area</w:t>
+      <w:r>
+        <w:t>Leaf Area</w:t>
       </w:r>
       <w:r>
         <w:t>) :</w:t>
@@ -687,13 +683,8 @@
         <w:t xml:space="preserve"> (</w:t>
       </w:r>
       <w:r>
-        <w:t xml:space="preserve">Total Dry </w:t>
-      </w:r>
-      <w:proofErr w:type="spellStart"/>
-      <w:r>
-        <w:t>Weight</w:t>
-      </w:r>
-      <w:proofErr w:type="spellEnd"/>
+        <w:t>Total Dry Weight</w:t>
+      </w:r>
       <w:r>
         <w:t>) :</w:t>
       </w:r>
@@ -727,19 +718,9 @@
       <w:r>
         <w:t xml:space="preserve"> (</w:t>
       </w:r>
-      <w:proofErr w:type="spellStart"/>
-      <w:r>
-        <w:t>Aerial</w:t>
-      </w:r>
-      <w:proofErr w:type="spellEnd"/>
-      <w:r>
-        <w:t xml:space="preserve"> Dry </w:t>
-      </w:r>
-      <w:proofErr w:type="spellStart"/>
-      <w:r>
-        <w:t>Weigh</w:t>
-      </w:r>
-      <w:proofErr w:type="spellEnd"/>
+      <w:r>
+        <w:t>Aerial Dry Weigh</w:t>
+      </w:r>
       <w:r>
         <w:t>) :</w:t>
       </w:r>
@@ -762,10 +743,7 @@
         <w:t>plante</w:t>
       </w:r>
       <w:r>
-        <w:t xml:space="preserve"> </w:t>
-      </w:r>
-      <w:r>
-        <w:t>en g/plante</w:t>
+        <w:t xml:space="preserve"> en g/plante</w:t>
       </w:r>
     </w:p>
     <w:p>
@@ -777,7 +755,6 @@
         </w:numPr>
       </w:pPr>
       <w:r>
-        <w:lastRenderedPageBreak/>
         <w:t>RDW</w:t>
       </w:r>
       <w:r>
@@ -787,13 +764,8 @@
         <w:t>Root</w:t>
       </w:r>
       <w:r>
-        <w:t xml:space="preserve"> Dry </w:t>
-      </w:r>
-      <w:proofErr w:type="spellStart"/>
-      <w:r>
-        <w:t>Weigh</w:t>
-      </w:r>
-      <w:proofErr w:type="spellEnd"/>
+        <w:t xml:space="preserve"> Dry Weigh</w:t>
+      </w:r>
       <w:r>
         <w:t>) :</w:t>
       </w:r>
@@ -830,21 +802,8 @@
       <w:r>
         <w:t xml:space="preserve"> (</w:t>
       </w:r>
-      <w:proofErr w:type="spellStart"/>
-      <w:r>
-        <w:t>Leaf</w:t>
-      </w:r>
-      <w:proofErr w:type="spellEnd"/>
-      <w:r>
-        <w:t xml:space="preserve"> </w:t>
-      </w:r>
-      <w:proofErr w:type="spellStart"/>
-      <w:r>
-        <w:t>Weight</w:t>
-      </w:r>
-      <w:proofErr w:type="spellEnd"/>
-      <w:r>
-        <w:t xml:space="preserve"> Ratio</w:t>
+      <w:r>
+        <w:t>Leaf Weight Ratio</w:t>
       </w:r>
       <w:r>
         <w:t>) :</w:t>
@@ -885,13 +844,8 @@
       <w:r>
         <w:t>(</w:t>
       </w:r>
-      <w:proofErr w:type="spellStart"/>
-      <w:r>
-        <w:t>Leaf</w:t>
-      </w:r>
-      <w:proofErr w:type="spellEnd"/>
-      <w:r>
-        <w:t xml:space="preserve"> </w:t>
+      <w:r>
+        <w:t xml:space="preserve">Leaf </w:t>
       </w:r>
       <w:r>
         <w:t>A</w:t>
@@ -947,21 +901,8 @@
       <w:r>
         <w:t xml:space="preserve"> (</w:t>
       </w:r>
-      <w:proofErr w:type="spellStart"/>
-      <w:r>
-        <w:t>Specific</w:t>
-      </w:r>
-      <w:proofErr w:type="spellEnd"/>
-      <w:r>
-        <w:t xml:space="preserve"> </w:t>
-      </w:r>
-      <w:proofErr w:type="spellStart"/>
-      <w:r>
-        <w:t>Leaf</w:t>
-      </w:r>
-      <w:proofErr w:type="spellEnd"/>
-      <w:r>
-        <w:t xml:space="preserve"> Area</w:t>
+      <w:r>
+        <w:t>Specific Leaf Area</w:t>
       </w:r>
       <w:r>
         <w:t>) :</w:t>
@@ -1036,21 +977,8 @@
         <w:t>(</w:t>
       </w:r>
       <w:r>
-        <w:t xml:space="preserve">Shoot </w:t>
-      </w:r>
-      <w:proofErr w:type="spellStart"/>
-      <w:r>
-        <w:t>Nitrogen</w:t>
-      </w:r>
-      <w:proofErr w:type="spellEnd"/>
-      <w:r>
-        <w:t xml:space="preserve"> </w:t>
-      </w:r>
-      <w:proofErr w:type="spellStart"/>
-      <w:r>
-        <w:t>Quantity</w:t>
-      </w:r>
-      <w:proofErr w:type="spellEnd"/>
+        <w:t>Shoot Nitrogen Quantity</w:t>
+      </w:r>
       <w:r>
         <w:t>) :</w:t>
       </w:r>
@@ -1084,41 +1012,20 @@
       <w:r>
         <w:t>(</w:t>
       </w:r>
-      <w:proofErr w:type="spellStart"/>
-      <w:r>
-        <w:t>Leaf</w:t>
-      </w:r>
-      <w:proofErr w:type="spellEnd"/>
-      <w:r>
-        <w:t xml:space="preserve"> Area</w:t>
+      <w:r>
+        <w:t>Leaf Area</w:t>
       </w:r>
       <w:r>
         <w:t>-</w:t>
       </w:r>
       <w:r>
-        <w:t xml:space="preserve">Shoot </w:t>
-      </w:r>
-      <w:proofErr w:type="spellStart"/>
-      <w:r>
-        <w:t>Nitrogen</w:t>
-      </w:r>
-      <w:proofErr w:type="spellEnd"/>
-      <w:r>
-        <w:t xml:space="preserve"> </w:t>
-      </w:r>
-      <w:proofErr w:type="spellStart"/>
-      <w:r>
-        <w:t>Quantity</w:t>
-      </w:r>
-      <w:proofErr w:type="spellEnd"/>
+        <w:t>Shoot Nitrogen Quantity</w:t>
+      </w:r>
       <w:r>
         <w:t>) :</w:t>
       </w:r>
       <w:r>
-        <w:t xml:space="preserve"> </w:t>
-      </w:r>
-      <w:r>
-        <w:t>Rapport entre la su</w:t>
+        <w:t xml:space="preserve"> Rapport entre la su</w:t>
       </w:r>
       <w:r>
         <w:t xml:space="preserve">rface foliaire LA et la </w:t>
@@ -1127,10 +1034,7 @@
         <w:t>qua</w:t>
       </w:r>
       <w:r>
-        <w:t>ntité d’azote dans les parties aérienne</w:t>
-      </w:r>
-      <w:r>
-        <w:t xml:space="preserve"> SNQ en </w:t>
+        <w:t xml:space="preserve">ntité d’azote dans les parties aérienne SNQ en </w:t>
       </w:r>
       <w:r>
         <w:t>cm².g</w:t>
@@ -1160,21 +1064,8 @@
         <w:t>(</w:t>
       </w:r>
       <w:r>
-        <w:t xml:space="preserve">Total </w:t>
-      </w:r>
-      <w:proofErr w:type="spellStart"/>
-      <w:r>
-        <w:t>Nitrogen</w:t>
-      </w:r>
-      <w:proofErr w:type="spellEnd"/>
-      <w:r>
-        <w:t xml:space="preserve"> </w:t>
-      </w:r>
-      <w:proofErr w:type="spellStart"/>
-      <w:r>
-        <w:t>Quantity</w:t>
-      </w:r>
-      <w:proofErr w:type="spellEnd"/>
+        <w:t>Total Nitrogen Quantity</w:t>
+      </w:r>
       <w:r>
         <w:t>) :</w:t>
       </w:r>
@@ -1194,6 +1085,7 @@
         </w:numPr>
       </w:pPr>
       <w:r>
+        <w:lastRenderedPageBreak/>
         <w:t>SNU</w:t>
       </w:r>
       <w:r>
@@ -1203,21 +1095,8 @@
         <w:t>(P</w:t>
       </w:r>
       <w:r>
-        <w:t>lant-</w:t>
-      </w:r>
-      <w:proofErr w:type="spellStart"/>
-      <w:r>
-        <w:t>Specific</w:t>
-      </w:r>
-      <w:proofErr w:type="spellEnd"/>
-      <w:r>
-        <w:t xml:space="preserve"> N </w:t>
-      </w:r>
-      <w:proofErr w:type="spellStart"/>
-      <w:r>
-        <w:t>Uptake</w:t>
-      </w:r>
-      <w:proofErr w:type="spellEnd"/>
+        <w:t>lant-Specific N Uptake</w:t>
+      </w:r>
       <w:r>
         <w:t>) :</w:t>
       </w:r>
@@ -1242,11 +1121,9 @@
           <w:numId w:val="3"/>
         </w:numPr>
       </w:pPr>
-      <w:proofErr w:type="spellStart"/>
       <w:r>
         <w:t>NUtE_tot</w:t>
       </w:r>
-      <w:proofErr w:type="spellEnd"/>
       <w:r>
         <w:t xml:space="preserve"> : </w:t>
       </w:r>
@@ -1265,30 +1142,14 @@
           <w:numId w:val="3"/>
         </w:numPr>
       </w:pPr>
-      <w:proofErr w:type="spellStart"/>
-      <w:r>
-        <w:t>NUtE_</w:t>
-      </w:r>
-      <w:proofErr w:type="gramStart"/>
-      <w:r>
-        <w:t>aer</w:t>
-      </w:r>
-      <w:proofErr w:type="spellEnd"/>
-      <w:r>
-        <w:t>:</w:t>
-      </w:r>
-      <w:proofErr w:type="gramEnd"/>
-      <w:r>
-        <w:t xml:space="preserve"> </w:t>
-      </w:r>
-      <w:r>
-        <w:t>Ratio entre le</w:t>
-      </w:r>
-      <w:r>
-        <w:t xml:space="preserve">s apports et les sorties d’azote pour </w:t>
-      </w:r>
-      <w:r>
-        <w:t>les parties aériennes de la plante</w:t>
+      <w:r>
+        <w:t>NUtE_aer</w:t>
+      </w:r>
+      <w:r>
+        <w:t>: Ratio entre le</w:t>
+      </w:r>
+      <w:r>
+        <w:t>s apports et les sorties d’azote pour les parties aériennes de la plante</w:t>
       </w:r>
     </w:p>
     <w:p>
@@ -1318,7 +1179,6 @@
           <w:numId w:val="4"/>
         </w:numPr>
       </w:pPr>
-      <w:proofErr w:type="spellStart"/>
       <w:r>
         <w:t>AUC_L</w:t>
       </w:r>
@@ -1331,7 +1191,6 @@
       <w:r>
         <w:t>b</w:t>
       </w:r>
-      <w:proofErr w:type="spellEnd"/>
       <w:r>
         <w:t> :</w:t>
       </w:r>
@@ -1359,7 +1218,6 @@
           <w:numId w:val="4"/>
         </w:numPr>
       </w:pPr>
-      <w:proofErr w:type="spellStart"/>
       <w:r>
         <w:t>Sp_L</w:t>
       </w:r>
@@ -1370,11 +1228,7 @@
         <w:t>_L</w:t>
       </w:r>
       <w:r>
-        <w:t>b</w:t>
-      </w:r>
-      <w:proofErr w:type="spellEnd"/>
-      <w:r>
-        <w:t> : Vitesse de développement entre les feuilles a et b</w:t>
+        <w:t>b : Vitesse de développement entre les feuilles a et b</w:t>
       </w:r>
     </w:p>
     <w:p>
@@ -1400,14 +1254,8 @@
     <w:p>
       <w:pPr>
         <w:pStyle w:val="Titre4"/>
-        <w:rPr>
-          <w:lang w:val="en-US"/>
-        </w:rPr>
-      </w:pPr>
-      <w:r>
-        <w:rPr>
-          <w:lang w:val="en-US"/>
-        </w:rPr>
+      </w:pPr>
+      <w:r>
         <w:t>ACP/AFM</w:t>
       </w:r>
     </w:p>
@@ -1452,18 +1300,10 @@
         <w:t xml:space="preserve">AFM </w:t>
       </w:r>
       <w:r>
-        <w:t>a été réalisée en considérant les groupes de variables</w:t>
-      </w:r>
-      <w:proofErr w:type="gramStart"/>
-      <w:r>
-        <w:t xml:space="preserve"> «</w:t>
-      </w:r>
-      <w:r>
-        <w:t>Traits</w:t>
-      </w:r>
-      <w:proofErr w:type="gramEnd"/>
-      <w:r>
-        <w:t xml:space="preserve"> physiologiques</w:t>
+        <w:t>a été réalisée en considérant les groupes de variables «</w:t>
+      </w:r>
+      <w:r>
+        <w:t>Traits physiologiques</w:t>
       </w:r>
       <w:r>
         <w:t> » et « </w:t>
@@ -1535,13 +1375,8 @@
         <w:t>anti corrélé à la</w:t>
       </w:r>
       <w:r>
-        <w:t xml:space="preserve"> variables </w:t>
-      </w:r>
-      <w:proofErr w:type="gramStart"/>
-      <w:r>
-        <w:t>LA</w:t>
-      </w:r>
-      <w:proofErr w:type="gramEnd"/>
+        <w:t xml:space="preserve"> variables LA</w:t>
+      </w:r>
       <w:r>
         <w:t xml:space="preserve">. </w:t>
       </w:r>
@@ -1549,15 +1384,7 @@
         <w:t xml:space="preserve">La bissectrice du groupe « traits développementaux » </w:t>
       </w:r>
       <w:r>
-        <w:t xml:space="preserve">montre une forte corrélation entre les variables </w:t>
-      </w:r>
-      <w:proofErr w:type="spellStart"/>
-      <w:r>
-        <w:t>Sp</w:t>
-      </w:r>
-      <w:proofErr w:type="spellEnd"/>
-      <w:r>
-        <w:t xml:space="preserve"> et AUC_L3_L4 et anti corrélé avec AUC_L1_L4. </w:t>
+        <w:t xml:space="preserve">montre une forte corrélation entre les variables Sp et AUC_L3_L4 et anti corrélé avec AUC_L1_L4. </w:t>
       </w:r>
     </w:p>
     <w:p>
@@ -1587,10 +1414,46 @@
         <w:jc w:val="both"/>
       </w:pPr>
       <w:r>
-        <w:t xml:space="preserve">Concernant les </w:t>
-      </w:r>
-      <w:r>
-        <w:t>individus</w:t>
+        <w:t>Concernant les individus :</w:t>
+      </w:r>
+    </w:p>
+    <w:p>
+      <w:pPr>
+        <w:pStyle w:val="Sansinterligne"/>
+        <w:jc w:val="both"/>
+      </w:pPr>
+      <w:r>
+        <w:t xml:space="preserve">Les individus ayant de fortes coordonnées sur les axes correspondent à des individus prenant des valeurs </w:t>
+      </w:r>
+      <w:r>
+        <w:t>sur un des</w:t>
+      </w:r>
+      <w:r>
+        <w:t xml:space="preserve"> groupes de variables « traits physiologique » </w:t>
+      </w:r>
+      <w:r>
+        <w:t>ou</w:t>
+      </w:r>
+      <w:r>
+        <w:t xml:space="preserve"> « traits développementaux ». </w:t>
+      </w:r>
+      <w:r>
+        <w:t xml:space="preserve"> Ces individus ont donc des traits physiologiques ou développementaux particulier. </w:t>
+      </w:r>
+    </w:p>
+    <w:p>
+      <w:pPr>
+        <w:pStyle w:val="Sansinterligne"/>
+        <w:jc w:val="both"/>
+      </w:pPr>
+    </w:p>
+    <w:p>
+      <w:pPr>
+        <w:pStyle w:val="Sansinterligne"/>
+        <w:jc w:val="both"/>
+      </w:pPr>
+      <w:r>
+        <w:t>Par exemple</w:t>
       </w:r>
       <w:r>
         <w:t> :</w:t>
@@ -1602,142 +1465,48 @@
         <w:jc w:val="both"/>
       </w:pPr>
       <w:r>
-        <w:t xml:space="preserve">Les individus ayant de fortes coordonnées sur les axes correspondent à des individus prenant des valeurs </w:t>
-      </w:r>
-      <w:r>
-        <w:t>sur un des</w:t>
-      </w:r>
-      <w:r>
-        <w:t xml:space="preserve"> groupes de variables </w:t>
-      </w:r>
-      <w:r>
-        <w:t>« traits physiologique »</w:t>
-      </w:r>
-      <w:r>
-        <w:t xml:space="preserve"> </w:t>
-      </w:r>
-      <w:r>
-        <w:t>ou</w:t>
-      </w:r>
-      <w:r>
-        <w:t xml:space="preserve"> </w:t>
-      </w:r>
-      <w:r>
-        <w:t xml:space="preserve">« traits </w:t>
-      </w:r>
+        <w:t>L</w:t>
+      </w:r>
+      <w:r>
+        <w:t xml:space="preserve">a variété Navig 176 </w:t>
+      </w:r>
+      <w:r>
+        <w:t xml:space="preserve">prend des valeurs soit très forte, soit très petite sur les variables des traits physiologique et des valeurs moyennes sur les variables des traits développementaux. </w:t>
+      </w:r>
+    </w:p>
+    <w:p>
+      <w:pPr>
+        <w:pStyle w:val="Sansinterligne"/>
+        <w:jc w:val="both"/>
+        <w:rPr>
+          <w:u w:val="single"/>
+        </w:rPr>
+      </w:pPr>
+    </w:p>
+    <w:p>
+      <w:pPr>
+        <w:pStyle w:val="Sansinterligne"/>
+        <w:jc w:val="both"/>
+      </w:pPr>
+      <w:r>
+        <w:t>L</w:t>
+      </w:r>
+      <w:r>
+        <w:t>a variété Navig 159 prend des valeurs soit très forte, soit très petite sur les variables des traits développementaux et des valeurs moyennes sur les variables des traits physiologique.</w:t>
+      </w:r>
+    </w:p>
+    <w:p>
+      <w:pPr>
+        <w:pStyle w:val="Sansinterligne"/>
+        <w:jc w:val="both"/>
+      </w:pPr>
+    </w:p>
+    <w:p>
+      <w:pPr>
+        <w:pStyle w:val="Titre2"/>
+      </w:pPr>
       <w:r>
         <w:lastRenderedPageBreak/>
-        <w:t>développementaux »</w:t>
-      </w:r>
-      <w:r>
-        <w:t xml:space="preserve">. </w:t>
-      </w:r>
-      <w:r>
-        <w:t xml:space="preserve"> Ces individus ont donc des traits physiologiques ou développementaux particulier. </w:t>
-      </w:r>
-    </w:p>
-    <w:p>
-      <w:pPr>
-        <w:pStyle w:val="Sansinterligne"/>
-        <w:jc w:val="both"/>
-      </w:pPr>
-    </w:p>
-    <w:p>
-      <w:pPr>
-        <w:pStyle w:val="Sansinterligne"/>
-        <w:jc w:val="both"/>
-      </w:pPr>
-      <w:r>
-        <w:t>Par exemple</w:t>
-      </w:r>
-      <w:r>
-        <w:t> :</w:t>
-      </w:r>
-    </w:p>
-    <w:p>
-      <w:pPr>
-        <w:pStyle w:val="Sansinterligne"/>
-        <w:jc w:val="both"/>
-      </w:pPr>
-      <w:r>
-        <w:t>L</w:t>
-      </w:r>
-      <w:r>
-        <w:t xml:space="preserve">a variété </w:t>
-      </w:r>
-      <w:proofErr w:type="spellStart"/>
-      <w:r>
-        <w:t>Navig</w:t>
-      </w:r>
-      <w:proofErr w:type="spellEnd"/>
-      <w:r>
-        <w:t xml:space="preserve"> 176 </w:t>
-      </w:r>
-      <w:r>
-        <w:t xml:space="preserve">prend des valeurs soit très forte, soit très petite sur les variables des </w:t>
-      </w:r>
-      <w:r>
-        <w:t>traits physiologique </w:t>
-      </w:r>
-      <w:r>
-        <w:t xml:space="preserve">et des valeurs moyennes sur les variables des </w:t>
-      </w:r>
-      <w:r>
-        <w:t>traits développementaux</w:t>
-      </w:r>
-      <w:r>
-        <w:t xml:space="preserve">. </w:t>
-      </w:r>
-    </w:p>
-    <w:p>
-      <w:pPr>
-        <w:pStyle w:val="Sansinterligne"/>
-        <w:jc w:val="both"/>
-        <w:rPr>
-          <w:u w:val="single"/>
-        </w:rPr>
-      </w:pPr>
-    </w:p>
-    <w:p>
-      <w:pPr>
-        <w:pStyle w:val="Sansinterligne"/>
-        <w:jc w:val="both"/>
-      </w:pPr>
-      <w:r>
-        <w:t>L</w:t>
-      </w:r>
-      <w:r>
-        <w:t xml:space="preserve">a variété </w:t>
-      </w:r>
-      <w:proofErr w:type="spellStart"/>
-      <w:r>
-        <w:t>Navig</w:t>
-      </w:r>
-      <w:proofErr w:type="spellEnd"/>
-      <w:r>
-        <w:t xml:space="preserve"> 159 </w:t>
-      </w:r>
-      <w:r>
-        <w:t>prend des valeurs soit très forte, soit très petite sur les variables des traits développementaux et des valeurs moyennes sur les variables des traits</w:t>
-      </w:r>
-      <w:r>
-        <w:t xml:space="preserve"> </w:t>
-      </w:r>
-      <w:r>
-        <w:t>physiologique.</w:t>
-      </w:r>
-    </w:p>
-    <w:p>
-      <w:pPr>
-        <w:pStyle w:val="Sansinterligne"/>
-        <w:jc w:val="both"/>
-      </w:pPr>
-    </w:p>
-    <w:p>
-      <w:pPr>
-        <w:pStyle w:val="Titre2"/>
-      </w:pPr>
-      <w:r>
         <w:t>Méthode</w:t>
       </w:r>
     </w:p>
@@ -1778,13 +1547,8 @@
         <w:pStyle w:val="Titre3"/>
       </w:pPr>
       <w:r>
-        <w:t>Régression fonctionnelle : méthode des B-</w:t>
-      </w:r>
-      <w:proofErr w:type="spellStart"/>
-      <w:r>
-        <w:t>splines</w:t>
-      </w:r>
-      <w:proofErr w:type="spellEnd"/>
+        <w:t>Régression fonctionnelle : méthode des B-splines</w:t>
+      </w:r>
     </w:p>
     <w:p>
       <w:pPr>
@@ -1798,35 +1562,7 @@
         <w:rPr>
           <w:rFonts w:cstheme="minorHAnsi"/>
         </w:rPr>
-        <w:t xml:space="preserve">Dans un premier temps, nous avons ajuster une </w:t>
-      </w:r>
-      <w:proofErr w:type="spellStart"/>
-      <w:r>
-        <w:rPr>
-          <w:rFonts w:cstheme="minorHAnsi"/>
-        </w:rPr>
-        <w:t>spline</w:t>
-      </w:r>
-      <w:proofErr w:type="spellEnd"/>
-      <w:r>
-        <w:rPr>
-          <w:rFonts w:cstheme="minorHAnsi"/>
-        </w:rPr>
-        <w:t xml:space="preserve"> sur 50 nœuds par spectre. Ceci nous permet d’obtenir une variable fonctionnelle qui expliquent chaque spectre avec 50 coefficients. Nous avons ensuite réalisé une régression linéaire avec les coefficients en variables explicative pour expliquer par exemple </w:t>
-      </w:r>
-      <w:proofErr w:type="gramStart"/>
-      <w:r>
-        <w:rPr>
-          <w:rFonts w:cstheme="minorHAnsi"/>
-        </w:rPr>
-        <w:t>la taux</w:t>
-      </w:r>
-      <w:proofErr w:type="gramEnd"/>
-      <w:r>
-        <w:rPr>
-          <w:rFonts w:cstheme="minorHAnsi"/>
-        </w:rPr>
-        <w:t xml:space="preserve"> d’azote dans le colza. Le but est de réaliser des prédictions, ainsi de la validation croisée sera réalisé sur le modèle linéaire. </w:t>
+        <w:t xml:space="preserve">Dans un premier temps, nous avons ajuster une spline sur 50 nœuds par spectre. Ceci nous permet d’obtenir une variable fonctionnelle qui expliquent chaque spectre avec 50 coefficients. Nous avons ensuite réalisé une régression linéaire avec les coefficients en variables explicative pour expliquer par exemple la taux d’azote dans le colza. Le but est de réaliser des prédictions, ainsi de la validation croisée sera réalisé sur le modèle linéaire. </w:t>
       </w:r>
     </w:p>
     <w:p>
@@ -1949,13 +1685,8 @@
         </w:numPr>
       </w:pPr>
       <w:r>
-        <w:t xml:space="preserve">Faire attention aux </w:t>
-      </w:r>
-      <w:proofErr w:type="spellStart"/>
-      <w:r>
-        <w:t>outlyers</w:t>
-      </w:r>
-      <w:proofErr w:type="spellEnd"/>
+        <w:t>Faire attention aux outlyers</w:t>
+      </w:r>
     </w:p>
     <w:p>
       <w:pPr>
@@ -1992,51 +1723,37 @@
         <w:pStyle w:val="Titre2"/>
       </w:pPr>
       <w:r>
+        <w:t>Bibliographie</w:t>
+      </w:r>
+    </w:p>
+    <w:p/>
+    <w:p>
+      <w:r>
+        <w:t>Livre sur les données fonctionnelles :</w:t>
+      </w:r>
+    </w:p>
+    <w:p>
+      <w:pPr>
+        <w:rPr>
+          <w:lang w:val="en-GB"/>
+        </w:rPr>
+      </w:pPr>
+      <w:r>
+        <w:tab/>
+      </w:r>
+      <w:r>
+        <w:rPr>
+          <w:lang w:val="en-GB"/>
+        </w:rPr>
+        <w:t>- functional data analysis (J. O. Ramsay , B. W. Silverman)</w:t>
+      </w:r>
+    </w:p>
+    <w:p>
+      <w:pPr>
+        <w:pStyle w:val="Titre2"/>
+      </w:pPr>
+      <w:r>
         <w:lastRenderedPageBreak/>
-        <w:t>Bibliographie</w:t>
-      </w:r>
-    </w:p>
-    <w:p/>
-    <w:p>
-      <w:r>
-        <w:t>Livre sur les données fonctionnelles :</w:t>
-      </w:r>
-    </w:p>
-    <w:p>
-      <w:pPr>
-        <w:rPr>
-          <w:lang w:val="en-GB"/>
-        </w:rPr>
-      </w:pPr>
-      <w:r>
-        <w:tab/>
-      </w:r>
-      <w:r>
-        <w:rPr>
-          <w:lang w:val="en-GB"/>
-        </w:rPr>
-        <w:t xml:space="preserve">- functional data analysis (J. O. </w:t>
-      </w:r>
-      <w:proofErr w:type="gramStart"/>
-      <w:r>
-        <w:rPr>
-          <w:lang w:val="en-GB"/>
-        </w:rPr>
-        <w:t>Ramsay ,</w:t>
-      </w:r>
-      <w:proofErr w:type="gramEnd"/>
-      <w:r>
-        <w:rPr>
-          <w:lang w:val="en-GB"/>
-        </w:rPr>
-        <w:t xml:space="preserve"> B. W. Silverman)</w:t>
-      </w:r>
-    </w:p>
-    <w:p>
-      <w:pPr>
-        <w:pStyle w:val="Titre2"/>
-      </w:pPr>
-      <w:r>
         <w:t>Brouillon</w:t>
       </w:r>
     </w:p>
@@ -2102,14 +1819,12 @@
         </w:rPr>
         <w:t xml:space="preserve"> est la phase de croissance du colza entre la germination et l'étape ou la plante à </w:t>
       </w:r>
-      <w:proofErr w:type="spellStart"/>
       <w:r>
         <w:rPr>
           <w:rFonts w:cstheme="minorHAnsi"/>
         </w:rPr>
         <w:t>développée</w:t>
       </w:r>
-      <w:proofErr w:type="spellEnd"/>
       <w:r>
         <w:rPr>
           <w:rFonts w:cstheme="minorHAnsi"/>
@@ -2273,35 +1988,7 @@
         <w:rPr>
           <w:rFonts w:cstheme="minorHAnsi"/>
         </w:rPr>
-        <w:t xml:space="preserve"> (FDA pour </w:t>
-      </w:r>
-      <w:proofErr w:type="spellStart"/>
-      <w:r>
-        <w:rPr>
-          <w:rFonts w:cstheme="minorHAnsi"/>
-        </w:rPr>
-        <w:t>Functional</w:t>
-      </w:r>
-      <w:proofErr w:type="spellEnd"/>
-      <w:r>
-        <w:rPr>
-          <w:rFonts w:cstheme="minorHAnsi"/>
-        </w:rPr>
-        <w:t xml:space="preserve"> Data </w:t>
-      </w:r>
-      <w:proofErr w:type="spellStart"/>
-      <w:r>
-        <w:rPr>
-          <w:rFonts w:cstheme="minorHAnsi"/>
-        </w:rPr>
-        <w:t>Analysis</w:t>
-      </w:r>
-      <w:proofErr w:type="spellEnd"/>
-      <w:r>
-        <w:rPr>
-          <w:rFonts w:cstheme="minorHAnsi"/>
-        </w:rPr>
-        <w:t xml:space="preserve">). </w:t>
+        <w:t xml:space="preserve"> (FDA pour Functional Data Analysis). </w:t>
       </w:r>
     </w:p>
     <w:p>
@@ -2353,21 +2040,7 @@
         <w:rPr>
           <w:rFonts w:cstheme="minorHAnsi"/>
         </w:rPr>
-        <w:t xml:space="preserve">. Par exemple, trouver une fonction </w:t>
-      </w:r>
-      <w:proofErr w:type="spellStart"/>
-      <w:r>
-        <w:rPr>
-          <w:rFonts w:cstheme="minorHAnsi"/>
-        </w:rPr>
-        <w:t>spline</w:t>
-      </w:r>
-      <w:proofErr w:type="spellEnd"/>
-      <w:r>
-        <w:rPr>
-          <w:rFonts w:cstheme="minorHAnsi"/>
-        </w:rPr>
-        <w:t xml:space="preserve"> sur des observations discrètes revient à trouver une variable fonctionnelle. </w:t>
+        <w:t xml:space="preserve">. Par exemple, trouver une fonction spline sur des observations discrètes revient à trouver une variable fonctionnelle. </w:t>
       </w:r>
     </w:p>
     <w:p>
@@ -2389,21 +2062,7 @@
         <w:rPr>
           <w:rFonts w:cstheme="minorHAnsi"/>
         </w:rPr>
-        <w:t>L'espace de fonction le plus étudié est l'espace de Hilbert. Un espace de Hilbert est un espace vectoriel (</w:t>
-      </w:r>
-      <w:proofErr w:type="spellStart"/>
-      <w:r>
-        <w:rPr>
-          <w:rFonts w:cstheme="minorHAnsi"/>
-        </w:rPr>
-        <w:t>ie</w:t>
-      </w:r>
-      <w:proofErr w:type="spellEnd"/>
-      <w:r>
-        <w:rPr>
-          <w:rFonts w:cstheme="minorHAnsi"/>
-        </w:rPr>
-        <w:t xml:space="preserve">. </w:t>
+        <w:t xml:space="preserve">L'espace de fonction le plus étudié est l'espace de Hilbert. Un espace de Hilbert est un espace vectoriel (ie. </w:t>
       </w:r>
       <w:r>
         <w:rPr>
@@ -2447,19 +2106,11 @@
           <w:rFonts w:cstheme="minorHAnsi"/>
         </w:rPr>
       </w:pPr>
-      <w:proofErr w:type="spellStart"/>
-      <w:r>
-        <w:rPr>
-          <w:rFonts w:cstheme="minorHAnsi"/>
-        </w:rPr>
-        <w:t>Sample_ID</w:t>
-      </w:r>
-      <w:proofErr w:type="spellEnd"/>
-      <w:r>
-        <w:rPr>
-          <w:rFonts w:cstheme="minorHAnsi"/>
-        </w:rPr>
-        <w:t>: Numéro d'identification unique de l'échantillon.</w:t>
+      <w:r>
+        <w:rPr>
+          <w:rFonts w:cstheme="minorHAnsi"/>
+        </w:rPr>
+        <w:t>Sample_ID: Numéro d'identification unique de l'échantillon.</w:t>
       </w:r>
     </w:p>
     <w:p>
@@ -2490,36 +2141,75 @@
         <w:rPr>
           <w:rFonts w:cstheme="minorHAnsi"/>
         </w:rPr>
+        <w:br/>
+        <w:t>Growth season: Saison de croissance (2014-2015; 2015-2016; 2016-2017).</w:t>
+      </w:r>
+    </w:p>
+    <w:p>
+      <w:pPr>
+        <w:spacing w:line="240" w:lineRule="auto"/>
+        <w:jc w:val="both"/>
+        <w:rPr>
+          <w:rFonts w:cstheme="minorHAnsi"/>
+        </w:rPr>
+      </w:pPr>
+      <w:r>
+        <w:rPr>
+          <w:rFonts w:cstheme="minorHAnsi"/>
+        </w:rPr>
+        <w:br/>
+        <w:t xml:space="preserve">Growth condition: Conditions de culture soit en champs soit en tunnel </w:t>
+      </w:r>
+    </w:p>
+    <w:p>
+      <w:pPr>
+        <w:spacing w:line="240" w:lineRule="auto"/>
+        <w:jc w:val="both"/>
+        <w:rPr>
+          <w:rFonts w:cstheme="minorHAnsi"/>
+        </w:rPr>
+      </w:pPr>
+      <w:r>
+        <w:rPr>
+          <w:rFonts w:cstheme="minorHAnsi"/>
+        </w:rPr>
+        <w:br/>
+        <w:t xml:space="preserve">N regime: Fertilisation azoté apporté au stade de monté en graine. N+ désigne des apports </w:t>
+      </w:r>
+      <w:r>
+        <w:rPr>
+          <w:rFonts w:cstheme="minorHAnsi"/>
+        </w:rPr>
         <w:lastRenderedPageBreak/>
+        <w:t xml:space="preserve">azotés optimaux pour atteindre un </w:t>
+      </w:r>
+      <w:r>
+        <w:rPr>
+          <w:rFonts w:cstheme="minorHAnsi"/>
+        </w:rPr>
+        <w:t>rendement</w:t>
+      </w:r>
+      <w:r>
+        <w:rPr>
+          <w:rFonts w:cstheme="minorHAnsi"/>
+        </w:rPr>
+        <w:t xml:space="preserve"> de 3.5 t.ha-1 de graine de colza. N- désigne un apport sous-optimal de  80-100 kg.ha-1 d'azote</w:t>
+      </w:r>
+    </w:p>
+    <w:p>
+      <w:pPr>
+        <w:spacing w:line="240" w:lineRule="auto"/>
+        <w:jc w:val="both"/>
+        <w:rPr>
+          <w:rFonts w:cstheme="minorHAnsi"/>
+        </w:rPr>
+      </w:pPr>
+      <w:r>
+        <w:rPr>
+          <w:rFonts w:cstheme="minorHAnsi"/>
+        </w:rPr>
         <w:br/>
-      </w:r>
-      <w:proofErr w:type="spellStart"/>
-      <w:r>
-        <w:rPr>
-          <w:rFonts w:cstheme="minorHAnsi"/>
-        </w:rPr>
-        <w:t>Growth</w:t>
-      </w:r>
-      <w:proofErr w:type="spellEnd"/>
-      <w:r>
-        <w:rPr>
-          <w:rFonts w:cstheme="minorHAnsi"/>
-        </w:rPr>
-        <w:t xml:space="preserve"> </w:t>
-      </w:r>
-      <w:proofErr w:type="spellStart"/>
-      <w:r>
-        <w:rPr>
-          <w:rFonts w:cstheme="minorHAnsi"/>
-        </w:rPr>
-        <w:t>season</w:t>
-      </w:r>
-      <w:proofErr w:type="spellEnd"/>
-      <w:r>
-        <w:rPr>
-          <w:rFonts w:cstheme="minorHAnsi"/>
-        </w:rPr>
-        <w:t>: Saison de croissance (2014-2015; 2015-2016; 2016-2017).</w:t>
+        <w:t xml:space="preserve">W regime: Apports en eau a partir du stade de floraison. W+ indique un apport en eau optimal avec un potentiel en eau du substrat de -200 mbar. W- correspond à un apport en eau sous-optimal avec un potentiel en eau du substrat de -600 mbar. </w:t>
       </w:r>
     </w:p>
     <w:p>
@@ -2535,136 +2225,7 @@
           <w:rFonts w:cstheme="minorHAnsi"/>
         </w:rPr>
         <w:br/>
-      </w:r>
-      <w:proofErr w:type="spellStart"/>
-      <w:r>
-        <w:rPr>
-          <w:rFonts w:cstheme="minorHAnsi"/>
-        </w:rPr>
-        <w:t>Growth</w:t>
-      </w:r>
-      <w:proofErr w:type="spellEnd"/>
-      <w:r>
-        <w:rPr>
-          <w:rFonts w:cstheme="minorHAnsi"/>
-        </w:rPr>
-        <w:t xml:space="preserve"> condition: Conditions de culture soit en champs soit en tunnel </w:t>
-      </w:r>
-    </w:p>
-    <w:p>
-      <w:pPr>
-        <w:spacing w:line="240" w:lineRule="auto"/>
-        <w:jc w:val="both"/>
-        <w:rPr>
-          <w:rFonts w:cstheme="minorHAnsi"/>
-        </w:rPr>
-      </w:pPr>
-      <w:r>
-        <w:rPr>
-          <w:rFonts w:cstheme="minorHAnsi"/>
-        </w:rPr>
-        <w:br/>
-        <w:t xml:space="preserve">N </w:t>
-      </w:r>
-      <w:proofErr w:type="spellStart"/>
-      <w:r>
-        <w:rPr>
-          <w:rFonts w:cstheme="minorHAnsi"/>
-        </w:rPr>
-        <w:t>regime</w:t>
-      </w:r>
-      <w:proofErr w:type="spellEnd"/>
-      <w:r>
-        <w:rPr>
-          <w:rFonts w:cstheme="minorHAnsi"/>
-        </w:rPr>
-        <w:t xml:space="preserve">: Fertilisation azoté apporté au stade de monté en graine. N+ désigne des apports azotés optimaux pour atteindre un </w:t>
-      </w:r>
-      <w:r>
-        <w:rPr>
-          <w:rFonts w:cstheme="minorHAnsi"/>
-        </w:rPr>
-        <w:t>rendement</w:t>
-      </w:r>
-      <w:r>
-        <w:rPr>
-          <w:rFonts w:cstheme="minorHAnsi"/>
-        </w:rPr>
-        <w:t xml:space="preserve"> de 3.5 t.ha-1 de graine de colza. N- désigne un apport sous-optimal de  80-100 kg.ha-1 d'azote</w:t>
-      </w:r>
-    </w:p>
-    <w:p>
-      <w:pPr>
-        <w:spacing w:line="240" w:lineRule="auto"/>
-        <w:jc w:val="both"/>
-        <w:rPr>
-          <w:rFonts w:cstheme="minorHAnsi"/>
-        </w:rPr>
-      </w:pPr>
-      <w:r>
-        <w:rPr>
-          <w:rFonts w:cstheme="minorHAnsi"/>
-        </w:rPr>
-        <w:br/>
-        <w:t xml:space="preserve">W </w:t>
-      </w:r>
-      <w:proofErr w:type="spellStart"/>
-      <w:r>
-        <w:rPr>
-          <w:rFonts w:cstheme="minorHAnsi"/>
-        </w:rPr>
-        <w:t>regime</w:t>
-      </w:r>
-      <w:proofErr w:type="spellEnd"/>
-      <w:r>
-        <w:rPr>
-          <w:rFonts w:cstheme="minorHAnsi"/>
-        </w:rPr>
-        <w:t xml:space="preserve">: Apports en eau </w:t>
-      </w:r>
-      <w:proofErr w:type="spellStart"/>
-      <w:r>
-        <w:rPr>
-          <w:rFonts w:cstheme="minorHAnsi"/>
-        </w:rPr>
-        <w:t>a</w:t>
-      </w:r>
-      <w:proofErr w:type="spellEnd"/>
-      <w:r>
-        <w:rPr>
-          <w:rFonts w:cstheme="minorHAnsi"/>
-        </w:rPr>
-        <w:t xml:space="preserve"> partir du stade de floraison. W+ indique un apport en eau optimal avec un potentiel en eau du substrat de -200 mbar. W- correspond à un apport en eau sous-optimal avec un potentiel en eau du substrat de -600 mbar. </w:t>
-      </w:r>
-    </w:p>
-    <w:p>
-      <w:pPr>
-        <w:spacing w:line="240" w:lineRule="auto"/>
-        <w:jc w:val="both"/>
-        <w:rPr>
-          <w:rFonts w:cstheme="minorHAnsi"/>
-        </w:rPr>
-      </w:pPr>
-      <w:r>
-        <w:rPr>
-          <w:rFonts w:cstheme="minorHAnsi"/>
-        </w:rPr>
-        <w:br/>
-        <w:t>Tissue: Tissus végétaux d'</w:t>
-      </w:r>
-      <w:proofErr w:type="spellStart"/>
-      <w:r>
-        <w:rPr>
-          <w:rFonts w:cstheme="minorHAnsi"/>
-        </w:rPr>
-        <w:t>ou</w:t>
-      </w:r>
-      <w:proofErr w:type="spellEnd"/>
-      <w:r>
-        <w:rPr>
-          <w:rFonts w:cstheme="minorHAnsi"/>
-        </w:rPr>
-        <w:t xml:space="preserve"> proviennent les échantillons dont les racines, les feuilles, les tiges, les fleurs et les gousses de graines.</w:t>
+        <w:t>Tissue: Tissus végétaux d'ou proviennent les échantillons dont les racines, les feuilles, les tiges, les fleurs et les gousses de graines.</w:t>
       </w:r>
     </w:p>
     <w:p>
@@ -2692,35 +2253,7 @@
         <w:rPr>
           <w:rFonts w:cstheme="minorHAnsi"/>
         </w:rPr>
-        <w:t xml:space="preserve"> d'</w:t>
-      </w:r>
-      <w:proofErr w:type="spellStart"/>
-      <w:r>
-        <w:rPr>
-          <w:rFonts w:cstheme="minorHAnsi"/>
-        </w:rPr>
-        <w:t>ou</w:t>
-      </w:r>
-      <w:proofErr w:type="spellEnd"/>
-      <w:r>
-        <w:rPr>
-          <w:rFonts w:cstheme="minorHAnsi"/>
-        </w:rPr>
-        <w:t xml:space="preserve"> </w:t>
-      </w:r>
-      <w:proofErr w:type="spellStart"/>
-      <w:r>
-        <w:rPr>
-          <w:rFonts w:cstheme="minorHAnsi"/>
-        </w:rPr>
-        <w:t>on</w:t>
-      </w:r>
-      <w:proofErr w:type="spellEnd"/>
-      <w:r>
-        <w:rPr>
-          <w:rFonts w:cstheme="minorHAnsi"/>
-        </w:rPr>
-        <w:t xml:space="preserve"> été prélevés les échantillons. </w:t>
+        <w:t xml:space="preserve"> d'ou on été prélevés les échantillons. </w:t>
       </w:r>
     </w:p>
     <w:p>
@@ -2887,20 +2420,7 @@
           <w:rFonts w:cstheme="minorHAnsi"/>
         </w:rPr>
         <w:br/>
-      </w:r>
-      <w:proofErr w:type="spellStart"/>
-      <w:r>
-        <w:rPr>
-          <w:rFonts w:cstheme="minorHAnsi"/>
-        </w:rPr>
-        <w:t>N_model_set</w:t>
-      </w:r>
-      <w:proofErr w:type="spellEnd"/>
-      <w:r>
-        <w:rPr>
-          <w:rFonts w:cstheme="minorHAnsi"/>
-        </w:rPr>
-        <w:t xml:space="preserve">-type: Désigne des échantillons sélectionnés pour la calibration (Cal) ou la validation (Val) pour le modèle de prédiction de l'azote. </w:t>
+        <w:t xml:space="preserve">N_model_set-type: Désigne des échantillons sélectionnés pour la calibration (Cal) ou la validation (Val) pour le modèle de prédiction de l'azote. </w:t>
       </w:r>
     </w:p>
     <w:p>
@@ -2932,20 +2452,7 @@
           <w:rFonts w:cstheme="minorHAnsi"/>
         </w:rPr>
         <w:br/>
-      </w:r>
-      <w:proofErr w:type="spellStart"/>
-      <w:r>
-        <w:rPr>
-          <w:rFonts w:cstheme="minorHAnsi"/>
-        </w:rPr>
-        <w:t>C_model_set</w:t>
-      </w:r>
-      <w:proofErr w:type="spellEnd"/>
-      <w:r>
-        <w:rPr>
-          <w:rFonts w:cstheme="minorHAnsi"/>
-        </w:rPr>
-        <w:t xml:space="preserve">-type: Désigne des échantillons sélectionnés pour la calibration (Cal) ou la validation (Val) pour le modèle de prédiction du carbone. </w:t>
+        <w:t xml:space="preserve">C_model_set-type: Désigne des échantillons sélectionnés pour la calibration (Cal) ou la validation (Val) pour le modèle de prédiction du carbone. </w:t>
       </w:r>
     </w:p>
     <w:p>
@@ -2961,20 +2468,7 @@
           <w:rFonts w:cstheme="minorHAnsi"/>
         </w:rPr>
         <w:br/>
-      </w:r>
-      <w:proofErr w:type="spellStart"/>
-      <w:r>
-        <w:rPr>
-          <w:rFonts w:cstheme="minorHAnsi"/>
-        </w:rPr>
-        <w:t>Spectra_acquisition_year</w:t>
-      </w:r>
-      <w:proofErr w:type="spellEnd"/>
-      <w:r>
-        <w:rPr>
-          <w:rFonts w:cstheme="minorHAnsi"/>
-        </w:rPr>
-        <w:t>: Années d'acquisition des spectres, ici 2027</w:t>
+        <w:t>Spectra_acquisition_year: Années d'acquisition des spectres, ici 2027</w:t>
       </w:r>
     </w:p>
     <w:p>
@@ -2989,78 +2483,8 @@
         <w:rPr>
           <w:rFonts w:cstheme="minorHAnsi"/>
         </w:rPr>
-        <w:lastRenderedPageBreak/>
         <w:br/>
-      </w:r>
-      <w:proofErr w:type="spellStart"/>
-      <w:r>
-        <w:rPr>
-          <w:rFonts w:cstheme="minorHAnsi"/>
-        </w:rPr>
-        <w:t>Cup_type</w:t>
-      </w:r>
-      <w:proofErr w:type="spellEnd"/>
-      <w:r>
-        <w:rPr>
-          <w:rFonts w:cstheme="minorHAnsi"/>
-        </w:rPr>
-        <w:t xml:space="preserve">: Indique le type de </w:t>
-      </w:r>
-      <w:proofErr w:type="spellStart"/>
-      <w:r>
-        <w:rPr>
-          <w:rFonts w:cstheme="minorHAnsi"/>
-        </w:rPr>
-        <w:t>vial</w:t>
-      </w:r>
-      <w:proofErr w:type="spellEnd"/>
-      <w:r>
-        <w:rPr>
-          <w:rFonts w:cstheme="minorHAnsi"/>
-        </w:rPr>
-        <w:t xml:space="preserve"> en verre utilisés pour l'acquisition du spectre NIRS. “fix” désigne des </w:t>
-      </w:r>
-      <w:proofErr w:type="spellStart"/>
-      <w:r>
-        <w:rPr>
-          <w:rFonts w:cstheme="minorHAnsi"/>
-        </w:rPr>
-        <w:t>vials</w:t>
-      </w:r>
-      <w:proofErr w:type="spellEnd"/>
-      <w:r>
-        <w:rPr>
-          <w:rFonts w:cstheme="minorHAnsi"/>
-        </w:rPr>
-        <w:t xml:space="preserve"> de 22 mm de diamètre sur un support fixé. “</w:t>
-      </w:r>
-      <w:proofErr w:type="spellStart"/>
-      <w:r>
-        <w:rPr>
-          <w:rFonts w:cstheme="minorHAnsi"/>
-        </w:rPr>
-        <w:t>rotating</w:t>
-      </w:r>
-      <w:proofErr w:type="spellEnd"/>
-      <w:r>
-        <w:rPr>
-          <w:rFonts w:cstheme="minorHAnsi"/>
-        </w:rPr>
-        <w:t xml:space="preserve">” sont des </w:t>
-      </w:r>
-      <w:proofErr w:type="spellStart"/>
-      <w:r>
-        <w:rPr>
-          <w:rFonts w:cstheme="minorHAnsi"/>
-        </w:rPr>
-        <w:t>vials</w:t>
-      </w:r>
-      <w:proofErr w:type="spellEnd"/>
-      <w:r>
-        <w:rPr>
-          <w:rFonts w:cstheme="minorHAnsi"/>
-        </w:rPr>
-        <w:t xml:space="preserve"> de 51 mm de diamètre placé sur un support rotatif. </w:t>
+        <w:t xml:space="preserve">Cup_type: Indique le type de vial en verre utilisés pour l'acquisition du spectre NIRS. “fix” désigne des vials de 22 mm de diamètre sur un support fixé. “rotating” sont des vials de 51 mm de diamètre placé sur un support rotatif. </w:t>
       </w:r>
     </w:p>
     <w:p>
@@ -3120,21 +2544,7 @@
         <w:rPr>
           <w:rFonts w:cstheme="minorHAnsi"/>
         </w:rPr>
-        <w:t xml:space="preserve">Démarche </w:t>
-      </w:r>
-      <w:proofErr w:type="spellStart"/>
-      <w:r>
-        <w:rPr>
-          <w:rFonts w:cstheme="minorHAnsi"/>
-        </w:rPr>
-        <w:t>spline</w:t>
-      </w:r>
-      <w:proofErr w:type="spellEnd"/>
-      <w:r>
-        <w:rPr>
-          <w:rFonts w:cstheme="minorHAnsi"/>
-        </w:rPr>
-        <w:t> :</w:t>
+        <w:t>Démarche spline :</w:t>
       </w:r>
     </w:p>
     <w:sectPr>
@@ -3376,6 +2786,118 @@
     </w:lvl>
   </w:abstractNum>
   <w:abstractNum w:abstractNumId="2" w15:restartNumberingAfterBreak="0">
+    <w:nsid w:val="411A49F2"/>
+    <w:multiLevelType w:val="hybridMultilevel"/>
+    <w:tmpl w:val="FEC46624"/>
+    <w:lvl w:ilvl="0" w:tplc="78B2AC50">
+      <w:numFmt w:val="bullet"/>
+      <w:lvlText w:val="-"/>
+      <w:lvlJc w:val="left"/>
+      <w:pPr>
+        <w:ind w:left="1776" w:hanging="360"/>
+      </w:pPr>
+      <w:rPr>
+        <w:rFonts w:ascii="Calibri" w:eastAsiaTheme="minorHAnsi" w:hAnsi="Calibri" w:cs="Calibri" w:hint="default"/>
+      </w:rPr>
+    </w:lvl>
+    <w:lvl w:ilvl="1" w:tplc="040C0003" w:tentative="1">
+      <w:start w:val="1"/>
+      <w:numFmt w:val="bullet"/>
+      <w:lvlText w:val="o"/>
+      <w:lvlJc w:val="left"/>
+      <w:pPr>
+        <w:ind w:left="2496" w:hanging="360"/>
+      </w:pPr>
+      <w:rPr>
+        <w:rFonts w:ascii="Courier New" w:hAnsi="Courier New" w:cs="Courier New" w:hint="default"/>
+      </w:rPr>
+    </w:lvl>
+    <w:lvl w:ilvl="2" w:tplc="040C0005" w:tentative="1">
+      <w:start w:val="1"/>
+      <w:numFmt w:val="bullet"/>
+      <w:lvlText w:val=""/>
+      <w:lvlJc w:val="left"/>
+      <w:pPr>
+        <w:ind w:left="3216" w:hanging="360"/>
+      </w:pPr>
+      <w:rPr>
+        <w:rFonts w:ascii="Wingdings" w:hAnsi="Wingdings" w:hint="default"/>
+      </w:rPr>
+    </w:lvl>
+    <w:lvl w:ilvl="3" w:tplc="040C0001" w:tentative="1">
+      <w:start w:val="1"/>
+      <w:numFmt w:val="bullet"/>
+      <w:lvlText w:val=""/>
+      <w:lvlJc w:val="left"/>
+      <w:pPr>
+        <w:ind w:left="3936" w:hanging="360"/>
+      </w:pPr>
+      <w:rPr>
+        <w:rFonts w:ascii="Symbol" w:hAnsi="Symbol" w:hint="default"/>
+      </w:rPr>
+    </w:lvl>
+    <w:lvl w:ilvl="4" w:tplc="040C0003" w:tentative="1">
+      <w:start w:val="1"/>
+      <w:numFmt w:val="bullet"/>
+      <w:lvlText w:val="o"/>
+      <w:lvlJc w:val="left"/>
+      <w:pPr>
+        <w:ind w:left="4656" w:hanging="360"/>
+      </w:pPr>
+      <w:rPr>
+        <w:rFonts w:ascii="Courier New" w:hAnsi="Courier New" w:cs="Courier New" w:hint="default"/>
+      </w:rPr>
+    </w:lvl>
+    <w:lvl w:ilvl="5" w:tplc="040C0005" w:tentative="1">
+      <w:start w:val="1"/>
+      <w:numFmt w:val="bullet"/>
+      <w:lvlText w:val=""/>
+      <w:lvlJc w:val="left"/>
+      <w:pPr>
+        <w:ind w:left="5376" w:hanging="360"/>
+      </w:pPr>
+      <w:rPr>
+        <w:rFonts w:ascii="Wingdings" w:hAnsi="Wingdings" w:hint="default"/>
+      </w:rPr>
+    </w:lvl>
+    <w:lvl w:ilvl="6" w:tplc="040C0001" w:tentative="1">
+      <w:start w:val="1"/>
+      <w:numFmt w:val="bullet"/>
+      <w:lvlText w:val=""/>
+      <w:lvlJc w:val="left"/>
+      <w:pPr>
+        <w:ind w:left="6096" w:hanging="360"/>
+      </w:pPr>
+      <w:rPr>
+        <w:rFonts w:ascii="Symbol" w:hAnsi="Symbol" w:hint="default"/>
+      </w:rPr>
+    </w:lvl>
+    <w:lvl w:ilvl="7" w:tplc="040C0003" w:tentative="1">
+      <w:start w:val="1"/>
+      <w:numFmt w:val="bullet"/>
+      <w:lvlText w:val="o"/>
+      <w:lvlJc w:val="left"/>
+      <w:pPr>
+        <w:ind w:left="6816" w:hanging="360"/>
+      </w:pPr>
+      <w:rPr>
+        <w:rFonts w:ascii="Courier New" w:hAnsi="Courier New" w:cs="Courier New" w:hint="default"/>
+      </w:rPr>
+    </w:lvl>
+    <w:lvl w:ilvl="8" w:tplc="040C0005" w:tentative="1">
+      <w:start w:val="1"/>
+      <w:numFmt w:val="bullet"/>
+      <w:lvlText w:val=""/>
+      <w:lvlJc w:val="left"/>
+      <w:pPr>
+        <w:ind w:left="7536" w:hanging="360"/>
+      </w:pPr>
+      <w:rPr>
+        <w:rFonts w:ascii="Wingdings" w:hAnsi="Wingdings" w:hint="default"/>
+      </w:rPr>
+    </w:lvl>
+  </w:abstractNum>
+  <w:abstractNum w:abstractNumId="3" w15:restartNumberingAfterBreak="0">
     <w:nsid w:val="73363AE9"/>
     <w:multiLevelType w:val="hybridMultilevel"/>
     <w:tmpl w:val="658AFA96"/>
@@ -3488,7 +3010,7 @@
       </w:rPr>
     </w:lvl>
   </w:abstractNum>
-  <w:abstractNum w:abstractNumId="3" w15:restartNumberingAfterBreak="0">
+  <w:abstractNum w:abstractNumId="4" w15:restartNumberingAfterBreak="0">
     <w:nsid w:val="78866E53"/>
     <w:multiLevelType w:val="hybridMultilevel"/>
     <w:tmpl w:val="D376EF92"/>
@@ -3601,7 +3123,7 @@
     </w:lvl>
   </w:abstractNum>
   <w:num w:numId="1" w16cid:durableId="442846978">
-    <w:abstractNumId w:val="3"/>
+    <w:abstractNumId w:val="4"/>
   </w:num>
   <w:num w:numId="2" w16cid:durableId="1562013530">
     <w:abstractNumId w:val="1"/>
@@ -3610,6 +3132,9 @@
     <w:abstractNumId w:val="0"/>
   </w:num>
   <w:num w:numId="4" w16cid:durableId="588125985">
+    <w:abstractNumId w:val="3"/>
+  </w:num>
+  <w:num w:numId="5" w16cid:durableId="216859866">
     <w:abstractNumId w:val="2"/>
   </w:num>
 </w:numbering>
@@ -4215,6 +3740,7 @@
   <w:style w:type="character" w:default="1" w:styleId="Policepardfaut">
     <w:name w:val="Default Paragraph Font"/>
     <w:uiPriority w:val="1"/>
+    <w:semiHidden/>
     <w:unhideWhenUsed/>
   </w:style>
   <w:style w:type="table" w:default="1" w:styleId="TableauNormal">

</xml_diff>

<commit_message>
Modificactions Notes et script AFM
</commit_message>
<xml_diff>
--- a/doc/Notes.docx
+++ b/doc/Notes.docx
@@ -1499,7 +1499,93 @@
         <w:t>lan 1,2 </w:t>
       </w:r>
       <w:r>
-        <w:t>explique 41% de la variabilité</w:t>
+        <w:t xml:space="preserve">explique </w:t>
+      </w:r>
+      <w:r>
+        <w:t xml:space="preserve">56.6 </w:t>
+      </w:r>
+      <w:r>
+        <w:t>% de la variabilité</w:t>
+      </w:r>
+    </w:p>
+    <w:p>
+      <w:pPr>
+        <w:pStyle w:val="Sansinterligne"/>
+        <w:jc w:val="both"/>
+      </w:pPr>
+      <w:r>
+        <w:t xml:space="preserve">Les variables du groupes </w:t>
+      </w:r>
+      <w:r>
+        <w:t>« traits développementaux »</w:t>
+      </w:r>
+      <w:r>
+        <w:t xml:space="preserve"> sont corrélées aux dimensions 1 et 2 (0.84 et 0.55 respectivement). </w:t>
+      </w:r>
+    </w:p>
+    <w:p>
+      <w:pPr>
+        <w:pStyle w:val="Sansinterligne"/>
+        <w:jc w:val="both"/>
+      </w:pPr>
+      <w:r>
+        <w:t>Les variables du groupes « </w:t>
+      </w:r>
+      <w:r>
+        <w:t>t</w:t>
+      </w:r>
+      <w:r>
+        <w:t>raits physiologiques</w:t>
+      </w:r>
+      <w:r>
+        <w:t> » sont corrélées aux dimensions 1</w:t>
+      </w:r>
+      <w:r>
+        <w:t xml:space="preserve">, </w:t>
+      </w:r>
+      <w:r>
+        <w:t>2</w:t>
+      </w:r>
+      <w:r>
+        <w:t>, 3 et 4</w:t>
+      </w:r>
+      <w:r>
+        <w:t xml:space="preserve"> (0</w:t>
+      </w:r>
+      <w:r>
+        <w:t>.</w:t>
+      </w:r>
+      <w:r>
+        <w:t>8</w:t>
+      </w:r>
+      <w:r>
+        <w:t xml:space="preserve">, </w:t>
+      </w:r>
+      <w:r>
+        <w:t>0</w:t>
+      </w:r>
+      <w:r>
+        <w:t>.</w:t>
+      </w:r>
+      <w:r>
+        <w:t>6</w:t>
+      </w:r>
+      <w:proofErr w:type="gramStart"/>
+      <w:r>
+        <w:t xml:space="preserve">, </w:t>
+      </w:r>
+      <w:r>
+        <w:t xml:space="preserve"> </w:t>
+      </w:r>
+      <w:r>
+        <w:t>0.99</w:t>
+      </w:r>
+      <w:proofErr w:type="gramEnd"/>
+      <w:r>
+        <w:t xml:space="preserve"> et 0.99 </w:t>
+      </w:r>
+      <w:r>
+        <w:t xml:space="preserve">respectivement). </w:t>
       </w:r>
     </w:p>
     <w:p>
@@ -1529,13 +1615,468 @@
         <w:t xml:space="preserve">es deux groupes de variables sont localisés sur deux bissectrices différentes sur le graphe des variables. </w:t>
       </w:r>
       <w:r>
-        <w:t xml:space="preserve">La bissectrice du groupe « traits physiologique » permet de voir une forte corrélation entre les variables SNQ, TNQ, RDW, TDW, ADW et </w:t>
+        <w:t>La bissectrice du groupe « traits physiologique » permet de voir une forte corrélation entre les variables RDW, TDW, ADW</w:t>
+      </w:r>
+      <w:r>
+        <w:t>, LA</w:t>
+      </w:r>
+      <w:r>
+        <w:t xml:space="preserve"> et </w:t>
       </w:r>
       <w:r>
         <w:t>anti corrélé à la</w:t>
       </w:r>
       <w:r>
-        <w:t xml:space="preserve"> variables </w:t>
+        <w:t xml:space="preserve"> variables LA</w:t>
+      </w:r>
+      <w:r>
+        <w:t>R et SLA</w:t>
+      </w:r>
+      <w:r>
+        <w:t xml:space="preserve">. </w:t>
+      </w:r>
+      <w:r>
+        <w:t xml:space="preserve">La bissectrice du groupe « traits développementaux » </w:t>
+      </w:r>
+      <w:r>
+        <w:t xml:space="preserve">montre une forte corrélation entre les variables </w:t>
+      </w:r>
+      <w:proofErr w:type="spellStart"/>
+      <w:r>
+        <w:t>Sp</w:t>
+      </w:r>
+      <w:proofErr w:type="spellEnd"/>
+      <w:r>
+        <w:t xml:space="preserve"> et AUC et anti corrélé avec </w:t>
+      </w:r>
+      <w:r>
+        <w:t>SCA</w:t>
+      </w:r>
+      <w:r>
+        <w:t xml:space="preserve">. </w:t>
+      </w:r>
+    </w:p>
+    <w:p>
+      <w:pPr>
+        <w:pStyle w:val="Sansinterligne"/>
+        <w:jc w:val="both"/>
+      </w:pPr>
+      <w:r>
+        <w:t xml:space="preserve">Ce plan 1-2 représente principalement les différences entre les traits physiologiques et les traits développementaux. </w:t>
+      </w:r>
+    </w:p>
+    <w:p>
+      <w:pPr>
+        <w:pStyle w:val="Sansinterligne"/>
+        <w:jc w:val="both"/>
+      </w:pPr>
+      <w:r>
+        <w:lastRenderedPageBreak/>
+        <w:drawing>
+          <wp:inline distT="0" distB="0" distL="0" distR="0" wp14:anchorId="734A40A9" wp14:editId="11092520">
+            <wp:extent cx="5760720" cy="4427855"/>
+            <wp:effectExtent l="0" t="0" r="0" b="0"/>
+            <wp:docPr id="1178372218" name="Image 1"/>
+            <wp:cNvGraphicFramePr>
+              <a:graphicFrameLocks xmlns:a="http://schemas.openxmlformats.org/drawingml/2006/main" noChangeAspect="1"/>
+            </wp:cNvGraphicFramePr>
+            <a:graphic xmlns:a="http://schemas.openxmlformats.org/drawingml/2006/main">
+              <a:graphicData uri="http://schemas.openxmlformats.org/drawingml/2006/picture">
+                <pic:pic xmlns:pic="http://schemas.openxmlformats.org/drawingml/2006/picture">
+                  <pic:nvPicPr>
+                    <pic:cNvPr id="1178372218" name=""/>
+                    <pic:cNvPicPr/>
+                  </pic:nvPicPr>
+                  <pic:blipFill>
+                    <a:blip r:embed="rId5"/>
+                    <a:stretch>
+                      <a:fillRect/>
+                    </a:stretch>
+                  </pic:blipFill>
+                  <pic:spPr>
+                    <a:xfrm>
+                      <a:off x="0" y="0"/>
+                      <a:ext cx="5760720" cy="4427855"/>
+                    </a:xfrm>
+                    <a:prstGeom prst="rect">
+                      <a:avLst/>
+                    </a:prstGeom>
+                  </pic:spPr>
+                </pic:pic>
+              </a:graphicData>
+            </a:graphic>
+          </wp:inline>
+        </w:drawing>
+      </w:r>
+    </w:p>
+    <w:p>
+      <w:pPr>
+        <w:pStyle w:val="Sansinterligne"/>
+        <w:jc w:val="both"/>
+      </w:pPr>
+    </w:p>
+    <w:p>
+      <w:pPr>
+        <w:pStyle w:val="Sansinterligne"/>
+        <w:jc w:val="both"/>
+      </w:pPr>
+      <w:r>
+        <w:t xml:space="preserve">Sur le plan 3-4, on observe </w:t>
+      </w:r>
+      <w:r>
+        <w:t>que les variables des traits physiologiques sont dirigées à droite du cercle des corrélations. U</w:t>
+      </w:r>
+      <w:r>
+        <w:t>ne forte corrélation entre les variables SR, LWR et SNU</w:t>
+      </w:r>
+      <w:r>
+        <w:t xml:space="preserve"> d’une part et une forte corrélation entre les variables LASNQ, SLA, LAR, </w:t>
+      </w:r>
+      <w:proofErr w:type="spellStart"/>
+      <w:r>
+        <w:t>NUtE_tot</w:t>
+      </w:r>
+      <w:proofErr w:type="spellEnd"/>
+      <w:r>
+        <w:t> </w:t>
+      </w:r>
+      <w:r>
+        <w:t xml:space="preserve">et </w:t>
+      </w:r>
+      <w:proofErr w:type="spellStart"/>
+      <w:r>
+        <w:t>NUtE_ae</w:t>
+      </w:r>
+      <w:r>
+        <w:t>r</w:t>
+      </w:r>
+      <w:proofErr w:type="spellEnd"/>
+      <w:r>
+        <w:t xml:space="preserve"> d’autre part. </w:t>
+      </w:r>
+    </w:p>
+    <w:p>
+      <w:pPr>
+        <w:pStyle w:val="Sansinterligne"/>
+        <w:jc w:val="both"/>
+      </w:pPr>
+      <w:r>
+        <w:t xml:space="preserve">Ce plan 3-4 représente donc des différences dans les variables des traits physiologiques. </w:t>
+      </w:r>
+    </w:p>
+    <w:p>
+      <w:pPr>
+        <w:pStyle w:val="Sansinterligne"/>
+        <w:jc w:val="both"/>
+      </w:pPr>
+    </w:p>
+    <w:p>
+      <w:pPr>
+        <w:pStyle w:val="Sansinterligne"/>
+        <w:jc w:val="both"/>
+      </w:pPr>
+      <w:r>
+        <w:lastRenderedPageBreak/>
+        <w:drawing>
+          <wp:inline distT="0" distB="0" distL="0" distR="0" wp14:anchorId="2390CD2B" wp14:editId="5D96848C">
+            <wp:extent cx="5760720" cy="4335145"/>
+            <wp:effectExtent l="0" t="0" r="0" b="8255"/>
+            <wp:docPr id="1833679288" name="Image 1"/>
+            <wp:cNvGraphicFramePr>
+              <a:graphicFrameLocks xmlns:a="http://schemas.openxmlformats.org/drawingml/2006/main" noChangeAspect="1"/>
+            </wp:cNvGraphicFramePr>
+            <a:graphic xmlns:a="http://schemas.openxmlformats.org/drawingml/2006/main">
+              <a:graphicData uri="http://schemas.openxmlformats.org/drawingml/2006/picture">
+                <pic:pic xmlns:pic="http://schemas.openxmlformats.org/drawingml/2006/picture">
+                  <pic:nvPicPr>
+                    <pic:cNvPr id="1833679288" name=""/>
+                    <pic:cNvPicPr/>
+                  </pic:nvPicPr>
+                  <pic:blipFill>
+                    <a:blip r:embed="rId6"/>
+                    <a:stretch>
+                      <a:fillRect/>
+                    </a:stretch>
+                  </pic:blipFill>
+                  <pic:spPr>
+                    <a:xfrm>
+                      <a:off x="0" y="0"/>
+                      <a:ext cx="5760720" cy="4335145"/>
+                    </a:xfrm>
+                    <a:prstGeom prst="rect">
+                      <a:avLst/>
+                    </a:prstGeom>
+                  </pic:spPr>
+                </pic:pic>
+              </a:graphicData>
+            </a:graphic>
+          </wp:inline>
+        </w:drawing>
+      </w:r>
+    </w:p>
+    <w:p>
+      <w:pPr>
+        <w:pStyle w:val="Sansinterligne"/>
+        <w:jc w:val="both"/>
+      </w:pPr>
+    </w:p>
+    <w:p>
+      <w:pPr>
+        <w:pStyle w:val="Sansinterligne"/>
+        <w:jc w:val="both"/>
+      </w:pPr>
+      <w:r>
+        <w:t xml:space="preserve">Concernant les </w:t>
+      </w:r>
+      <w:r>
+        <w:t>individus</w:t>
+      </w:r>
+      <w:r>
+        <w:t> :</w:t>
+      </w:r>
+    </w:p>
+    <w:p>
+      <w:pPr>
+        <w:pStyle w:val="Sansinterligne"/>
+        <w:jc w:val="both"/>
+      </w:pPr>
+      <w:r>
+        <w:t>Sur le plan 1-2, l</w:t>
+      </w:r>
+      <w:r>
+        <w:t xml:space="preserve">es individus ayant de fortes coordonnées sur les axes correspondent à des individus prenant des valeurs </w:t>
+      </w:r>
+      <w:r>
+        <w:t>sur un des</w:t>
+      </w:r>
+      <w:r>
+        <w:t xml:space="preserve"> groupes de variables </w:t>
+      </w:r>
+      <w:r>
+        <w:t>« traits physiologique »</w:t>
+      </w:r>
+      <w:r>
+        <w:t xml:space="preserve"> </w:t>
+      </w:r>
+      <w:r>
+        <w:t>ou</w:t>
+      </w:r>
+      <w:r>
+        <w:t xml:space="preserve"> </w:t>
+      </w:r>
+      <w:r>
+        <w:t>« traits développementaux »</w:t>
+      </w:r>
+      <w:r>
+        <w:t xml:space="preserve">. </w:t>
+      </w:r>
+      <w:r>
+        <w:t xml:space="preserve"> Ces individus ont donc des traits physiologiques ou développementaux particulier. </w:t>
+      </w:r>
+    </w:p>
+    <w:p>
+      <w:pPr>
+        <w:pStyle w:val="Sansinterligne"/>
+        <w:jc w:val="both"/>
+      </w:pPr>
+    </w:p>
+    <w:p>
+      <w:pPr>
+        <w:pStyle w:val="Sansinterligne"/>
+        <w:jc w:val="both"/>
+      </w:pPr>
+      <w:r>
+        <w:t>Par exemple :</w:t>
+      </w:r>
+    </w:p>
+    <w:p>
+      <w:pPr>
+        <w:pStyle w:val="Sansinterligne"/>
+        <w:jc w:val="both"/>
+      </w:pPr>
+      <w:r>
+        <w:t xml:space="preserve">La variété </w:t>
+      </w:r>
+      <w:proofErr w:type="spellStart"/>
+      <w:r>
+        <w:t>Navig</w:t>
+      </w:r>
+      <w:proofErr w:type="spellEnd"/>
+      <w:r>
+        <w:t xml:space="preserve"> 176 prend des valeurs soit très forte, soit très petite sur les variables des traits physiologique et des valeurs moyennes sur les variables des traits développementaux. </w:t>
+      </w:r>
+    </w:p>
+    <w:p>
+      <w:pPr>
+        <w:pStyle w:val="Sansinterligne"/>
+        <w:jc w:val="both"/>
+        <w:rPr>
+          <w:u w:val="single"/>
+        </w:rPr>
+      </w:pPr>
+    </w:p>
+    <w:p>
+      <w:pPr>
+        <w:pStyle w:val="Sansinterligne"/>
+        <w:jc w:val="both"/>
+      </w:pPr>
+      <w:r>
+        <w:t>L</w:t>
+      </w:r>
+      <w:r>
+        <w:t xml:space="preserve">a variété </w:t>
+      </w:r>
+      <w:proofErr w:type="spellStart"/>
+      <w:r>
+        <w:t>Navig</w:t>
+      </w:r>
+      <w:proofErr w:type="spellEnd"/>
+      <w:r>
+        <w:t xml:space="preserve"> 159 prend des valeurs soit très forte, soit très petite sur les variables des traits développementaux et des valeurs moyennes sur les variables des traits physiologique.</w:t>
+      </w:r>
+    </w:p>
+    <w:p>
+      <w:pPr>
+        <w:pStyle w:val="Sansinterligne"/>
+        <w:jc w:val="both"/>
+      </w:pPr>
+    </w:p>
+    <w:p>
+      <w:pPr>
+        <w:pStyle w:val="Sansinterligne"/>
+        <w:jc w:val="both"/>
+      </w:pPr>
+      <w:r>
+        <w:lastRenderedPageBreak/>
+        <w:drawing>
+          <wp:inline distT="0" distB="0" distL="0" distR="0" wp14:anchorId="0738E02B" wp14:editId="2BFC8818">
+            <wp:extent cx="5759746" cy="4743694"/>
+            <wp:effectExtent l="0" t="0" r="0" b="0"/>
+            <wp:docPr id="257294629" name="Image 1"/>
+            <wp:cNvGraphicFramePr>
+              <a:graphicFrameLocks xmlns:a="http://schemas.openxmlformats.org/drawingml/2006/main" noChangeAspect="1"/>
+            </wp:cNvGraphicFramePr>
+            <a:graphic xmlns:a="http://schemas.openxmlformats.org/drawingml/2006/main">
+              <a:graphicData uri="http://schemas.openxmlformats.org/drawingml/2006/picture">
+                <pic:pic xmlns:pic="http://schemas.openxmlformats.org/drawingml/2006/picture">
+                  <pic:nvPicPr>
+                    <pic:cNvPr id="257294629" name=""/>
+                    <pic:cNvPicPr/>
+                  </pic:nvPicPr>
+                  <pic:blipFill>
+                    <a:blip r:embed="rId7"/>
+                    <a:stretch>
+                      <a:fillRect/>
+                    </a:stretch>
+                  </pic:blipFill>
+                  <pic:spPr>
+                    <a:xfrm>
+                      <a:off x="0" y="0"/>
+                      <a:ext cx="5759746" cy="4743694"/>
+                    </a:xfrm>
+                    <a:prstGeom prst="rect">
+                      <a:avLst/>
+                    </a:prstGeom>
+                  </pic:spPr>
+                </pic:pic>
+              </a:graphicData>
+            </a:graphic>
+          </wp:inline>
+        </w:drawing>
+      </w:r>
+    </w:p>
+    <w:p>
+      <w:pPr>
+        <w:pStyle w:val="Sansinterligne"/>
+        <w:jc w:val="both"/>
+      </w:pPr>
+    </w:p>
+    <w:p>
+      <w:pPr>
+        <w:pStyle w:val="Sansinterligne"/>
+        <w:jc w:val="both"/>
+      </w:pPr>
+      <w:r>
+        <w:t xml:space="preserve">Sur le plan 3-4, les individus ayant de fortes coordonnées sur les axes sont des variétés prenant des valeurs extrêmes soit pour les variables SR, LWR et SNU, soit pour les variables LASNQ, SLA, LAR, </w:t>
+      </w:r>
+      <w:proofErr w:type="spellStart"/>
+      <w:r>
+        <w:t>NUtE_tot</w:t>
+      </w:r>
+      <w:proofErr w:type="spellEnd"/>
+      <w:r>
+        <w:t xml:space="preserve"> et </w:t>
+      </w:r>
+      <w:proofErr w:type="spellStart"/>
+      <w:r>
+        <w:t>NUtE_ae</w:t>
+      </w:r>
+      <w:r>
+        <w:t>r</w:t>
+      </w:r>
+      <w:proofErr w:type="spellEnd"/>
+      <w:r>
+        <w:t xml:space="preserve">. </w:t>
+      </w:r>
+    </w:p>
+    <w:p>
+      <w:pPr>
+        <w:pStyle w:val="Sansinterligne"/>
+        <w:jc w:val="both"/>
+      </w:pPr>
+    </w:p>
+    <w:p>
+      <w:pPr>
+        <w:pStyle w:val="Sansinterligne"/>
+        <w:jc w:val="both"/>
+        <w:rPr>
+          <w:u w:val="single"/>
+        </w:rPr>
+      </w:pPr>
+      <w:r>
+        <w:rPr>
+          <w:u w:val="single"/>
+        </w:rPr>
+        <w:t>AFM avec le type en variable supplémentaire</w:t>
+      </w:r>
+    </w:p>
+    <w:p>
+      <w:pPr>
+        <w:pStyle w:val="Sansinterligne"/>
+        <w:jc w:val="both"/>
+      </w:pPr>
+      <w:r>
+        <w:t>L</w:t>
+      </w:r>
+      <w:r>
+        <w:t xml:space="preserve">e type SORS regroupe des variétés </w:t>
+      </w:r>
+      <w:r>
+        <w:t xml:space="preserve">prenant des valeurs moyennes ou extrêmes pour les variables des traits développementaux et physiologiques. Le type WOSR regroupe des variétés prenant des valeurs moyennes </w:t>
+      </w:r>
+      <w:r>
+        <w:t>pour les variables des traits développementaux et physiologiques</w:t>
+      </w:r>
+      <w:r>
+        <w:t xml:space="preserve">. </w:t>
+      </w:r>
+      <w:r>
+        <w:t>Le type WFR, regroupe des variété</w:t>
+      </w:r>
+      <w:r>
+        <w:t>s</w:t>
+      </w:r>
+      <w:r>
+        <w:t xml:space="preserve"> </w:t>
+      </w:r>
+      <w:r>
+        <w:t xml:space="preserve">prenant de fortes valeurs pour les variables </w:t>
+      </w:r>
+      <w:r>
+        <w:t>RDW, TDW, ADW</w:t>
+      </w:r>
+      <w:r>
+        <w:t xml:space="preserve"> et </w:t>
       </w:r>
       <w:proofErr w:type="gramStart"/>
       <w:r>
@@ -1545,193 +2086,56 @@
       <w:r>
         <w:t xml:space="preserve">. </w:t>
       </w:r>
-      <w:r>
-        <w:t xml:space="preserve">La bissectrice du groupe « traits développementaux » </w:t>
-      </w:r>
-      <w:r>
-        <w:t xml:space="preserve">montre une forte corrélation entre les variables </w:t>
-      </w:r>
-      <w:proofErr w:type="spellStart"/>
-      <w:r>
-        <w:t>Sp</w:t>
-      </w:r>
-      <w:proofErr w:type="spellEnd"/>
-      <w:r>
-        <w:t xml:space="preserve"> et AUC_L3_L4 et anti corrélé avec AUC_L1_L4. </w:t>
-      </w:r>
-    </w:p>
-    <w:p>
-      <w:pPr>
-        <w:pStyle w:val="Sansinterligne"/>
-        <w:jc w:val="both"/>
-      </w:pPr>
-    </w:p>
-    <w:p>
-      <w:pPr>
-        <w:pStyle w:val="Sansinterligne"/>
-        <w:jc w:val="both"/>
-      </w:pPr>
-      <w:r>
-        <w:t xml:space="preserve">Sur le plan 3-4, on observe une forte corrélation entre les variables SR, LWR et SNU. </w:t>
-      </w:r>
-    </w:p>
-    <w:p>
-      <w:pPr>
-        <w:pStyle w:val="Sansinterligne"/>
-        <w:jc w:val="both"/>
-      </w:pPr>
-    </w:p>
-    <w:p>
-      <w:pPr>
-        <w:pStyle w:val="Sansinterligne"/>
-        <w:jc w:val="both"/>
-      </w:pPr>
-      <w:r>
-        <w:t xml:space="preserve">Concernant les </w:t>
-      </w:r>
-      <w:r>
-        <w:t>individus</w:t>
-      </w:r>
-      <w:r>
-        <w:t> :</w:t>
-      </w:r>
-    </w:p>
-    <w:p>
-      <w:pPr>
-        <w:pStyle w:val="Sansinterligne"/>
-        <w:jc w:val="both"/>
-      </w:pPr>
-      <w:r>
-        <w:t xml:space="preserve">Les individus ayant de fortes coordonnées sur les axes correspondent à des individus prenant des valeurs </w:t>
-      </w:r>
-      <w:r>
-        <w:t>sur un des</w:t>
-      </w:r>
-      <w:r>
-        <w:t xml:space="preserve"> groupes de variables </w:t>
-      </w:r>
-      <w:r>
-        <w:t>« traits physiologique »</w:t>
-      </w:r>
-      <w:r>
-        <w:t xml:space="preserve"> </w:t>
-      </w:r>
-      <w:r>
-        <w:t>ou</w:t>
-      </w:r>
-      <w:r>
-        <w:t xml:space="preserve"> </w:t>
-      </w:r>
-      <w:r>
-        <w:t xml:space="preserve">« traits </w:t>
-      </w:r>
+    </w:p>
+    <w:p>
+      <w:pPr>
+        <w:pStyle w:val="Sansinterligne"/>
+        <w:jc w:val="both"/>
+      </w:pPr>
+    </w:p>
+    <w:p>
+      <w:pPr>
+        <w:pStyle w:val="Sansinterligne"/>
+        <w:jc w:val="both"/>
+      </w:pPr>
       <w:r>
         <w:lastRenderedPageBreak/>
-        <w:t>développementaux »</w:t>
-      </w:r>
-      <w:r>
-        <w:t xml:space="preserve">. </w:t>
-      </w:r>
-      <w:r>
-        <w:t xml:space="preserve"> Ces individus ont donc des traits physiologiques ou développementaux particulier. </w:t>
-      </w:r>
-    </w:p>
-    <w:p>
-      <w:pPr>
-        <w:pStyle w:val="Sansinterligne"/>
-        <w:jc w:val="both"/>
-      </w:pPr>
-    </w:p>
-    <w:p>
-      <w:pPr>
-        <w:pStyle w:val="Sansinterligne"/>
-        <w:jc w:val="both"/>
-      </w:pPr>
-      <w:r>
-        <w:t>Par exemple</w:t>
-      </w:r>
-      <w:r>
-        <w:t> :</w:t>
-      </w:r>
-    </w:p>
-    <w:p>
-      <w:pPr>
-        <w:pStyle w:val="Sansinterligne"/>
-        <w:jc w:val="both"/>
-      </w:pPr>
-      <w:r>
-        <w:t>L</w:t>
-      </w:r>
-      <w:r>
-        <w:t xml:space="preserve">a variété </w:t>
-      </w:r>
-      <w:proofErr w:type="spellStart"/>
-      <w:r>
-        <w:t>Navig</w:t>
-      </w:r>
-      <w:proofErr w:type="spellEnd"/>
-      <w:r>
-        <w:t xml:space="preserve"> 176 </w:t>
-      </w:r>
-      <w:r>
-        <w:t xml:space="preserve">prend des valeurs soit très forte, soit très petite sur les variables des </w:t>
-      </w:r>
-      <w:r>
-        <w:t>traits physiologique </w:t>
-      </w:r>
-      <w:r>
-        <w:t xml:space="preserve">et des valeurs moyennes sur les variables des </w:t>
-      </w:r>
-      <w:r>
-        <w:t>traits développementaux</w:t>
-      </w:r>
-      <w:r>
-        <w:t xml:space="preserve">. </w:t>
-      </w:r>
-    </w:p>
-    <w:p>
-      <w:pPr>
-        <w:pStyle w:val="Sansinterligne"/>
-        <w:jc w:val="both"/>
-        <w:rPr>
-          <w:u w:val="single"/>
-        </w:rPr>
-      </w:pPr>
-    </w:p>
-    <w:p>
-      <w:pPr>
-        <w:pStyle w:val="Sansinterligne"/>
-        <w:jc w:val="both"/>
-      </w:pPr>
-      <w:r>
-        <w:t>L</w:t>
-      </w:r>
-      <w:r>
-        <w:t xml:space="preserve">a variété </w:t>
-      </w:r>
-      <w:proofErr w:type="spellStart"/>
-      <w:r>
-        <w:t>Navig</w:t>
-      </w:r>
-      <w:proofErr w:type="spellEnd"/>
-      <w:r>
-        <w:t xml:space="preserve"> 159 </w:t>
-      </w:r>
-      <w:r>
-        <w:t>prend des valeurs soit très forte, soit très petite sur les variables des traits développementaux et des valeurs moyennes sur les variables des traits</w:t>
-      </w:r>
-      <w:r>
-        <w:t xml:space="preserve"> </w:t>
-      </w:r>
-      <w:r>
-        <w:t>physiologique.</w:t>
-      </w:r>
-    </w:p>
-    <w:p>
-      <w:pPr>
-        <w:pStyle w:val="Sansinterligne"/>
-        <w:jc w:val="both"/>
-      </w:pPr>
+        <w:drawing>
+          <wp:inline distT="0" distB="0" distL="0" distR="0" wp14:anchorId="1A332727" wp14:editId="3771D12B">
+            <wp:extent cx="5397777" cy="4121362"/>
+            <wp:effectExtent l="0" t="0" r="0" b="0"/>
+            <wp:docPr id="463913720" name="Image 1"/>
+            <wp:cNvGraphicFramePr>
+              <a:graphicFrameLocks xmlns:a="http://schemas.openxmlformats.org/drawingml/2006/main" noChangeAspect="1"/>
+            </wp:cNvGraphicFramePr>
+            <a:graphic xmlns:a="http://schemas.openxmlformats.org/drawingml/2006/main">
+              <a:graphicData uri="http://schemas.openxmlformats.org/drawingml/2006/picture">
+                <pic:pic xmlns:pic="http://schemas.openxmlformats.org/drawingml/2006/picture">
+                  <pic:nvPicPr>
+                    <pic:cNvPr id="463913720" name=""/>
+                    <pic:cNvPicPr/>
+                  </pic:nvPicPr>
+                  <pic:blipFill>
+                    <a:blip r:embed="rId8"/>
+                    <a:stretch>
+                      <a:fillRect/>
+                    </a:stretch>
+                  </pic:blipFill>
+                  <pic:spPr>
+                    <a:xfrm>
+                      <a:off x="0" y="0"/>
+                      <a:ext cx="5397777" cy="4121362"/>
+                    </a:xfrm>
+                    <a:prstGeom prst="rect">
+                      <a:avLst/>
+                    </a:prstGeom>
+                  </pic:spPr>
+                </pic:pic>
+              </a:graphicData>
+            </a:graphic>
+          </wp:inline>
+        </w:drawing>
+      </w:r>
     </w:p>
     <w:p>
       <w:pPr>
@@ -1901,6 +2305,7 @@
         <w:pStyle w:val="Titre2"/>
       </w:pPr>
       <w:r>
+        <w:lastRenderedPageBreak/>
         <w:t>Questions de recherche</w:t>
       </w:r>
     </w:p>
@@ -1992,7 +2397,6 @@
         <w:pStyle w:val="Titre2"/>
       </w:pPr>
       <w:r>
-        <w:lastRenderedPageBreak/>
         <w:t>Bibliographie</w:t>
       </w:r>
     </w:p>
@@ -2490,36 +2894,433 @@
         <w:rPr>
           <w:rFonts w:cstheme="minorHAnsi"/>
         </w:rPr>
+        <w:br/>
+      </w:r>
+      <w:proofErr w:type="spellStart"/>
+      <w:r>
+        <w:rPr>
+          <w:rFonts w:cstheme="minorHAnsi"/>
+        </w:rPr>
+        <w:t>Growth</w:t>
+      </w:r>
+      <w:proofErr w:type="spellEnd"/>
+      <w:r>
+        <w:rPr>
+          <w:rFonts w:cstheme="minorHAnsi"/>
+        </w:rPr>
+        <w:t xml:space="preserve"> </w:t>
+      </w:r>
+      <w:proofErr w:type="spellStart"/>
+      <w:r>
+        <w:rPr>
+          <w:rFonts w:cstheme="minorHAnsi"/>
+        </w:rPr>
+        <w:t>season</w:t>
+      </w:r>
+      <w:proofErr w:type="spellEnd"/>
+      <w:r>
+        <w:rPr>
+          <w:rFonts w:cstheme="minorHAnsi"/>
+        </w:rPr>
+        <w:t>: Saison de croissance (2014-2015; 2015-2016; 2016-2017).</w:t>
+      </w:r>
+    </w:p>
+    <w:p>
+      <w:pPr>
+        <w:spacing w:line="240" w:lineRule="auto"/>
+        <w:jc w:val="both"/>
+        <w:rPr>
+          <w:rFonts w:cstheme="minorHAnsi"/>
+        </w:rPr>
+      </w:pPr>
+      <w:r>
+        <w:rPr>
+          <w:rFonts w:cstheme="minorHAnsi"/>
+        </w:rPr>
+        <w:br/>
+      </w:r>
+      <w:proofErr w:type="spellStart"/>
+      <w:r>
+        <w:rPr>
+          <w:rFonts w:cstheme="minorHAnsi"/>
+        </w:rPr>
+        <w:t>Growth</w:t>
+      </w:r>
+      <w:proofErr w:type="spellEnd"/>
+      <w:r>
+        <w:rPr>
+          <w:rFonts w:cstheme="minorHAnsi"/>
+        </w:rPr>
+        <w:t xml:space="preserve"> condition: Conditions de culture soit en champs soit en tunnel </w:t>
+      </w:r>
+    </w:p>
+    <w:p>
+      <w:pPr>
+        <w:spacing w:line="240" w:lineRule="auto"/>
+        <w:jc w:val="both"/>
+        <w:rPr>
+          <w:rFonts w:cstheme="minorHAnsi"/>
+        </w:rPr>
+      </w:pPr>
+      <w:r>
+        <w:rPr>
+          <w:rFonts w:cstheme="minorHAnsi"/>
+        </w:rPr>
+        <w:br/>
+        <w:t xml:space="preserve">N </w:t>
+      </w:r>
+      <w:proofErr w:type="spellStart"/>
+      <w:r>
+        <w:rPr>
+          <w:rFonts w:cstheme="minorHAnsi"/>
+        </w:rPr>
+        <w:t>regime</w:t>
+      </w:r>
+      <w:proofErr w:type="spellEnd"/>
+      <w:r>
+        <w:rPr>
+          <w:rFonts w:cstheme="minorHAnsi"/>
+        </w:rPr>
+        <w:t xml:space="preserve">: Fertilisation azoté apporté au stade de monté en graine. N+ désigne des apports azotés optimaux pour atteindre un </w:t>
+      </w:r>
+      <w:r>
+        <w:rPr>
+          <w:rFonts w:cstheme="minorHAnsi"/>
+        </w:rPr>
+        <w:t>rendement</w:t>
+      </w:r>
+      <w:r>
+        <w:rPr>
+          <w:rFonts w:cstheme="minorHAnsi"/>
+        </w:rPr>
+        <w:t xml:space="preserve"> de 3.5 t.ha-1 de graine de colza. N- désigne un apport sous-optimal de  80-100 kg.ha-1 d'azote</w:t>
+      </w:r>
+    </w:p>
+    <w:p>
+      <w:pPr>
+        <w:spacing w:line="240" w:lineRule="auto"/>
+        <w:jc w:val="both"/>
+        <w:rPr>
+          <w:rFonts w:cstheme="minorHAnsi"/>
+        </w:rPr>
+      </w:pPr>
+      <w:r>
+        <w:rPr>
+          <w:rFonts w:cstheme="minorHAnsi"/>
+        </w:rPr>
+        <w:br/>
+        <w:t xml:space="preserve">W </w:t>
+      </w:r>
+      <w:proofErr w:type="spellStart"/>
+      <w:r>
+        <w:rPr>
+          <w:rFonts w:cstheme="minorHAnsi"/>
+        </w:rPr>
+        <w:t>regime</w:t>
+      </w:r>
+      <w:proofErr w:type="spellEnd"/>
+      <w:r>
+        <w:rPr>
+          <w:rFonts w:cstheme="minorHAnsi"/>
+        </w:rPr>
+        <w:t xml:space="preserve">: Apports en eau </w:t>
+      </w:r>
+      <w:proofErr w:type="spellStart"/>
+      <w:r>
+        <w:rPr>
+          <w:rFonts w:cstheme="minorHAnsi"/>
+        </w:rPr>
+        <w:t>a</w:t>
+      </w:r>
+      <w:proofErr w:type="spellEnd"/>
+      <w:r>
+        <w:rPr>
+          <w:rFonts w:cstheme="minorHAnsi"/>
+        </w:rPr>
+        <w:t xml:space="preserve"> partir du stade de floraison. W+ indique un apport en eau optimal avec un potentiel en eau du substrat de -200 mbar. W- correspond à un apport en eau sous-optimal avec un potentiel en eau du substrat de -600 mbar. </w:t>
+      </w:r>
+    </w:p>
+    <w:p>
+      <w:pPr>
+        <w:spacing w:line="240" w:lineRule="auto"/>
+        <w:jc w:val="both"/>
+        <w:rPr>
+          <w:rFonts w:cstheme="minorHAnsi"/>
+        </w:rPr>
+      </w:pPr>
+      <w:r>
+        <w:rPr>
+          <w:rFonts w:cstheme="minorHAnsi"/>
+        </w:rPr>
+        <w:br/>
+        <w:t>Tissue: Tissus végétaux d'</w:t>
+      </w:r>
+      <w:proofErr w:type="spellStart"/>
+      <w:r>
+        <w:rPr>
+          <w:rFonts w:cstheme="minorHAnsi"/>
+        </w:rPr>
+        <w:t>ou</w:t>
+      </w:r>
+      <w:proofErr w:type="spellEnd"/>
+      <w:r>
+        <w:rPr>
+          <w:rFonts w:cstheme="minorHAnsi"/>
+        </w:rPr>
+        <w:t xml:space="preserve"> proviennent les échantillons dont les racines, les feuilles, les tiges, les fleurs et les gousses de graines.</w:t>
+      </w:r>
+    </w:p>
+    <w:p>
+      <w:pPr>
+        <w:spacing w:line="240" w:lineRule="auto"/>
+        <w:jc w:val="both"/>
+        <w:rPr>
+          <w:rFonts w:cstheme="minorHAnsi"/>
+        </w:rPr>
+      </w:pPr>
+      <w:r>
+        <w:rPr>
+          <w:rFonts w:cstheme="minorHAnsi"/>
+        </w:rPr>
+        <w:br/>
+        <w:t xml:space="preserve">BBCH dev. Stage: Stade de </w:t>
+      </w:r>
+      <w:r>
+        <w:rPr>
+          <w:rFonts w:cstheme="minorHAnsi"/>
+        </w:rPr>
+        <w:t>développement</w:t>
+      </w:r>
+      <w:r>
+        <w:rPr>
+          <w:rFonts w:cstheme="minorHAnsi"/>
+        </w:rPr>
+        <w:t xml:space="preserve"> d'</w:t>
+      </w:r>
+      <w:proofErr w:type="spellStart"/>
+      <w:r>
+        <w:rPr>
+          <w:rFonts w:cstheme="minorHAnsi"/>
+        </w:rPr>
+        <w:t>ou</w:t>
+      </w:r>
+      <w:proofErr w:type="spellEnd"/>
+      <w:r>
+        <w:rPr>
+          <w:rFonts w:cstheme="minorHAnsi"/>
+        </w:rPr>
+        <w:t xml:space="preserve"> </w:t>
+      </w:r>
+      <w:proofErr w:type="spellStart"/>
+      <w:r>
+        <w:rPr>
+          <w:rFonts w:cstheme="minorHAnsi"/>
+        </w:rPr>
+        <w:t>on</w:t>
+      </w:r>
+      <w:proofErr w:type="spellEnd"/>
+      <w:r>
+        <w:rPr>
+          <w:rFonts w:cstheme="minorHAnsi"/>
+        </w:rPr>
+        <w:t xml:space="preserve"> été prélevés les échantillons. </w:t>
+      </w:r>
+    </w:p>
+    <w:p>
+      <w:pPr>
+        <w:spacing w:line="240" w:lineRule="auto"/>
+        <w:jc w:val="both"/>
+        <w:rPr>
+          <w:rFonts w:cstheme="minorHAnsi"/>
+        </w:rPr>
+      </w:pPr>
+      <w:r>
+        <w:rPr>
+          <w:rFonts w:cstheme="minorHAnsi"/>
+        </w:rPr>
+        <w:t>15-19 stage = Plante possédant les 5 à 9 feuilles</w:t>
+      </w:r>
+    </w:p>
+    <w:p>
+      <w:pPr>
+        <w:spacing w:line="240" w:lineRule="auto"/>
+        <w:jc w:val="both"/>
+        <w:rPr>
+          <w:rFonts w:cstheme="minorHAnsi"/>
+        </w:rPr>
+      </w:pPr>
+      <w:r>
+        <w:rPr>
+          <w:rFonts w:cstheme="minorHAnsi"/>
+        </w:rPr>
+        <w:t xml:space="preserve">31-35 stage = Stade de montée en graine, la plante montre 1 à 5 </w:t>
+      </w:r>
+      <w:r>
+        <w:rPr>
+          <w:rFonts w:cstheme="minorHAnsi"/>
+        </w:rPr>
+        <w:t>entrenœuds</w:t>
+      </w:r>
+    </w:p>
+    <w:p>
+      <w:pPr>
+        <w:spacing w:line="240" w:lineRule="auto"/>
+        <w:jc w:val="both"/>
+        <w:rPr>
+          <w:rFonts w:cstheme="minorHAnsi"/>
+        </w:rPr>
+      </w:pPr>
+      <w:r>
+        <w:rPr>
+          <w:rFonts w:cstheme="minorHAnsi"/>
+        </w:rPr>
+        <w:t>55-59 stage = Production de l'inflorescence principale</w:t>
+      </w:r>
+    </w:p>
+    <w:p>
+      <w:pPr>
+        <w:spacing w:line="240" w:lineRule="auto"/>
+        <w:jc w:val="both"/>
+        <w:rPr>
+          <w:rFonts w:cstheme="minorHAnsi"/>
+        </w:rPr>
+      </w:pPr>
+      <w:r>
+        <w:rPr>
+          <w:rFonts w:cstheme="minorHAnsi"/>
+        </w:rPr>
+        <w:t>61-65 stage = Stade de floraison</w:t>
+      </w:r>
+    </w:p>
+    <w:p>
+      <w:pPr>
+        <w:spacing w:line="240" w:lineRule="auto"/>
+        <w:jc w:val="both"/>
+        <w:rPr>
+          <w:rFonts w:cstheme="minorHAnsi"/>
+        </w:rPr>
+      </w:pPr>
+      <w:r>
+        <w:rPr>
+          <w:rFonts w:cstheme="minorHAnsi"/>
+        </w:rPr>
+        <w:t xml:space="preserve">70-75 stage = </w:t>
+      </w:r>
+      <w:r>
+        <w:rPr>
+          <w:rFonts w:cstheme="minorHAnsi"/>
+        </w:rPr>
+        <w:t>Développement</w:t>
+      </w:r>
+      <w:r>
+        <w:rPr>
+          <w:rFonts w:cstheme="minorHAnsi"/>
+        </w:rPr>
+        <w:t xml:space="preserve"> des graines</w:t>
+      </w:r>
+    </w:p>
+    <w:p>
+      <w:pPr>
+        <w:spacing w:line="240" w:lineRule="auto"/>
+        <w:jc w:val="both"/>
+        <w:rPr>
+          <w:rFonts w:cstheme="minorHAnsi"/>
+        </w:rPr>
+      </w:pPr>
+      <w:r>
+        <w:rPr>
+          <w:rFonts w:cstheme="minorHAnsi"/>
+        </w:rPr>
+        <w:t>79-85 stage = Maturation des graines</w:t>
+      </w:r>
+    </w:p>
+    <w:p>
+      <w:pPr>
+        <w:spacing w:line="240" w:lineRule="auto"/>
+        <w:jc w:val="both"/>
+        <w:rPr>
+          <w:rFonts w:cstheme="minorHAnsi"/>
+        </w:rPr>
+      </w:pPr>
+      <w:r>
+        <w:rPr>
+          <w:rFonts w:cstheme="minorHAnsi"/>
+        </w:rPr>
+        <w:t xml:space="preserve">89-91 stage = Phase de </w:t>
+      </w:r>
+      <w:r>
+        <w:rPr>
+          <w:rFonts w:cstheme="minorHAnsi"/>
+        </w:rPr>
+        <w:t>sénescence</w:t>
+      </w:r>
+      <w:r>
+        <w:rPr>
+          <w:rFonts w:cstheme="minorHAnsi"/>
+        </w:rPr>
+        <w:t xml:space="preserve"> de la plante</w:t>
+      </w:r>
+    </w:p>
+    <w:p>
+      <w:pPr>
+        <w:spacing w:line="240" w:lineRule="auto"/>
+        <w:jc w:val="both"/>
+        <w:rPr>
+          <w:rFonts w:cstheme="minorHAnsi"/>
+        </w:rPr>
+      </w:pPr>
+      <w:r>
+        <w:rPr>
+          <w:rFonts w:cstheme="minorHAnsi"/>
+        </w:rPr>
+        <w:br/>
+        <w:t>N content (%DM): Contenu en azote dans l'échantillon en pourcentage de matière sèche.</w:t>
+      </w:r>
+    </w:p>
+    <w:p>
+      <w:pPr>
+        <w:spacing w:line="240" w:lineRule="auto"/>
+        <w:jc w:val="both"/>
+        <w:rPr>
+          <w:rFonts w:cstheme="minorHAnsi"/>
+        </w:rPr>
+      </w:pPr>
+      <w:r>
+        <w:rPr>
+          <w:rFonts w:cstheme="minorHAnsi"/>
+        </w:rPr>
+        <w:br/>
+      </w:r>
+      <w:proofErr w:type="spellStart"/>
+      <w:r>
+        <w:rPr>
+          <w:rFonts w:cstheme="minorHAnsi"/>
+        </w:rPr>
+        <w:t>N_model_set</w:t>
+      </w:r>
+      <w:proofErr w:type="spellEnd"/>
+      <w:r>
+        <w:rPr>
+          <w:rFonts w:cstheme="minorHAnsi"/>
+        </w:rPr>
+        <w:t xml:space="preserve">-type: Désigne des échantillons sélectionnés pour la calibration (Cal) ou la validation (Val) pour le modèle de prédiction de l'azote. </w:t>
+      </w:r>
+    </w:p>
+    <w:p>
+      <w:pPr>
+        <w:spacing w:line="240" w:lineRule="auto"/>
+        <w:jc w:val="both"/>
+        <w:rPr>
+          <w:rFonts w:cstheme="minorHAnsi"/>
+        </w:rPr>
+      </w:pPr>
+      <w:r>
+        <w:rPr>
+          <w:rFonts w:cstheme="minorHAnsi"/>
+        </w:rPr>
         <w:lastRenderedPageBreak/>
         <w:br/>
-      </w:r>
-      <w:proofErr w:type="spellStart"/>
-      <w:r>
-        <w:rPr>
-          <w:rFonts w:cstheme="minorHAnsi"/>
-        </w:rPr>
-        <w:t>Growth</w:t>
-      </w:r>
-      <w:proofErr w:type="spellEnd"/>
-      <w:r>
-        <w:rPr>
-          <w:rFonts w:cstheme="minorHAnsi"/>
-        </w:rPr>
-        <w:t xml:space="preserve"> </w:t>
-      </w:r>
-      <w:proofErr w:type="spellStart"/>
-      <w:r>
-        <w:rPr>
-          <w:rFonts w:cstheme="minorHAnsi"/>
-        </w:rPr>
-        <w:t>season</w:t>
-      </w:r>
-      <w:proofErr w:type="spellEnd"/>
-      <w:r>
-        <w:rPr>
-          <w:rFonts w:cstheme="minorHAnsi"/>
-        </w:rPr>
-        <w:t>: Saison de croissance (2014-2015; 2015-2016; 2016-2017).</w:t>
+        <w:t>C content (%DM): Contenu en carbone dans l'échantillon en pourcentage de matière sèche.</w:t>
       </w:r>
     </w:p>
     <w:p>
@@ -2541,14 +3342,14 @@
         <w:rPr>
           <w:rFonts w:cstheme="minorHAnsi"/>
         </w:rPr>
-        <w:t>Growth</w:t>
-      </w:r>
-      <w:proofErr w:type="spellEnd"/>
-      <w:r>
-        <w:rPr>
-          <w:rFonts w:cstheme="minorHAnsi"/>
-        </w:rPr>
-        <w:t xml:space="preserve"> condition: Conditions de culture soit en champs soit en tunnel </w:t>
+        <w:t>C_model_set</w:t>
+      </w:r>
+      <w:proofErr w:type="spellEnd"/>
+      <w:r>
+        <w:rPr>
+          <w:rFonts w:cstheme="minorHAnsi"/>
+        </w:rPr>
+        <w:t xml:space="preserve">-type: Désigne des échantillons sélectionnés pour la calibration (Cal) ou la validation (Val) pour le modèle de prédiction du carbone. </w:t>
       </w:r>
     </w:p>
     <w:p>
@@ -2564,33 +3365,20 @@
           <w:rFonts w:cstheme="minorHAnsi"/>
         </w:rPr>
         <w:br/>
-        <w:t xml:space="preserve">N </w:t>
-      </w:r>
-      <w:proofErr w:type="spellStart"/>
-      <w:r>
-        <w:rPr>
-          <w:rFonts w:cstheme="minorHAnsi"/>
-        </w:rPr>
-        <w:t>regime</w:t>
-      </w:r>
-      <w:proofErr w:type="spellEnd"/>
-      <w:r>
-        <w:rPr>
-          <w:rFonts w:cstheme="minorHAnsi"/>
-        </w:rPr>
-        <w:t xml:space="preserve">: Fertilisation azoté apporté au stade de monté en graine. N+ désigne des apports azotés optimaux pour atteindre un </w:t>
-      </w:r>
-      <w:r>
-        <w:rPr>
-          <w:rFonts w:cstheme="minorHAnsi"/>
-        </w:rPr>
-        <w:t>rendement</w:t>
-      </w:r>
-      <w:r>
-        <w:rPr>
-          <w:rFonts w:cstheme="minorHAnsi"/>
-        </w:rPr>
-        <w:t xml:space="preserve"> de 3.5 t.ha-1 de graine de colza. N- désigne un apport sous-optimal de  80-100 kg.ha-1 d'azote</w:t>
+      </w:r>
+      <w:proofErr w:type="spellStart"/>
+      <w:r>
+        <w:rPr>
+          <w:rFonts w:cstheme="minorHAnsi"/>
+        </w:rPr>
+        <w:t>Spectra_acquisition_year</w:t>
+      </w:r>
+      <w:proofErr w:type="spellEnd"/>
+      <w:r>
+        <w:rPr>
+          <w:rFonts w:cstheme="minorHAnsi"/>
+        </w:rPr>
+        <w:t>: Années d'acquisition des spectres, ici 2027</w:t>
       </w:r>
     </w:p>
     <w:p>
@@ -2605,391 +3393,6 @@
         <w:rPr>
           <w:rFonts w:cstheme="minorHAnsi"/>
         </w:rPr>
-        <w:br/>
-        <w:t xml:space="preserve">W </w:t>
-      </w:r>
-      <w:proofErr w:type="spellStart"/>
-      <w:r>
-        <w:rPr>
-          <w:rFonts w:cstheme="minorHAnsi"/>
-        </w:rPr>
-        <w:t>regime</w:t>
-      </w:r>
-      <w:proofErr w:type="spellEnd"/>
-      <w:r>
-        <w:rPr>
-          <w:rFonts w:cstheme="minorHAnsi"/>
-        </w:rPr>
-        <w:t xml:space="preserve">: Apports en eau </w:t>
-      </w:r>
-      <w:proofErr w:type="spellStart"/>
-      <w:r>
-        <w:rPr>
-          <w:rFonts w:cstheme="minorHAnsi"/>
-        </w:rPr>
-        <w:t>a</w:t>
-      </w:r>
-      <w:proofErr w:type="spellEnd"/>
-      <w:r>
-        <w:rPr>
-          <w:rFonts w:cstheme="minorHAnsi"/>
-        </w:rPr>
-        <w:t xml:space="preserve"> partir du stade de floraison. W+ indique un apport en eau optimal avec un potentiel en eau du substrat de -200 mbar. W- correspond à un apport en eau sous-optimal avec un potentiel en eau du substrat de -600 mbar. </w:t>
-      </w:r>
-    </w:p>
-    <w:p>
-      <w:pPr>
-        <w:spacing w:line="240" w:lineRule="auto"/>
-        <w:jc w:val="both"/>
-        <w:rPr>
-          <w:rFonts w:cstheme="minorHAnsi"/>
-        </w:rPr>
-      </w:pPr>
-      <w:r>
-        <w:rPr>
-          <w:rFonts w:cstheme="minorHAnsi"/>
-        </w:rPr>
-        <w:br/>
-        <w:t>Tissue: Tissus végétaux d'</w:t>
-      </w:r>
-      <w:proofErr w:type="spellStart"/>
-      <w:r>
-        <w:rPr>
-          <w:rFonts w:cstheme="minorHAnsi"/>
-        </w:rPr>
-        <w:t>ou</w:t>
-      </w:r>
-      <w:proofErr w:type="spellEnd"/>
-      <w:r>
-        <w:rPr>
-          <w:rFonts w:cstheme="minorHAnsi"/>
-        </w:rPr>
-        <w:t xml:space="preserve"> proviennent les échantillons dont les racines, les feuilles, les tiges, les fleurs et les gousses de graines.</w:t>
-      </w:r>
-    </w:p>
-    <w:p>
-      <w:pPr>
-        <w:spacing w:line="240" w:lineRule="auto"/>
-        <w:jc w:val="both"/>
-        <w:rPr>
-          <w:rFonts w:cstheme="minorHAnsi"/>
-        </w:rPr>
-      </w:pPr>
-      <w:r>
-        <w:rPr>
-          <w:rFonts w:cstheme="minorHAnsi"/>
-        </w:rPr>
-        <w:br/>
-        <w:t xml:space="preserve">BBCH dev. Stage: Stade de </w:t>
-      </w:r>
-      <w:r>
-        <w:rPr>
-          <w:rFonts w:cstheme="minorHAnsi"/>
-        </w:rPr>
-        <w:t>développement</w:t>
-      </w:r>
-      <w:r>
-        <w:rPr>
-          <w:rFonts w:cstheme="minorHAnsi"/>
-        </w:rPr>
-        <w:t xml:space="preserve"> d'</w:t>
-      </w:r>
-      <w:proofErr w:type="spellStart"/>
-      <w:r>
-        <w:rPr>
-          <w:rFonts w:cstheme="minorHAnsi"/>
-        </w:rPr>
-        <w:t>ou</w:t>
-      </w:r>
-      <w:proofErr w:type="spellEnd"/>
-      <w:r>
-        <w:rPr>
-          <w:rFonts w:cstheme="minorHAnsi"/>
-        </w:rPr>
-        <w:t xml:space="preserve"> </w:t>
-      </w:r>
-      <w:proofErr w:type="spellStart"/>
-      <w:r>
-        <w:rPr>
-          <w:rFonts w:cstheme="minorHAnsi"/>
-        </w:rPr>
-        <w:t>on</w:t>
-      </w:r>
-      <w:proofErr w:type="spellEnd"/>
-      <w:r>
-        <w:rPr>
-          <w:rFonts w:cstheme="minorHAnsi"/>
-        </w:rPr>
-        <w:t xml:space="preserve"> été prélevés les échantillons. </w:t>
-      </w:r>
-    </w:p>
-    <w:p>
-      <w:pPr>
-        <w:spacing w:line="240" w:lineRule="auto"/>
-        <w:jc w:val="both"/>
-        <w:rPr>
-          <w:rFonts w:cstheme="minorHAnsi"/>
-        </w:rPr>
-      </w:pPr>
-      <w:r>
-        <w:rPr>
-          <w:rFonts w:cstheme="minorHAnsi"/>
-        </w:rPr>
-        <w:t>15-19 stage = Plante possédant les 5 à 9 feuilles</w:t>
-      </w:r>
-    </w:p>
-    <w:p>
-      <w:pPr>
-        <w:spacing w:line="240" w:lineRule="auto"/>
-        <w:jc w:val="both"/>
-        <w:rPr>
-          <w:rFonts w:cstheme="minorHAnsi"/>
-        </w:rPr>
-      </w:pPr>
-      <w:r>
-        <w:rPr>
-          <w:rFonts w:cstheme="minorHAnsi"/>
-        </w:rPr>
-        <w:t xml:space="preserve">31-35 stage = Stade de montée en graine, la plante montre 1 à 5 </w:t>
-      </w:r>
-      <w:r>
-        <w:rPr>
-          <w:rFonts w:cstheme="minorHAnsi"/>
-        </w:rPr>
-        <w:t>entrenœuds</w:t>
-      </w:r>
-    </w:p>
-    <w:p>
-      <w:pPr>
-        <w:spacing w:line="240" w:lineRule="auto"/>
-        <w:jc w:val="both"/>
-        <w:rPr>
-          <w:rFonts w:cstheme="minorHAnsi"/>
-        </w:rPr>
-      </w:pPr>
-      <w:r>
-        <w:rPr>
-          <w:rFonts w:cstheme="minorHAnsi"/>
-        </w:rPr>
-        <w:t>55-59 stage = Production de l'inflorescence principale</w:t>
-      </w:r>
-    </w:p>
-    <w:p>
-      <w:pPr>
-        <w:spacing w:line="240" w:lineRule="auto"/>
-        <w:jc w:val="both"/>
-        <w:rPr>
-          <w:rFonts w:cstheme="minorHAnsi"/>
-        </w:rPr>
-      </w:pPr>
-      <w:r>
-        <w:rPr>
-          <w:rFonts w:cstheme="minorHAnsi"/>
-        </w:rPr>
-        <w:t>61-65 stage = Stade de floraison</w:t>
-      </w:r>
-    </w:p>
-    <w:p>
-      <w:pPr>
-        <w:spacing w:line="240" w:lineRule="auto"/>
-        <w:jc w:val="both"/>
-        <w:rPr>
-          <w:rFonts w:cstheme="minorHAnsi"/>
-        </w:rPr>
-      </w:pPr>
-      <w:r>
-        <w:rPr>
-          <w:rFonts w:cstheme="minorHAnsi"/>
-        </w:rPr>
-        <w:t xml:space="preserve">70-75 stage = </w:t>
-      </w:r>
-      <w:r>
-        <w:rPr>
-          <w:rFonts w:cstheme="minorHAnsi"/>
-        </w:rPr>
-        <w:t>Développement</w:t>
-      </w:r>
-      <w:r>
-        <w:rPr>
-          <w:rFonts w:cstheme="minorHAnsi"/>
-        </w:rPr>
-        <w:t xml:space="preserve"> des graines</w:t>
-      </w:r>
-    </w:p>
-    <w:p>
-      <w:pPr>
-        <w:spacing w:line="240" w:lineRule="auto"/>
-        <w:jc w:val="both"/>
-        <w:rPr>
-          <w:rFonts w:cstheme="minorHAnsi"/>
-        </w:rPr>
-      </w:pPr>
-      <w:r>
-        <w:rPr>
-          <w:rFonts w:cstheme="minorHAnsi"/>
-        </w:rPr>
-        <w:t>79-85 stage = Maturation des graines</w:t>
-      </w:r>
-    </w:p>
-    <w:p>
-      <w:pPr>
-        <w:spacing w:line="240" w:lineRule="auto"/>
-        <w:jc w:val="both"/>
-        <w:rPr>
-          <w:rFonts w:cstheme="minorHAnsi"/>
-        </w:rPr>
-      </w:pPr>
-      <w:r>
-        <w:rPr>
-          <w:rFonts w:cstheme="minorHAnsi"/>
-        </w:rPr>
-        <w:t xml:space="preserve">89-91 stage = Phase de </w:t>
-      </w:r>
-      <w:r>
-        <w:rPr>
-          <w:rFonts w:cstheme="minorHAnsi"/>
-        </w:rPr>
-        <w:t>sénescence</w:t>
-      </w:r>
-      <w:r>
-        <w:rPr>
-          <w:rFonts w:cstheme="minorHAnsi"/>
-        </w:rPr>
-        <w:t xml:space="preserve"> de la plante</w:t>
-      </w:r>
-    </w:p>
-    <w:p>
-      <w:pPr>
-        <w:spacing w:line="240" w:lineRule="auto"/>
-        <w:jc w:val="both"/>
-        <w:rPr>
-          <w:rFonts w:cstheme="minorHAnsi"/>
-        </w:rPr>
-      </w:pPr>
-      <w:r>
-        <w:rPr>
-          <w:rFonts w:cstheme="minorHAnsi"/>
-        </w:rPr>
-        <w:br/>
-        <w:t>N content (%DM): Contenu en azote dans l'échantillon en pourcentage de matière sèche.</w:t>
-      </w:r>
-    </w:p>
-    <w:p>
-      <w:pPr>
-        <w:spacing w:line="240" w:lineRule="auto"/>
-        <w:jc w:val="both"/>
-        <w:rPr>
-          <w:rFonts w:cstheme="minorHAnsi"/>
-        </w:rPr>
-      </w:pPr>
-      <w:r>
-        <w:rPr>
-          <w:rFonts w:cstheme="minorHAnsi"/>
-        </w:rPr>
-        <w:br/>
-      </w:r>
-      <w:proofErr w:type="spellStart"/>
-      <w:r>
-        <w:rPr>
-          <w:rFonts w:cstheme="minorHAnsi"/>
-        </w:rPr>
-        <w:t>N_model_set</w:t>
-      </w:r>
-      <w:proofErr w:type="spellEnd"/>
-      <w:r>
-        <w:rPr>
-          <w:rFonts w:cstheme="minorHAnsi"/>
-        </w:rPr>
-        <w:t xml:space="preserve">-type: Désigne des échantillons sélectionnés pour la calibration (Cal) ou la validation (Val) pour le modèle de prédiction de l'azote. </w:t>
-      </w:r>
-    </w:p>
-    <w:p>
-      <w:pPr>
-        <w:spacing w:line="240" w:lineRule="auto"/>
-        <w:jc w:val="both"/>
-        <w:rPr>
-          <w:rFonts w:cstheme="minorHAnsi"/>
-        </w:rPr>
-      </w:pPr>
-      <w:r>
-        <w:rPr>
-          <w:rFonts w:cstheme="minorHAnsi"/>
-        </w:rPr>
-        <w:br/>
-        <w:t>C content (%DM): Contenu en carbone dans l'échantillon en pourcentage de matière sèche.</w:t>
-      </w:r>
-    </w:p>
-    <w:p>
-      <w:pPr>
-        <w:spacing w:line="240" w:lineRule="auto"/>
-        <w:jc w:val="both"/>
-        <w:rPr>
-          <w:rFonts w:cstheme="minorHAnsi"/>
-        </w:rPr>
-      </w:pPr>
-      <w:r>
-        <w:rPr>
-          <w:rFonts w:cstheme="minorHAnsi"/>
-        </w:rPr>
-        <w:br/>
-      </w:r>
-      <w:proofErr w:type="spellStart"/>
-      <w:r>
-        <w:rPr>
-          <w:rFonts w:cstheme="minorHAnsi"/>
-        </w:rPr>
-        <w:t>C_model_set</w:t>
-      </w:r>
-      <w:proofErr w:type="spellEnd"/>
-      <w:r>
-        <w:rPr>
-          <w:rFonts w:cstheme="minorHAnsi"/>
-        </w:rPr>
-        <w:t xml:space="preserve">-type: Désigne des échantillons sélectionnés pour la calibration (Cal) ou la validation (Val) pour le modèle de prédiction du carbone. </w:t>
-      </w:r>
-    </w:p>
-    <w:p>
-      <w:pPr>
-        <w:spacing w:line="240" w:lineRule="auto"/>
-        <w:jc w:val="both"/>
-        <w:rPr>
-          <w:rFonts w:cstheme="minorHAnsi"/>
-        </w:rPr>
-      </w:pPr>
-      <w:r>
-        <w:rPr>
-          <w:rFonts w:cstheme="minorHAnsi"/>
-        </w:rPr>
-        <w:br/>
-      </w:r>
-      <w:proofErr w:type="spellStart"/>
-      <w:r>
-        <w:rPr>
-          <w:rFonts w:cstheme="minorHAnsi"/>
-        </w:rPr>
-        <w:t>Spectra_acquisition_year</w:t>
-      </w:r>
-      <w:proofErr w:type="spellEnd"/>
-      <w:r>
-        <w:rPr>
-          <w:rFonts w:cstheme="minorHAnsi"/>
-        </w:rPr>
-        <w:t>: Années d'acquisition des spectres, ici 2027</w:t>
-      </w:r>
-    </w:p>
-    <w:p>
-      <w:pPr>
-        <w:spacing w:line="240" w:lineRule="auto"/>
-        <w:jc w:val="both"/>
-        <w:rPr>
-          <w:rFonts w:cstheme="minorHAnsi"/>
-        </w:rPr>
-      </w:pPr>
-      <w:r>
-        <w:rPr>
-          <w:rFonts w:cstheme="minorHAnsi"/>
-        </w:rPr>
-        <w:lastRenderedPageBreak/>
         <w:br/>
       </w:r>
       <w:proofErr w:type="spellStart"/>

</xml_diff>

<commit_message>
Update note and these_results
</commit_message>
<xml_diff>
--- a/doc/Notes.docx
+++ b/doc/Notes.docx
@@ -128,7 +128,28 @@
         <w:rPr>
           <w:rFonts w:cstheme="minorHAnsi"/>
         </w:rPr>
-        <w:t>est d’utiliser des données issues de spectres proches infrarouges (NIRS pour Near InfraRed  Spectrocsop</w:t>
+        <w:t xml:space="preserve">est d’utiliser des données issues de spectres proches infrarouges (NIRS pour Near </w:t>
+      </w:r>
+      <w:proofErr w:type="spellStart"/>
+      <w:r>
+        <w:rPr>
+          <w:rFonts w:cstheme="minorHAnsi"/>
+        </w:rPr>
+        <w:t>InfraRed</w:t>
+      </w:r>
+      <w:proofErr w:type="spellEnd"/>
+      <w:r>
+        <w:rPr>
+          <w:rFonts w:cstheme="minorHAnsi"/>
+        </w:rPr>
+        <w:t xml:space="preserve">  </w:t>
+      </w:r>
+      <w:proofErr w:type="spellStart"/>
+      <w:r>
+        <w:rPr>
+          <w:rFonts w:cstheme="minorHAnsi"/>
+        </w:rPr>
+        <w:t>Spectrocsop</w:t>
       </w:r>
       <w:r>
         <w:rPr>
@@ -136,6 +157,7 @@
         </w:rPr>
         <w:t>y</w:t>
       </w:r>
+      <w:proofErr w:type="spellEnd"/>
       <w:r>
         <w:rPr>
           <w:rFonts w:cstheme="minorHAnsi"/>
@@ -209,7 +231,21 @@
         <w:rPr>
           <w:rFonts w:cstheme="minorHAnsi"/>
         </w:rPr>
-        <w:t xml:space="preserve">a thèse M. Laurençon se focalise sur la prédiction </w:t>
+        <w:t xml:space="preserve">a thèse M. </w:t>
+      </w:r>
+      <w:proofErr w:type="spellStart"/>
+      <w:r>
+        <w:rPr>
+          <w:rFonts w:cstheme="minorHAnsi"/>
+        </w:rPr>
+        <w:t>Laurençon</w:t>
+      </w:r>
+      <w:proofErr w:type="spellEnd"/>
+      <w:r>
+        <w:rPr>
+          <w:rFonts w:cstheme="minorHAnsi"/>
+        </w:rPr>
+        <w:t xml:space="preserve"> se focalise sur la prédiction </w:t>
       </w:r>
       <w:r>
         <w:rPr>
@@ -440,7 +476,21 @@
         <w:rPr>
           <w:rFonts w:cstheme="minorHAnsi"/>
         </w:rPr>
-        <w:t xml:space="preserve">Dans son approche statistique, M. Laurençon n’utilise pas du tout de données fonctionnelles, et nous nous proposons donc de les implémenter sur ces données NIRS et de phénotype de colza. Nous allons explorer plusieurs méthodes d’analyse de données fonctionnelles pour faire le lien entre le phénotype et le génotype via ces spectres NIRS. </w:t>
+        <w:t xml:space="preserve">Dans son approche statistique, M. </w:t>
+      </w:r>
+      <w:proofErr w:type="spellStart"/>
+      <w:r>
+        <w:rPr>
+          <w:rFonts w:cstheme="minorHAnsi"/>
+        </w:rPr>
+        <w:t>Laurençon</w:t>
+      </w:r>
+      <w:proofErr w:type="spellEnd"/>
+      <w:r>
+        <w:rPr>
+          <w:rFonts w:cstheme="minorHAnsi"/>
+        </w:rPr>
+        <w:t xml:space="preserve"> n’utilise pas du tout de données fonctionnelles, et nous nous proposons donc de les implémenter sur ces données NIRS et de phénotype de colza. Nous allons explorer plusieurs méthodes d’analyse de données fonctionnelles pour faire le lien entre le phénotype et le génotype via ces spectres NIRS. </w:t>
       </w:r>
     </w:p>
     <w:p>
@@ -493,6 +543,7 @@
       <w:r>
         <w:t xml:space="preserve"> regroupe les 85 génotypes de colza oléagineux de printemps, et le type </w:t>
       </w:r>
+      <w:proofErr w:type="spellStart"/>
       <w:r>
         <w:rPr>
           <w:b/>
@@ -500,8 +551,17 @@
         </w:rPr>
         <w:t>Swede</w:t>
       </w:r>
-      <w:r>
-        <w:t xml:space="preserve"> comprend 2 génotypes de rutabaga. Les rutabagas ont été introduits dans l’expérimentation afin d’augmenter la diversité génétique dans l’expérimentation. En effet, tout comme le colza, le rutabaga fait partie de l’espèce Brassica, et il est intéressant d’étudier son phénotype puisqu’il partage une grande part de son génotype avec le colza.</w:t>
+      <w:proofErr w:type="spellEnd"/>
+      <w:r>
+        <w:t xml:space="preserve"> comprend 2 génotypes de rutabaga. Les rutabagas ont été introduits dans l’expérimentation afin d’augmenter la diversité génétique dans l’expérimentation. En effet, tout comme le colza, le rutabaga fait partie de l’espèce </w:t>
+      </w:r>
+      <w:proofErr w:type="spellStart"/>
+      <w:r>
+        <w:t>Brassica</w:t>
+      </w:r>
+      <w:proofErr w:type="spellEnd"/>
+      <w:r>
+        <w:t>, et il est intéressant d’étudier son phénotype puisqu’il partage une grande part de son génotype avec le colza.</w:t>
       </w:r>
     </w:p>
     <w:p>
@@ -523,7 +583,7 @@
     </w:p>
     <w:p>
       <w:pPr>
-        <w:ind w:firstLine="708"/>
+        <w:jc w:val="both"/>
       </w:pPr>
       <w:r>
         <w:t xml:space="preserve">Les spectres ont été obtenus de trois manières différentes : </w:t>
@@ -534,8 +594,9 @@
         <w:pStyle w:val="Paragraphedeliste"/>
         <w:numPr>
           <w:ilvl w:val="0"/>
-          <w:numId w:val="5"/>
+          <w:numId w:val="6"/>
         </w:numPr>
+        <w:jc w:val="both"/>
       </w:pPr>
       <w:r>
         <w:t>Soit à partir de graines séchées et broyées</w:t>
@@ -546,14 +607,63 @@
         <w:pStyle w:val="Paragraphedeliste"/>
         <w:numPr>
           <w:ilvl w:val="0"/>
-          <w:numId w:val="5"/>
+          <w:numId w:val="6"/>
         </w:numPr>
-      </w:pPr>
-      <w:r>
-        <w:t>Soit à partir de feuilles. Les graines ont été plantées dans des caissons sur trois expérimentations différentes. A chaque fois, un caisson contient 4 génotypes, et chaque partie du caisson correspondant à un génotype contient 4 plantes (pour avoir des répétitions). Il y a eu 3 expérimentations. La première consiste à un phénotypage des génotype SOSR et Swede qui ont été planté en mars. Pour éviter un effet de l’orientation du tunnel, il y a eu deux répétitions de cette expérimentation en inversant les bacs de place. Les génotypes WOSR et WFR ont été planté en août puis en septembre (faisant office de seconde répétition)</w:t>
-      </w:r>
-      <w:r>
-        <w:t>. On a ensuite réalisé nos mesures phénotypiques sur ces plantes, mesuré leurs valeurs de réflectance en spectre infrarouge sur les feuilles fraiches, puis elles ont été séchée et réduite en poudre pour une mesure de l’absorbance en spectre proche infrarouge par spectrométrie</w:t>
+        <w:jc w:val="both"/>
+      </w:pPr>
+      <w:r>
+        <w:t xml:space="preserve">Soit à partir de feuilles. Les graines ont été plantées dans des caissons sur trois expérimentations différentes. A chaque fois, un caisson contient 4 génotypes, et chaque partie du caisson correspondant à un génotype contient 4 plantes (pour avoir des répétitions). Il y a eu 3 expérimentations. La première consiste à un phénotypage des génotype </w:t>
+      </w:r>
+      <w:r>
+        <w:rPr>
+          <w:b/>
+          <w:bCs/>
+        </w:rPr>
+        <w:t>SOSR</w:t>
+      </w:r>
+      <w:r>
+        <w:t xml:space="preserve"> et </w:t>
+      </w:r>
+      <w:proofErr w:type="spellStart"/>
+      <w:r>
+        <w:rPr>
+          <w:b/>
+          <w:bCs/>
+        </w:rPr>
+        <w:t>Swede</w:t>
+      </w:r>
+      <w:proofErr w:type="spellEnd"/>
+      <w:r>
+        <w:t xml:space="preserve"> qui ont été planté en mars. Pour éviter un effet de l’orientation du tunnel, il y a eu deux répétitions de cette expérimentation en inversant les bacs de place. Les génotypes </w:t>
+      </w:r>
+      <w:r>
+        <w:rPr>
+          <w:b/>
+          <w:bCs/>
+        </w:rPr>
+        <w:t>WOSR</w:t>
+      </w:r>
+      <w:r>
+        <w:t xml:space="preserve"> et </w:t>
+      </w:r>
+      <w:r>
+        <w:rPr>
+          <w:b/>
+          <w:bCs/>
+        </w:rPr>
+        <w:t>WFR</w:t>
+      </w:r>
+      <w:r>
+        <w:t xml:space="preserve"> ont été planté en août puis en septembre (faisant office de seconde répétition)</w:t>
+      </w:r>
+      <w:r>
+        <w:t>. On a ensuite réalisé nos mesures phénotypiques sur ces plantes, mesuré leurs valeurs de réflectance en spectre infrarouge sur les feuilles fraiches, puis elles ont été séchée</w:t>
+      </w:r>
+      <w:r>
+        <w:t>s</w:t>
+      </w:r>
+      <w:r>
+        <w:t xml:space="preserve"> et réduite en poudre pour une mesure de l’absorbance en spectre proche infrarouge par spectrométrie</w:t>
       </w:r>
     </w:p>
     <w:p>
@@ -573,7 +683,15 @@
         </w:numPr>
       </w:pPr>
       <w:r>
-        <w:t>Centrage réduction (snv ?)</w:t>
+        <w:t>Centrage réduction (</w:t>
+      </w:r>
+      <w:proofErr w:type="spellStart"/>
+      <w:r>
+        <w:t>snv</w:t>
+      </w:r>
+      <w:proofErr w:type="spellEnd"/>
+      <w:r>
+        <w:t> ?)</w:t>
       </w:r>
     </w:p>
     <w:p>
@@ -587,8 +705,13 @@
       <w:r>
         <w:t xml:space="preserve">Lissage de </w:t>
       </w:r>
-      <w:r>
-        <w:t>Savitzky-Golay</w:t>
+      <w:proofErr w:type="spellStart"/>
+      <w:r>
+        <w:t>Savitzky</w:t>
+      </w:r>
+      <w:proofErr w:type="spellEnd"/>
+      <w:r>
+        <w:t>-Golay</w:t>
       </w:r>
     </w:p>
     <w:p>
@@ -613,7 +736,23 @@
         <w:t>phénotype</w:t>
       </w:r>
       <w:r>
-        <w:t xml:space="preserve"> contiennent une variable qualitative "variety" et 23 varibales quantitatives :</w:t>
+        <w:t xml:space="preserve"> contiennent une variable qualitative "</w:t>
+      </w:r>
+      <w:proofErr w:type="spellStart"/>
+      <w:r>
+        <w:t>variety</w:t>
+      </w:r>
+      <w:proofErr w:type="spellEnd"/>
+      <w:r>
+        <w:t xml:space="preserve">" et 23 </w:t>
+      </w:r>
+      <w:proofErr w:type="spellStart"/>
+      <w:r>
+        <w:t>varibales</w:t>
+      </w:r>
+      <w:proofErr w:type="spellEnd"/>
+      <w:r>
+        <w:t xml:space="preserve"> quantitatives :</w:t>
       </w:r>
     </w:p>
     <w:p>
@@ -652,8 +791,13 @@
       <w:r>
         <w:t>(</w:t>
       </w:r>
-      <w:r>
-        <w:t>Leaf Area</w:t>
+      <w:proofErr w:type="spellStart"/>
+      <w:r>
+        <w:t>Leaf</w:t>
+      </w:r>
+      <w:proofErr w:type="spellEnd"/>
+      <w:r>
+        <w:t xml:space="preserve"> Area</w:t>
       </w:r>
       <w:r>
         <w:t>) :</w:t>
@@ -683,8 +827,13 @@
         <w:t xml:space="preserve"> (</w:t>
       </w:r>
       <w:r>
-        <w:t>Total Dry Weight</w:t>
-      </w:r>
+        <w:t xml:space="preserve">Total Dry </w:t>
+      </w:r>
+      <w:proofErr w:type="spellStart"/>
+      <w:r>
+        <w:t>Weight</w:t>
+      </w:r>
+      <w:proofErr w:type="spellEnd"/>
       <w:r>
         <w:t>) :</w:t>
       </w:r>
@@ -718,9 +867,19 @@
       <w:r>
         <w:t xml:space="preserve"> (</w:t>
       </w:r>
-      <w:r>
-        <w:t>Aerial Dry Weigh</w:t>
-      </w:r>
+      <w:proofErr w:type="spellStart"/>
+      <w:r>
+        <w:t>Aerial</w:t>
+      </w:r>
+      <w:proofErr w:type="spellEnd"/>
+      <w:r>
+        <w:t xml:space="preserve"> Dry </w:t>
+      </w:r>
+      <w:proofErr w:type="spellStart"/>
+      <w:r>
+        <w:t>Weigh</w:t>
+      </w:r>
+      <w:proofErr w:type="spellEnd"/>
       <w:r>
         <w:t>) :</w:t>
       </w:r>
@@ -764,8 +923,13 @@
         <w:t>Root</w:t>
       </w:r>
       <w:r>
-        <w:t xml:space="preserve"> Dry Weigh</w:t>
-      </w:r>
+        <w:t xml:space="preserve"> Dry </w:t>
+      </w:r>
+      <w:proofErr w:type="spellStart"/>
+      <w:r>
+        <w:t>Weigh</w:t>
+      </w:r>
+      <w:proofErr w:type="spellEnd"/>
       <w:r>
         <w:t>) :</w:t>
       </w:r>
@@ -802,8 +966,21 @@
       <w:r>
         <w:t xml:space="preserve"> (</w:t>
       </w:r>
-      <w:r>
-        <w:t>Leaf Weight Ratio</w:t>
+      <w:proofErr w:type="spellStart"/>
+      <w:r>
+        <w:t>Leaf</w:t>
+      </w:r>
+      <w:proofErr w:type="spellEnd"/>
+      <w:r>
+        <w:t xml:space="preserve"> </w:t>
+      </w:r>
+      <w:proofErr w:type="spellStart"/>
+      <w:r>
+        <w:t>Weight</w:t>
+      </w:r>
+      <w:proofErr w:type="spellEnd"/>
+      <w:r>
+        <w:t xml:space="preserve"> Ratio</w:t>
       </w:r>
       <w:r>
         <w:t>) :</w:t>
@@ -844,8 +1021,13 @@
       <w:r>
         <w:t>(</w:t>
       </w:r>
-      <w:r>
-        <w:t xml:space="preserve">Leaf </w:t>
+      <w:proofErr w:type="spellStart"/>
+      <w:r>
+        <w:t>Leaf</w:t>
+      </w:r>
+      <w:proofErr w:type="spellEnd"/>
+      <w:r>
+        <w:t xml:space="preserve"> </w:t>
       </w:r>
       <w:r>
         <w:t>A</w:t>
@@ -901,8 +1083,21 @@
       <w:r>
         <w:t xml:space="preserve"> (</w:t>
       </w:r>
-      <w:r>
-        <w:t>Specific Leaf Area</w:t>
+      <w:proofErr w:type="spellStart"/>
+      <w:r>
+        <w:t>Specific</w:t>
+      </w:r>
+      <w:proofErr w:type="spellEnd"/>
+      <w:r>
+        <w:t xml:space="preserve"> </w:t>
+      </w:r>
+      <w:proofErr w:type="spellStart"/>
+      <w:r>
+        <w:t>Leaf</w:t>
+      </w:r>
+      <w:proofErr w:type="spellEnd"/>
+      <w:r>
+        <w:t xml:space="preserve"> Area</w:t>
       </w:r>
       <w:r>
         <w:t>) :</w:t>
@@ -977,8 +1172,21 @@
         <w:t>(</w:t>
       </w:r>
       <w:r>
-        <w:t>Shoot Nitrogen Quantity</w:t>
-      </w:r>
+        <w:t xml:space="preserve">Shoot </w:t>
+      </w:r>
+      <w:proofErr w:type="spellStart"/>
+      <w:r>
+        <w:t>Nitrogen</w:t>
+      </w:r>
+      <w:proofErr w:type="spellEnd"/>
+      <w:r>
+        <w:t xml:space="preserve"> </w:t>
+      </w:r>
+      <w:proofErr w:type="spellStart"/>
+      <w:r>
+        <w:t>Quantity</w:t>
+      </w:r>
+      <w:proofErr w:type="spellEnd"/>
       <w:r>
         <w:t>) :</w:t>
       </w:r>
@@ -1012,15 +1220,33 @@
       <w:r>
         <w:t>(</w:t>
       </w:r>
-      <w:r>
-        <w:t>Leaf Area</w:t>
+      <w:proofErr w:type="spellStart"/>
+      <w:r>
+        <w:t>Leaf</w:t>
+      </w:r>
+      <w:proofErr w:type="spellEnd"/>
+      <w:r>
+        <w:t xml:space="preserve"> Area</w:t>
       </w:r>
       <w:r>
         <w:t>-</w:t>
       </w:r>
       <w:r>
-        <w:t>Shoot Nitrogen Quantity</w:t>
-      </w:r>
+        <w:t xml:space="preserve">Shoot </w:t>
+      </w:r>
+      <w:proofErr w:type="spellStart"/>
+      <w:r>
+        <w:t>Nitrogen</w:t>
+      </w:r>
+      <w:proofErr w:type="spellEnd"/>
+      <w:r>
+        <w:t xml:space="preserve"> </w:t>
+      </w:r>
+      <w:proofErr w:type="spellStart"/>
+      <w:r>
+        <w:t>Quantity</w:t>
+      </w:r>
+      <w:proofErr w:type="spellEnd"/>
       <w:r>
         <w:t>) :</w:t>
       </w:r>
@@ -1064,8 +1290,21 @@
         <w:t>(</w:t>
       </w:r>
       <w:r>
-        <w:t>Total Nitrogen Quantity</w:t>
-      </w:r>
+        <w:t xml:space="preserve">Total </w:t>
+      </w:r>
+      <w:proofErr w:type="spellStart"/>
+      <w:r>
+        <w:t>Nitrogen</w:t>
+      </w:r>
+      <w:proofErr w:type="spellEnd"/>
+      <w:r>
+        <w:t xml:space="preserve"> </w:t>
+      </w:r>
+      <w:proofErr w:type="spellStart"/>
+      <w:r>
+        <w:t>Quantity</w:t>
+      </w:r>
+      <w:proofErr w:type="spellEnd"/>
       <w:r>
         <w:t>) :</w:t>
       </w:r>
@@ -1085,7 +1324,6 @@
         </w:numPr>
       </w:pPr>
       <w:r>
-        <w:lastRenderedPageBreak/>
         <w:t>SNU</w:t>
       </w:r>
       <w:r>
@@ -1095,8 +1333,21 @@
         <w:t>(P</w:t>
       </w:r>
       <w:r>
-        <w:t>lant-Specific N Uptake</w:t>
-      </w:r>
+        <w:t>lant-</w:t>
+      </w:r>
+      <w:proofErr w:type="spellStart"/>
+      <w:r>
+        <w:t>Specific</w:t>
+      </w:r>
+      <w:proofErr w:type="spellEnd"/>
+      <w:r>
+        <w:t xml:space="preserve"> N </w:t>
+      </w:r>
+      <w:proofErr w:type="spellStart"/>
+      <w:r>
+        <w:t>Uptake</w:t>
+      </w:r>
+      <w:proofErr w:type="spellEnd"/>
       <w:r>
         <w:t>) :</w:t>
       </w:r>
@@ -1121,9 +1372,11 @@
           <w:numId w:val="3"/>
         </w:numPr>
       </w:pPr>
+      <w:proofErr w:type="spellStart"/>
       <w:r>
         <w:t>NUtE_tot</w:t>
       </w:r>
+      <w:proofErr w:type="spellEnd"/>
       <w:r>
         <w:t xml:space="preserve"> : </w:t>
       </w:r>
@@ -1142,9 +1395,12 @@
           <w:numId w:val="3"/>
         </w:numPr>
       </w:pPr>
-      <w:r>
+      <w:proofErr w:type="spellStart"/>
+      <w:r>
+        <w:lastRenderedPageBreak/>
         <w:t>NUtE_aer</w:t>
       </w:r>
+      <w:proofErr w:type="spellEnd"/>
       <w:r>
         <w:t>: Ratio entre le</w:t>
       </w:r>
@@ -1179,6 +1435,7 @@
           <w:numId w:val="4"/>
         </w:numPr>
       </w:pPr>
+      <w:proofErr w:type="spellStart"/>
       <w:r>
         <w:t>AUC_L</w:t>
       </w:r>
@@ -1191,6 +1448,7 @@
       <w:r>
         <w:t>b</w:t>
       </w:r>
+      <w:proofErr w:type="spellEnd"/>
       <w:r>
         <w:t> :</w:t>
       </w:r>
@@ -1218,6 +1476,7 @@
           <w:numId w:val="4"/>
         </w:numPr>
       </w:pPr>
+      <w:proofErr w:type="spellStart"/>
       <w:r>
         <w:t>Sp_L</w:t>
       </w:r>
@@ -1228,7 +1487,11 @@
         <w:t>_L</w:t>
       </w:r>
       <w:r>
-        <w:t>b : Vitesse de développement entre les feuilles a et b</w:t>
+        <w:t>b</w:t>
+      </w:r>
+      <w:proofErr w:type="spellEnd"/>
+      <w:r>
+        <w:t> : Vitesse de développement entre les feuilles a et b</w:t>
       </w:r>
     </w:p>
     <w:p>
@@ -1384,7 +1647,15 @@
         <w:t xml:space="preserve">La bissectrice du groupe « traits développementaux » </w:t>
       </w:r>
       <w:r>
-        <w:t xml:space="preserve">montre une forte corrélation entre les variables Sp et AUC_L3_L4 et anti corrélé avec AUC_L1_L4. </w:t>
+        <w:t xml:space="preserve">montre une forte corrélation entre les variables </w:t>
+      </w:r>
+      <w:proofErr w:type="spellStart"/>
+      <w:r>
+        <w:t>Sp</w:t>
+      </w:r>
+      <w:proofErr w:type="spellEnd"/>
+      <w:r>
+        <w:t xml:space="preserve"> et AUC_L3_L4 et anti corrélé avec AUC_L1_L4. </w:t>
       </w:r>
     </w:p>
     <w:p>
@@ -1468,7 +1739,15 @@
         <w:t>L</w:t>
       </w:r>
       <w:r>
-        <w:t xml:space="preserve">a variété Navig 176 </w:t>
+        <w:t xml:space="preserve">a variété </w:t>
+      </w:r>
+      <w:proofErr w:type="spellStart"/>
+      <w:r>
+        <w:t>Navig</w:t>
+      </w:r>
+      <w:proofErr w:type="spellEnd"/>
+      <w:r>
+        <w:t xml:space="preserve"> 176 </w:t>
       </w:r>
       <w:r>
         <w:t xml:space="preserve">prend des valeurs soit très forte, soit très petite sur les variables des traits physiologique et des valeurs moyennes sur les variables des traits développementaux. </w:t>
@@ -1492,7 +1771,15 @@
         <w:t>L</w:t>
       </w:r>
       <w:r>
-        <w:t>a variété Navig 159 prend des valeurs soit très forte, soit très petite sur les variables des traits développementaux et des valeurs moyennes sur les variables des traits physiologique.</w:t>
+        <w:t xml:space="preserve">a variété </w:t>
+      </w:r>
+      <w:proofErr w:type="spellStart"/>
+      <w:r>
+        <w:t>Navig</w:t>
+      </w:r>
+      <w:proofErr w:type="spellEnd"/>
+      <w:r>
+        <w:t xml:space="preserve"> 159 prend des valeurs soit très forte, soit très petite sur les variables des traits développementaux et des valeurs moyennes sur les variables des traits physiologique.</w:t>
       </w:r>
     </w:p>
     <w:p>
@@ -1506,7 +1793,6 @@
         <w:pStyle w:val="Titre2"/>
       </w:pPr>
       <w:r>
-        <w:lastRenderedPageBreak/>
         <w:t>Méthode</w:t>
       </w:r>
     </w:p>
@@ -1539,6 +1825,7 @@
         </w:numPr>
       </w:pPr>
       <w:r>
+        <w:lastRenderedPageBreak/>
         <w:t>Intérêt pour cette étude</w:t>
       </w:r>
     </w:p>
@@ -1547,8 +1834,13 @@
         <w:pStyle w:val="Titre3"/>
       </w:pPr>
       <w:r>
-        <w:t>Régression fonctionnelle : méthode des B-splines</w:t>
-      </w:r>
+        <w:t>Régression fonctionnelle : méthode des B-</w:t>
+      </w:r>
+      <w:proofErr w:type="spellStart"/>
+      <w:r>
+        <w:t>splines</w:t>
+      </w:r>
+      <w:proofErr w:type="spellEnd"/>
     </w:p>
     <w:p>
       <w:pPr>
@@ -1562,7 +1854,35 @@
         <w:rPr>
           <w:rFonts w:cstheme="minorHAnsi"/>
         </w:rPr>
-        <w:t xml:space="preserve">Dans un premier temps, nous avons ajuster une spline sur 50 nœuds par spectre. Ceci nous permet d’obtenir une variable fonctionnelle qui expliquent chaque spectre avec 50 coefficients. Nous avons ensuite réalisé une régression linéaire avec les coefficients en variables explicative pour expliquer par exemple la taux d’azote dans le colza. Le but est de réaliser des prédictions, ainsi de la validation croisée sera réalisé sur le modèle linéaire. </w:t>
+        <w:t xml:space="preserve">Dans un premier temps, nous avons ajuster une </w:t>
+      </w:r>
+      <w:proofErr w:type="spellStart"/>
+      <w:r>
+        <w:rPr>
+          <w:rFonts w:cstheme="minorHAnsi"/>
+        </w:rPr>
+        <w:t>spline</w:t>
+      </w:r>
+      <w:proofErr w:type="spellEnd"/>
+      <w:r>
+        <w:rPr>
+          <w:rFonts w:cstheme="minorHAnsi"/>
+        </w:rPr>
+        <w:t xml:space="preserve"> sur 50 nœuds par spectre. Ceci nous permet d’obtenir une variable fonctionnelle qui expliquent chaque spectre avec 50 coefficients. Nous avons ensuite réalisé une régression linéaire avec les coefficients en variables explicative pour expliquer par exemple </w:t>
+      </w:r>
+      <w:proofErr w:type="gramStart"/>
+      <w:r>
+        <w:rPr>
+          <w:rFonts w:cstheme="minorHAnsi"/>
+        </w:rPr>
+        <w:t>la taux</w:t>
+      </w:r>
+      <w:proofErr w:type="gramEnd"/>
+      <w:r>
+        <w:rPr>
+          <w:rFonts w:cstheme="minorHAnsi"/>
+        </w:rPr>
+        <w:t xml:space="preserve"> d’azote dans le colza. Le but est de réaliser des prédictions, ainsi de la validation croisée sera réalisé sur le modèle linéaire. </w:t>
       </w:r>
     </w:p>
     <w:p>
@@ -1685,8 +2005,13 @@
         </w:numPr>
       </w:pPr>
       <w:r>
-        <w:t>Faire attention aux outlyers</w:t>
-      </w:r>
+        <w:t xml:space="preserve">Faire attention aux </w:t>
+      </w:r>
+      <w:proofErr w:type="spellStart"/>
+      <w:r>
+        <w:t>outlyers</w:t>
+      </w:r>
+      <w:proofErr w:type="spellEnd"/>
     </w:p>
     <w:p>
       <w:pPr>
@@ -1745,7 +2070,21 @@
         <w:rPr>
           <w:lang w:val="en-GB"/>
         </w:rPr>
-        <w:t>- functional data analysis (J. O. Ramsay , B. W. Silverman)</w:t>
+        <w:t xml:space="preserve">- functional data analysis (J. O. </w:t>
+      </w:r>
+      <w:proofErr w:type="gramStart"/>
+      <w:r>
+        <w:rPr>
+          <w:lang w:val="en-GB"/>
+        </w:rPr>
+        <w:t>Ramsay ,</w:t>
+      </w:r>
+      <w:proofErr w:type="gramEnd"/>
+      <w:r>
+        <w:rPr>
+          <w:lang w:val="en-GB"/>
+        </w:rPr>
+        <w:t xml:space="preserve"> B. W. Silverman)</w:t>
       </w:r>
     </w:p>
     <w:p>
@@ -1753,8 +2092,121 @@
         <w:pStyle w:val="Titre2"/>
       </w:pPr>
       <w:r>
+        <w:t>Brouillon</w:t>
+      </w:r>
+    </w:p>
+    <w:p>
+      <w:pPr>
+        <w:spacing w:line="240" w:lineRule="auto"/>
+        <w:jc w:val="both"/>
+        <w:rPr>
+          <w:rFonts w:cstheme="minorHAnsi"/>
+        </w:rPr>
+      </w:pPr>
+      <w:r>
+        <w:rPr>
+          <w:rFonts w:cstheme="minorHAnsi"/>
+        </w:rPr>
+        <w:t xml:space="preserve">En effet, les processus environnementaux ont un impact sur le phénotype ce qui peut altérer le lien entre génotype et phénotype. </w:t>
+      </w:r>
+      <w:r>
+        <w:rPr>
+          <w:rFonts w:cstheme="minorHAnsi"/>
+        </w:rPr>
+        <w:t xml:space="preserve">L’approche utilisée n’appliquait des méthodes fonctionnelles, ce qui est proposé dans le présent travail. </w:t>
+      </w:r>
+    </w:p>
+    <w:p>
+      <w:pPr>
+        <w:spacing w:line="240" w:lineRule="auto"/>
+        <w:jc w:val="both"/>
+        <w:rPr>
+          <w:rFonts w:cstheme="minorHAnsi"/>
+        </w:rPr>
+      </w:pPr>
+      <w:r>
+        <w:rPr>
+          <w:rFonts w:cstheme="minorHAnsi"/>
+        </w:rPr>
+        <w:t xml:space="preserve">Nous proposons donc d’utiliser des méthodes fonctionnelles pour tenter une meilleure prédiction du phénotype pendant la vigueur précoce à partir de données NIRS. </w:t>
+      </w:r>
+    </w:p>
+    <w:p>
+      <w:pPr>
+        <w:spacing w:line="240" w:lineRule="auto"/>
+        <w:jc w:val="both"/>
+        <w:rPr>
+          <w:rFonts w:cstheme="minorHAnsi"/>
+        </w:rPr>
+      </w:pPr>
+      <w:r>
+        <w:rPr>
+          <w:rFonts w:cstheme="minorHAnsi"/>
+        </w:rPr>
         <w:lastRenderedPageBreak/>
-        <w:t>Brouillon</w:t>
+        <w:t xml:space="preserve">La phase </w:t>
+      </w:r>
+      <w:r>
+        <w:rPr>
+          <w:rFonts w:cstheme="minorHAnsi"/>
+        </w:rPr>
+        <w:t>précoce</w:t>
+      </w:r>
+      <w:r>
+        <w:rPr>
+          <w:rFonts w:cstheme="minorHAnsi"/>
+        </w:rPr>
+        <w:t xml:space="preserve"> est la phase de croissance du colza entre la germination et l'étape ou la plante à </w:t>
+      </w:r>
+      <w:proofErr w:type="spellStart"/>
+      <w:r>
+        <w:rPr>
+          <w:rFonts w:cstheme="minorHAnsi"/>
+        </w:rPr>
+        <w:t>développée</w:t>
+      </w:r>
+      <w:proofErr w:type="spellEnd"/>
+      <w:r>
+        <w:rPr>
+          <w:rFonts w:cstheme="minorHAnsi"/>
+        </w:rPr>
+        <w:t xml:space="preserve"> 4 à 5 </w:t>
+      </w:r>
+      <w:r>
+        <w:rPr>
+          <w:rFonts w:cstheme="minorHAnsi"/>
+        </w:rPr>
+        <w:t>feuilles</w:t>
+      </w:r>
+      <w:r>
+        <w:rPr>
+          <w:rFonts w:cstheme="minorHAnsi"/>
+        </w:rPr>
+        <w:t xml:space="preserve"> (thèse). La </w:t>
+      </w:r>
+      <w:r>
+        <w:rPr>
+          <w:rFonts w:cstheme="minorHAnsi"/>
+        </w:rPr>
+        <w:t>vigueur</w:t>
+      </w:r>
+      <w:r>
+        <w:rPr>
+          <w:rFonts w:cstheme="minorHAnsi"/>
+        </w:rPr>
+        <w:t xml:space="preserve"> précoce du colza désigne la </w:t>
+      </w:r>
+      <w:r>
+        <w:rPr>
+          <w:rFonts w:cstheme="minorHAnsi"/>
+        </w:rPr>
+        <w:t>vigueur</w:t>
+      </w:r>
+      <w:r>
+        <w:rPr>
+          <w:rFonts w:cstheme="minorHAnsi"/>
+        </w:rPr>
+        <w:t xml:space="preserve"> aux cours de ce stade précoce. </w:t>
       </w:r>
     </w:p>
     <w:p>
@@ -1765,18 +2217,6 @@
           <w:rFonts w:cstheme="minorHAnsi"/>
         </w:rPr>
       </w:pPr>
-      <w:r>
-        <w:rPr>
-          <w:rFonts w:cstheme="minorHAnsi"/>
-        </w:rPr>
-        <w:t xml:space="preserve">En effet, les processus environnementaux ont un impact sur le phénotype ce qui peut altérer le lien entre génotype et phénotype. </w:t>
-      </w:r>
-      <w:r>
-        <w:rPr>
-          <w:rFonts w:cstheme="minorHAnsi"/>
-        </w:rPr>
-        <w:t xml:space="preserve">L’approche utilisée n’appliquait des méthodes fonctionnelles, ce qui est proposé dans le présent travail. </w:t>
-      </w:r>
     </w:p>
     <w:p>
       <w:pPr>
@@ -1790,7 +2230,31 @@
         <w:rPr>
           <w:rFonts w:cstheme="minorHAnsi"/>
         </w:rPr>
-        <w:t xml:space="preserve">Nous proposons donc d’utiliser des méthodes fonctionnelles pour tenter une meilleure prédiction du phénotype pendant la vigueur précoce à partir de données NIRS. </w:t>
+        <w:t xml:space="preserve">Un spectre infrarouge montre l'absorbance d'un composé en ordonnées en fonction des </w:t>
+      </w:r>
+      <w:r>
+        <w:rPr>
+          <w:rFonts w:cstheme="minorHAnsi"/>
+        </w:rPr>
+        <w:t>longueurs</w:t>
+      </w:r>
+      <w:r>
+        <w:rPr>
+          <w:rFonts w:cstheme="minorHAnsi"/>
+        </w:rPr>
+        <w:t xml:space="preserve"> d'ondes en </w:t>
+      </w:r>
+      <w:r>
+        <w:rPr>
+          <w:rFonts w:cstheme="minorHAnsi"/>
+        </w:rPr>
+        <w:t>abscisses</w:t>
+      </w:r>
+      <w:r>
+        <w:rPr>
+          <w:rFonts w:cstheme="minorHAnsi"/>
+        </w:rPr>
+        <w:t xml:space="preserve">. </w:t>
       </w:r>
     </w:p>
     <w:p>
@@ -1801,72 +2265,6 @@
           <w:rFonts w:cstheme="minorHAnsi"/>
         </w:rPr>
       </w:pPr>
-      <w:r>
-        <w:rPr>
-          <w:rFonts w:cstheme="minorHAnsi"/>
-        </w:rPr>
-        <w:t xml:space="preserve">La phase </w:t>
-      </w:r>
-      <w:r>
-        <w:rPr>
-          <w:rFonts w:cstheme="minorHAnsi"/>
-        </w:rPr>
-        <w:t>précoce</w:t>
-      </w:r>
-      <w:r>
-        <w:rPr>
-          <w:rFonts w:cstheme="minorHAnsi"/>
-        </w:rPr>
-        <w:t xml:space="preserve"> est la phase de croissance du colza entre la germination et l'étape ou la plante à </w:t>
-      </w:r>
-      <w:r>
-        <w:rPr>
-          <w:rFonts w:cstheme="minorHAnsi"/>
-        </w:rPr>
-        <w:t>développée</w:t>
-      </w:r>
-      <w:r>
-        <w:rPr>
-          <w:rFonts w:cstheme="minorHAnsi"/>
-        </w:rPr>
-        <w:t xml:space="preserve"> 4 à 5 </w:t>
-      </w:r>
-      <w:r>
-        <w:rPr>
-          <w:rFonts w:cstheme="minorHAnsi"/>
-        </w:rPr>
-        <w:t>feuilles</w:t>
-      </w:r>
-      <w:r>
-        <w:rPr>
-          <w:rFonts w:cstheme="minorHAnsi"/>
-        </w:rPr>
-        <w:t xml:space="preserve"> (thèse). La </w:t>
-      </w:r>
-      <w:r>
-        <w:rPr>
-          <w:rFonts w:cstheme="minorHAnsi"/>
-        </w:rPr>
-        <w:t>vigueur</w:t>
-      </w:r>
-      <w:r>
-        <w:rPr>
-          <w:rFonts w:cstheme="minorHAnsi"/>
-        </w:rPr>
-        <w:t xml:space="preserve"> précoce du colza désigne la </w:t>
-      </w:r>
-      <w:r>
-        <w:rPr>
-          <w:rFonts w:cstheme="minorHAnsi"/>
-        </w:rPr>
-        <w:t>vigueur</w:t>
-      </w:r>
-      <w:r>
-        <w:rPr>
-          <w:rFonts w:cstheme="minorHAnsi"/>
-        </w:rPr>
-        <w:t xml:space="preserve"> aux cours de ce stade précoce. </w:t>
-      </w:r>
     </w:p>
     <w:p>
       <w:pPr>
@@ -1876,6 +2274,24 @@
           <w:rFonts w:cstheme="minorHAnsi"/>
         </w:rPr>
       </w:pPr>
+      <w:r>
+        <w:rPr>
+          <w:rFonts w:cstheme="minorHAnsi"/>
+        </w:rPr>
+        <w:t xml:space="preserve">Données </w:t>
+      </w:r>
+      <w:r>
+        <w:rPr>
+          <w:rFonts w:cstheme="minorHAnsi"/>
+        </w:rPr>
+        <w:t>fonctionnelles :</w:t>
+      </w:r>
+      <w:r>
+        <w:rPr>
+          <w:rFonts w:cstheme="minorHAnsi"/>
+        </w:rPr>
+        <w:t xml:space="preserve"> </w:t>
+      </w:r>
     </w:p>
     <w:p>
       <w:pPr>
@@ -1889,81 +2305,6 @@
         <w:rPr>
           <w:rFonts w:cstheme="minorHAnsi"/>
         </w:rPr>
-        <w:t xml:space="preserve">Un spectre infrarouge montre l'absorbance d'un composé en ordonnées en fonction des </w:t>
-      </w:r>
-      <w:r>
-        <w:rPr>
-          <w:rFonts w:cstheme="minorHAnsi"/>
-        </w:rPr>
-        <w:t>longueurs</w:t>
-      </w:r>
-      <w:r>
-        <w:rPr>
-          <w:rFonts w:cstheme="minorHAnsi"/>
-        </w:rPr>
-        <w:t xml:space="preserve"> d'ondes en </w:t>
-      </w:r>
-      <w:r>
-        <w:rPr>
-          <w:rFonts w:cstheme="minorHAnsi"/>
-        </w:rPr>
-        <w:t>abscisses</w:t>
-      </w:r>
-      <w:r>
-        <w:rPr>
-          <w:rFonts w:cstheme="minorHAnsi"/>
-        </w:rPr>
-        <w:t xml:space="preserve">. </w:t>
-      </w:r>
-    </w:p>
-    <w:p>
-      <w:pPr>
-        <w:spacing w:line="240" w:lineRule="auto"/>
-        <w:jc w:val="both"/>
-        <w:rPr>
-          <w:rFonts w:cstheme="minorHAnsi"/>
-        </w:rPr>
-      </w:pPr>
-    </w:p>
-    <w:p>
-      <w:pPr>
-        <w:spacing w:line="240" w:lineRule="auto"/>
-        <w:jc w:val="both"/>
-        <w:rPr>
-          <w:rFonts w:cstheme="minorHAnsi"/>
-        </w:rPr>
-      </w:pPr>
-      <w:r>
-        <w:rPr>
-          <w:rFonts w:cstheme="minorHAnsi"/>
-        </w:rPr>
-        <w:t xml:space="preserve">Données </w:t>
-      </w:r>
-      <w:r>
-        <w:rPr>
-          <w:rFonts w:cstheme="minorHAnsi"/>
-        </w:rPr>
-        <w:t>fonctionnelles :</w:t>
-      </w:r>
-      <w:r>
-        <w:rPr>
-          <w:rFonts w:cstheme="minorHAnsi"/>
-        </w:rPr>
-        <w:t xml:space="preserve"> </w:t>
-      </w:r>
-    </w:p>
-    <w:p>
-      <w:pPr>
-        <w:spacing w:line="240" w:lineRule="auto"/>
-        <w:jc w:val="both"/>
-        <w:rPr>
-          <w:rFonts w:cstheme="minorHAnsi"/>
-        </w:rPr>
-      </w:pPr>
-      <w:r>
-        <w:rPr>
-          <w:rFonts w:cstheme="minorHAnsi"/>
-        </w:rPr>
         <w:t xml:space="preserve">L'amélioration des technologies d'acquisition de données permettent aujourd'hui de collecter des données de manière quasi continue. Les observations ne sont plus des valeurs ponctuelles mais peuvent être considérées comme des fonctions continues. Des observations de telles variables sont </w:t>
       </w:r>
       <w:r>
@@ -1988,7 +2329,35 @@
         <w:rPr>
           <w:rFonts w:cstheme="minorHAnsi"/>
         </w:rPr>
-        <w:t xml:space="preserve"> (FDA pour Functional Data Analysis). </w:t>
+        <w:t xml:space="preserve"> (FDA pour </w:t>
+      </w:r>
+      <w:proofErr w:type="spellStart"/>
+      <w:r>
+        <w:rPr>
+          <w:rFonts w:cstheme="minorHAnsi"/>
+        </w:rPr>
+        <w:t>Functional</w:t>
+      </w:r>
+      <w:proofErr w:type="spellEnd"/>
+      <w:r>
+        <w:rPr>
+          <w:rFonts w:cstheme="minorHAnsi"/>
+        </w:rPr>
+        <w:t xml:space="preserve"> Data </w:t>
+      </w:r>
+      <w:proofErr w:type="spellStart"/>
+      <w:r>
+        <w:rPr>
+          <w:rFonts w:cstheme="minorHAnsi"/>
+        </w:rPr>
+        <w:t>Analysis</w:t>
+      </w:r>
+      <w:proofErr w:type="spellEnd"/>
+      <w:r>
+        <w:rPr>
+          <w:rFonts w:cstheme="minorHAnsi"/>
+        </w:rPr>
+        <w:t xml:space="preserve">). </w:t>
       </w:r>
     </w:p>
     <w:p>
@@ -2040,7 +2409,21 @@
         <w:rPr>
           <w:rFonts w:cstheme="minorHAnsi"/>
         </w:rPr>
-        <w:t xml:space="preserve">. Par exemple, trouver une fonction spline sur des observations discrètes revient à trouver une variable fonctionnelle. </w:t>
+        <w:t xml:space="preserve">. Par exemple, trouver une fonction </w:t>
+      </w:r>
+      <w:proofErr w:type="spellStart"/>
+      <w:r>
+        <w:rPr>
+          <w:rFonts w:cstheme="minorHAnsi"/>
+        </w:rPr>
+        <w:t>spline</w:t>
+      </w:r>
+      <w:proofErr w:type="spellEnd"/>
+      <w:r>
+        <w:rPr>
+          <w:rFonts w:cstheme="minorHAnsi"/>
+        </w:rPr>
+        <w:t xml:space="preserve"> sur des observations discrètes revient à trouver une variable fonctionnelle. </w:t>
       </w:r>
     </w:p>
     <w:p>
@@ -2062,7 +2445,21 @@
         <w:rPr>
           <w:rFonts w:cstheme="minorHAnsi"/>
         </w:rPr>
-        <w:t xml:space="preserve">L'espace de fonction le plus étudié est l'espace de Hilbert. Un espace de Hilbert est un espace vectoriel (ie. </w:t>
+        <w:t>L'espace de fonction le plus étudié est l'espace de Hilbert. Un espace de Hilbert est un espace vectoriel (</w:t>
+      </w:r>
+      <w:proofErr w:type="spellStart"/>
+      <w:r>
+        <w:rPr>
+          <w:rFonts w:cstheme="minorHAnsi"/>
+        </w:rPr>
+        <w:t>ie</w:t>
+      </w:r>
+      <w:proofErr w:type="spellEnd"/>
+      <w:r>
+        <w:rPr>
+          <w:rFonts w:cstheme="minorHAnsi"/>
+        </w:rPr>
+        <w:t xml:space="preserve">. </w:t>
       </w:r>
       <w:r>
         <w:rPr>
@@ -2106,11 +2503,19 @@
           <w:rFonts w:cstheme="minorHAnsi"/>
         </w:rPr>
       </w:pPr>
-      <w:r>
-        <w:rPr>
-          <w:rFonts w:cstheme="minorHAnsi"/>
-        </w:rPr>
-        <w:t>Sample_ID: Numéro d'identification unique de l'échantillon.</w:t>
+      <w:proofErr w:type="spellStart"/>
+      <w:r>
+        <w:rPr>
+          <w:rFonts w:cstheme="minorHAnsi"/>
+        </w:rPr>
+        <w:t>Sample_ID</w:t>
+      </w:r>
+      <w:proofErr w:type="spellEnd"/>
+      <w:r>
+        <w:rPr>
+          <w:rFonts w:cstheme="minorHAnsi"/>
+        </w:rPr>
+        <w:t>: Numéro d'identification unique de l'échantillon.</w:t>
       </w:r>
     </w:p>
     <w:p>
@@ -2142,7 +2547,34 @@
           <w:rFonts w:cstheme="minorHAnsi"/>
         </w:rPr>
         <w:br/>
-        <w:t>Growth season: Saison de croissance (2014-2015; 2015-2016; 2016-2017).</w:t>
+      </w:r>
+      <w:proofErr w:type="spellStart"/>
+      <w:r>
+        <w:rPr>
+          <w:rFonts w:cstheme="minorHAnsi"/>
+        </w:rPr>
+        <w:t>Growth</w:t>
+      </w:r>
+      <w:proofErr w:type="spellEnd"/>
+      <w:r>
+        <w:rPr>
+          <w:rFonts w:cstheme="minorHAnsi"/>
+        </w:rPr>
+        <w:t xml:space="preserve"> </w:t>
+      </w:r>
+      <w:proofErr w:type="spellStart"/>
+      <w:r>
+        <w:rPr>
+          <w:rFonts w:cstheme="minorHAnsi"/>
+        </w:rPr>
+        <w:t>season</w:t>
+      </w:r>
+      <w:proofErr w:type="spellEnd"/>
+      <w:r>
+        <w:rPr>
+          <w:rFonts w:cstheme="minorHAnsi"/>
+        </w:rPr>
+        <w:t>: Saison de croissance (2014-2015; 2015-2016; 2016-2017).</w:t>
       </w:r>
     </w:p>
     <w:p>
@@ -2158,7 +2590,20 @@
           <w:rFonts w:cstheme="minorHAnsi"/>
         </w:rPr>
         <w:br/>
-        <w:t xml:space="preserve">Growth condition: Conditions de culture soit en champs soit en tunnel </w:t>
+      </w:r>
+      <w:proofErr w:type="spellStart"/>
+      <w:r>
+        <w:rPr>
+          <w:rFonts w:cstheme="minorHAnsi"/>
+        </w:rPr>
+        <w:t>Growth</w:t>
+      </w:r>
+      <w:proofErr w:type="spellEnd"/>
+      <w:r>
+        <w:rPr>
+          <w:rFonts w:cstheme="minorHAnsi"/>
+        </w:rPr>
+        <w:t xml:space="preserve"> condition: Conditions de culture soit en champs soit en tunnel </w:t>
       </w:r>
     </w:p>
     <w:p>
@@ -2174,58 +2619,108 @@
           <w:rFonts w:cstheme="minorHAnsi"/>
         </w:rPr>
         <w:br/>
-        <w:t xml:space="preserve">N regime: Fertilisation azoté apporté au stade de monté en graine. N+ désigne des apports </w:t>
-      </w:r>
+        <w:t xml:space="preserve">N </w:t>
+      </w:r>
+      <w:proofErr w:type="spellStart"/>
+      <w:r>
+        <w:rPr>
+          <w:rFonts w:cstheme="minorHAnsi"/>
+        </w:rPr>
+        <w:t>regime</w:t>
+      </w:r>
+      <w:proofErr w:type="spellEnd"/>
+      <w:r>
+        <w:rPr>
+          <w:rFonts w:cstheme="minorHAnsi"/>
+        </w:rPr>
+        <w:t xml:space="preserve">: Fertilisation azoté apporté au stade de monté en graine. N+ désigne des apports azotés optimaux pour atteindre un </w:t>
+      </w:r>
+      <w:r>
+        <w:rPr>
+          <w:rFonts w:cstheme="minorHAnsi"/>
+        </w:rPr>
+        <w:t>rendement</w:t>
+      </w:r>
+      <w:r>
+        <w:rPr>
+          <w:rFonts w:cstheme="minorHAnsi"/>
+        </w:rPr>
+        <w:t xml:space="preserve"> de 3.5 t.ha-1 de graine de colza. N- désigne un apport sous-optimal de  80-100 kg.ha-1 d'azote</w:t>
+      </w:r>
+    </w:p>
+    <w:p>
+      <w:pPr>
+        <w:spacing w:line="240" w:lineRule="auto"/>
+        <w:jc w:val="both"/>
+        <w:rPr>
+          <w:rFonts w:cstheme="minorHAnsi"/>
+        </w:rPr>
+      </w:pPr>
+      <w:r>
+        <w:rPr>
+          <w:rFonts w:cstheme="minorHAnsi"/>
+        </w:rPr>
+        <w:br/>
+        <w:t xml:space="preserve">W </w:t>
+      </w:r>
+      <w:proofErr w:type="spellStart"/>
+      <w:r>
+        <w:rPr>
+          <w:rFonts w:cstheme="minorHAnsi"/>
+        </w:rPr>
+        <w:t>regime</w:t>
+      </w:r>
+      <w:proofErr w:type="spellEnd"/>
+      <w:r>
+        <w:rPr>
+          <w:rFonts w:cstheme="minorHAnsi"/>
+        </w:rPr>
+        <w:t xml:space="preserve">: Apports en eau </w:t>
+      </w:r>
+      <w:proofErr w:type="spellStart"/>
+      <w:r>
+        <w:rPr>
+          <w:rFonts w:cstheme="minorHAnsi"/>
+        </w:rPr>
+        <w:t>a</w:t>
+      </w:r>
+      <w:proofErr w:type="spellEnd"/>
+      <w:r>
+        <w:rPr>
+          <w:rFonts w:cstheme="minorHAnsi"/>
+        </w:rPr>
+        <w:t xml:space="preserve"> partir du stade de floraison. W+ indique un apport en eau optimal avec un potentiel en eau du substrat de -200 mbar. W- correspond à un apport en eau sous-optimal avec un potentiel en eau du substrat de -600 mbar. </w:t>
+      </w:r>
+    </w:p>
+    <w:p>
+      <w:pPr>
+        <w:spacing w:line="240" w:lineRule="auto"/>
+        <w:jc w:val="both"/>
+        <w:rPr>
+          <w:rFonts w:cstheme="minorHAnsi"/>
+        </w:rPr>
+      </w:pPr>
       <w:r>
         <w:rPr>
           <w:rFonts w:cstheme="minorHAnsi"/>
         </w:rPr>
         <w:lastRenderedPageBreak/>
-        <w:t xml:space="preserve">azotés optimaux pour atteindre un </w:t>
-      </w:r>
-      <w:r>
-        <w:rPr>
-          <w:rFonts w:cstheme="minorHAnsi"/>
-        </w:rPr>
-        <w:t>rendement</w:t>
-      </w:r>
-      <w:r>
-        <w:rPr>
-          <w:rFonts w:cstheme="minorHAnsi"/>
-        </w:rPr>
-        <w:t xml:space="preserve"> de 3.5 t.ha-1 de graine de colza. N- désigne un apport sous-optimal de  80-100 kg.ha-1 d'azote</w:t>
-      </w:r>
-    </w:p>
-    <w:p>
-      <w:pPr>
-        <w:spacing w:line="240" w:lineRule="auto"/>
-        <w:jc w:val="both"/>
-        <w:rPr>
-          <w:rFonts w:cstheme="minorHAnsi"/>
-        </w:rPr>
-      </w:pPr>
-      <w:r>
-        <w:rPr>
-          <w:rFonts w:cstheme="minorHAnsi"/>
-        </w:rPr>
         <w:br/>
-        <w:t xml:space="preserve">W regime: Apports en eau a partir du stade de floraison. W+ indique un apport en eau optimal avec un potentiel en eau du substrat de -200 mbar. W- correspond à un apport en eau sous-optimal avec un potentiel en eau du substrat de -600 mbar. </w:t>
-      </w:r>
-    </w:p>
-    <w:p>
-      <w:pPr>
-        <w:spacing w:line="240" w:lineRule="auto"/>
-        <w:jc w:val="both"/>
-        <w:rPr>
-          <w:rFonts w:cstheme="minorHAnsi"/>
-        </w:rPr>
-      </w:pPr>
-      <w:r>
-        <w:rPr>
-          <w:rFonts w:cstheme="minorHAnsi"/>
-        </w:rPr>
-        <w:br/>
-        <w:t>Tissue: Tissus végétaux d'ou proviennent les échantillons dont les racines, les feuilles, les tiges, les fleurs et les gousses de graines.</w:t>
+        <w:t>Tissue: Tissus végétaux d'</w:t>
+      </w:r>
+      <w:proofErr w:type="spellStart"/>
+      <w:r>
+        <w:rPr>
+          <w:rFonts w:cstheme="minorHAnsi"/>
+        </w:rPr>
+        <w:t>ou</w:t>
+      </w:r>
+      <w:proofErr w:type="spellEnd"/>
+      <w:r>
+        <w:rPr>
+          <w:rFonts w:cstheme="minorHAnsi"/>
+        </w:rPr>
+        <w:t xml:space="preserve"> proviennent les échantillons dont les racines, les feuilles, les tiges, les fleurs et les gousses de graines.</w:t>
       </w:r>
     </w:p>
     <w:p>
@@ -2253,7 +2748,35 @@
         <w:rPr>
           <w:rFonts w:cstheme="minorHAnsi"/>
         </w:rPr>
-        <w:t xml:space="preserve"> d'ou on été prélevés les échantillons. </w:t>
+        <w:t xml:space="preserve"> d'</w:t>
+      </w:r>
+      <w:proofErr w:type="spellStart"/>
+      <w:r>
+        <w:rPr>
+          <w:rFonts w:cstheme="minorHAnsi"/>
+        </w:rPr>
+        <w:t>ou</w:t>
+      </w:r>
+      <w:proofErr w:type="spellEnd"/>
+      <w:r>
+        <w:rPr>
+          <w:rFonts w:cstheme="minorHAnsi"/>
+        </w:rPr>
+        <w:t xml:space="preserve"> </w:t>
+      </w:r>
+      <w:proofErr w:type="spellStart"/>
+      <w:r>
+        <w:rPr>
+          <w:rFonts w:cstheme="minorHAnsi"/>
+        </w:rPr>
+        <w:t>on</w:t>
+      </w:r>
+      <w:proofErr w:type="spellEnd"/>
+      <w:r>
+        <w:rPr>
+          <w:rFonts w:cstheme="minorHAnsi"/>
+        </w:rPr>
+        <w:t xml:space="preserve"> été prélevés les échantillons. </w:t>
       </w:r>
     </w:p>
     <w:p>
@@ -2420,7 +2943,20 @@
           <w:rFonts w:cstheme="minorHAnsi"/>
         </w:rPr>
         <w:br/>
-        <w:t xml:space="preserve">N_model_set-type: Désigne des échantillons sélectionnés pour la calibration (Cal) ou la validation (Val) pour le modèle de prédiction de l'azote. </w:t>
+      </w:r>
+      <w:proofErr w:type="spellStart"/>
+      <w:r>
+        <w:rPr>
+          <w:rFonts w:cstheme="minorHAnsi"/>
+        </w:rPr>
+        <w:t>N_model_set</w:t>
+      </w:r>
+      <w:proofErr w:type="spellEnd"/>
+      <w:r>
+        <w:rPr>
+          <w:rFonts w:cstheme="minorHAnsi"/>
+        </w:rPr>
+        <w:t xml:space="preserve">-type: Désigne des échantillons sélectionnés pour la calibration (Cal) ou la validation (Val) pour le modèle de prédiction de l'azote. </w:t>
       </w:r>
     </w:p>
     <w:p>
@@ -2452,7 +2988,20 @@
           <w:rFonts w:cstheme="minorHAnsi"/>
         </w:rPr>
         <w:br/>
-        <w:t xml:space="preserve">C_model_set-type: Désigne des échantillons sélectionnés pour la calibration (Cal) ou la validation (Val) pour le modèle de prédiction du carbone. </w:t>
+      </w:r>
+      <w:proofErr w:type="spellStart"/>
+      <w:r>
+        <w:rPr>
+          <w:rFonts w:cstheme="minorHAnsi"/>
+        </w:rPr>
+        <w:t>C_model_set</w:t>
+      </w:r>
+      <w:proofErr w:type="spellEnd"/>
+      <w:r>
+        <w:rPr>
+          <w:rFonts w:cstheme="minorHAnsi"/>
+        </w:rPr>
+        <w:t xml:space="preserve">-type: Désigne des échantillons sélectionnés pour la calibration (Cal) ou la validation (Val) pour le modèle de prédiction du carbone. </w:t>
       </w:r>
     </w:p>
     <w:p>
@@ -2468,7 +3017,20 @@
           <w:rFonts w:cstheme="minorHAnsi"/>
         </w:rPr>
         <w:br/>
-        <w:t>Spectra_acquisition_year: Années d'acquisition des spectres, ici 2027</w:t>
+      </w:r>
+      <w:proofErr w:type="spellStart"/>
+      <w:r>
+        <w:rPr>
+          <w:rFonts w:cstheme="minorHAnsi"/>
+        </w:rPr>
+        <w:t>Spectra_acquisition_year</w:t>
+      </w:r>
+      <w:proofErr w:type="spellEnd"/>
+      <w:r>
+        <w:rPr>
+          <w:rFonts w:cstheme="minorHAnsi"/>
+        </w:rPr>
+        <w:t>: Années d'acquisition des spectres, ici 2027</w:t>
       </w:r>
     </w:p>
     <w:p>
@@ -2484,7 +3046,76 @@
           <w:rFonts w:cstheme="minorHAnsi"/>
         </w:rPr>
         <w:br/>
-        <w:t xml:space="preserve">Cup_type: Indique le type de vial en verre utilisés pour l'acquisition du spectre NIRS. “fix” désigne des vials de 22 mm de diamètre sur un support fixé. “rotating” sont des vials de 51 mm de diamètre placé sur un support rotatif. </w:t>
+      </w:r>
+      <w:proofErr w:type="spellStart"/>
+      <w:r>
+        <w:rPr>
+          <w:rFonts w:cstheme="minorHAnsi"/>
+        </w:rPr>
+        <w:t>Cup_type</w:t>
+      </w:r>
+      <w:proofErr w:type="spellEnd"/>
+      <w:r>
+        <w:rPr>
+          <w:rFonts w:cstheme="minorHAnsi"/>
+        </w:rPr>
+        <w:t xml:space="preserve">: Indique le type de </w:t>
+      </w:r>
+      <w:proofErr w:type="spellStart"/>
+      <w:r>
+        <w:rPr>
+          <w:rFonts w:cstheme="minorHAnsi"/>
+        </w:rPr>
+        <w:t>vial</w:t>
+      </w:r>
+      <w:proofErr w:type="spellEnd"/>
+      <w:r>
+        <w:rPr>
+          <w:rFonts w:cstheme="minorHAnsi"/>
+        </w:rPr>
+        <w:t xml:space="preserve"> en verre utilisés pour l'acquisition du spectre NIRS. “fix” désigne des </w:t>
+      </w:r>
+      <w:proofErr w:type="spellStart"/>
+      <w:r>
+        <w:rPr>
+          <w:rFonts w:cstheme="minorHAnsi"/>
+        </w:rPr>
+        <w:t>vials</w:t>
+      </w:r>
+      <w:proofErr w:type="spellEnd"/>
+      <w:r>
+        <w:rPr>
+          <w:rFonts w:cstheme="minorHAnsi"/>
+        </w:rPr>
+        <w:t xml:space="preserve"> de 22 mm de diamètre sur un support fixé. “</w:t>
+      </w:r>
+      <w:proofErr w:type="spellStart"/>
+      <w:r>
+        <w:rPr>
+          <w:rFonts w:cstheme="minorHAnsi"/>
+        </w:rPr>
+        <w:t>rotating</w:t>
+      </w:r>
+      <w:proofErr w:type="spellEnd"/>
+      <w:r>
+        <w:rPr>
+          <w:rFonts w:cstheme="minorHAnsi"/>
+        </w:rPr>
+        <w:t xml:space="preserve">” sont des </w:t>
+      </w:r>
+      <w:proofErr w:type="spellStart"/>
+      <w:r>
+        <w:rPr>
+          <w:rFonts w:cstheme="minorHAnsi"/>
+        </w:rPr>
+        <w:t>vials</w:t>
+      </w:r>
+      <w:proofErr w:type="spellEnd"/>
+      <w:r>
+        <w:rPr>
+          <w:rFonts w:cstheme="minorHAnsi"/>
+        </w:rPr>
+        <w:t xml:space="preserve"> de 51 mm de diamètre placé sur un support rotatif. </w:t>
       </w:r>
     </w:p>
     <w:p>
@@ -2544,7 +3175,21 @@
         <w:rPr>
           <w:rFonts w:cstheme="minorHAnsi"/>
         </w:rPr>
-        <w:t>Démarche spline :</w:t>
+        <w:t xml:space="preserve">Démarche </w:t>
+      </w:r>
+      <w:proofErr w:type="spellStart"/>
+      <w:r>
+        <w:rPr>
+          <w:rFonts w:cstheme="minorHAnsi"/>
+        </w:rPr>
+        <w:t>spline</w:t>
+      </w:r>
+      <w:proofErr w:type="spellEnd"/>
+      <w:r>
+        <w:rPr>
+          <w:rFonts w:cstheme="minorHAnsi"/>
+        </w:rPr>
+        <w:t> :</w:t>
       </w:r>
     </w:p>
     <w:sectPr>
@@ -2786,6 +3431,118 @@
     </w:lvl>
   </w:abstractNum>
   <w:abstractNum w:abstractNumId="2" w15:restartNumberingAfterBreak="0">
+    <w:nsid w:val="34AF4F90"/>
+    <w:multiLevelType w:val="hybridMultilevel"/>
+    <w:tmpl w:val="19703F04"/>
+    <w:lvl w:ilvl="0" w:tplc="770467CA">
+      <w:numFmt w:val="bullet"/>
+      <w:lvlText w:val="-"/>
+      <w:lvlJc w:val="left"/>
+      <w:pPr>
+        <w:ind w:left="720" w:hanging="360"/>
+      </w:pPr>
+      <w:rPr>
+        <w:rFonts w:ascii="Calibri" w:eastAsiaTheme="minorHAnsi" w:hAnsi="Calibri" w:cs="Calibri" w:hint="default"/>
+      </w:rPr>
+    </w:lvl>
+    <w:lvl w:ilvl="1" w:tplc="040C0003" w:tentative="1">
+      <w:start w:val="1"/>
+      <w:numFmt w:val="bullet"/>
+      <w:lvlText w:val="o"/>
+      <w:lvlJc w:val="left"/>
+      <w:pPr>
+        <w:ind w:left="1440" w:hanging="360"/>
+      </w:pPr>
+      <w:rPr>
+        <w:rFonts w:ascii="Courier New" w:hAnsi="Courier New" w:cs="Courier New" w:hint="default"/>
+      </w:rPr>
+    </w:lvl>
+    <w:lvl w:ilvl="2" w:tplc="040C0005" w:tentative="1">
+      <w:start w:val="1"/>
+      <w:numFmt w:val="bullet"/>
+      <w:lvlText w:val=""/>
+      <w:lvlJc w:val="left"/>
+      <w:pPr>
+        <w:ind w:left="2160" w:hanging="360"/>
+      </w:pPr>
+      <w:rPr>
+        <w:rFonts w:ascii="Wingdings" w:hAnsi="Wingdings" w:hint="default"/>
+      </w:rPr>
+    </w:lvl>
+    <w:lvl w:ilvl="3" w:tplc="040C0001" w:tentative="1">
+      <w:start w:val="1"/>
+      <w:numFmt w:val="bullet"/>
+      <w:lvlText w:val=""/>
+      <w:lvlJc w:val="left"/>
+      <w:pPr>
+        <w:ind w:left="2880" w:hanging="360"/>
+      </w:pPr>
+      <w:rPr>
+        <w:rFonts w:ascii="Symbol" w:hAnsi="Symbol" w:hint="default"/>
+      </w:rPr>
+    </w:lvl>
+    <w:lvl w:ilvl="4" w:tplc="040C0003" w:tentative="1">
+      <w:start w:val="1"/>
+      <w:numFmt w:val="bullet"/>
+      <w:lvlText w:val="o"/>
+      <w:lvlJc w:val="left"/>
+      <w:pPr>
+        <w:ind w:left="3600" w:hanging="360"/>
+      </w:pPr>
+      <w:rPr>
+        <w:rFonts w:ascii="Courier New" w:hAnsi="Courier New" w:cs="Courier New" w:hint="default"/>
+      </w:rPr>
+    </w:lvl>
+    <w:lvl w:ilvl="5" w:tplc="040C0005" w:tentative="1">
+      <w:start w:val="1"/>
+      <w:numFmt w:val="bullet"/>
+      <w:lvlText w:val=""/>
+      <w:lvlJc w:val="left"/>
+      <w:pPr>
+        <w:ind w:left="4320" w:hanging="360"/>
+      </w:pPr>
+      <w:rPr>
+        <w:rFonts w:ascii="Wingdings" w:hAnsi="Wingdings" w:hint="default"/>
+      </w:rPr>
+    </w:lvl>
+    <w:lvl w:ilvl="6" w:tplc="040C0001" w:tentative="1">
+      <w:start w:val="1"/>
+      <w:numFmt w:val="bullet"/>
+      <w:lvlText w:val=""/>
+      <w:lvlJc w:val="left"/>
+      <w:pPr>
+        <w:ind w:left="5040" w:hanging="360"/>
+      </w:pPr>
+      <w:rPr>
+        <w:rFonts w:ascii="Symbol" w:hAnsi="Symbol" w:hint="default"/>
+      </w:rPr>
+    </w:lvl>
+    <w:lvl w:ilvl="7" w:tplc="040C0003" w:tentative="1">
+      <w:start w:val="1"/>
+      <w:numFmt w:val="bullet"/>
+      <w:lvlText w:val="o"/>
+      <w:lvlJc w:val="left"/>
+      <w:pPr>
+        <w:ind w:left="5760" w:hanging="360"/>
+      </w:pPr>
+      <w:rPr>
+        <w:rFonts w:ascii="Courier New" w:hAnsi="Courier New" w:cs="Courier New" w:hint="default"/>
+      </w:rPr>
+    </w:lvl>
+    <w:lvl w:ilvl="8" w:tplc="040C0005" w:tentative="1">
+      <w:start w:val="1"/>
+      <w:numFmt w:val="bullet"/>
+      <w:lvlText w:val=""/>
+      <w:lvlJc w:val="left"/>
+      <w:pPr>
+        <w:ind w:left="6480" w:hanging="360"/>
+      </w:pPr>
+      <w:rPr>
+        <w:rFonts w:ascii="Wingdings" w:hAnsi="Wingdings" w:hint="default"/>
+      </w:rPr>
+    </w:lvl>
+  </w:abstractNum>
+  <w:abstractNum w:abstractNumId="3" w15:restartNumberingAfterBreak="0">
     <w:nsid w:val="411A49F2"/>
     <w:multiLevelType w:val="hybridMultilevel"/>
     <w:tmpl w:val="FEC46624"/>
@@ -2897,7 +3654,7 @@
       </w:rPr>
     </w:lvl>
   </w:abstractNum>
-  <w:abstractNum w:abstractNumId="3" w15:restartNumberingAfterBreak="0">
+  <w:abstractNum w:abstractNumId="4" w15:restartNumberingAfterBreak="0">
     <w:nsid w:val="73363AE9"/>
     <w:multiLevelType w:val="hybridMultilevel"/>
     <w:tmpl w:val="658AFA96"/>
@@ -3010,7 +3767,7 @@
       </w:rPr>
     </w:lvl>
   </w:abstractNum>
-  <w:abstractNum w:abstractNumId="4" w15:restartNumberingAfterBreak="0">
+  <w:abstractNum w:abstractNumId="5" w15:restartNumberingAfterBreak="0">
     <w:nsid w:val="78866E53"/>
     <w:multiLevelType w:val="hybridMultilevel"/>
     <w:tmpl w:val="D376EF92"/>
@@ -3123,7 +3880,7 @@
     </w:lvl>
   </w:abstractNum>
   <w:num w:numId="1" w16cid:durableId="442846978">
-    <w:abstractNumId w:val="4"/>
+    <w:abstractNumId w:val="5"/>
   </w:num>
   <w:num w:numId="2" w16cid:durableId="1562013530">
     <w:abstractNumId w:val="1"/>
@@ -3132,9 +3889,12 @@
     <w:abstractNumId w:val="0"/>
   </w:num>
   <w:num w:numId="4" w16cid:durableId="588125985">
+    <w:abstractNumId w:val="4"/>
+  </w:num>
+  <w:num w:numId="5" w16cid:durableId="216859866">
     <w:abstractNumId w:val="3"/>
   </w:num>
-  <w:num w:numId="5" w16cid:durableId="216859866">
+  <w:num w:numId="6" w16cid:durableId="205724411">
     <w:abstractNumId w:val="2"/>
   </w:num>
 </w:numbering>

</xml_diff>

<commit_message>
Ajout figure dans Notes
</commit_message>
<xml_diff>
--- a/doc/Notes.docx
+++ b/doc/Notes.docx
@@ -2044,6 +2044,44 @@
         <w:pStyle w:val="Sansinterligne"/>
         <w:jc w:val="both"/>
       </w:pPr>
+      <w:r>
+        <w:lastRenderedPageBreak/>
+        <w:drawing>
+          <wp:inline distT="0" distB="0" distL="0" distR="0" wp14:anchorId="1058FDEF" wp14:editId="7E702CAE">
+            <wp:extent cx="4730993" cy="3378374"/>
+            <wp:effectExtent l="0" t="0" r="0" b="0"/>
+            <wp:docPr id="2126417076" name="Image 1" descr="Une image contenant texte, capture d’écran, diagramme, ligne&#10;&#10;Le contenu généré par l’IA peut être incorrect."/>
+            <wp:cNvGraphicFramePr>
+              <a:graphicFrameLocks xmlns:a="http://schemas.openxmlformats.org/drawingml/2006/main" noChangeAspect="1"/>
+            </wp:cNvGraphicFramePr>
+            <a:graphic xmlns:a="http://schemas.openxmlformats.org/drawingml/2006/main">
+              <a:graphicData uri="http://schemas.openxmlformats.org/drawingml/2006/picture">
+                <pic:pic xmlns:pic="http://schemas.openxmlformats.org/drawingml/2006/picture">
+                  <pic:nvPicPr>
+                    <pic:cNvPr id="2126417076" name="Image 1" descr="Une image contenant texte, capture d’écran, diagramme, ligne&#10;&#10;Le contenu généré par l’IA peut être incorrect."/>
+                    <pic:cNvPicPr/>
+                  </pic:nvPicPr>
+                  <pic:blipFill>
+                    <a:blip r:embed="rId8"/>
+                    <a:stretch>
+                      <a:fillRect/>
+                    </a:stretch>
+                  </pic:blipFill>
+                  <pic:spPr>
+                    <a:xfrm>
+                      <a:off x="0" y="0"/>
+                      <a:ext cx="4730993" cy="3378374"/>
+                    </a:xfrm>
+                    <a:prstGeom prst="rect">
+                      <a:avLst/>
+                    </a:prstGeom>
+                  </pic:spPr>
+                </pic:pic>
+              </a:graphicData>
+            </a:graphic>
+          </wp:inline>
+        </w:drawing>
+      </w:r>
     </w:p>
     <w:p>
       <w:pPr>
@@ -2090,7 +2128,6 @@
         <w:pStyle w:val="Titre3"/>
       </w:pPr>
       <w:r>
-        <w:lastRenderedPageBreak/>
         <w:t>Régression fonctionnelle : méthode des B-</w:t>
       </w:r>
       <w:proofErr w:type="spellStart"/>
@@ -2238,6 +2275,7 @@
         </w:numPr>
       </w:pPr>
       <w:r>
+        <w:lastRenderedPageBreak/>
         <w:t>Modèle d’association des spectres par variété</w:t>
       </w:r>
     </w:p>
@@ -2400,7 +2438,6 @@
         <w:rPr>
           <w:rFonts w:cstheme="minorHAnsi"/>
         </w:rPr>
-        <w:lastRenderedPageBreak/>
         <w:t xml:space="preserve">La phase </w:t>
       </w:r>
       <w:r>
@@ -2702,6 +2739,7 @@
         <w:rPr>
           <w:rFonts w:cstheme="minorHAnsi"/>
         </w:rPr>
+        <w:lastRenderedPageBreak/>
         <w:t>L'espace de fonction le plus étudié est l'espace de Hilbert. Un espace de Hilbert est un espace vectoriel (</w:t>
       </w:r>
       <w:proofErr w:type="spellStart"/>
@@ -2961,7 +2999,6 @@
         <w:rPr>
           <w:rFonts w:cstheme="minorHAnsi"/>
         </w:rPr>
-        <w:lastRenderedPageBreak/>
         <w:br/>
         <w:t>Tissue: Tissus végétaux d'</w:t>
       </w:r>
@@ -3228,6 +3265,7 @@
         <w:rPr>
           <w:rFonts w:cstheme="minorHAnsi"/>
         </w:rPr>
+        <w:lastRenderedPageBreak/>
         <w:br/>
         <w:t>C content (%DM): Contenu en carbone dans l'échantillon en pourcentage de matière sèche.</w:t>
       </w:r>

</xml_diff>

<commit_message>
Update "notes" ==> Add modeles
</commit_message>
<xml_diff>
--- a/doc/Notes.docx
+++ b/doc/Notes.docx
@@ -675,6 +675,406 @@
       </w:r>
     </w:p>
     <w:p>
+      <w:r>
+        <w:t>Les données de spectres ont eu 3 méthodes de prétraitement différentes.</w:t>
+      </w:r>
+    </w:p>
+    <w:p>
+      <w:pPr>
+        <w:rPr>
+          <w:b/>
+          <w:bCs/>
+          <w:u w:val="single"/>
+        </w:rPr>
+      </w:pPr>
+      <w:r>
+        <w:rPr>
+          <w:b/>
+          <w:bCs/>
+          <w:u w:val="single"/>
+        </w:rPr>
+        <w:t>Correction 1 :</w:t>
+      </w:r>
+    </w:p>
+    <w:p>
+      <w:r>
+        <w:tab/>
+        <w:t>L’o</w:t>
+      </w:r>
+      <w:r>
+        <w:t>b</w:t>
+      </w:r>
+      <w:r>
+        <w:t>te</w:t>
+      </w:r>
+      <w:r>
+        <w:t>n</w:t>
+      </w:r>
+      <w:r>
+        <w:t>tion d’un spectre moyen par génotype, pour  les feuilles sèches et les graines. Ce spectre est calculé comme la moyenne arithmétique des spectres pour un génotype (jeu de donnée MEAN). Les modèles seront nommés HBLUP</w:t>
+      </w:r>
+      <w:r>
+        <w:rPr>
+          <w:vertAlign w:val="subscript"/>
+        </w:rPr>
+        <w:t>leaf1</w:t>
+      </w:r>
+      <w:r>
+        <w:t xml:space="preserve"> pour les feuilles et HBLUP</w:t>
+      </w:r>
+      <w:r>
+        <w:softHyphen/>
+      </w:r>
+      <w:r>
+        <w:softHyphen/>
+      </w:r>
+      <w:r>
+        <w:softHyphen/>
+      </w:r>
+      <w:r>
+        <w:rPr>
+          <w:vertAlign w:val="subscript"/>
+        </w:rPr>
+        <w:t>seed1</w:t>
+      </w:r>
+      <w:r>
+        <w:t xml:space="preserve"> pour les graines</w:t>
+      </w:r>
+    </w:p>
+    <w:p>
+      <w:pPr>
+        <w:rPr>
+          <w:b/>
+          <w:bCs/>
+          <w:u w:val="single"/>
+        </w:rPr>
+      </w:pPr>
+      <w:r>
+        <w:rPr>
+          <w:b/>
+          <w:bCs/>
+          <w:u w:val="single"/>
+        </w:rPr>
+        <w:t>Correction 2 :</w:t>
+      </w:r>
+    </w:p>
+    <w:p>
+      <w:r>
+        <w:tab/>
+        <w:t xml:space="preserve">L’obtention de moyennes ajustées (BLUE) pour chaque longueur d’onde et chaque génotype pour corriger les effets environnementaux subis par les plantes pendant l’acquisition des données. Cette correction n’est pas appliquée sur les graines qui ont subis les mêmes conditions d’obtention. Le modèle utilisé pour calculer les valeurs BLUE sont obtenus avec le modèle suivant : </w:t>
+      </w:r>
+    </w:p>
+    <w:p>
+      <w:pPr>
+        <w:jc w:val="center"/>
+        <w:rPr>
+          <w:rFonts w:ascii="Cambria Math" w:hAnsi="Cambria Math" w:cs="Cambria Math"/>
+          <w:sz w:val="22"/>
+          <w:vertAlign w:val="subscript"/>
+        </w:rPr>
+      </w:pPr>
+      <w:r>
+        <w:rPr>
+          <w:rFonts w:ascii="Cambria Math" w:hAnsi="Cambria Math" w:cs="Cambria Math"/>
+          <w:sz w:val="22"/>
+        </w:rPr>
+        <w:t>𝐴</w:t>
+      </w:r>
+      <w:r>
+        <w:rPr>
+          <w:sz w:val="22"/>
+        </w:rPr>
+        <w:t xml:space="preserve"> = </w:t>
+      </w:r>
+      <w:r>
+        <w:rPr>
+          <w:rFonts w:ascii="Cambria Math" w:hAnsi="Cambria Math" w:cs="Cambria Math"/>
+          <w:sz w:val="22"/>
+        </w:rPr>
+        <w:t>𝜇</w:t>
+      </w:r>
+      <w:r>
+        <w:rPr>
+          <w:sz w:val="22"/>
+        </w:rPr>
+        <w:t>+</w:t>
+      </w:r>
+      <w:r>
+        <w:rPr>
+          <w:rFonts w:ascii="Cambria Math" w:hAnsi="Cambria Math" w:cs="Cambria Math"/>
+          <w:sz w:val="22"/>
+        </w:rPr>
+        <w:t>𝑏𝑙𝑜𝑐</w:t>
+      </w:r>
+      <w:r>
+        <w:rPr>
+          <w:rFonts w:ascii="Cambria Math" w:hAnsi="Cambria Math" w:cs="Cambria Math"/>
+          <w:sz w:val="22"/>
+          <w:vertAlign w:val="subscript"/>
+        </w:rPr>
+        <w:t>j</w:t>
+      </w:r>
+      <w:r>
+        <w:rPr>
+          <w:sz w:val="22"/>
+        </w:rPr>
+        <w:t>+</w:t>
+      </w:r>
+      <w:r>
+        <w:rPr>
+          <w:rFonts w:ascii="Cambria Math" w:hAnsi="Cambria Math" w:cs="Cambria Math"/>
+          <w:sz w:val="22"/>
+        </w:rPr>
+        <w:t>𝑇</w:t>
+      </w:r>
+      <w:r>
+        <w:rPr>
+          <w:sz w:val="22"/>
+        </w:rPr>
+        <w:t>é</w:t>
+      </w:r>
+      <w:r>
+        <w:rPr>
+          <w:rFonts w:ascii="Cambria Math" w:hAnsi="Cambria Math" w:cs="Cambria Math"/>
+          <w:sz w:val="22"/>
+        </w:rPr>
+        <w:t>𝑚𝑜𝑖𝑛</w:t>
+      </w:r>
+      <w:r>
+        <w:rPr>
+          <w:rFonts w:ascii="Cambria Math" w:hAnsi="Cambria Math" w:cs="Cambria Math"/>
+          <w:sz w:val="22"/>
+          <w:vertAlign w:val="subscript"/>
+        </w:rPr>
+        <w:t>l</w:t>
+      </w:r>
+      <w:r>
+        <w:rPr>
+          <w:sz w:val="22"/>
+        </w:rPr>
+        <w:t>+</w:t>
+      </w:r>
+      <w:r>
+        <w:rPr>
+          <w:rFonts w:ascii="Cambria Math" w:hAnsi="Cambria Math" w:cs="Cambria Math"/>
+          <w:sz w:val="22"/>
+        </w:rPr>
+        <w:t>𝐺</w:t>
+      </w:r>
+      <w:r>
+        <w:rPr>
+          <w:sz w:val="22"/>
+        </w:rPr>
+        <w:t>é</w:t>
+      </w:r>
+      <w:r>
+        <w:rPr>
+          <w:rFonts w:ascii="Cambria Math" w:hAnsi="Cambria Math" w:cs="Cambria Math"/>
+          <w:sz w:val="22"/>
+        </w:rPr>
+        <w:t>𝑛𝑜𝑡𝑦𝑝𝑒</w:t>
+      </w:r>
+      <w:r>
+        <w:rPr>
+          <w:rFonts w:ascii="Cambria Math" w:hAnsi="Cambria Math" w:cs="Cambria Math"/>
+          <w:sz w:val="22"/>
+          <w:vertAlign w:val="subscript"/>
+        </w:rPr>
+        <w:t>i(j)</w:t>
+      </w:r>
+      <w:r>
+        <w:rPr>
+          <w:sz w:val="22"/>
+        </w:rPr>
+        <w:t xml:space="preserve"> +</w:t>
+      </w:r>
+      <w:r>
+        <w:rPr>
+          <w:rFonts w:ascii="Cambria Math" w:hAnsi="Cambria Math" w:cs="Cambria Math"/>
+          <w:sz w:val="22"/>
+        </w:rPr>
+        <w:t>𝑚</w:t>
+      </w:r>
+      <w:r>
+        <w:rPr>
+          <w:sz w:val="22"/>
+        </w:rPr>
+        <w:t>é</w:t>
+      </w:r>
+      <w:r>
+        <w:rPr>
+          <w:rFonts w:ascii="Cambria Math" w:hAnsi="Cambria Math" w:cs="Cambria Math"/>
+          <w:sz w:val="22"/>
+        </w:rPr>
+        <w:t>𝑡ℎ𝑜𝑑𝑒</w:t>
+      </w:r>
+      <w:r>
+        <w:rPr>
+          <w:sz w:val="22"/>
+        </w:rPr>
+        <w:t>_</w:t>
+      </w:r>
+      <w:r>
+        <w:rPr>
+          <w:rFonts w:ascii="Cambria Math" w:hAnsi="Cambria Math" w:cs="Cambria Math"/>
+          <w:sz w:val="22"/>
+        </w:rPr>
+        <w:t>𝑎𝑐𝑞𝑢𝑖𝑠𝑖𝑡𝑖𝑜𝑛</w:t>
+      </w:r>
+      <w:r>
+        <w:rPr>
+          <w:rFonts w:ascii="Cambria Math" w:hAnsi="Cambria Math" w:cs="Cambria Math"/>
+          <w:sz w:val="22"/>
+          <w:vertAlign w:val="subscript"/>
+        </w:rPr>
+        <w:t>k</w:t>
+      </w:r>
+      <w:r>
+        <w:rPr>
+          <w:sz w:val="22"/>
+        </w:rPr>
+        <w:t xml:space="preserve"> +</w:t>
+      </w:r>
+      <w:r>
+        <w:rPr>
+          <w:rFonts w:ascii="Cambria Math" w:hAnsi="Cambria Math" w:cs="Cambria Math"/>
+          <w:sz w:val="22"/>
+        </w:rPr>
+        <w:t>𝜀</w:t>
+      </w:r>
+      <w:proofErr w:type="spellStart"/>
+      <w:r>
+        <w:rPr>
+          <w:rFonts w:ascii="Cambria Math" w:hAnsi="Cambria Math" w:cs="Cambria Math"/>
+          <w:sz w:val="22"/>
+          <w:vertAlign w:val="subscript"/>
+        </w:rPr>
+        <w:t>ijk</w:t>
+      </w:r>
+      <w:proofErr w:type="spellEnd"/>
+    </w:p>
+    <w:p>
+      <w:pPr>
+        <w:rPr>
+          <w:rFonts w:cstheme="minorHAnsi"/>
+        </w:rPr>
+      </w:pPr>
+      <w:r>
+        <w:rPr>
+          <w:rFonts w:ascii="Cambria Math" w:hAnsi="Cambria Math" w:cs="Cambria Math"/>
+          <w:vertAlign w:val="subscript"/>
+        </w:rPr>
+        <w:tab/>
+      </w:r>
+      <w:r>
+        <w:rPr>
+          <w:rFonts w:cstheme="minorHAnsi"/>
+        </w:rPr>
+        <w:t>Le modèle est nommé HBLUP</w:t>
+      </w:r>
+      <w:r>
+        <w:rPr>
+          <w:rFonts w:cstheme="minorHAnsi"/>
+          <w:vertAlign w:val="subscript"/>
+        </w:rPr>
+        <w:t>leaf2</w:t>
+      </w:r>
+    </w:p>
+    <w:p>
+      <w:pPr>
+        <w:rPr>
+          <w:rFonts w:cstheme="minorHAnsi"/>
+          <w:b/>
+          <w:bCs/>
+          <w:u w:val="single"/>
+        </w:rPr>
+      </w:pPr>
+      <w:r>
+        <w:rPr>
+          <w:rFonts w:cstheme="minorHAnsi"/>
+          <w:b/>
+          <w:bCs/>
+          <w:u w:val="single"/>
+        </w:rPr>
+        <w:t>Correction 3 :</w:t>
+      </w:r>
+    </w:p>
+    <w:p>
+      <w:pPr>
+        <w:rPr>
+          <w:rFonts w:cstheme="minorHAnsi"/>
+        </w:rPr>
+      </w:pPr>
+      <w:r>
+        <w:rPr>
+          <w:rFonts w:cstheme="minorHAnsi"/>
+        </w:rPr>
+        <w:tab/>
+        <w:t>L’obtention de valeur génétiques (BLUP) pour chaque longueur d’onde et chaque génotype. (</w:t>
+      </w:r>
+      <w:proofErr w:type="spellStart"/>
+      <w:r>
+        <w:rPr>
+          <w:rFonts w:cstheme="minorHAnsi"/>
+        </w:rPr>
+        <w:t>cf</w:t>
+      </w:r>
+      <w:proofErr w:type="spellEnd"/>
+      <w:r>
+        <w:rPr>
+          <w:rFonts w:cstheme="minorHAnsi"/>
+        </w:rPr>
+        <w:t xml:space="preserve"> thèse, page 80). Les modèles sont nommés respectivement HBLUP</w:t>
+      </w:r>
+      <w:r>
+        <w:rPr>
+          <w:rFonts w:cstheme="minorHAnsi"/>
+          <w:vertAlign w:val="subscript"/>
+        </w:rPr>
+        <w:t>seed3</w:t>
+      </w:r>
+      <w:r>
+        <w:rPr>
+          <w:rFonts w:cstheme="minorHAnsi"/>
+        </w:rPr>
+        <w:t xml:space="preserve"> et HBLUP</w:t>
+      </w:r>
+      <w:r>
+        <w:rPr>
+          <w:rFonts w:cstheme="minorHAnsi"/>
+          <w:vertAlign w:val="subscript"/>
+        </w:rPr>
+        <w:t>leaf3</w:t>
+      </w:r>
+    </w:p>
+    <w:p>
+      <w:pPr>
+        <w:rPr>
+          <w:rFonts w:cstheme="minorHAnsi"/>
+        </w:rPr>
+      </w:pPr>
+    </w:p>
+    <w:p>
+      <w:r>
+        <w:rPr>
+          <w:b/>
+          <w:bCs/>
+        </w:rPr>
+        <w:lastRenderedPageBreak/>
+        <w:t>Prétraitement possible de notre côté :</w:t>
+      </w:r>
+      <w:r>
+        <w:rPr>
+          <w:b/>
+          <w:bCs/>
+        </w:rPr>
+        <w:t xml:space="preserve"> </w:t>
+      </w:r>
+      <w:r>
+        <w:t>(à explorer)</w:t>
+      </w:r>
+    </w:p>
+    <w:p>
       <w:pPr>
         <w:pStyle w:val="Paragraphedeliste"/>
         <w:numPr>
@@ -1397,7 +1797,6 @@
       </w:pPr>
       <w:proofErr w:type="spellStart"/>
       <w:r>
-        <w:lastRenderedPageBreak/>
         <w:t>NUtE_aer</w:t>
       </w:r>
       <w:proofErr w:type="spellEnd"/>
@@ -1563,18 +1962,10 @@
         <w:t xml:space="preserve">AFM </w:t>
       </w:r>
       <w:r>
-        <w:t>a été réalisée en considérant les groupes de variables</w:t>
-      </w:r>
-      <w:proofErr w:type="gramStart"/>
-      <w:r>
-        <w:t xml:space="preserve"> «</w:t>
-      </w:r>
-      <w:r>
-        <w:t>Traits</w:t>
-      </w:r>
-      <w:proofErr w:type="gramEnd"/>
-      <w:r>
-        <w:t xml:space="preserve"> physiologiques</w:t>
+        <w:t>a été réalisée en considérant les groupes de variables «</w:t>
+      </w:r>
+      <w:r>
+        <w:t>Traits physiologiques</w:t>
       </w:r>
       <w:r>
         <w:t> » et « </w:t>
@@ -1613,6 +2004,7 @@
         <w:jc w:val="both"/>
       </w:pPr>
       <w:r>
+        <w:lastRenderedPageBreak/>
         <w:t xml:space="preserve">Les variables du groupes « traits développementaux » sont corrélées aux dimensions 1 et 2 (0.84 et 0.55 respectivement). </w:t>
       </w:r>
     </w:p>
@@ -1628,15 +2020,7 @@
         <w:t>raits physiologiques</w:t>
       </w:r>
       <w:r>
-        <w:t> » sont corrélées aux dimensions 1, 2, 3 et 4 (0.8, 0.6</w:t>
-      </w:r>
-      <w:proofErr w:type="gramStart"/>
-      <w:r>
-        <w:t>,  0.99</w:t>
-      </w:r>
-      <w:proofErr w:type="gramEnd"/>
-      <w:r>
-        <w:t xml:space="preserve"> et 0.99 respectivement). </w:t>
+        <w:t xml:space="preserve"> » sont corrélées aux dimensions 1, 2, 3 et 4 (0.8, 0.6,  0.99 et 0.99 respectivement). </w:t>
       </w:r>
     </w:p>
     <w:p>
@@ -1689,7 +2073,6 @@
         <w:rPr>
           <w:noProof/>
         </w:rPr>
-        <w:lastRenderedPageBreak/>
         <w:drawing>
           <wp:inline distT="0" distB="0" distL="0" distR="0" wp14:anchorId="397B79B7" wp14:editId="70E0C52C">
             <wp:extent cx="5760720" cy="4427855"/>
@@ -2022,15 +2405,7 @@
         <w:jc w:val="both"/>
       </w:pPr>
       <w:r>
-        <w:t xml:space="preserve">Le type SORS regroupe des variétés prenant des valeurs moyennes ou extrêmes pour les variables des traits développementaux et physiologiques. Le type WOSR regroupe des variétés prenant des valeurs moyennes pour les variables des traits développementaux et physiologiques. Le type WFR, regroupe des variétés prenant de fortes valeurs pour les variables RDW, TDW, ADW et </w:t>
-      </w:r>
-      <w:proofErr w:type="gramStart"/>
-      <w:r>
-        <w:t>LA</w:t>
-      </w:r>
-      <w:proofErr w:type="gramEnd"/>
-      <w:r>
-        <w:t xml:space="preserve">. </w:t>
+        <w:t xml:space="preserve">Le type SORS regroupe des variétés prenant des valeurs moyennes ou extrêmes pour les variables des traits développementaux et physiologiques. Le type WOSR regroupe des variétés prenant des valeurs moyennes pour les variables des traits développementaux et physiologiques. Le type WFR, regroupe des variétés prenant de fortes valeurs pour les variables RDW, TDW, ADW et LA. </w:t>
       </w:r>
     </w:p>
     <w:p>
@@ -4757,7 +5132,6 @@
   <w:style w:type="character" w:default="1" w:styleId="Policepardfaut">
     <w:name w:val="Default Paragraph Font"/>
     <w:uiPriority w:val="1"/>
-    <w:semiHidden/>
     <w:unhideWhenUsed/>
   </w:style>
   <w:style w:type="table" w:default="1" w:styleId="TableauNormal">

</xml_diff>

<commit_message>
Ajout plot AFM type
</commit_message>
<xml_diff>
--- a/doc/Notes.docx
+++ b/doc/Notes.docx
@@ -2419,6 +2419,44 @@
         <w:pStyle w:val="Sansinterligne"/>
         <w:jc w:val="both"/>
       </w:pPr>
+      <w:r>
+        <w:lastRenderedPageBreak/>
+        <w:drawing>
+          <wp:inline distT="0" distB="0" distL="0" distR="0" wp14:anchorId="22411A39" wp14:editId="2CAED549">
+            <wp:extent cx="5760720" cy="4314190"/>
+            <wp:effectExtent l="0" t="0" r="0" b="0"/>
+            <wp:docPr id="1432080453" name="Image 1" descr="Une image contenant texte, diagramme, capture d’écran, Tracé&#10;&#10;Le contenu généré par l’IA peut être incorrect."/>
+            <wp:cNvGraphicFramePr>
+              <a:graphicFrameLocks xmlns:a="http://schemas.openxmlformats.org/drawingml/2006/main" noChangeAspect="1"/>
+            </wp:cNvGraphicFramePr>
+            <a:graphic xmlns:a="http://schemas.openxmlformats.org/drawingml/2006/main">
+              <a:graphicData uri="http://schemas.openxmlformats.org/drawingml/2006/picture">
+                <pic:pic xmlns:pic="http://schemas.openxmlformats.org/drawingml/2006/picture">
+                  <pic:nvPicPr>
+                    <pic:cNvPr id="1432080453" name="Image 1" descr="Une image contenant texte, diagramme, capture d’écran, Tracé&#10;&#10;Le contenu généré par l’IA peut être incorrect."/>
+                    <pic:cNvPicPr/>
+                  </pic:nvPicPr>
+                  <pic:blipFill>
+                    <a:blip r:embed="rId8"/>
+                    <a:stretch>
+                      <a:fillRect/>
+                    </a:stretch>
+                  </pic:blipFill>
+                  <pic:spPr>
+                    <a:xfrm>
+                      <a:off x="0" y="0"/>
+                      <a:ext cx="5760720" cy="4314190"/>
+                    </a:xfrm>
+                    <a:prstGeom prst="rect">
+                      <a:avLst/>
+                    </a:prstGeom>
+                  </pic:spPr>
+                </pic:pic>
+              </a:graphicData>
+            </a:graphic>
+          </wp:inline>
+        </w:drawing>
+      </w:r>
     </w:p>
     <w:p>
       <w:pPr>
@@ -2465,7 +2503,6 @@
         <w:pStyle w:val="Titre3"/>
       </w:pPr>
       <w:r>
-        <w:lastRenderedPageBreak/>
         <w:t>Régression fonctionnelle : méthode des B-</w:t>
       </w:r>
       <w:proofErr w:type="spellStart"/>
@@ -2581,6 +2618,7 @@
         </w:numPr>
       </w:pPr>
       <w:r>
+        <w:lastRenderedPageBreak/>
         <w:t>équivalence entre spectre sur feuille sèche et sur feuille fraiche</w:t>
       </w:r>
     </w:p>
@@ -2775,244 +2813,244 @@
         <w:rPr>
           <w:rFonts w:cstheme="minorHAnsi"/>
         </w:rPr>
+        <w:t xml:space="preserve">La phase </w:t>
+      </w:r>
+      <w:r>
+        <w:rPr>
+          <w:rFonts w:cstheme="minorHAnsi"/>
+        </w:rPr>
+        <w:t>précoce</w:t>
+      </w:r>
+      <w:r>
+        <w:rPr>
+          <w:rFonts w:cstheme="minorHAnsi"/>
+        </w:rPr>
+        <w:t xml:space="preserve"> est la phase de croissance du colza entre la germination et l'étape ou la plante à </w:t>
+      </w:r>
+      <w:proofErr w:type="spellStart"/>
+      <w:r>
+        <w:rPr>
+          <w:rFonts w:cstheme="minorHAnsi"/>
+        </w:rPr>
+        <w:t>développée</w:t>
+      </w:r>
+      <w:proofErr w:type="spellEnd"/>
+      <w:r>
+        <w:rPr>
+          <w:rFonts w:cstheme="minorHAnsi"/>
+        </w:rPr>
+        <w:t xml:space="preserve"> 4 à 5 </w:t>
+      </w:r>
+      <w:r>
+        <w:rPr>
+          <w:rFonts w:cstheme="minorHAnsi"/>
+        </w:rPr>
+        <w:t>feuilles</w:t>
+      </w:r>
+      <w:r>
+        <w:rPr>
+          <w:rFonts w:cstheme="minorHAnsi"/>
+        </w:rPr>
+        <w:t xml:space="preserve"> (thèse). La </w:t>
+      </w:r>
+      <w:r>
+        <w:rPr>
+          <w:rFonts w:cstheme="minorHAnsi"/>
+        </w:rPr>
+        <w:t>vigueur</w:t>
+      </w:r>
+      <w:r>
+        <w:rPr>
+          <w:rFonts w:cstheme="minorHAnsi"/>
+        </w:rPr>
+        <w:t xml:space="preserve"> précoce du colza désigne la </w:t>
+      </w:r>
+      <w:r>
+        <w:rPr>
+          <w:rFonts w:cstheme="minorHAnsi"/>
+        </w:rPr>
+        <w:t>vigueur</w:t>
+      </w:r>
+      <w:r>
+        <w:rPr>
+          <w:rFonts w:cstheme="minorHAnsi"/>
+        </w:rPr>
+        <w:t xml:space="preserve"> aux cours de ce stade précoce. </w:t>
+      </w:r>
+    </w:p>
+    <w:p>
+      <w:pPr>
+        <w:spacing w:line="240" w:lineRule="auto"/>
+        <w:jc w:val="both"/>
+        <w:rPr>
+          <w:rFonts w:cstheme="minorHAnsi"/>
+        </w:rPr>
+      </w:pPr>
+    </w:p>
+    <w:p>
+      <w:pPr>
+        <w:spacing w:line="240" w:lineRule="auto"/>
+        <w:jc w:val="both"/>
+        <w:rPr>
+          <w:rFonts w:cstheme="minorHAnsi"/>
+        </w:rPr>
+      </w:pPr>
+      <w:r>
+        <w:rPr>
+          <w:rFonts w:cstheme="minorHAnsi"/>
+        </w:rPr>
+        <w:t xml:space="preserve">Un spectre infrarouge montre l'absorbance d'un composé en ordonnées en fonction des </w:t>
+      </w:r>
+      <w:r>
+        <w:rPr>
+          <w:rFonts w:cstheme="minorHAnsi"/>
+        </w:rPr>
+        <w:t>longueurs</w:t>
+      </w:r>
+      <w:r>
+        <w:rPr>
+          <w:rFonts w:cstheme="minorHAnsi"/>
+        </w:rPr>
+        <w:t xml:space="preserve"> d'ondes en </w:t>
+      </w:r>
+      <w:r>
+        <w:rPr>
+          <w:rFonts w:cstheme="minorHAnsi"/>
+        </w:rPr>
+        <w:t>abscisses</w:t>
+      </w:r>
+      <w:r>
+        <w:rPr>
+          <w:rFonts w:cstheme="minorHAnsi"/>
+        </w:rPr>
+        <w:t xml:space="preserve">. </w:t>
+      </w:r>
+    </w:p>
+    <w:p>
+      <w:pPr>
+        <w:spacing w:line="240" w:lineRule="auto"/>
+        <w:jc w:val="both"/>
+        <w:rPr>
+          <w:rFonts w:cstheme="minorHAnsi"/>
+        </w:rPr>
+      </w:pPr>
+    </w:p>
+    <w:p>
+      <w:pPr>
+        <w:spacing w:line="240" w:lineRule="auto"/>
+        <w:jc w:val="both"/>
+        <w:rPr>
+          <w:rFonts w:cstheme="minorHAnsi"/>
+        </w:rPr>
+      </w:pPr>
+      <w:r>
+        <w:rPr>
+          <w:rFonts w:cstheme="minorHAnsi"/>
+        </w:rPr>
+        <w:t xml:space="preserve">Données </w:t>
+      </w:r>
+      <w:r>
+        <w:rPr>
+          <w:rFonts w:cstheme="minorHAnsi"/>
+        </w:rPr>
+        <w:t>fonctionnelles :</w:t>
+      </w:r>
+      <w:r>
+        <w:rPr>
+          <w:rFonts w:cstheme="minorHAnsi"/>
+        </w:rPr>
+        <w:t xml:space="preserve"> </w:t>
+      </w:r>
+    </w:p>
+    <w:p>
+      <w:pPr>
+        <w:spacing w:line="240" w:lineRule="auto"/>
+        <w:jc w:val="both"/>
+        <w:rPr>
+          <w:rFonts w:cstheme="minorHAnsi"/>
+        </w:rPr>
+      </w:pPr>
+      <w:r>
+        <w:rPr>
+          <w:rFonts w:cstheme="minorHAnsi"/>
+        </w:rPr>
+        <w:t xml:space="preserve">L'amélioration des technologies d'acquisition de données permettent aujourd'hui de collecter des données de manière quasi continue. Les observations ne sont plus des valeurs ponctuelles mais peuvent être considérées comme des fonctions continues. Des observations de telles variables sont </w:t>
+      </w:r>
+      <w:r>
+        <w:rPr>
+          <w:rFonts w:cstheme="minorHAnsi"/>
+        </w:rPr>
+        <w:t xml:space="preserve">appelées </w:t>
+      </w:r>
+      <w:r>
+        <w:rPr>
+          <w:rFonts w:cstheme="minorHAnsi"/>
+        </w:rPr>
+        <w:t xml:space="preserve">des données </w:t>
+      </w:r>
+      <w:r>
+        <w:rPr>
+          <w:rFonts w:cstheme="minorHAnsi"/>
+        </w:rPr>
+        <w:t>fonctionnelles</w:t>
+      </w:r>
+      <w:r>
+        <w:rPr>
+          <w:rFonts w:cstheme="minorHAnsi"/>
+        </w:rPr>
+        <w:t xml:space="preserve"> (FDA pour </w:t>
+      </w:r>
+      <w:proofErr w:type="spellStart"/>
+      <w:r>
+        <w:rPr>
+          <w:rFonts w:cstheme="minorHAnsi"/>
+        </w:rPr>
+        <w:t>Functional</w:t>
+      </w:r>
+      <w:proofErr w:type="spellEnd"/>
+      <w:r>
+        <w:rPr>
+          <w:rFonts w:cstheme="minorHAnsi"/>
+        </w:rPr>
+        <w:t xml:space="preserve"> Data </w:t>
+      </w:r>
+      <w:proofErr w:type="spellStart"/>
+      <w:r>
+        <w:rPr>
+          <w:rFonts w:cstheme="minorHAnsi"/>
+        </w:rPr>
+        <w:t>Analysis</w:t>
+      </w:r>
+      <w:proofErr w:type="spellEnd"/>
+      <w:r>
+        <w:rPr>
+          <w:rFonts w:cstheme="minorHAnsi"/>
+        </w:rPr>
+        <w:t xml:space="preserve">). </w:t>
+      </w:r>
+    </w:p>
+    <w:p>
+      <w:pPr>
+        <w:spacing w:line="240" w:lineRule="auto"/>
+        <w:jc w:val="both"/>
+        <w:rPr>
+          <w:rFonts w:cstheme="minorHAnsi"/>
+        </w:rPr>
+      </w:pPr>
+    </w:p>
+    <w:p>
+      <w:pPr>
+        <w:spacing w:line="240" w:lineRule="auto"/>
+        <w:jc w:val="both"/>
+        <w:rPr>
+          <w:rFonts w:cstheme="minorHAnsi"/>
+        </w:rPr>
+      </w:pPr>
+      <w:r>
+        <w:rPr>
+          <w:rFonts w:cstheme="minorHAnsi"/>
+        </w:rPr>
         <w:lastRenderedPageBreak/>
-        <w:t xml:space="preserve">La phase </w:t>
-      </w:r>
-      <w:r>
-        <w:rPr>
-          <w:rFonts w:cstheme="minorHAnsi"/>
-        </w:rPr>
-        <w:t>précoce</w:t>
-      </w:r>
-      <w:r>
-        <w:rPr>
-          <w:rFonts w:cstheme="minorHAnsi"/>
-        </w:rPr>
-        <w:t xml:space="preserve"> est la phase de croissance du colza entre la germination et l'étape ou la plante à </w:t>
-      </w:r>
-      <w:proofErr w:type="spellStart"/>
-      <w:r>
-        <w:rPr>
-          <w:rFonts w:cstheme="minorHAnsi"/>
-        </w:rPr>
-        <w:t>développée</w:t>
-      </w:r>
-      <w:proofErr w:type="spellEnd"/>
-      <w:r>
-        <w:rPr>
-          <w:rFonts w:cstheme="minorHAnsi"/>
-        </w:rPr>
-        <w:t xml:space="preserve"> 4 à 5 </w:t>
-      </w:r>
-      <w:r>
-        <w:rPr>
-          <w:rFonts w:cstheme="minorHAnsi"/>
-        </w:rPr>
-        <w:t>feuilles</w:t>
-      </w:r>
-      <w:r>
-        <w:rPr>
-          <w:rFonts w:cstheme="minorHAnsi"/>
-        </w:rPr>
-        <w:t xml:space="preserve"> (thèse). La </w:t>
-      </w:r>
-      <w:r>
-        <w:rPr>
-          <w:rFonts w:cstheme="minorHAnsi"/>
-        </w:rPr>
-        <w:t>vigueur</w:t>
-      </w:r>
-      <w:r>
-        <w:rPr>
-          <w:rFonts w:cstheme="minorHAnsi"/>
-        </w:rPr>
-        <w:t xml:space="preserve"> précoce du colza désigne la </w:t>
-      </w:r>
-      <w:r>
-        <w:rPr>
-          <w:rFonts w:cstheme="minorHAnsi"/>
-        </w:rPr>
-        <w:t>vigueur</w:t>
-      </w:r>
-      <w:r>
-        <w:rPr>
-          <w:rFonts w:cstheme="minorHAnsi"/>
-        </w:rPr>
-        <w:t xml:space="preserve"> aux cours de ce stade précoce. </w:t>
-      </w:r>
-    </w:p>
-    <w:p>
-      <w:pPr>
-        <w:spacing w:line="240" w:lineRule="auto"/>
-        <w:jc w:val="both"/>
-        <w:rPr>
-          <w:rFonts w:cstheme="minorHAnsi"/>
-        </w:rPr>
-      </w:pPr>
-    </w:p>
-    <w:p>
-      <w:pPr>
-        <w:spacing w:line="240" w:lineRule="auto"/>
-        <w:jc w:val="both"/>
-        <w:rPr>
-          <w:rFonts w:cstheme="minorHAnsi"/>
-        </w:rPr>
-      </w:pPr>
-      <w:r>
-        <w:rPr>
-          <w:rFonts w:cstheme="minorHAnsi"/>
-        </w:rPr>
-        <w:t xml:space="preserve">Un spectre infrarouge montre l'absorbance d'un composé en ordonnées en fonction des </w:t>
-      </w:r>
-      <w:r>
-        <w:rPr>
-          <w:rFonts w:cstheme="minorHAnsi"/>
-        </w:rPr>
-        <w:t>longueurs</w:t>
-      </w:r>
-      <w:r>
-        <w:rPr>
-          <w:rFonts w:cstheme="minorHAnsi"/>
-        </w:rPr>
-        <w:t xml:space="preserve"> d'ondes en </w:t>
-      </w:r>
-      <w:r>
-        <w:rPr>
-          <w:rFonts w:cstheme="minorHAnsi"/>
-        </w:rPr>
-        <w:t>abscisses</w:t>
-      </w:r>
-      <w:r>
-        <w:rPr>
-          <w:rFonts w:cstheme="minorHAnsi"/>
-        </w:rPr>
-        <w:t xml:space="preserve">. </w:t>
-      </w:r>
-    </w:p>
-    <w:p>
-      <w:pPr>
-        <w:spacing w:line="240" w:lineRule="auto"/>
-        <w:jc w:val="both"/>
-        <w:rPr>
-          <w:rFonts w:cstheme="minorHAnsi"/>
-        </w:rPr>
-      </w:pPr>
-    </w:p>
-    <w:p>
-      <w:pPr>
-        <w:spacing w:line="240" w:lineRule="auto"/>
-        <w:jc w:val="both"/>
-        <w:rPr>
-          <w:rFonts w:cstheme="minorHAnsi"/>
-        </w:rPr>
-      </w:pPr>
-      <w:r>
-        <w:rPr>
-          <w:rFonts w:cstheme="minorHAnsi"/>
-        </w:rPr>
-        <w:t xml:space="preserve">Données </w:t>
-      </w:r>
-      <w:r>
-        <w:rPr>
-          <w:rFonts w:cstheme="minorHAnsi"/>
-        </w:rPr>
-        <w:t>fonctionnelles :</w:t>
-      </w:r>
-      <w:r>
-        <w:rPr>
-          <w:rFonts w:cstheme="minorHAnsi"/>
-        </w:rPr>
-        <w:t xml:space="preserve"> </w:t>
-      </w:r>
-    </w:p>
-    <w:p>
-      <w:pPr>
-        <w:spacing w:line="240" w:lineRule="auto"/>
-        <w:jc w:val="both"/>
-        <w:rPr>
-          <w:rFonts w:cstheme="minorHAnsi"/>
-        </w:rPr>
-      </w:pPr>
-      <w:r>
-        <w:rPr>
-          <w:rFonts w:cstheme="minorHAnsi"/>
-        </w:rPr>
-        <w:t xml:space="preserve">L'amélioration des technologies d'acquisition de données permettent aujourd'hui de collecter des données de manière quasi continue. Les observations ne sont plus des valeurs ponctuelles mais peuvent être considérées comme des fonctions continues. Des observations de telles variables sont </w:t>
-      </w:r>
-      <w:r>
-        <w:rPr>
-          <w:rFonts w:cstheme="minorHAnsi"/>
-        </w:rPr>
-        <w:t xml:space="preserve">appelées </w:t>
-      </w:r>
-      <w:r>
-        <w:rPr>
-          <w:rFonts w:cstheme="minorHAnsi"/>
-        </w:rPr>
-        <w:t xml:space="preserve">des données </w:t>
-      </w:r>
-      <w:r>
-        <w:rPr>
-          <w:rFonts w:cstheme="minorHAnsi"/>
-        </w:rPr>
-        <w:t>fonctionnelles</w:t>
-      </w:r>
-      <w:r>
-        <w:rPr>
-          <w:rFonts w:cstheme="minorHAnsi"/>
-        </w:rPr>
-        <w:t xml:space="preserve"> (FDA pour </w:t>
-      </w:r>
-      <w:proofErr w:type="spellStart"/>
-      <w:r>
-        <w:rPr>
-          <w:rFonts w:cstheme="minorHAnsi"/>
-        </w:rPr>
-        <w:t>Functional</w:t>
-      </w:r>
-      <w:proofErr w:type="spellEnd"/>
-      <w:r>
-        <w:rPr>
-          <w:rFonts w:cstheme="minorHAnsi"/>
-        </w:rPr>
-        <w:t xml:space="preserve"> Data </w:t>
-      </w:r>
-      <w:proofErr w:type="spellStart"/>
-      <w:r>
-        <w:rPr>
-          <w:rFonts w:cstheme="minorHAnsi"/>
-        </w:rPr>
-        <w:t>Analysis</w:t>
-      </w:r>
-      <w:proofErr w:type="spellEnd"/>
-      <w:r>
-        <w:rPr>
-          <w:rFonts w:cstheme="minorHAnsi"/>
-        </w:rPr>
-        <w:t xml:space="preserve">). </w:t>
-      </w:r>
-    </w:p>
-    <w:p>
-      <w:pPr>
-        <w:spacing w:line="240" w:lineRule="auto"/>
-        <w:jc w:val="both"/>
-        <w:rPr>
-          <w:rFonts w:cstheme="minorHAnsi"/>
-        </w:rPr>
-      </w:pPr>
-    </w:p>
-    <w:p>
-      <w:pPr>
-        <w:spacing w:line="240" w:lineRule="auto"/>
-        <w:jc w:val="both"/>
-        <w:rPr>
-          <w:rFonts w:cstheme="minorHAnsi"/>
-        </w:rPr>
-      </w:pPr>
-      <w:r>
-        <w:rPr>
-          <w:rFonts w:cstheme="minorHAnsi"/>
-        </w:rPr>
         <w:t xml:space="preserve">Une données fonctionnelle aléatoire </w:t>
       </w:r>
       <w:r>
@@ -3336,7 +3374,6 @@
         <w:rPr>
           <w:rFonts w:cstheme="minorHAnsi"/>
         </w:rPr>
-        <w:lastRenderedPageBreak/>
         <w:br/>
         <w:t>Tissue: Tissus végétaux d'</w:t>
       </w:r>
@@ -3574,6 +3611,7 @@
         <w:rPr>
           <w:rFonts w:cstheme="minorHAnsi"/>
         </w:rPr>
+        <w:lastRenderedPageBreak/>
         <w:br/>
       </w:r>
       <w:proofErr w:type="spellStart"/>

</xml_diff>

<commit_message>
Description regression fonctionelle dans Notes
</commit_message>
<xml_diff>
--- a/doc/Notes.docx
+++ b/doc/Notes.docx
@@ -5,6 +5,7 @@
     <w:p>
       <w:pPr>
         <w:pStyle w:val="Titre1"/>
+        <w:jc w:val="both"/>
       </w:pPr>
       <w:r>
         <w:t>Utilisation de données spectrale pour la prédiction de traits d’intérêt du colz</w:t>
@@ -13,9 +14,14 @@
         <w:t>a</w:t>
       </w:r>
     </w:p>
-    <w:p/>
-    <w:p>
-      <w:pPr>
+    <w:p>
+      <w:pPr>
+        <w:jc w:val="both"/>
+      </w:pPr>
+    </w:p>
+    <w:p>
+      <w:pPr>
+        <w:jc w:val="both"/>
         <w:sectPr>
           <w:pgSz w:w="11906" w:h="16838"/>
           <w:pgMar w:top="1417" w:right="1417" w:bottom="1417" w:left="1417" w:header="708" w:footer="708" w:gutter="0"/>
@@ -27,6 +33,7 @@
     <w:p>
       <w:pPr>
         <w:pStyle w:val="Titre2"/>
+        <w:jc w:val="both"/>
       </w:pPr>
       <w:r>
         <w:t>Contexte</w:t>
@@ -496,6 +503,7 @@
     <w:p>
       <w:pPr>
         <w:pStyle w:val="Titre2"/>
+        <w:jc w:val="both"/>
       </w:pPr>
       <w:r>
         <w:t xml:space="preserve">Jeu de donnée </w:t>
@@ -515,12 +523,16 @@
     <w:p>
       <w:pPr>
         <w:pStyle w:val="Titre3"/>
+        <w:jc w:val="both"/>
       </w:pPr>
       <w:r>
         <w:t>Génotypes</w:t>
       </w:r>
     </w:p>
     <w:p>
+      <w:pPr>
+        <w:jc w:val="both"/>
+      </w:pPr>
       <w:r>
         <w:t xml:space="preserve">Les plantes utilisées pour cette thèse sont issues de 4 types de génotypes différents. Le type </w:t>
       </w:r>
@@ -582,6 +594,7 @@
     <w:p>
       <w:pPr>
         <w:pStyle w:val="Titre3"/>
+        <w:jc w:val="both"/>
       </w:pPr>
       <w:r>
         <w:t>Données NIRS</w:t>
@@ -590,6 +603,7 @@
     <w:p>
       <w:pPr>
         <w:pStyle w:val="Titre4"/>
+        <w:jc w:val="both"/>
       </w:pPr>
       <w:r>
         <w:t>Création des expérimentations</w:t>
@@ -683,18 +697,23 @@
     <w:p>
       <w:pPr>
         <w:pStyle w:val="Titre4"/>
+        <w:jc w:val="both"/>
       </w:pPr>
       <w:r>
         <w:t>Méthode de prétraitement utilisés</w:t>
       </w:r>
     </w:p>
     <w:p>
+      <w:pPr>
+        <w:jc w:val="both"/>
+      </w:pPr>
       <w:r>
         <w:t>Les données de spectres ont eu 3 méthodes de prétraitement différentes.</w:t>
       </w:r>
     </w:p>
     <w:p>
       <w:pPr>
+        <w:jc w:val="both"/>
         <w:rPr>
           <w:b/>
           <w:bCs/>
@@ -771,6 +790,7 @@
     </w:p>
     <w:p>
       <w:pPr>
+        <w:jc w:val="both"/>
         <w:rPr>
           <w:b/>
           <w:bCs/>
@@ -1087,6 +1107,7 @@
     </w:p>
     <w:p>
       <w:pPr>
+        <w:jc w:val="both"/>
         <w:rPr>
           <w:rFonts w:cstheme="minorHAnsi"/>
           <w:b/>
@@ -1106,6 +1127,7 @@
     </w:p>
     <w:p>
       <w:pPr>
+        <w:jc w:val="both"/>
         <w:rPr>
           <w:rFonts w:cstheme="minorHAnsi"/>
         </w:rPr>
@@ -1154,12 +1176,16 @@
     </w:p>
     <w:p>
       <w:pPr>
-        <w:rPr>
-          <w:rFonts w:cstheme="minorHAnsi"/>
-        </w:rPr>
-      </w:pPr>
-    </w:p>
-    <w:p>
+        <w:jc w:val="both"/>
+        <w:rPr>
+          <w:rFonts w:cstheme="minorHAnsi"/>
+        </w:rPr>
+      </w:pPr>
+    </w:p>
+    <w:p>
+      <w:pPr>
+        <w:jc w:val="both"/>
+      </w:pPr>
       <w:r>
         <w:rPr>
           <w:b/>
@@ -1185,6 +1211,7 @@
           <w:ilvl w:val="0"/>
           <w:numId w:val="2"/>
         </w:numPr>
+        <w:jc w:val="both"/>
       </w:pPr>
       <w:r>
         <w:t>Centrage réduction (</w:t>
@@ -1205,6 +1232,7 @@
           <w:ilvl w:val="0"/>
           <w:numId w:val="2"/>
         </w:numPr>
+        <w:jc w:val="both"/>
       </w:pPr>
       <w:r>
         <w:t xml:space="preserve">Lissage de </w:t>
@@ -1224,6 +1252,7 @@
         <w:tabs>
           <w:tab w:val="left" w:pos="1843"/>
         </w:tabs>
+        <w:jc w:val="both"/>
       </w:pPr>
       <w:r>
         <w:t>Données de phénotype</w:t>
@@ -1232,6 +1261,7 @@
     <w:p>
       <w:pPr>
         <w:pStyle w:val="Sansinterligne"/>
+        <w:jc w:val="both"/>
       </w:pPr>
       <w:r>
         <w:t xml:space="preserve">Les données de </w:t>
@@ -1262,11 +1292,13 @@
     <w:p>
       <w:pPr>
         <w:pStyle w:val="Sansinterligne"/>
+        <w:jc w:val="both"/>
       </w:pPr>
     </w:p>
     <w:p>
       <w:pPr>
         <w:pStyle w:val="Sansinterligne"/>
+        <w:jc w:val="both"/>
         <w:rPr>
           <w:u w:val="single"/>
         </w:rPr>
@@ -1285,6 +1317,7 @@
           <w:ilvl w:val="0"/>
           <w:numId w:val="3"/>
         </w:numPr>
+        <w:jc w:val="both"/>
       </w:pPr>
       <w:r>
         <w:t>LA</w:t>
@@ -1323,6 +1356,7 @@
           <w:ilvl w:val="0"/>
           <w:numId w:val="3"/>
         </w:numPr>
+        <w:jc w:val="both"/>
       </w:pPr>
       <w:r>
         <w:t>TDW</w:t>
@@ -1364,6 +1398,7 @@
           <w:ilvl w:val="0"/>
           <w:numId w:val="3"/>
         </w:numPr>
+        <w:jc w:val="both"/>
       </w:pPr>
       <w:r>
         <w:t>ADW</w:t>
@@ -1416,6 +1451,7 @@
           <w:ilvl w:val="0"/>
           <w:numId w:val="3"/>
         </w:numPr>
+        <w:jc w:val="both"/>
       </w:pPr>
       <w:r>
         <w:t>RDW</w:t>
@@ -1463,6 +1499,7 @@
           <w:ilvl w:val="0"/>
           <w:numId w:val="3"/>
         </w:numPr>
+        <w:jc w:val="both"/>
       </w:pPr>
       <w:r>
         <w:t>LWR</w:t>
@@ -1515,6 +1552,7 @@
           <w:ilvl w:val="0"/>
           <w:numId w:val="3"/>
         </w:numPr>
+        <w:jc w:val="both"/>
       </w:pPr>
       <w:r>
         <w:t>LAR</w:t>
@@ -1580,6 +1618,7 @@
           <w:ilvl w:val="0"/>
           <w:numId w:val="3"/>
         </w:numPr>
+        <w:jc w:val="both"/>
       </w:pPr>
       <w:r>
         <w:t>SLA</w:t>
@@ -1641,6 +1680,7 @@
           <w:ilvl w:val="0"/>
           <w:numId w:val="3"/>
         </w:numPr>
+        <w:jc w:val="both"/>
       </w:pPr>
       <w:r>
         <w:t>SR (</w:t>
@@ -1665,6 +1705,7 @@
           <w:ilvl w:val="0"/>
           <w:numId w:val="3"/>
         </w:numPr>
+        <w:jc w:val="both"/>
       </w:pPr>
       <w:r>
         <w:t>SNQ</w:t>
@@ -1714,6 +1755,7 @@
           <w:ilvl w:val="0"/>
           <w:numId w:val="3"/>
         </w:numPr>
+        <w:jc w:val="both"/>
       </w:pPr>
       <w:r>
         <w:t>LASNQ</w:t>
@@ -1783,6 +1825,7 @@
           <w:ilvl w:val="0"/>
           <w:numId w:val="3"/>
         </w:numPr>
+        <w:jc w:val="both"/>
       </w:pPr>
       <w:r>
         <w:t>TNQ</w:t>
@@ -1826,6 +1869,7 @@
           <w:ilvl w:val="0"/>
           <w:numId w:val="3"/>
         </w:numPr>
+        <w:jc w:val="both"/>
       </w:pPr>
       <w:r>
         <w:t>SNU</w:t>
@@ -1875,6 +1919,7 @@
           <w:ilvl w:val="0"/>
           <w:numId w:val="3"/>
         </w:numPr>
+        <w:jc w:val="both"/>
       </w:pPr>
       <w:proofErr w:type="spellStart"/>
       <w:r>
@@ -1898,6 +1943,7 @@
           <w:ilvl w:val="0"/>
           <w:numId w:val="3"/>
         </w:numPr>
+        <w:jc w:val="both"/>
       </w:pPr>
       <w:proofErr w:type="spellStart"/>
       <w:r>
@@ -1914,11 +1960,13 @@
     <w:p>
       <w:pPr>
         <w:pStyle w:val="Sansinterligne"/>
+        <w:jc w:val="both"/>
       </w:pPr>
     </w:p>
     <w:p>
       <w:pPr>
         <w:pStyle w:val="Sansinterligne"/>
+        <w:jc w:val="both"/>
         <w:rPr>
           <w:u w:val="single"/>
         </w:rPr>
@@ -1937,6 +1985,7 @@
           <w:ilvl w:val="0"/>
           <w:numId w:val="4"/>
         </w:numPr>
+        <w:jc w:val="both"/>
       </w:pPr>
       <w:proofErr w:type="spellStart"/>
       <w:r>
@@ -1978,6 +2027,7 @@
           <w:ilvl w:val="0"/>
           <w:numId w:val="4"/>
         </w:numPr>
+        <w:jc w:val="both"/>
       </w:pPr>
       <w:proofErr w:type="spellStart"/>
       <w:r>
@@ -2004,6 +2054,7 @@
           <w:ilvl w:val="0"/>
           <w:numId w:val="4"/>
         </w:numPr>
+        <w:jc w:val="both"/>
       </w:pPr>
       <w:r>
         <w:t>SCA</w:t>
@@ -2015,11 +2066,13 @@
     <w:p>
       <w:pPr>
         <w:pStyle w:val="Sansinterligne"/>
+        <w:jc w:val="both"/>
       </w:pPr>
     </w:p>
     <w:p>
       <w:pPr>
         <w:pStyle w:val="Titre4"/>
+        <w:jc w:val="both"/>
       </w:pPr>
       <w:r>
         <w:lastRenderedPageBreak/>
@@ -2029,6 +2082,7 @@
     <w:p>
       <w:pPr>
         <w:pStyle w:val="Sansinterligne"/>
+        <w:jc w:val="both"/>
         <w:rPr>
           <w:u w:val="single"/>
         </w:rPr>
@@ -2580,6 +2634,7 @@
     <w:p>
       <w:pPr>
         <w:pStyle w:val="Titre2"/>
+        <w:jc w:val="both"/>
       </w:pPr>
       <w:r>
         <w:t>Méthode</w:t>
@@ -2588,6 +2643,7 @@
     <w:p>
       <w:pPr>
         <w:pStyle w:val="Titre3"/>
+        <w:jc w:val="both"/>
       </w:pPr>
       <w:r>
         <w:t>Présentation des données fonctionnelles</w:t>
@@ -2600,6 +2656,7 @@
           <w:ilvl w:val="0"/>
           <w:numId w:val="1"/>
         </w:numPr>
+        <w:jc w:val="both"/>
       </w:pPr>
       <w:r>
         <w:t>Qu’est-ce que c’est ?</w:t>
@@ -2612,6 +2669,7 @@
           <w:ilvl w:val="0"/>
           <w:numId w:val="1"/>
         </w:numPr>
+        <w:jc w:val="both"/>
       </w:pPr>
       <w:r>
         <w:t>Intérêt pour cette étude</w:t>
@@ -2620,6 +2678,7 @@
     <w:p>
       <w:pPr>
         <w:pStyle w:val="Titre3"/>
+        <w:jc w:val="both"/>
       </w:pPr>
       <w:r>
         <w:t>Régression fonctionnelle : méthode des B-</w:t>
@@ -2695,6 +2754,7 @@
           <w:ilvl w:val="0"/>
           <w:numId w:val="1"/>
         </w:numPr>
+        <w:jc w:val="both"/>
       </w:pPr>
       <w:r>
         <w:t>Intérêt du classement entre variétés</w:t>
@@ -2703,6 +2763,7 @@
     <w:p>
       <w:pPr>
         <w:pStyle w:val="Titre3"/>
+        <w:jc w:val="both"/>
       </w:pPr>
       <w:r>
         <w:t>ACP fonctionnelle</w:t>
@@ -2711,6 +2772,7 @@
     <w:p>
       <w:pPr>
         <w:pStyle w:val="Titre3"/>
+        <w:jc w:val="both"/>
       </w:pPr>
       <w:r>
         <w:t>Méthodes à expérimenter</w:t>
@@ -2723,6 +2785,7 @@
           <w:ilvl w:val="0"/>
           <w:numId w:val="1"/>
         </w:numPr>
+        <w:jc w:val="both"/>
       </w:pPr>
       <w:r>
         <w:t>loi de mélange de régression fonctionnelle en fonction des espèces (probabilité à priori d'appartenance remplacée par probabilité à posteriori estimées à partir des données</w:t>
@@ -2735,15 +2798,1772 @@
           <w:ilvl w:val="0"/>
           <w:numId w:val="1"/>
         </w:numPr>
+        <w:jc w:val="both"/>
+      </w:pPr>
+      <w:proofErr w:type="gramStart"/>
+      <w:r>
+        <w:t>équivalence</w:t>
+      </w:r>
+      <w:proofErr w:type="gramEnd"/>
+      <w:r>
+        <w:t xml:space="preserve"> entre spectre sur feuille sèche et sur feuille fraiche</w:t>
+      </w:r>
+    </w:p>
+    <w:p>
+      <w:pPr>
+        <w:pStyle w:val="Titre3"/>
       </w:pPr>
       <w:r>
         <w:lastRenderedPageBreak/>
-        <w:t>équivalence entre spectre sur feuille sèche et sur feuille fraiche</w:t>
-      </w:r>
+        <w:t>Régression fonctionnelle</w:t>
+      </w:r>
+    </w:p>
+    <w:p>
+      <w:pPr>
+        <w:pStyle w:val="Sansinterligne"/>
+        <w:jc w:val="both"/>
+      </w:pPr>
+      <w:r>
+        <w:t xml:space="preserve">Pour la présente étude, nous souhaitons prédire un phénotype qui est un scalaire. Dans le cas d’une prédiction d’un scalaire par des variables fonctionnelles, le modèle </w:t>
+      </w:r>
+      <w:proofErr w:type="spellStart"/>
+      <w:r>
+        <w:t>Linear</w:t>
+      </w:r>
+      <w:proofErr w:type="spellEnd"/>
+      <w:r>
+        <w:t xml:space="preserve"> </w:t>
+      </w:r>
+      <w:proofErr w:type="spellStart"/>
+      <w:r>
+        <w:t>scalar</w:t>
+      </w:r>
+      <w:proofErr w:type="spellEnd"/>
+      <w:r>
+        <w:t>-on-</w:t>
+      </w:r>
+      <w:proofErr w:type="spellStart"/>
+      <w:r>
+        <w:t>function</w:t>
+      </w:r>
+      <w:proofErr w:type="spellEnd"/>
+      <w:r>
+        <w:t xml:space="preserve"> </w:t>
+      </w:r>
+      <w:proofErr w:type="spellStart"/>
+      <w:r>
+        <w:t>regression</w:t>
+      </w:r>
+      <w:proofErr w:type="spellEnd"/>
+      <w:r>
+        <w:t xml:space="preserve"> (LSFR) doit être utilisé. </w:t>
+      </w:r>
+    </w:p>
+    <w:p>
+      <w:pPr>
+        <w:pStyle w:val="Sansinterligne"/>
+        <w:jc w:val="both"/>
+      </w:pPr>
+    </w:p>
+    <w:p>
+      <w:pPr>
+        <w:pStyle w:val="Sansinterligne"/>
+        <w:jc w:val="both"/>
+        <w:rPr>
+          <w:rFonts w:eastAsiaTheme="minorEastAsia"/>
+        </w:rPr>
+      </w:pPr>
+      <w:r>
+        <w:t>Dans le cas d’une régression classique, la variable réponse et l</w:t>
+      </w:r>
+      <w:r>
+        <w:t xml:space="preserve">es </w:t>
+      </w:r>
+      <w:r>
+        <w:t xml:space="preserve">paramètres </w:t>
+      </w:r>
+      <m:oMath>
+        <m:sSub>
+          <m:sSubPr>
+            <m:ctrlPr>
+              <w:rPr>
+                <w:rFonts w:ascii="Cambria Math" w:hAnsi="Cambria Math"/>
+              </w:rPr>
+            </m:ctrlPr>
+          </m:sSubPr>
+          <m:e>
+            <m:r>
+              <m:rPr>
+                <m:sty m:val="p"/>
+              </m:rPr>
+              <w:rPr>
+                <w:rFonts w:ascii="Cambria Math" w:hAnsi="Cambria Math"/>
+              </w:rPr>
+              <m:t>β</m:t>
+            </m:r>
+          </m:e>
+          <m:sub>
+            <m:r>
+              <m:rPr>
+                <m:sty m:val="p"/>
+              </m:rPr>
+              <w:rPr>
+                <w:rFonts w:ascii="Cambria Math" w:hAnsi="Cambria Math"/>
+              </w:rPr>
+              <m:t>0</m:t>
+            </m:r>
+          </m:sub>
+        </m:sSub>
+      </m:oMath>
+      <w:r>
+        <w:rPr>
+          <w:rFonts w:eastAsiaTheme="minorEastAsia"/>
+        </w:rPr>
+        <w:t xml:space="preserve"> et </w:t>
+      </w:r>
+      <m:oMath>
+        <m:sSub>
+          <m:sSubPr>
+            <m:ctrlPr>
+              <w:rPr>
+                <w:rFonts w:ascii="Cambria Math" w:eastAsiaTheme="minorEastAsia" w:hAnsi="Cambria Math"/>
+                <w:i/>
+              </w:rPr>
+            </m:ctrlPr>
+          </m:sSubPr>
+          <m:e>
+            <m:r>
+              <m:rPr>
+                <m:sty m:val="p"/>
+              </m:rPr>
+              <w:rPr>
+                <w:rFonts w:ascii="Cambria Math" w:eastAsiaTheme="minorEastAsia" w:hAnsi="Cambria Math"/>
+              </w:rPr>
+              <m:t>β</m:t>
+            </m:r>
+            <m:ctrlPr>
+              <w:rPr>
+                <w:rFonts w:ascii="Cambria Math" w:eastAsiaTheme="minorEastAsia" w:hAnsi="Cambria Math"/>
+              </w:rPr>
+            </m:ctrlPr>
+          </m:e>
+          <m:sub>
+            <m:r>
+              <w:rPr>
+                <w:rFonts w:ascii="Cambria Math" w:eastAsiaTheme="minorEastAsia" w:hAnsi="Cambria Math"/>
+              </w:rPr>
+              <m:t>1</m:t>
+            </m:r>
+          </m:sub>
+        </m:sSub>
+      </m:oMath>
+      <w:r>
+        <w:rPr>
+          <w:rFonts w:eastAsiaTheme="minorEastAsia"/>
+        </w:rPr>
+        <w:t xml:space="preserve"> </w:t>
+      </w:r>
+      <w:r>
+        <w:t>sont des scalaires :</w:t>
+      </w:r>
+    </w:p>
+    <w:p>
+      <w:pPr>
+        <w:pStyle w:val="Sansinterligne"/>
+        <w:jc w:val="both"/>
+        <w:rPr>
+          <w:rFonts w:eastAsiaTheme="minorEastAsia"/>
+        </w:rPr>
+      </w:pPr>
+    </w:p>
+    <w:p>
+      <w:pPr>
+        <w:pStyle w:val="Sansinterligne"/>
+        <w:jc w:val="both"/>
+        <w:rPr>
+          <w:rFonts w:eastAsiaTheme="minorEastAsia"/>
+        </w:rPr>
+      </w:pPr>
+      <m:oMathPara>
+        <m:oMath>
+          <m:r>
+            <w:rPr>
+              <w:rFonts w:ascii="Cambria Math" w:hAnsi="Cambria Math"/>
+            </w:rPr>
+            <m:t>Y=</m:t>
+          </m:r>
+          <m:sSub>
+            <m:sSubPr>
+              <m:ctrlPr>
+                <w:rPr>
+                  <w:rFonts w:ascii="Cambria Math" w:hAnsi="Cambria Math"/>
+                  <w:i/>
+                </w:rPr>
+              </m:ctrlPr>
+            </m:sSubPr>
+            <m:e>
+              <m:r>
+                <m:rPr>
+                  <m:sty m:val="p"/>
+                </m:rPr>
+                <w:rPr>
+                  <w:rFonts w:ascii="Cambria Math" w:hAnsi="Cambria Math"/>
+                </w:rPr>
+                <m:t>β</m:t>
+              </m:r>
+            </m:e>
+            <m:sub>
+              <m:r>
+                <w:rPr>
+                  <w:rFonts w:ascii="Cambria Math" w:hAnsi="Cambria Math"/>
+                </w:rPr>
+                <m:t>0</m:t>
+              </m:r>
+            </m:sub>
+          </m:sSub>
+          <m:r>
+            <w:rPr>
+              <w:rFonts w:ascii="Cambria Math" w:hAnsi="Cambria Math"/>
+            </w:rPr>
+            <m:t>+X</m:t>
+          </m:r>
+          <m:sSub>
+            <m:sSubPr>
+              <m:ctrlPr>
+                <w:rPr>
+                  <w:rFonts w:ascii="Cambria Math" w:hAnsi="Cambria Math"/>
+                  <w:i/>
+                </w:rPr>
+              </m:ctrlPr>
+            </m:sSubPr>
+            <m:e>
+              <m:r>
+                <m:rPr>
+                  <m:sty m:val="p"/>
+                </m:rPr>
+                <w:rPr>
+                  <w:rFonts w:ascii="Cambria Math" w:hAnsi="Cambria Math"/>
+                </w:rPr>
+                <m:t>β</m:t>
+              </m:r>
+              <m:ctrlPr>
+                <w:rPr>
+                  <w:rFonts w:ascii="Cambria Math" w:hAnsi="Cambria Math"/>
+                </w:rPr>
+              </m:ctrlPr>
+            </m:e>
+            <m:sub>
+              <m:r>
+                <w:rPr>
+                  <w:rFonts w:ascii="Cambria Math" w:hAnsi="Cambria Math"/>
+                </w:rPr>
+                <m:t>1</m:t>
+              </m:r>
+            </m:sub>
+          </m:sSub>
+          <m:r>
+            <w:rPr>
+              <w:rFonts w:ascii="Cambria Math" w:hAnsi="Cambria Math"/>
+            </w:rPr>
+            <m:t>+</m:t>
+          </m:r>
+          <m:r>
+            <m:rPr>
+              <m:sty m:val="p"/>
+            </m:rPr>
+            <w:rPr>
+              <w:rFonts w:ascii="Cambria Math" w:hAnsi="Cambria Math"/>
+            </w:rPr>
+            <m:t>ϵ</m:t>
+          </m:r>
+          <m:r>
+            <m:rPr>
+              <m:sty m:val="p"/>
+            </m:rPr>
+            <w:rPr>
+              <w:rFonts w:ascii="Cambria Math" w:hAnsi="Cambria Math"/>
+            </w:rPr>
+            <m:t xml:space="preserve">   </m:t>
+          </m:r>
+          <m:d>
+            <m:dPr>
+              <m:ctrlPr>
+                <w:rPr>
+                  <w:rFonts w:ascii="Cambria Math" w:hAnsi="Cambria Math"/>
+                </w:rPr>
+              </m:ctrlPr>
+            </m:dPr>
+            <m:e>
+              <m:r>
+                <m:rPr>
+                  <m:sty m:val="p"/>
+                </m:rPr>
+                <w:rPr>
+                  <w:rFonts w:ascii="Cambria Math" w:hAnsi="Cambria Math"/>
+                </w:rPr>
+                <m:t>1</m:t>
+              </m:r>
+            </m:e>
+          </m:d>
+        </m:oMath>
+      </m:oMathPara>
+    </w:p>
+    <w:p>
+      <w:pPr>
+        <w:pStyle w:val="Sansinterligne"/>
+        <w:jc w:val="both"/>
+        <w:rPr>
+          <w:rFonts w:eastAsiaTheme="minorEastAsia"/>
+        </w:rPr>
+      </w:pPr>
+    </w:p>
+    <w:p>
+      <w:pPr>
+        <w:pStyle w:val="Sansinterligne"/>
+        <w:jc w:val="both"/>
+        <w:rPr>
+          <w:rFonts w:eastAsiaTheme="minorEastAsia"/>
+          <w:iCs/>
+        </w:rPr>
+      </w:pPr>
+      <w:r>
+        <w:rPr>
+          <w:rFonts w:eastAsiaTheme="minorEastAsia"/>
+        </w:rPr>
+        <w:t xml:space="preserve">Pour le modèle LSFR, la variable réponse et </w:t>
+      </w:r>
+      <w:r>
+        <w:t xml:space="preserve">le paramètres </w:t>
+      </w:r>
+      <m:oMath>
+        <m:r>
+          <w:rPr>
+            <w:rFonts w:ascii="Cambria Math" w:hAnsi="Cambria Math"/>
+          </w:rPr>
+          <m:t>β</m:t>
+        </m:r>
+      </m:oMath>
+      <w:r>
+        <w:rPr>
+          <w:rFonts w:eastAsiaTheme="minorEastAsia"/>
+          <w:iCs/>
+        </w:rPr>
+        <w:t xml:space="preserve"> sont des fonctions. L’équation 1 peut donc s’écrire ainsi :</w:t>
+      </w:r>
+    </w:p>
+    <w:p>
+      <w:pPr>
+        <w:pStyle w:val="Sansinterligne"/>
+        <w:jc w:val="both"/>
+        <w:rPr>
+          <w:rFonts w:eastAsiaTheme="minorEastAsia"/>
+          <w:iCs/>
+        </w:rPr>
+      </w:pPr>
+    </w:p>
+    <w:p>
+      <w:pPr>
+        <w:pStyle w:val="Sansinterligne"/>
+        <w:jc w:val="both"/>
+        <w:rPr>
+          <w:rFonts w:eastAsiaTheme="minorEastAsia"/>
+        </w:rPr>
+      </w:pPr>
+      <m:oMathPara>
+        <m:oMath>
+          <m:r>
+            <w:rPr>
+              <w:rFonts w:ascii="Cambria Math" w:eastAsiaTheme="minorEastAsia" w:hAnsi="Cambria Math"/>
+            </w:rPr>
+            <m:t>Y=</m:t>
+          </m:r>
+          <m:sSub>
+            <m:sSubPr>
+              <m:ctrlPr>
+                <w:rPr>
+                  <w:rFonts w:ascii="Cambria Math" w:eastAsiaTheme="minorEastAsia" w:hAnsi="Cambria Math"/>
+                  <w:i/>
+                </w:rPr>
+              </m:ctrlPr>
+            </m:sSubPr>
+            <m:e>
+              <m:r>
+                <m:rPr>
+                  <m:sty m:val="p"/>
+                </m:rPr>
+                <w:rPr>
+                  <w:rFonts w:ascii="Cambria Math" w:eastAsiaTheme="minorEastAsia" w:hAnsi="Cambria Math"/>
+                </w:rPr>
+                <m:t>β</m:t>
+              </m:r>
+            </m:e>
+            <m:sub>
+              <m:r>
+                <w:rPr>
+                  <w:rFonts w:ascii="Cambria Math" w:eastAsiaTheme="minorEastAsia" w:hAnsi="Cambria Math"/>
+                </w:rPr>
+                <m:t>0</m:t>
+              </m:r>
+            </m:sub>
+          </m:sSub>
+          <m:r>
+            <w:rPr>
+              <w:rFonts w:ascii="Cambria Math" w:eastAsiaTheme="minorEastAsia" w:hAnsi="Cambria Math"/>
+            </w:rPr>
+            <m:t>+</m:t>
+          </m:r>
+          <m:nary>
+            <m:naryPr>
+              <m:supHide m:val="1"/>
+              <m:ctrlPr>
+                <w:rPr>
+                  <w:rFonts w:ascii="Cambria Math" w:eastAsiaTheme="minorEastAsia" w:hAnsi="Cambria Math"/>
+                </w:rPr>
+              </m:ctrlPr>
+            </m:naryPr>
+            <m:sub>
+              <m:r>
+                <w:rPr>
+                  <w:rFonts w:ascii="Cambria Math" w:eastAsiaTheme="minorEastAsia" w:hAnsi="Cambria Math"/>
+                </w:rPr>
+                <m:t>t</m:t>
+              </m:r>
+              <m:ctrlPr>
+                <w:rPr>
+                  <w:rFonts w:ascii="Cambria Math" w:eastAsiaTheme="minorEastAsia" w:hAnsi="Cambria Math"/>
+                  <w:i/>
+                </w:rPr>
+              </m:ctrlPr>
+            </m:sub>
+            <m:sup>
+              <m:ctrlPr>
+                <w:rPr>
+                  <w:rFonts w:ascii="Cambria Math" w:eastAsiaTheme="minorEastAsia" w:hAnsi="Cambria Math"/>
+                  <w:i/>
+                </w:rPr>
+              </m:ctrlPr>
+            </m:sup>
+            <m:e>
+              <m:r>
+                <w:rPr>
+                  <w:rFonts w:ascii="Cambria Math" w:eastAsiaTheme="minorEastAsia" w:hAnsi="Cambria Math"/>
+                </w:rPr>
+                <m:t>X</m:t>
+              </m:r>
+              <m:d>
+                <m:dPr>
+                  <m:ctrlPr>
+                    <w:rPr>
+                      <w:rFonts w:ascii="Cambria Math" w:eastAsiaTheme="minorEastAsia" w:hAnsi="Cambria Math"/>
+                      <w:i/>
+                    </w:rPr>
+                  </m:ctrlPr>
+                </m:dPr>
+                <m:e>
+                  <m:r>
+                    <w:rPr>
+                      <w:rFonts w:ascii="Cambria Math" w:eastAsiaTheme="minorEastAsia" w:hAnsi="Cambria Math"/>
+                    </w:rPr>
+                    <m:t>t</m:t>
+                  </m:r>
+                </m:e>
+              </m:d>
+              <m:r>
+                <m:rPr>
+                  <m:sty m:val="p"/>
+                </m:rPr>
+                <w:rPr>
+                  <w:rFonts w:ascii="Cambria Math" w:eastAsiaTheme="minorEastAsia" w:hAnsi="Cambria Math"/>
+                </w:rPr>
+                <m:t>β</m:t>
+              </m:r>
+              <m:d>
+                <m:dPr>
+                  <m:ctrlPr>
+                    <w:rPr>
+                      <w:rFonts w:ascii="Cambria Math" w:eastAsiaTheme="minorEastAsia" w:hAnsi="Cambria Math"/>
+                      <w:i/>
+                    </w:rPr>
+                  </m:ctrlPr>
+                </m:dPr>
+                <m:e>
+                  <m:r>
+                    <w:rPr>
+                      <w:rFonts w:ascii="Cambria Math" w:eastAsiaTheme="minorEastAsia" w:hAnsi="Cambria Math"/>
+                    </w:rPr>
+                    <m:t>t</m:t>
+                  </m:r>
+                </m:e>
+              </m:d>
+              <m:r>
+                <m:rPr>
+                  <m:nor/>
+                </m:rPr>
+                <w:rPr>
+                  <w:rFonts w:ascii="Cambria Math" w:eastAsiaTheme="minorEastAsia" w:hAnsi="Cambria Math"/>
+                </w:rPr>
+                <m:t>d</m:t>
+              </m:r>
+              <m:ctrlPr>
+                <w:rPr>
+                  <w:rFonts w:ascii="Cambria Math" w:eastAsiaTheme="minorEastAsia" w:hAnsi="Cambria Math"/>
+                  <w:i/>
+                </w:rPr>
+              </m:ctrlPr>
+            </m:e>
+          </m:nary>
+          <m:r>
+            <w:rPr>
+              <w:rFonts w:ascii="Cambria Math" w:eastAsiaTheme="minorEastAsia" w:hAnsi="Cambria Math"/>
+            </w:rPr>
+            <m:t>t</m:t>
+          </m:r>
+          <m:r>
+            <w:rPr>
+              <w:rFonts w:ascii="Cambria Math" w:eastAsiaTheme="minorEastAsia" w:hAnsi="Cambria Math"/>
+            </w:rPr>
+            <m:t>+</m:t>
+          </m:r>
+          <m:r>
+            <m:rPr>
+              <m:sty m:val="p"/>
+            </m:rPr>
+            <w:rPr>
+              <w:rFonts w:ascii="Cambria Math" w:eastAsiaTheme="minorEastAsia" w:hAnsi="Cambria Math"/>
+            </w:rPr>
+            <m:t>ϵ</m:t>
+          </m:r>
+          <m:r>
+            <m:rPr>
+              <m:sty m:val="p"/>
+            </m:rPr>
+            <w:rPr>
+              <w:rFonts w:ascii="Cambria Math" w:eastAsiaTheme="minorEastAsia" w:hAnsi="Cambria Math"/>
+            </w:rPr>
+            <m:t xml:space="preserve">   (2)</m:t>
+          </m:r>
+        </m:oMath>
+      </m:oMathPara>
+    </w:p>
+    <w:p>
+      <w:pPr>
+        <w:pStyle w:val="Sansinterligne"/>
+        <w:jc w:val="both"/>
+        <w:rPr>
+          <w:rFonts w:eastAsiaTheme="minorEastAsia"/>
+        </w:rPr>
+      </w:pPr>
+    </w:p>
+    <w:p>
+      <w:pPr>
+        <w:pStyle w:val="Sansinterligne"/>
+        <w:jc w:val="both"/>
+        <w:rPr>
+          <w:rFonts w:eastAsiaTheme="minorEastAsia"/>
+        </w:rPr>
+      </w:pPr>
+      <w:r>
+        <w:t>L’</w:t>
+      </w:r>
+      <w:r>
+        <w:t>approche pour l’</w:t>
+      </w:r>
+      <w:r>
+        <w:t xml:space="preserve">estimation de </w:t>
+      </w:r>
+      <m:oMath>
+        <m:sSub>
+          <m:sSubPr>
+            <m:ctrlPr>
+              <w:rPr>
+                <w:rFonts w:ascii="Cambria Math" w:hAnsi="Cambria Math"/>
+                <w:i/>
+              </w:rPr>
+            </m:ctrlPr>
+          </m:sSubPr>
+          <m:e>
+            <m:r>
+              <m:rPr>
+                <m:sty m:val="p"/>
+              </m:rPr>
+              <w:rPr>
+                <w:rFonts w:ascii="Cambria Math" w:hAnsi="Cambria Math"/>
+              </w:rPr>
+              <m:t>β</m:t>
+            </m:r>
+            <m:ctrlPr>
+              <w:rPr>
+                <w:rFonts w:ascii="Cambria Math" w:hAnsi="Cambria Math"/>
+              </w:rPr>
+            </m:ctrlPr>
+          </m:e>
+          <m:sub>
+            <m:r>
+              <w:rPr>
+                <w:rFonts w:ascii="Cambria Math" w:hAnsi="Cambria Math"/>
+              </w:rPr>
+              <m:t>0</m:t>
+            </m:r>
+          </m:sub>
+        </m:sSub>
+      </m:oMath>
+      <w:r>
+        <w:rPr>
+          <w:rFonts w:eastAsiaTheme="minorEastAsia"/>
+        </w:rPr>
+        <w:t xml:space="preserve"> et de </w:t>
+      </w:r>
+      <w:r>
+        <w:t xml:space="preserve">la fonction du coefficient </w:t>
+      </w:r>
+      <m:oMath>
+        <m:r>
+          <m:rPr>
+            <m:sty m:val="p"/>
+          </m:rPr>
+          <w:rPr>
+            <w:rFonts w:ascii="Cambria Math" w:hAnsi="Cambria Math"/>
+          </w:rPr>
+          <m:t>β</m:t>
+        </m:r>
+      </m:oMath>
+      <w:r>
+        <w:rPr>
+          <w:rFonts w:eastAsiaTheme="minorEastAsia"/>
+        </w:rPr>
+        <w:t xml:space="preserve"> </w:t>
+      </w:r>
+      <w:r>
+        <w:rPr>
+          <w:rFonts w:eastAsiaTheme="minorEastAsia"/>
+        </w:rPr>
+        <w:t xml:space="preserve">est </w:t>
+      </w:r>
+      <w:r>
+        <w:rPr>
+          <w:rFonts w:eastAsiaTheme="minorEastAsia"/>
+        </w:rPr>
+        <w:t>d’utiliser</w:t>
+      </w:r>
+      <w:r>
+        <w:rPr>
+          <w:rFonts w:eastAsiaTheme="minorEastAsia"/>
+        </w:rPr>
+        <w:t xml:space="preserve"> </w:t>
+      </w:r>
+      <w:r>
+        <w:rPr>
+          <w:rFonts w:eastAsiaTheme="minorEastAsia"/>
+        </w:rPr>
+        <w:t>un</w:t>
+      </w:r>
+      <w:r>
+        <w:rPr>
+          <w:rFonts w:eastAsiaTheme="minorEastAsia"/>
+        </w:rPr>
+        <w:t xml:space="preserve"> ensemble de fonctions de bases</w:t>
+      </w:r>
+      <w:r>
+        <w:rPr>
+          <w:rFonts w:eastAsiaTheme="minorEastAsia"/>
+        </w:rPr>
+        <w:t xml:space="preserve"> </w:t>
+      </w:r>
+      <w:r>
+        <w:rPr>
+          <w:rFonts w:eastAsiaTheme="minorEastAsia"/>
+          <w:i/>
+          <w:iCs/>
+        </w:rPr>
+        <w:t>a priori</w:t>
+      </w:r>
+      <w:r>
+        <w:rPr>
+          <w:rFonts w:eastAsiaTheme="minorEastAsia"/>
+        </w:rPr>
+        <w:t xml:space="preserve"> tel que</w:t>
+      </w:r>
+      <w:r>
+        <w:rPr>
+          <w:rFonts w:eastAsiaTheme="minorEastAsia"/>
+        </w:rPr>
+        <w:t xml:space="preserve"> </w:t>
+      </w:r>
+      <m:oMath>
+        <m:r>
+          <w:rPr>
+            <w:rFonts w:ascii="Cambria Math" w:eastAsiaTheme="minorEastAsia" w:hAnsi="Cambria Math"/>
+          </w:rPr>
+          <m:t>β</m:t>
+        </m:r>
+        <m:d>
+          <m:dPr>
+            <m:ctrlPr>
+              <w:rPr>
+                <w:rFonts w:ascii="Cambria Math" w:eastAsiaTheme="minorEastAsia" w:hAnsi="Cambria Math"/>
+                <w:i/>
+              </w:rPr>
+            </m:ctrlPr>
+          </m:dPr>
+          <m:e>
+            <m:r>
+              <w:rPr>
+                <w:rFonts w:ascii="Cambria Math" w:eastAsiaTheme="minorEastAsia" w:hAnsi="Cambria Math"/>
+              </w:rPr>
+              <m:t>t</m:t>
+            </m:r>
+          </m:e>
+        </m:d>
+        <m:r>
+          <w:rPr>
+            <w:rFonts w:ascii="Cambria Math" w:eastAsiaTheme="minorEastAsia" w:hAnsi="Cambria Math"/>
+          </w:rPr>
+          <m:t>=b</m:t>
+        </m:r>
+        <m:d>
+          <m:dPr>
+            <m:ctrlPr>
+              <w:rPr>
+                <w:rFonts w:ascii="Cambria Math" w:eastAsiaTheme="minorEastAsia" w:hAnsi="Cambria Math"/>
+                <w:i/>
+              </w:rPr>
+            </m:ctrlPr>
+          </m:dPr>
+          <m:e>
+            <m:r>
+              <w:rPr>
+                <w:rFonts w:ascii="Cambria Math" w:eastAsiaTheme="minorEastAsia" w:hAnsi="Cambria Math"/>
+              </w:rPr>
+              <m:t>t</m:t>
+            </m:r>
+          </m:e>
+        </m:d>
+        <m:r>
+          <w:rPr>
+            <w:rFonts w:ascii="Cambria Math" w:eastAsiaTheme="minorEastAsia" w:hAnsi="Cambria Math"/>
+          </w:rPr>
+          <m:t>γ</m:t>
+        </m:r>
+      </m:oMath>
+      <w:r>
+        <w:rPr>
+          <w:rFonts w:eastAsiaTheme="minorEastAsia"/>
+        </w:rPr>
+        <w:t xml:space="preserve"> avec </w:t>
+      </w:r>
+      <m:oMath>
+        <m:r>
+          <w:rPr>
+            <w:rFonts w:ascii="Cambria Math" w:eastAsiaTheme="minorEastAsia" w:hAnsi="Cambria Math"/>
+          </w:rPr>
+          <m:t>b</m:t>
+        </m:r>
+        <m:d>
+          <m:dPr>
+            <m:ctrlPr>
+              <w:rPr>
+                <w:rFonts w:ascii="Cambria Math" w:eastAsiaTheme="minorEastAsia" w:hAnsi="Cambria Math"/>
+                <w:i/>
+              </w:rPr>
+            </m:ctrlPr>
+          </m:dPr>
+          <m:e>
+            <m:r>
+              <w:rPr>
+                <w:rFonts w:ascii="Cambria Math" w:eastAsiaTheme="minorEastAsia" w:hAnsi="Cambria Math"/>
+              </w:rPr>
+              <m:t>t</m:t>
+            </m:r>
+          </m:e>
+        </m:d>
+        <m:r>
+          <w:rPr>
+            <w:rFonts w:ascii="Cambria Math" w:eastAsiaTheme="minorEastAsia" w:hAnsi="Cambria Math"/>
+          </w:rPr>
+          <m:t>=</m:t>
+        </m:r>
+        <m:d>
+          <m:dPr>
+            <m:begChr m:val="["/>
+            <m:endChr m:val="]"/>
+            <m:ctrlPr>
+              <w:rPr>
+                <w:rFonts w:ascii="Cambria Math" w:eastAsiaTheme="minorEastAsia" w:hAnsi="Cambria Math"/>
+                <w:i/>
+              </w:rPr>
+            </m:ctrlPr>
+          </m:dPr>
+          <m:e>
+            <m:sSub>
+              <m:sSubPr>
+                <m:ctrlPr>
+                  <w:rPr>
+                    <w:rFonts w:ascii="Cambria Math" w:eastAsiaTheme="minorEastAsia" w:hAnsi="Cambria Math"/>
+                    <w:i/>
+                  </w:rPr>
+                </m:ctrlPr>
+              </m:sSubPr>
+              <m:e>
+                <m:r>
+                  <w:rPr>
+                    <w:rFonts w:ascii="Cambria Math" w:eastAsiaTheme="minorEastAsia" w:hAnsi="Cambria Math"/>
+                  </w:rPr>
+                  <m:t>b</m:t>
+                </m:r>
+              </m:e>
+              <m:sub>
+                <m:r>
+                  <w:rPr>
+                    <w:rFonts w:ascii="Cambria Math" w:eastAsiaTheme="minorEastAsia" w:hAnsi="Cambria Math"/>
+                  </w:rPr>
+                  <m:t>1</m:t>
+                </m:r>
+              </m:sub>
+            </m:sSub>
+            <m:d>
+              <m:dPr>
+                <m:ctrlPr>
+                  <w:rPr>
+                    <w:rFonts w:ascii="Cambria Math" w:eastAsiaTheme="minorEastAsia" w:hAnsi="Cambria Math"/>
+                    <w:i/>
+                  </w:rPr>
+                </m:ctrlPr>
+              </m:dPr>
+              <m:e>
+                <m:r>
+                  <w:rPr>
+                    <w:rFonts w:ascii="Cambria Math" w:eastAsiaTheme="minorEastAsia" w:hAnsi="Cambria Math"/>
+                  </w:rPr>
+                  <m:t>t</m:t>
+                </m:r>
+              </m:e>
+            </m:d>
+            <m:r>
+              <w:rPr>
+                <w:rFonts w:ascii="Cambria Math" w:eastAsiaTheme="minorEastAsia" w:hAnsi="Cambria Math"/>
+              </w:rPr>
+              <m:t>,…,</m:t>
+            </m:r>
+            <m:sSub>
+              <m:sSubPr>
+                <m:ctrlPr>
+                  <w:rPr>
+                    <w:rFonts w:ascii="Cambria Math" w:eastAsiaTheme="minorEastAsia" w:hAnsi="Cambria Math"/>
+                    <w:i/>
+                  </w:rPr>
+                </m:ctrlPr>
+              </m:sSubPr>
+              <m:e>
+                <m:r>
+                  <w:rPr>
+                    <w:rFonts w:ascii="Cambria Math" w:eastAsiaTheme="minorEastAsia" w:hAnsi="Cambria Math"/>
+                  </w:rPr>
+                  <m:t>b</m:t>
+                </m:r>
+              </m:e>
+              <m:sub>
+                <m:r>
+                  <w:rPr>
+                    <w:rFonts w:ascii="Cambria Math" w:eastAsiaTheme="minorEastAsia" w:hAnsi="Cambria Math"/>
+                  </w:rPr>
+                  <m:t>k</m:t>
+                </m:r>
+              </m:sub>
+            </m:sSub>
+            <m:d>
+              <m:dPr>
+                <m:ctrlPr>
+                  <w:rPr>
+                    <w:rFonts w:ascii="Cambria Math" w:eastAsiaTheme="minorEastAsia" w:hAnsi="Cambria Math"/>
+                    <w:i/>
+                  </w:rPr>
+                </m:ctrlPr>
+              </m:dPr>
+              <m:e>
+                <m:r>
+                  <w:rPr>
+                    <w:rFonts w:ascii="Cambria Math" w:eastAsiaTheme="minorEastAsia" w:hAnsi="Cambria Math"/>
+                  </w:rPr>
+                  <m:t>t</m:t>
+                </m:r>
+              </m:e>
+            </m:d>
+          </m:e>
+        </m:d>
+      </m:oMath>
+      <w:r>
+        <w:rPr>
+          <w:rFonts w:eastAsiaTheme="minorEastAsia"/>
+        </w:rPr>
+        <w:t xml:space="preserve"> un ensemble de fonction de base et </w:t>
+      </w:r>
+      <m:oMath>
+        <m:r>
+          <m:rPr>
+            <m:sty m:val="p"/>
+          </m:rPr>
+          <w:rPr>
+            <w:rFonts w:ascii="Cambria Math" w:eastAsiaTheme="minorEastAsia" w:hAnsi="Cambria Math"/>
+          </w:rPr>
+          <m:t>γ</m:t>
+        </m:r>
+        <m:r>
+          <w:rPr>
+            <w:rFonts w:ascii="Cambria Math" w:eastAsiaTheme="minorEastAsia" w:hAnsi="Cambria Math"/>
+          </w:rPr>
+          <m:t>=</m:t>
+        </m:r>
+        <m:d>
+          <m:dPr>
+            <m:ctrlPr>
+              <w:rPr>
+                <w:rFonts w:ascii="Cambria Math" w:eastAsiaTheme="minorEastAsia" w:hAnsi="Cambria Math"/>
+                <w:i/>
+              </w:rPr>
+            </m:ctrlPr>
+          </m:dPr>
+          <m:e>
+            <m:sSub>
+              <m:sSubPr>
+                <m:ctrlPr>
+                  <w:rPr>
+                    <w:rFonts w:ascii="Cambria Math" w:eastAsiaTheme="minorEastAsia" w:hAnsi="Cambria Math"/>
+                    <w:i/>
+                  </w:rPr>
+                </m:ctrlPr>
+              </m:sSubPr>
+              <m:e>
+                <m:r>
+                  <m:rPr>
+                    <m:sty m:val="p"/>
+                  </m:rPr>
+                  <w:rPr>
+                    <w:rFonts w:ascii="Cambria Math" w:eastAsiaTheme="minorEastAsia" w:hAnsi="Cambria Math"/>
+                  </w:rPr>
+                  <m:t>γ</m:t>
+                </m:r>
+              </m:e>
+              <m:sub>
+                <m:r>
+                  <w:rPr>
+                    <w:rFonts w:ascii="Cambria Math" w:eastAsiaTheme="minorEastAsia" w:hAnsi="Cambria Math"/>
+                  </w:rPr>
+                  <m:t>1</m:t>
+                </m:r>
+              </m:sub>
+            </m:sSub>
+            <m:r>
+              <w:rPr>
+                <w:rFonts w:ascii="Cambria Math" w:eastAsiaTheme="minorEastAsia" w:hAnsi="Cambria Math"/>
+              </w:rPr>
+              <m:t>,…,</m:t>
+            </m:r>
+            <m:sSub>
+              <m:sSubPr>
+                <m:ctrlPr>
+                  <w:rPr>
+                    <w:rFonts w:ascii="Cambria Math" w:eastAsiaTheme="minorEastAsia" w:hAnsi="Cambria Math"/>
+                    <w:i/>
+                  </w:rPr>
+                </m:ctrlPr>
+              </m:sSubPr>
+              <m:e>
+                <m:r>
+                  <m:rPr>
+                    <m:sty m:val="p"/>
+                  </m:rPr>
+                  <w:rPr>
+                    <w:rFonts w:ascii="Cambria Math" w:eastAsiaTheme="minorEastAsia" w:hAnsi="Cambria Math"/>
+                  </w:rPr>
+                  <m:t>γ</m:t>
+                </m:r>
+              </m:e>
+              <m:sub>
+                <m:r>
+                  <w:rPr>
+                    <w:rFonts w:ascii="Cambria Math" w:eastAsiaTheme="minorEastAsia" w:hAnsi="Cambria Math"/>
+                  </w:rPr>
+                  <m:t>k</m:t>
+                </m:r>
+              </m:sub>
+            </m:sSub>
+          </m:e>
+        </m:d>
+      </m:oMath>
+      <w:r>
+        <w:rPr>
+          <w:rFonts w:eastAsiaTheme="minorEastAsia"/>
+        </w:rPr>
+        <w:t>.</w:t>
+      </w:r>
+      <w:r>
+        <w:rPr>
+          <w:rFonts w:eastAsiaTheme="minorEastAsia"/>
+        </w:rPr>
+        <w:t xml:space="preserve"> Les paramètres</w:t>
+      </w:r>
+      <w:r>
+        <w:rPr>
+          <w:rFonts w:eastAsiaTheme="minorEastAsia"/>
+        </w:rPr>
+        <w:t xml:space="preserve"> </w:t>
+      </w:r>
+      <m:oMath>
+        <m:sSub>
+          <m:sSubPr>
+            <m:ctrlPr>
+              <w:rPr>
+                <w:rFonts w:ascii="Cambria Math" w:eastAsiaTheme="minorEastAsia" w:hAnsi="Cambria Math"/>
+                <w:i/>
+              </w:rPr>
+            </m:ctrlPr>
+          </m:sSubPr>
+          <m:e>
+            <m:r>
+              <m:rPr>
+                <m:sty m:val="p"/>
+              </m:rPr>
+              <w:rPr>
+                <w:rFonts w:ascii="Cambria Math" w:eastAsiaTheme="minorEastAsia" w:hAnsi="Cambria Math"/>
+              </w:rPr>
+              <m:t>β</m:t>
+            </m:r>
+            <m:ctrlPr>
+              <w:rPr>
+                <w:rFonts w:ascii="Cambria Math" w:eastAsiaTheme="minorEastAsia" w:hAnsi="Cambria Math"/>
+              </w:rPr>
+            </m:ctrlPr>
+          </m:e>
+          <m:sub>
+            <m:r>
+              <w:rPr>
+                <w:rFonts w:ascii="Cambria Math" w:eastAsiaTheme="minorEastAsia" w:hAnsi="Cambria Math"/>
+              </w:rPr>
+              <m:t>0</m:t>
+            </m:r>
+          </m:sub>
+        </m:sSub>
+      </m:oMath>
+      <w:r>
+        <w:rPr>
+          <w:rFonts w:eastAsiaTheme="minorEastAsia"/>
+        </w:rPr>
+        <w:t xml:space="preserve"> et </w:t>
+      </w:r>
+      <m:oMath>
+        <m:r>
+          <m:rPr>
+            <m:sty m:val="p"/>
+          </m:rPr>
+          <w:rPr>
+            <w:rFonts w:ascii="Cambria Math" w:eastAsiaTheme="minorEastAsia" w:hAnsi="Cambria Math"/>
+          </w:rPr>
+          <m:t>γ</m:t>
+        </m:r>
+      </m:oMath>
+      <w:r>
+        <w:rPr>
+          <w:rFonts w:eastAsiaTheme="minorEastAsia"/>
+        </w:rPr>
+        <w:t xml:space="preserve"> s’estime ainsi :</w:t>
+      </w:r>
+    </w:p>
+    <w:p>
+      <w:pPr>
+        <w:pStyle w:val="Sansinterligne"/>
+        <w:jc w:val="both"/>
+        <w:rPr>
+          <w:rFonts w:eastAsiaTheme="minorEastAsia"/>
+        </w:rPr>
+      </w:pPr>
+    </w:p>
+    <w:p>
+      <w:pPr>
+        <w:pStyle w:val="Sansinterligne"/>
+        <w:jc w:val="both"/>
+        <w:rPr>
+          <w:rFonts w:eastAsiaTheme="minorEastAsia"/>
+          <w:lang w:val="en-US"/>
+        </w:rPr>
+      </w:pPr>
+      <m:oMathPara>
+        <m:oMath>
+          <m:acc>
+            <m:accPr>
+              <m:ctrlPr>
+                <w:rPr>
+                  <w:rFonts w:ascii="Cambria Math" w:eastAsiaTheme="minorEastAsia" w:hAnsi="Cambria Math"/>
+                </w:rPr>
+              </m:ctrlPr>
+            </m:accPr>
+            <m:e>
+              <m:sSub>
+                <m:sSubPr>
+                  <m:ctrlPr>
+                    <w:rPr>
+                      <w:rFonts w:ascii="Cambria Math" w:eastAsiaTheme="minorEastAsia" w:hAnsi="Cambria Math"/>
+                      <w:i/>
+                    </w:rPr>
+                  </m:ctrlPr>
+                </m:sSubPr>
+                <m:e>
+                  <m:r>
+                    <m:rPr>
+                      <m:sty m:val="p"/>
+                    </m:rPr>
+                    <w:rPr>
+                      <w:rFonts w:ascii="Cambria Math" w:eastAsiaTheme="minorEastAsia" w:hAnsi="Cambria Math"/>
+                    </w:rPr>
+                    <m:t>β</m:t>
+                  </m:r>
+                  <m:ctrlPr>
+                    <w:rPr>
+                      <w:rFonts w:ascii="Cambria Math" w:eastAsiaTheme="minorEastAsia" w:hAnsi="Cambria Math"/>
+                    </w:rPr>
+                  </m:ctrlPr>
+                </m:e>
+                <m:sub>
+                  <m:r>
+                    <w:rPr>
+                      <w:rFonts w:ascii="Cambria Math" w:eastAsiaTheme="minorEastAsia" w:hAnsi="Cambria Math"/>
+                      <w:lang w:val="en-US"/>
+                    </w:rPr>
+                    <m:t>0</m:t>
+                  </m:r>
+                </m:sub>
+              </m:sSub>
+            </m:e>
+          </m:acc>
+          <m:r>
+            <w:rPr>
+              <w:rFonts w:ascii="Cambria Math" w:eastAsiaTheme="minorEastAsia" w:hAnsi="Cambria Math"/>
+              <w:lang w:val="en-US"/>
+            </w:rPr>
+            <m:t>,</m:t>
+          </m:r>
+          <m:acc>
+            <m:accPr>
+              <m:ctrlPr>
+                <w:rPr>
+                  <w:rFonts w:ascii="Cambria Math" w:eastAsiaTheme="minorEastAsia" w:hAnsi="Cambria Math"/>
+                </w:rPr>
+              </m:ctrlPr>
+            </m:accPr>
+            <m:e>
+              <m:r>
+                <m:rPr>
+                  <m:sty m:val="p"/>
+                </m:rPr>
+                <w:rPr>
+                  <w:rFonts w:ascii="Cambria Math" w:eastAsiaTheme="minorEastAsia" w:hAnsi="Cambria Math"/>
+                </w:rPr>
+                <m:t>γ</m:t>
+              </m:r>
+            </m:e>
+          </m:acc>
+          <m:r>
+            <w:rPr>
+              <w:rFonts w:ascii="Cambria Math" w:eastAsiaTheme="minorEastAsia" w:hAnsi="Cambria Math"/>
+              <w:lang w:val="en-US"/>
+            </w:rPr>
+            <m:t>=</m:t>
+          </m:r>
+          <m:r>
+            <m:rPr>
+              <m:sty m:val="p"/>
+            </m:rPr>
+            <w:rPr>
+              <w:rFonts w:ascii="Cambria Math" w:eastAsiaTheme="minorEastAsia" w:hAnsi="Cambria Math"/>
+            </w:rPr>
+            <m:t>argmi</m:t>
+          </m:r>
+          <m:sSub>
+            <m:sSubPr>
+              <m:ctrlPr>
+                <w:rPr>
+                  <w:rFonts w:ascii="Cambria Math" w:eastAsiaTheme="minorEastAsia" w:hAnsi="Cambria Math"/>
+                  <w:i/>
+                </w:rPr>
+              </m:ctrlPr>
+            </m:sSubPr>
+            <m:e>
+              <m:r>
+                <w:rPr>
+                  <w:rFonts w:ascii="Cambria Math" w:eastAsiaTheme="minorEastAsia" w:hAnsi="Cambria Math"/>
+                </w:rPr>
+                <m:t>n</m:t>
+              </m:r>
+            </m:e>
+            <m:sub>
+              <m:r>
+                <m:rPr>
+                  <m:sty m:val="p"/>
+                </m:rPr>
+                <w:rPr>
+                  <w:rFonts w:ascii="Cambria Math" w:eastAsiaTheme="minorEastAsia" w:hAnsi="Cambria Math"/>
+                </w:rPr>
+                <m:t>β</m:t>
+              </m:r>
+              <m:r>
+                <m:rPr>
+                  <m:sty m:val="p"/>
+                </m:rPr>
+                <w:rPr>
+                  <w:rFonts w:ascii="Cambria Math" w:eastAsiaTheme="minorEastAsia" w:hAnsi="Cambria Math"/>
+                  <w:lang w:val="en-US"/>
+                </w:rPr>
+                <m:t>,</m:t>
+              </m:r>
+              <m:r>
+                <m:rPr>
+                  <m:sty m:val="p"/>
+                </m:rPr>
+                <w:rPr>
+                  <w:rFonts w:ascii="Cambria Math" w:eastAsiaTheme="minorEastAsia" w:hAnsi="Cambria Math"/>
+                </w:rPr>
+                <m:t>γ</m:t>
+              </m:r>
+            </m:sub>
+          </m:sSub>
+          <m:d>
+            <m:dPr>
+              <m:begChr m:val="["/>
+              <m:endChr m:val="]"/>
+              <m:ctrlPr>
+                <w:rPr>
+                  <w:rFonts w:ascii="Cambria Math" w:eastAsiaTheme="minorEastAsia" w:hAnsi="Cambria Math"/>
+                </w:rPr>
+              </m:ctrlPr>
+            </m:dPr>
+            <m:e>
+              <m:nary>
+                <m:naryPr>
+                  <m:chr m:val="∑"/>
+                  <m:ctrlPr>
+                    <w:rPr>
+                      <w:rFonts w:ascii="Cambria Math" w:eastAsiaTheme="minorEastAsia" w:hAnsi="Cambria Math"/>
+                    </w:rPr>
+                  </m:ctrlPr>
+                </m:naryPr>
+                <m:sub>
+                  <m:r>
+                    <w:rPr>
+                      <w:rFonts w:ascii="Cambria Math" w:eastAsiaTheme="minorEastAsia" w:hAnsi="Cambria Math"/>
+                    </w:rPr>
+                    <m:t>i</m:t>
+                  </m:r>
+                  <m:r>
+                    <w:rPr>
+                      <w:rFonts w:ascii="Cambria Math" w:eastAsiaTheme="minorEastAsia" w:hAnsi="Cambria Math"/>
+                      <w:lang w:val="en-US"/>
+                    </w:rPr>
+                    <m:t>=1</m:t>
+                  </m:r>
+                  <m:ctrlPr>
+                    <w:rPr>
+                      <w:rFonts w:ascii="Cambria Math" w:eastAsiaTheme="minorEastAsia" w:hAnsi="Cambria Math"/>
+                      <w:i/>
+                    </w:rPr>
+                  </m:ctrlPr>
+                </m:sub>
+                <m:sup>
+                  <m:r>
+                    <w:rPr>
+                      <w:rFonts w:ascii="Cambria Math" w:eastAsiaTheme="minorEastAsia" w:hAnsi="Cambria Math"/>
+                    </w:rPr>
+                    <m:t>n</m:t>
+                  </m:r>
+                  <m:ctrlPr>
+                    <w:rPr>
+                      <w:rFonts w:ascii="Cambria Math" w:eastAsiaTheme="minorEastAsia" w:hAnsi="Cambria Math"/>
+                      <w:i/>
+                    </w:rPr>
+                  </m:ctrlPr>
+                </m:sup>
+                <m:e>
+                  <m:r>
+                    <m:rPr>
+                      <m:lit/>
+                    </m:rPr>
+                    <w:rPr>
+                      <w:rFonts w:ascii="Cambria Math" w:eastAsiaTheme="minorEastAsia" w:hAnsi="Cambria Math"/>
+                      <w:lang w:val="en-US"/>
+                    </w:rPr>
+                    <m:t>{</m:t>
+                  </m:r>
+                  <m:sSub>
+                    <m:sSubPr>
+                      <m:ctrlPr>
+                        <w:rPr>
+                          <w:rFonts w:ascii="Cambria Math" w:eastAsiaTheme="minorEastAsia" w:hAnsi="Cambria Math"/>
+                          <w:i/>
+                        </w:rPr>
+                      </m:ctrlPr>
+                    </m:sSubPr>
+                    <m:e>
+                      <m:r>
+                        <w:rPr>
+                          <w:rFonts w:ascii="Cambria Math" w:eastAsiaTheme="minorEastAsia" w:hAnsi="Cambria Math"/>
+                        </w:rPr>
+                        <m:t>y</m:t>
+                      </m:r>
+                    </m:e>
+                    <m:sub>
+                      <m:r>
+                        <w:rPr>
+                          <w:rFonts w:ascii="Cambria Math" w:eastAsiaTheme="minorEastAsia" w:hAnsi="Cambria Math"/>
+                        </w:rPr>
+                        <m:t>i</m:t>
+                      </m:r>
+                    </m:sub>
+                  </m:sSub>
+                  <m:ctrlPr>
+                    <w:rPr>
+                      <w:rFonts w:ascii="Cambria Math" w:eastAsiaTheme="minorEastAsia" w:hAnsi="Cambria Math"/>
+                      <w:i/>
+                    </w:rPr>
+                  </m:ctrlPr>
+                </m:e>
+              </m:nary>
+              <m:r>
+                <w:rPr>
+                  <w:rFonts w:ascii="Cambria Math" w:eastAsiaTheme="minorEastAsia" w:hAnsi="Cambria Math"/>
+                  <w:lang w:val="en-US"/>
+                </w:rPr>
+                <m:t>-</m:t>
+              </m:r>
+              <m:sSub>
+                <m:sSubPr>
+                  <m:ctrlPr>
+                    <w:rPr>
+                      <w:rFonts w:ascii="Cambria Math" w:eastAsiaTheme="minorEastAsia" w:hAnsi="Cambria Math"/>
+                      <w:i/>
+                    </w:rPr>
+                  </m:ctrlPr>
+                </m:sSubPr>
+                <m:e>
+                  <m:r>
+                    <m:rPr>
+                      <m:sty m:val="p"/>
+                    </m:rPr>
+                    <w:rPr>
+                      <w:rFonts w:ascii="Cambria Math" w:eastAsiaTheme="minorEastAsia" w:hAnsi="Cambria Math"/>
+                    </w:rPr>
+                    <m:t>β</m:t>
+                  </m:r>
+                  <m:ctrlPr>
+                    <w:rPr>
+                      <w:rFonts w:ascii="Cambria Math" w:eastAsiaTheme="minorEastAsia" w:hAnsi="Cambria Math"/>
+                      <w:i/>
+                      <w:lang w:val="en-US"/>
+                    </w:rPr>
+                  </m:ctrlPr>
+                </m:e>
+                <m:sub>
+                  <m:r>
+                    <w:rPr>
+                      <w:rFonts w:ascii="Cambria Math" w:eastAsiaTheme="minorEastAsia" w:hAnsi="Cambria Math"/>
+                      <w:lang w:val="en-US"/>
+                    </w:rPr>
+                    <m:t>0</m:t>
+                  </m:r>
+                </m:sub>
+              </m:sSub>
+              <m:r>
+                <w:rPr>
+                  <w:rFonts w:ascii="Cambria Math" w:eastAsiaTheme="minorEastAsia" w:hAnsi="Cambria Math"/>
+                  <w:lang w:val="en-US"/>
+                </w:rPr>
+                <m:t>-</m:t>
+              </m:r>
+              <m:nary>
+                <m:naryPr>
+                  <m:supHide m:val="1"/>
+                  <m:ctrlPr>
+                    <w:rPr>
+                      <w:rFonts w:ascii="Cambria Math" w:eastAsiaTheme="minorEastAsia" w:hAnsi="Cambria Math"/>
+                    </w:rPr>
+                  </m:ctrlPr>
+                </m:naryPr>
+                <m:sub>
+                  <m:r>
+                    <w:rPr>
+                      <w:rFonts w:ascii="Cambria Math" w:eastAsiaTheme="minorEastAsia" w:hAnsi="Cambria Math"/>
+                    </w:rPr>
+                    <m:t>t</m:t>
+                  </m:r>
+                  <m:ctrlPr>
+                    <w:rPr>
+                      <w:rFonts w:ascii="Cambria Math" w:eastAsiaTheme="minorEastAsia" w:hAnsi="Cambria Math"/>
+                      <w:i/>
+                    </w:rPr>
+                  </m:ctrlPr>
+                </m:sub>
+                <m:sup>
+                  <m:ctrlPr>
+                    <w:rPr>
+                      <w:rFonts w:ascii="Cambria Math" w:eastAsiaTheme="minorEastAsia" w:hAnsi="Cambria Math"/>
+                      <w:i/>
+                    </w:rPr>
+                  </m:ctrlPr>
+                </m:sup>
+                <m:e>
+                  <m:r>
+                    <w:rPr>
+                      <w:rFonts w:ascii="Cambria Math" w:eastAsiaTheme="minorEastAsia" w:hAnsi="Cambria Math"/>
+                    </w:rPr>
+                    <m:t>X</m:t>
+                  </m:r>
+                  <m:d>
+                    <m:dPr>
+                      <m:ctrlPr>
+                        <w:rPr>
+                          <w:rFonts w:ascii="Cambria Math" w:eastAsiaTheme="minorEastAsia" w:hAnsi="Cambria Math"/>
+                        </w:rPr>
+                      </m:ctrlPr>
+                    </m:dPr>
+                    <m:e>
+                      <m:r>
+                        <w:rPr>
+                          <w:rFonts w:ascii="Cambria Math" w:eastAsiaTheme="minorEastAsia" w:hAnsi="Cambria Math"/>
+                        </w:rPr>
+                        <m:t>t</m:t>
+                      </m:r>
+                      <m:ctrlPr>
+                        <w:rPr>
+                          <w:rFonts w:ascii="Cambria Math" w:eastAsiaTheme="minorEastAsia" w:hAnsi="Cambria Math"/>
+                          <w:i/>
+                        </w:rPr>
+                      </m:ctrlPr>
+                    </m:e>
+                  </m:d>
+                  <m:d>
+                    <m:dPr>
+                      <m:ctrlPr>
+                        <w:rPr>
+                          <w:rFonts w:ascii="Cambria Math" w:eastAsiaTheme="minorEastAsia" w:hAnsi="Cambria Math"/>
+                          <w:i/>
+                        </w:rPr>
+                      </m:ctrlPr>
+                    </m:dPr>
+                    <m:e>
+                      <m:r>
+                        <w:rPr>
+                          <w:rFonts w:ascii="Cambria Math" w:eastAsiaTheme="minorEastAsia" w:hAnsi="Cambria Math"/>
+                        </w:rPr>
+                        <m:t>b</m:t>
+                      </m:r>
+                      <m:d>
+                        <m:dPr>
+                          <m:ctrlPr>
+                            <w:rPr>
+                              <w:rFonts w:ascii="Cambria Math" w:eastAsiaTheme="minorEastAsia" w:hAnsi="Cambria Math"/>
+                            </w:rPr>
+                          </m:ctrlPr>
+                        </m:dPr>
+                        <m:e>
+                          <m:r>
+                            <w:rPr>
+                              <w:rFonts w:ascii="Cambria Math" w:eastAsiaTheme="minorEastAsia" w:hAnsi="Cambria Math"/>
+                            </w:rPr>
+                            <m:t>t</m:t>
+                          </m:r>
+                          <m:ctrlPr>
+                            <w:rPr>
+                              <w:rFonts w:ascii="Cambria Math" w:eastAsiaTheme="minorEastAsia" w:hAnsi="Cambria Math"/>
+                              <w:i/>
+                            </w:rPr>
+                          </m:ctrlPr>
+                        </m:e>
+                      </m:d>
+                      <m:r>
+                        <m:rPr>
+                          <m:sty m:val="p"/>
+                        </m:rPr>
+                        <w:rPr>
+                          <w:rFonts w:ascii="Cambria Math" w:eastAsiaTheme="minorEastAsia" w:hAnsi="Cambria Math"/>
+                        </w:rPr>
+                        <m:t>γ</m:t>
+                      </m:r>
+                      <m:ctrlPr>
+                        <w:rPr>
+                          <w:rFonts w:ascii="Cambria Math" w:eastAsiaTheme="minorEastAsia" w:hAnsi="Cambria Math"/>
+                        </w:rPr>
+                      </m:ctrlPr>
+                    </m:e>
+                  </m:d>
+                  <m:r>
+                    <m:rPr>
+                      <m:nor/>
+                    </m:rPr>
+                    <w:rPr>
+                      <w:rFonts w:ascii="Cambria Math" w:eastAsiaTheme="minorEastAsia" w:hAnsi="Cambria Math"/>
+                      <w:lang w:val="en-US"/>
+                    </w:rPr>
+                    <m:t>dt</m:t>
+                  </m:r>
+                  <m:ctrlPr>
+                    <w:rPr>
+                      <w:rFonts w:ascii="Cambria Math" w:eastAsiaTheme="minorEastAsia" w:hAnsi="Cambria Math"/>
+                      <w:i/>
+                    </w:rPr>
+                  </m:ctrlPr>
+                </m:e>
+              </m:nary>
+              <m:sSup>
+                <m:sSupPr>
+                  <m:ctrlPr>
+                    <w:rPr>
+                      <w:rFonts w:ascii="Cambria Math" w:eastAsiaTheme="minorEastAsia" w:hAnsi="Cambria Math"/>
+                      <w:i/>
+                    </w:rPr>
+                  </m:ctrlPr>
+                </m:sSupPr>
+                <m:e>
+                  <m:r>
+                    <m:rPr>
+                      <m:lit/>
+                    </m:rPr>
+                    <w:rPr>
+                      <w:rFonts w:ascii="Cambria Math" w:eastAsiaTheme="minorEastAsia" w:hAnsi="Cambria Math"/>
+                      <w:lang w:val="en-US"/>
+                    </w:rPr>
+                    <m:t>}</m:t>
+                  </m:r>
+                  <m:ctrlPr>
+                    <w:rPr>
+                      <w:rFonts w:ascii="Cambria Math" w:eastAsiaTheme="minorEastAsia" w:hAnsi="Cambria Math"/>
+                      <w:i/>
+                      <w:lang w:val="en-US"/>
+                    </w:rPr>
+                  </m:ctrlPr>
+                </m:e>
+                <m:sup>
+                  <m:r>
+                    <w:rPr>
+                      <w:rFonts w:ascii="Cambria Math" w:eastAsiaTheme="minorEastAsia" w:hAnsi="Cambria Math"/>
+                      <w:lang w:val="en-US"/>
+                    </w:rPr>
+                    <m:t>2</m:t>
+                  </m:r>
+                </m:sup>
+              </m:sSup>
+              <m:ctrlPr>
+                <w:rPr>
+                  <w:rFonts w:ascii="Cambria Math" w:eastAsiaTheme="minorEastAsia" w:hAnsi="Cambria Math"/>
+                  <w:i/>
+                </w:rPr>
+              </m:ctrlPr>
+            </m:e>
+          </m:d>
+          <m:r>
+            <w:rPr>
+              <w:rFonts w:ascii="Cambria Math" w:eastAsiaTheme="minorEastAsia" w:hAnsi="Cambria Math"/>
+              <w:lang w:val="en-US"/>
+            </w:rPr>
+            <m:t>+</m:t>
+          </m:r>
+          <m:r>
+            <m:rPr>
+              <m:sty m:val="p"/>
+            </m:rPr>
+            <w:rPr>
+              <w:rFonts w:ascii="Cambria Math" w:eastAsiaTheme="minorEastAsia" w:hAnsi="Cambria Math"/>
+            </w:rPr>
+            <m:t>γP</m:t>
+          </m:r>
+          <m:d>
+            <m:dPr>
+              <m:ctrlPr>
+                <w:rPr>
+                  <w:rFonts w:ascii="Cambria Math" w:eastAsiaTheme="minorEastAsia" w:hAnsi="Cambria Math"/>
+                </w:rPr>
+              </m:ctrlPr>
+            </m:dPr>
+            <m:e>
+              <m:r>
+                <m:rPr>
+                  <m:sty m:val="p"/>
+                </m:rPr>
+                <w:rPr>
+                  <w:rFonts w:ascii="Cambria Math" w:eastAsiaTheme="minorEastAsia" w:hAnsi="Cambria Math"/>
+                </w:rPr>
+                <m:t>γ</m:t>
+              </m:r>
+              <m:ctrlPr>
+                <w:rPr>
+                  <w:rFonts w:ascii="Cambria Math" w:eastAsiaTheme="minorEastAsia" w:hAnsi="Cambria Math"/>
+                  <w:i/>
+                </w:rPr>
+              </m:ctrlPr>
+            </m:e>
+          </m:d>
+          <m:r>
+            <w:rPr>
+              <w:rFonts w:ascii="Cambria Math" w:eastAsiaTheme="minorEastAsia" w:hAnsi="Cambria Math"/>
+              <w:lang w:val="en-US"/>
+            </w:rPr>
+            <m:t>   </m:t>
+          </m:r>
+          <m:d>
+            <m:dPr>
+              <m:ctrlPr>
+                <w:rPr>
+                  <w:rFonts w:ascii="Cambria Math" w:eastAsiaTheme="minorEastAsia" w:hAnsi="Cambria Math"/>
+                </w:rPr>
+              </m:ctrlPr>
+            </m:dPr>
+            <m:e>
+              <m:r>
+                <w:rPr>
+                  <w:rFonts w:ascii="Cambria Math" w:eastAsiaTheme="minorEastAsia" w:hAnsi="Cambria Math"/>
+                  <w:lang w:val="en-US"/>
+                </w:rPr>
+                <m:t>3</m:t>
+              </m:r>
+              <m:ctrlPr>
+                <w:rPr>
+                  <w:rFonts w:ascii="Cambria Math" w:eastAsiaTheme="minorEastAsia" w:hAnsi="Cambria Math"/>
+                  <w:i/>
+                </w:rPr>
+              </m:ctrlPr>
+            </m:e>
+          </m:d>
+        </m:oMath>
+      </m:oMathPara>
+    </w:p>
+    <w:p>
+      <w:pPr>
+        <w:pStyle w:val="Sansinterligne"/>
+        <w:jc w:val="both"/>
+        <w:rPr>
+          <w:rFonts w:eastAsiaTheme="minorEastAsia"/>
+          <w:lang w:val="en-US"/>
+        </w:rPr>
+      </w:pPr>
+    </w:p>
+    <w:p>
+      <w:pPr>
+        <w:pStyle w:val="Sansinterligne"/>
+        <w:jc w:val="both"/>
+        <w:rPr>
+          <w:rFonts w:eastAsiaTheme="minorEastAsia"/>
+        </w:rPr>
+      </w:pPr>
+      <w:r>
+        <w:rPr>
+          <w:rFonts w:eastAsiaTheme="minorEastAsia"/>
+        </w:rPr>
+        <w:t>Avec</w:t>
+      </w:r>
+      <w:r>
+        <w:rPr>
+          <w:rFonts w:eastAsiaTheme="minorEastAsia"/>
+        </w:rPr>
+        <w:t xml:space="preserve"> </w:t>
+      </w:r>
+      <m:oMath>
+        <m:r>
+          <w:rPr>
+            <w:rFonts w:ascii="Cambria Math" w:eastAsiaTheme="minorEastAsia" w:hAnsi="Cambria Math"/>
+          </w:rPr>
+          <m:t>P</m:t>
+        </m:r>
+        <m:r>
+          <w:rPr>
+            <w:rFonts w:ascii="Cambria Math" w:eastAsiaTheme="minorEastAsia" w:hAnsi="Cambria Math"/>
+          </w:rPr>
+          <m:t xml:space="preserve"> </m:t>
+        </m:r>
+      </m:oMath>
+      <w:r>
+        <w:rPr>
+          <w:rFonts w:eastAsiaTheme="minorEastAsia"/>
+        </w:rPr>
+        <w:t>une fonction de pénalisation</w:t>
+      </w:r>
+      <w:r>
+        <w:rPr>
+          <w:rFonts w:eastAsiaTheme="minorEastAsia"/>
+        </w:rPr>
+        <w:t xml:space="preserve">. L’expression 3 revient à minimiser l’écart entre l’observation et la prédiction de manière pénaliser. </w:t>
+      </w:r>
+    </w:p>
+    <w:p>
+      <w:pPr>
+        <w:pStyle w:val="Sansinterligne"/>
+        <w:jc w:val="both"/>
+        <w:rPr>
+          <w:rFonts w:eastAsiaTheme="minorEastAsia"/>
+        </w:rPr>
+      </w:pPr>
+    </w:p>
+    <w:p>
+      <w:pPr>
+        <w:pStyle w:val="Sansinterligne"/>
+        <w:jc w:val="both"/>
+        <w:rPr>
+          <w:rFonts w:eastAsiaTheme="minorEastAsia"/>
+        </w:rPr>
+      </w:pPr>
+      <w:r>
+        <w:rPr>
+          <w:rFonts w:eastAsiaTheme="minorEastAsia"/>
+        </w:rPr>
+        <w:t>L’ensemble de fonction</w:t>
+      </w:r>
+      <w:r>
+        <w:rPr>
+          <w:rFonts w:eastAsiaTheme="minorEastAsia"/>
+        </w:rPr>
+        <w:t>s</w:t>
+      </w:r>
+      <w:r>
+        <w:rPr>
+          <w:rFonts w:eastAsiaTheme="minorEastAsia"/>
+        </w:rPr>
+        <w:t xml:space="preserve"> de bases peuvent être des B </w:t>
+      </w:r>
+      <w:proofErr w:type="spellStart"/>
+      <w:r>
+        <w:rPr>
+          <w:rFonts w:eastAsiaTheme="minorEastAsia"/>
+        </w:rPr>
+        <w:t>splines</w:t>
+      </w:r>
+      <w:proofErr w:type="spellEnd"/>
+      <w:r>
+        <w:rPr>
+          <w:rFonts w:eastAsiaTheme="minorEastAsia"/>
+        </w:rPr>
+        <w:t>.</w:t>
+      </w:r>
+      <w:r>
+        <w:rPr>
+          <w:rFonts w:eastAsiaTheme="minorEastAsia"/>
+        </w:rPr>
+        <w:t xml:space="preserve"> </w:t>
+      </w:r>
+      <w:r>
+        <w:rPr>
+          <w:rFonts w:eastAsiaTheme="minorEastAsia"/>
+        </w:rPr>
+        <w:t xml:space="preserve">Dans ce cas, la pénalité est de forme quadratique, l’expression 3 revient donc à résoudre un problème de régression pénalisée Ridge. </w:t>
+      </w:r>
+    </w:p>
+    <w:p>
+      <w:pPr>
+        <w:pStyle w:val="Sansinterligne"/>
+        <w:jc w:val="both"/>
+        <w:rPr>
+          <w:rFonts w:eastAsiaTheme="minorEastAsia"/>
+        </w:rPr>
+      </w:pPr>
     </w:p>
     <w:p>
       <w:pPr>
         <w:pStyle w:val="Titre2"/>
+        <w:jc w:val="both"/>
       </w:pPr>
       <w:r>
         <w:t>Questions de recherche</w:t>
@@ -2756,6 +4576,7 @@
           <w:ilvl w:val="0"/>
           <w:numId w:val="1"/>
         </w:numPr>
+        <w:jc w:val="both"/>
       </w:pPr>
       <w:r>
         <w:t>Equivalence des spectres entre feuille sèche et feuille fraiche ?</w:t>
@@ -2768,6 +4589,7 @@
           <w:ilvl w:val="0"/>
           <w:numId w:val="1"/>
         </w:numPr>
+        <w:jc w:val="both"/>
       </w:pPr>
       <w:r>
         <w:t>Modèle d’association des spectres par variété</w:t>
@@ -2780,6 +4602,7 @@
           <w:ilvl w:val="0"/>
           <w:numId w:val="1"/>
         </w:numPr>
+        <w:jc w:val="both"/>
       </w:pPr>
       <w:r>
         <w:t>Répartition des données dans les modèles (regarder les résidus dans les modèles linéaires, etc…)</w:t>
@@ -2792,6 +4615,7 @@
           <w:ilvl w:val="0"/>
           <w:numId w:val="1"/>
         </w:numPr>
+        <w:jc w:val="both"/>
       </w:pPr>
       <w:r>
         <w:t xml:space="preserve">Faire attention aux </w:t>
@@ -2809,6 +4633,7 @@
           <w:ilvl w:val="0"/>
           <w:numId w:val="1"/>
         </w:numPr>
+        <w:jc w:val="both"/>
       </w:pPr>
       <w:r>
         <w:t>P</w:t>
@@ -2835,19 +4660,29 @@
     <w:p>
       <w:pPr>
         <w:pStyle w:val="Titre2"/>
+        <w:jc w:val="both"/>
       </w:pPr>
       <w:r>
         <w:t>Bibliographie</w:t>
       </w:r>
     </w:p>
-    <w:p/>
-    <w:p>
-      <w:r>
+    <w:p>
+      <w:pPr>
+        <w:jc w:val="both"/>
+      </w:pPr>
+    </w:p>
+    <w:p>
+      <w:pPr>
+        <w:jc w:val="both"/>
+      </w:pPr>
+      <w:r>
+        <w:lastRenderedPageBreak/>
         <w:t>Livre sur les données fonctionnelles :</w:t>
       </w:r>
     </w:p>
     <w:p>
       <w:pPr>
+        <w:jc w:val="both"/>
         <w:rPr>
           <w:lang w:val="en-GB"/>
         </w:rPr>
@@ -2879,6 +4714,7 @@
     <w:p>
       <w:pPr>
         <w:pStyle w:val="Titre2"/>
+        <w:jc w:val="both"/>
       </w:pPr>
       <w:r>
         <w:t>Brouillon</w:t>
@@ -3169,7 +5005,6 @@
         <w:rPr>
           <w:rFonts w:cstheme="minorHAnsi"/>
         </w:rPr>
-        <w:lastRenderedPageBreak/>
         <w:t xml:space="preserve">Une données fonctionnelle aléatoire </w:t>
       </w:r>
       <w:r>
@@ -3217,6 +5052,7 @@
     </w:p>
     <w:p>
       <w:pPr>
+        <w:jc w:val="both"/>
         <w:rPr>
           <w:rFonts w:cstheme="minorHAnsi"/>
         </w:rPr>
@@ -3407,6 +5243,7 @@
         <w:rPr>
           <w:rFonts w:cstheme="minorHAnsi"/>
         </w:rPr>
+        <w:lastRenderedPageBreak/>
         <w:br/>
         <w:t xml:space="preserve">N </w:t>
       </w:r>
@@ -3730,7 +5567,6 @@
         <w:rPr>
           <w:rFonts w:cstheme="minorHAnsi"/>
         </w:rPr>
-        <w:lastRenderedPageBreak/>
         <w:br/>
       </w:r>
       <w:proofErr w:type="spellStart"/>
@@ -3928,6 +5764,7 @@
         <w:rPr>
           <w:rFonts w:cstheme="minorHAnsi"/>
         </w:rPr>
+        <w:lastRenderedPageBreak/>
         <w:t>12489,6 to 3594,9</w:t>
       </w:r>
       <w:r>
@@ -5289,7 +7126,6 @@
   <w:style w:type="character" w:default="1" w:styleId="Policepardfaut">
     <w:name w:val="Default Paragraph Font"/>
     <w:uiPriority w:val="1"/>
-    <w:semiHidden/>
     <w:unhideWhenUsed/>
   </w:style>
   <w:style w:type="table" w:default="1" w:styleId="TableauNormal">
@@ -5609,6 +7445,16 @@
       <w:spacing w:after="0" w:line="240" w:lineRule="auto"/>
     </w:pPr>
   </w:style>
+  <w:style w:type="character" w:styleId="Textedelespacerserv">
+    <w:name w:val="Placeholder Text"/>
+    <w:basedOn w:val="Policepardfaut"/>
+    <w:uiPriority w:val="99"/>
+    <w:semiHidden/>
+    <w:rsid w:val="00660CBA"/>
+    <w:rPr>
+      <w:color w:val="666666"/>
+    </w:rPr>
+  </w:style>
 </w:styles>
 </file>
 

</xml_diff>

<commit_message>
Modifications texte regression fonctionelle Notes
</commit_message>
<xml_diff>
--- a/doc/Notes.docx
+++ b/doc/Notes.docx
@@ -4481,6 +4481,12 @@
           <w:rFonts w:eastAsiaTheme="minorEastAsia"/>
         </w:rPr>
         <w:t>une fonction de pénalisation</w:t>
+      </w:r>
+      <w:r>
+        <w:rPr>
+          <w:rFonts w:eastAsiaTheme="minorEastAsia"/>
+        </w:rPr>
+        <w:t xml:space="preserve"> pour éviter un surapprentissage</w:t>
       </w:r>
       <w:r>
         <w:rPr>

</xml_diff>

<commit_message>
Regression fonctionnelle et modifs notes
</commit_message>
<xml_diff>
--- a/doc/Notes.docx
+++ b/doc/Notes.docx
@@ -841,7 +841,6 @@
           <w:vertAlign w:val="subscript"/>
         </w:rPr>
       </w:pPr>
-      <w:proofErr w:type="gramStart"/>
       <w:r>
         <w:rPr>
           <w:rFonts w:ascii="Cambria Math" w:hAnsi="Cambria Math" w:cs="Cambria Math"/>
@@ -849,7 +848,6 @@
         </w:rPr>
         <w:t>𝐴</w:t>
       </w:r>
-      <w:proofErr w:type="gramEnd"/>
       <w:r>
         <w:rPr>
           <w:sz w:val="22"/>
@@ -2715,21 +2713,7 @@
         <w:rPr>
           <w:rFonts w:cstheme="minorHAnsi"/>
         </w:rPr>
-        <w:t xml:space="preserve"> sur 50 nœuds par spectre. Ceci nous permet d’obtenir une variable fonctionnelle qui expliquent chaque spectre avec 50 coefficients. Nous avons ensuite réalisé une régression linéaire avec les coefficients en variables explicative pour expliquer par exemple </w:t>
-      </w:r>
-      <w:proofErr w:type="gramStart"/>
-      <w:r>
-        <w:rPr>
-          <w:rFonts w:cstheme="minorHAnsi"/>
-        </w:rPr>
-        <w:t>la taux</w:t>
-      </w:r>
-      <w:proofErr w:type="gramEnd"/>
-      <w:r>
-        <w:rPr>
-          <w:rFonts w:cstheme="minorHAnsi"/>
-        </w:rPr>
-        <w:t xml:space="preserve"> d’azote dans le colza. Le but est de réaliser des prédictions, ainsi de la validation croisée sera réalisé sur le modèle linéaire. </w:t>
+        <w:t xml:space="preserve"> sur 50 nœuds par spectre. Ceci nous permet d’obtenir une variable fonctionnelle qui expliquent chaque spectre avec 50 coefficients. Nous avons ensuite réalisé une régression linéaire avec les coefficients en variables explicative pour expliquer par exemple la taux d’azote dans le colza. Le but est de réaliser des prédictions, ainsi de la validation croisée sera réalisé sur le modèle linéaire. </w:t>
       </w:r>
     </w:p>
     <w:p>
@@ -2800,13 +2784,8 @@
         </w:numPr>
         <w:jc w:val="both"/>
       </w:pPr>
-      <w:proofErr w:type="gramStart"/>
-      <w:r>
-        <w:t>équivalence</w:t>
-      </w:r>
-      <w:proofErr w:type="gramEnd"/>
-      <w:r>
-        <w:t xml:space="preserve"> entre spectre sur feuille sèche et sur feuille fraiche</w:t>
+      <w:r>
+        <w:t>équivalence entre spectre sur feuille sèche et sur feuille fraiche</w:t>
       </w:r>
     </w:p>
     <w:p>
@@ -4502,23 +4481,37 @@
           <w:rFonts w:eastAsiaTheme="minorEastAsia"/>
         </w:rPr>
       </w:pPr>
+      <w:proofErr w:type="spellStart"/>
       <w:r>
         <w:rPr>
           <w:rFonts w:eastAsiaTheme="minorEastAsia"/>
         </w:rPr>
-        <w:t>L’ensemble de fonction</w:t>
-      </w:r>
+        <w:t>Splines</w:t>
+      </w:r>
+      <w:proofErr w:type="spellEnd"/>
       <w:r>
         <w:rPr>
           <w:rFonts w:eastAsiaTheme="minorEastAsia"/>
         </w:rPr>
-        <w:t>s</w:t>
+        <w:t xml:space="preserve"> pénalisées : La </w:t>
       </w:r>
       <w:r>
         <w:rPr>
           <w:rFonts w:eastAsiaTheme="minorEastAsia"/>
         </w:rPr>
-        <w:t xml:space="preserve"> de bases peuvent être des B </w:t>
+        <w:t xml:space="preserve">log vraisemblance du modèle de </w:t>
+      </w:r>
+      <w:r>
+        <w:rPr>
+          <w:rFonts w:eastAsiaTheme="minorEastAsia"/>
+        </w:rPr>
+        <w:t xml:space="preserve">régression </w:t>
+      </w:r>
+      <w:r>
+        <w:rPr>
+          <w:rFonts w:eastAsiaTheme="minorEastAsia"/>
+        </w:rPr>
+        <w:t xml:space="preserve">faisant intervenir des B </w:t>
       </w:r>
       <w:proofErr w:type="spellStart"/>
       <w:r>
@@ -4532,14 +4525,224 @@
         <w:rPr>
           <w:rFonts w:eastAsiaTheme="minorEastAsia"/>
         </w:rPr>
-        <w:t xml:space="preserve">. </w:t>
-      </w:r>
+        <w:t xml:space="preserve"> </w:t>
+      </w:r>
+      <m:oMath>
+        <m:r>
+          <w:rPr>
+            <w:rFonts w:ascii="Cambria Math" w:eastAsiaTheme="minorEastAsia" w:hAnsi="Cambria Math"/>
+          </w:rPr>
+          <m:t>l</m:t>
+        </m:r>
+        <m:d>
+          <m:dPr>
+            <m:ctrlPr>
+              <w:rPr>
+                <w:rFonts w:ascii="Cambria Math" w:eastAsiaTheme="minorEastAsia" w:hAnsi="Cambria Math"/>
+                <w:i/>
+              </w:rPr>
+            </m:ctrlPr>
+          </m:dPr>
+          <m:e>
+            <m:r>
+              <m:rPr>
+                <m:sty m:val="p"/>
+              </m:rPr>
+              <w:rPr>
+                <w:rFonts w:ascii="Cambria Math" w:eastAsiaTheme="minorEastAsia" w:hAnsi="Cambria Math"/>
+              </w:rPr>
+              <m:t>β</m:t>
+            </m:r>
+          </m:e>
+        </m:d>
+      </m:oMath>
       <w:r>
         <w:rPr>
           <w:rFonts w:eastAsiaTheme="minorEastAsia"/>
         </w:rPr>
-        <w:t xml:space="preserve">Dans ce cas, la pénalité est de forme quadratique, l’expression 3 revient donc à résoudre un problème de régression pénalisée Ridge. </w:t>
-      </w:r>
+        <w:t xml:space="preserve"> est pénalisée par le paramètre de lissage </w:t>
+      </w:r>
+      <m:oMath>
+        <m:r>
+          <m:rPr>
+            <m:sty m:val="p"/>
+          </m:rPr>
+          <w:rPr>
+            <w:rFonts w:ascii="Cambria Math" w:eastAsiaTheme="minorEastAsia" w:hAnsi="Cambria Math"/>
+          </w:rPr>
+          <m:t>λ</m:t>
+        </m:r>
+      </m:oMath>
+      <w:r>
+        <w:rPr>
+          <w:rFonts w:eastAsiaTheme="minorEastAsia"/>
+        </w:rPr>
+        <w:t xml:space="preserve"> (nombre de </w:t>
+      </w:r>
+      <w:proofErr w:type="spellStart"/>
+      <w:r>
+        <w:rPr>
+          <w:rFonts w:eastAsiaTheme="minorEastAsia"/>
+        </w:rPr>
+        <w:t>noeurds</w:t>
+      </w:r>
+      <w:proofErr w:type="spellEnd"/>
+      <w:r>
+        <w:rPr>
+          <w:rFonts w:eastAsiaTheme="minorEastAsia"/>
+        </w:rPr>
+        <w:t>):</w:t>
+      </w:r>
+    </w:p>
+    <w:p>
+      <w:pPr>
+        <w:pStyle w:val="Sansinterligne"/>
+        <w:jc w:val="both"/>
+        <w:rPr>
+          <w:rFonts w:eastAsiaTheme="minorEastAsia"/>
+        </w:rPr>
+      </w:pPr>
+    </w:p>
+    <w:p>
+      <w:pPr>
+        <w:pStyle w:val="Sansinterligne"/>
+        <w:jc w:val="both"/>
+        <w:rPr>
+          <w:rFonts w:eastAsiaTheme="minorEastAsia"/>
+        </w:rPr>
+      </w:pPr>
+      <m:oMathPara>
+        <m:oMath>
+          <m:r>
+            <m:rPr>
+              <m:scr m:val="script"/>
+            </m:rPr>
+            <w:rPr>
+              <w:rFonts w:ascii="Cambria Math" w:eastAsiaTheme="minorEastAsia" w:hAnsi="Cambria Math"/>
+            </w:rPr>
+            <m:t>L</m:t>
+          </m:r>
+          <m:d>
+            <m:dPr>
+              <m:ctrlPr>
+                <w:rPr>
+                  <w:rFonts w:ascii="Cambria Math" w:eastAsiaTheme="minorEastAsia" w:hAnsi="Cambria Math"/>
+                  <w:i/>
+                </w:rPr>
+              </m:ctrlPr>
+            </m:dPr>
+            <m:e>
+              <m:r>
+                <m:rPr>
+                  <m:sty m:val="p"/>
+                </m:rPr>
+                <w:rPr>
+                  <w:rFonts w:ascii="Cambria Math" w:eastAsiaTheme="minorEastAsia" w:hAnsi="Cambria Math"/>
+                </w:rPr>
+                <m:t>β</m:t>
+              </m:r>
+              <m:r>
+                <w:rPr>
+                  <w:rFonts w:ascii="Cambria Math" w:eastAsiaTheme="minorEastAsia" w:hAnsi="Cambria Math"/>
+                </w:rPr>
+                <m:t>,</m:t>
+              </m:r>
+              <m:r>
+                <m:rPr>
+                  <m:sty m:val="p"/>
+                </m:rPr>
+                <w:rPr>
+                  <w:rFonts w:ascii="Cambria Math" w:eastAsiaTheme="minorEastAsia" w:hAnsi="Cambria Math"/>
+                </w:rPr>
+                <m:t>λ</m:t>
+              </m:r>
+            </m:e>
+          </m:d>
+          <m:r>
+            <w:rPr>
+              <w:rFonts w:ascii="Cambria Math" w:eastAsiaTheme="minorEastAsia" w:hAnsi="Cambria Math"/>
+            </w:rPr>
+            <m:t>=l</m:t>
+          </m:r>
+          <m:d>
+            <m:dPr>
+              <m:ctrlPr>
+                <w:rPr>
+                  <w:rFonts w:ascii="Cambria Math" w:eastAsiaTheme="minorEastAsia" w:hAnsi="Cambria Math"/>
+                  <w:i/>
+                </w:rPr>
+              </m:ctrlPr>
+            </m:dPr>
+            <m:e>
+              <m:r>
+                <m:rPr>
+                  <m:sty m:val="p"/>
+                </m:rPr>
+                <w:rPr>
+                  <w:rFonts w:ascii="Cambria Math" w:eastAsiaTheme="minorEastAsia" w:hAnsi="Cambria Math"/>
+                </w:rPr>
+                <m:t>β</m:t>
+              </m:r>
+            </m:e>
+          </m:d>
+          <m:r>
+            <w:rPr>
+              <w:rFonts w:ascii="Cambria Math" w:eastAsiaTheme="minorEastAsia" w:hAnsi="Cambria Math"/>
+            </w:rPr>
+            <m:t>-</m:t>
+          </m:r>
+          <m:r>
+            <m:rPr>
+              <m:sty m:val="p"/>
+            </m:rPr>
+            <w:rPr>
+              <w:rFonts w:ascii="Cambria Math" w:eastAsiaTheme="minorEastAsia" w:hAnsi="Cambria Math"/>
+            </w:rPr>
+            <m:t>λ</m:t>
+          </m:r>
+          <m:d>
+            <m:dPr>
+              <m:begChr m:val="["/>
+              <m:endChr m:val="]"/>
+              <m:ctrlPr>
+                <w:rPr>
+                  <w:rFonts w:ascii="Cambria Math" w:eastAsiaTheme="minorEastAsia" w:hAnsi="Cambria Math"/>
+                  <w:i/>
+                </w:rPr>
+              </m:ctrlPr>
+            </m:dPr>
+            <m:e>
+              <m:r>
+                <w:rPr>
+                  <w:rFonts w:ascii="Cambria Math" w:eastAsiaTheme="minorEastAsia" w:hAnsi="Cambria Math"/>
+                </w:rPr>
+                <m:t>Pen</m:t>
+              </m:r>
+              <m:d>
+                <m:dPr>
+                  <m:ctrlPr>
+                    <w:rPr>
+                      <w:rFonts w:ascii="Cambria Math" w:eastAsiaTheme="minorEastAsia" w:hAnsi="Cambria Math"/>
+                      <w:i/>
+                    </w:rPr>
+                  </m:ctrlPr>
+                </m:dPr>
+                <m:e>
+                  <m:r>
+                    <m:rPr>
+                      <m:sty m:val="p"/>
+                    </m:rPr>
+                    <w:rPr>
+                      <w:rFonts w:ascii="Cambria Math" w:eastAsiaTheme="minorEastAsia" w:hAnsi="Cambria Math"/>
+                    </w:rPr>
+                    <m:t>β</m:t>
+                  </m:r>
+                </m:e>
+              </m:d>
+            </m:e>
+          </m:d>
+        </m:oMath>
+      </m:oMathPara>
     </w:p>
     <w:p>
       <w:pPr>
@@ -4684,21 +4887,7 @@
         <w:rPr>
           <w:lang w:val="en-GB"/>
         </w:rPr>
-        <w:t xml:space="preserve">- functional data analysis (J. O. </w:t>
-      </w:r>
-      <w:proofErr w:type="gramStart"/>
-      <w:r>
-        <w:rPr>
-          <w:lang w:val="en-GB"/>
-        </w:rPr>
-        <w:t>Ramsay ,</w:t>
-      </w:r>
-      <w:proofErr w:type="gramEnd"/>
-      <w:r>
-        <w:rPr>
-          <w:lang w:val="en-GB"/>
-        </w:rPr>
-        <w:t xml:space="preserve"> B. W. Silverman)</w:t>
+        <w:t>- functional data analysis (J. O. Ramsay , B. W. Silverman)</w:t>
       </w:r>
     </w:p>
     <w:p>

</xml_diff>

<commit_message>
Ajout intéret reg fonctionnelle dans Notes
</commit_message>
<xml_diff>
--- a/doc/Notes.docx
+++ b/doc/Notes.docx
@@ -2859,82 +2859,24 @@
         <w:t xml:space="preserve">es </w:t>
       </w:r>
       <w:r>
-        <w:t xml:space="preserve">paramètres </w:t>
+        <w:t>paramètres</w:t>
+      </w:r>
+      <w:r>
+        <w:rPr>
+          <w:rFonts w:eastAsiaTheme="minorEastAsia"/>
+        </w:rPr>
+        <w:t xml:space="preserve"> </w:t>
       </w:r>
       <m:oMath>
-        <m:sSub>
-          <m:sSubPr>
-            <m:ctrlPr>
-              <w:rPr>
-                <w:rFonts w:ascii="Cambria Math" w:hAnsi="Cambria Math"/>
-              </w:rPr>
-            </m:ctrlPr>
-          </m:sSubPr>
-          <m:e>
-            <m:r>
-              <m:rPr>
-                <m:sty m:val="p"/>
-              </m:rPr>
-              <w:rPr>
-                <w:rFonts w:ascii="Cambria Math" w:hAnsi="Cambria Math"/>
-              </w:rPr>
-              <m:t>β</m:t>
-            </m:r>
-          </m:e>
-          <m:sub>
-            <m:r>
-              <m:rPr>
-                <m:sty m:val="p"/>
-              </m:rPr>
-              <w:rPr>
-                <w:rFonts w:ascii="Cambria Math" w:hAnsi="Cambria Math"/>
-              </w:rPr>
-              <m:t>0</m:t>
-            </m:r>
-          </m:sub>
-        </m:sSub>
-      </m:oMath>
-      <w:r>
-        <w:rPr>
-          <w:rFonts w:eastAsiaTheme="minorEastAsia"/>
-        </w:rPr>
-        <w:t xml:space="preserve"> et </w:t>
-      </w:r>
-      <m:oMath>
-        <m:sSub>
-          <m:sSubPr>
-            <m:ctrlPr>
-              <w:rPr>
-                <w:rFonts w:ascii="Cambria Math" w:eastAsiaTheme="minorEastAsia" w:hAnsi="Cambria Math"/>
-                <w:i/>
-              </w:rPr>
-            </m:ctrlPr>
-          </m:sSubPr>
-          <m:e>
-            <m:r>
-              <m:rPr>
-                <m:sty m:val="p"/>
-              </m:rPr>
-              <w:rPr>
-                <w:rFonts w:ascii="Cambria Math" w:eastAsiaTheme="minorEastAsia" w:hAnsi="Cambria Math"/>
-              </w:rPr>
-              <m:t>β</m:t>
-            </m:r>
-            <m:ctrlPr>
-              <w:rPr>
-                <w:rFonts w:ascii="Cambria Math" w:eastAsiaTheme="minorEastAsia" w:hAnsi="Cambria Math"/>
-              </w:rPr>
-            </m:ctrlPr>
-          </m:e>
-          <m:sub>
-            <m:r>
-              <w:rPr>
-                <w:rFonts w:ascii="Cambria Math" w:eastAsiaTheme="minorEastAsia" w:hAnsi="Cambria Math"/>
-              </w:rPr>
-              <m:t>1</m:t>
-            </m:r>
-          </m:sub>
-        </m:sSub>
+        <m:r>
+          <m:rPr>
+            <m:sty m:val="p"/>
+          </m:rPr>
+          <w:rPr>
+            <w:rFonts w:ascii="Cambria Math" w:eastAsiaTheme="minorEastAsia" w:hAnsi="Cambria Math"/>
+          </w:rPr>
+          <m:t>β</m:t>
+        </m:r>
       </m:oMath>
       <w:r>
         <w:rPr>
@@ -2965,11 +2907,20 @@
       </w:pPr>
       <m:oMathPara>
         <m:oMath>
+          <m:r>
+            <m:rPr>
+              <m:sty m:val="p"/>
+            </m:rPr>
+            <w:rPr>
+              <w:rFonts w:ascii="Cambria Math" w:hAnsi="Cambria Math"/>
+            </w:rPr>
+            <m:t>Y</m:t>
+          </m:r>
           <m:r>
             <w:rPr>
               <w:rFonts w:ascii="Cambria Math" w:hAnsi="Cambria Math"/>
             </w:rPr>
-            <m:t>Y=</m:t>
+            <m:t>=</m:t>
           </m:r>
           <m:sSub>
             <m:sSubPr>
@@ -3004,8 +2955,45 @@
             <w:rPr>
               <w:rFonts w:ascii="Cambria Math" w:hAnsi="Cambria Math"/>
             </w:rPr>
-            <m:t>+X</m:t>
+            <m:t>+</m:t>
           </m:r>
+          <m:sSub>
+            <m:sSubPr>
+              <m:ctrlPr>
+                <w:rPr>
+                  <w:rFonts w:ascii="Cambria Math" w:hAnsi="Cambria Math"/>
+                </w:rPr>
+              </m:ctrlPr>
+            </m:sSubPr>
+            <m:e>
+              <m:r>
+                <m:rPr>
+                  <m:sty m:val="p"/>
+                </m:rPr>
+                <w:rPr>
+                  <w:rFonts w:ascii="Cambria Math" w:hAnsi="Cambria Math"/>
+                </w:rPr>
+                <m:t>X</m:t>
+              </m:r>
+              <m:ctrlPr>
+                <w:rPr>
+                  <w:rFonts w:ascii="Cambria Math" w:hAnsi="Cambria Math"/>
+                  <w:i/>
+                </w:rPr>
+              </m:ctrlPr>
+            </m:e>
+            <m:sub>
+              <m:r>
+                <m:rPr>
+                  <m:sty m:val="p"/>
+                </m:rPr>
+                <w:rPr>
+                  <w:rFonts w:ascii="Cambria Math" w:hAnsi="Cambria Math"/>
+                </w:rPr>
+                <m:t>1</m:t>
+              </m:r>
+            </m:sub>
+          </m:sSub>
           <m:sSub>
             <m:sSubPr>
               <m:ctrlPr>
@@ -3046,6 +3034,166 @@
             </w:rPr>
             <m:t>+</m:t>
           </m:r>
+          <m:sSub>
+            <m:sSubPr>
+              <m:ctrlPr>
+                <w:rPr>
+                  <w:rFonts w:ascii="Cambria Math" w:hAnsi="Cambria Math"/>
+                </w:rPr>
+              </m:ctrlPr>
+            </m:sSubPr>
+            <m:e>
+              <m:r>
+                <m:rPr>
+                  <m:sty m:val="p"/>
+                </m:rPr>
+                <w:rPr>
+                  <w:rFonts w:ascii="Cambria Math" w:hAnsi="Cambria Math"/>
+                </w:rPr>
+                <m:t>X</m:t>
+              </m:r>
+              <m:ctrlPr>
+                <w:rPr>
+                  <w:rFonts w:ascii="Cambria Math" w:hAnsi="Cambria Math"/>
+                  <w:i/>
+                </w:rPr>
+              </m:ctrlPr>
+            </m:e>
+            <m:sub>
+              <m:r>
+                <m:rPr>
+                  <m:sty m:val="p"/>
+                </m:rPr>
+                <w:rPr>
+                  <w:rFonts w:ascii="Cambria Math" w:hAnsi="Cambria Math"/>
+                </w:rPr>
+                <m:t>2</m:t>
+              </m:r>
+            </m:sub>
+          </m:sSub>
+          <m:sSub>
+            <m:sSubPr>
+              <m:ctrlPr>
+                <w:rPr>
+                  <w:rFonts w:ascii="Cambria Math" w:hAnsi="Cambria Math"/>
+                  <w:i/>
+                </w:rPr>
+              </m:ctrlPr>
+            </m:sSubPr>
+            <m:e>
+              <m:r>
+                <m:rPr>
+                  <m:sty m:val="p"/>
+                </m:rPr>
+                <w:rPr>
+                  <w:rFonts w:ascii="Cambria Math" w:hAnsi="Cambria Math"/>
+                </w:rPr>
+                <m:t>β</m:t>
+              </m:r>
+              <m:ctrlPr>
+                <w:rPr>
+                  <w:rFonts w:ascii="Cambria Math" w:hAnsi="Cambria Math"/>
+                </w:rPr>
+              </m:ctrlPr>
+            </m:e>
+            <m:sub>
+              <m:r>
+                <w:rPr>
+                  <w:rFonts w:ascii="Cambria Math" w:hAnsi="Cambria Math"/>
+                </w:rPr>
+                <m:t>2</m:t>
+              </m:r>
+            </m:sub>
+          </m:sSub>
+          <m:r>
+            <w:rPr>
+              <w:rFonts w:ascii="Cambria Math" w:hAnsi="Cambria Math"/>
+            </w:rPr>
+            <m:t>+</m:t>
+          </m:r>
+          <m:r>
+            <w:rPr>
+              <w:rFonts w:ascii="Cambria Math" w:hAnsi="Cambria Math"/>
+            </w:rPr>
+            <m:t>…+</m:t>
+          </m:r>
+          <m:sSub>
+            <m:sSubPr>
+              <m:ctrlPr>
+                <w:rPr>
+                  <w:rFonts w:ascii="Cambria Math" w:hAnsi="Cambria Math"/>
+                </w:rPr>
+              </m:ctrlPr>
+            </m:sSubPr>
+            <m:e>
+              <m:r>
+                <m:rPr>
+                  <m:sty m:val="p"/>
+                </m:rPr>
+                <w:rPr>
+                  <w:rFonts w:ascii="Cambria Math" w:hAnsi="Cambria Math"/>
+                </w:rPr>
+                <m:t>X</m:t>
+              </m:r>
+              <m:ctrlPr>
+                <w:rPr>
+                  <w:rFonts w:ascii="Cambria Math" w:hAnsi="Cambria Math"/>
+                  <w:i/>
+                </w:rPr>
+              </m:ctrlPr>
+            </m:e>
+            <m:sub>
+              <m:r>
+                <m:rPr>
+                  <m:sty m:val="p"/>
+                </m:rPr>
+                <w:rPr>
+                  <w:rFonts w:ascii="Cambria Math" w:hAnsi="Cambria Math"/>
+                </w:rPr>
+                <m:t>p</m:t>
+              </m:r>
+            </m:sub>
+          </m:sSub>
+          <m:sSub>
+            <m:sSubPr>
+              <m:ctrlPr>
+                <w:rPr>
+                  <w:rFonts w:ascii="Cambria Math" w:hAnsi="Cambria Math"/>
+                  <w:i/>
+                </w:rPr>
+              </m:ctrlPr>
+            </m:sSubPr>
+            <m:e>
+              <m:r>
+                <m:rPr>
+                  <m:sty m:val="p"/>
+                </m:rPr>
+                <w:rPr>
+                  <w:rFonts w:ascii="Cambria Math" w:hAnsi="Cambria Math"/>
+                </w:rPr>
+                <m:t>β</m:t>
+              </m:r>
+              <m:ctrlPr>
+                <w:rPr>
+                  <w:rFonts w:ascii="Cambria Math" w:hAnsi="Cambria Math"/>
+                </w:rPr>
+              </m:ctrlPr>
+            </m:e>
+            <m:sub>
+              <m:r>
+                <w:rPr>
+                  <w:rFonts w:ascii="Cambria Math" w:hAnsi="Cambria Math"/>
+                </w:rPr>
+                <m:t>p</m:t>
+              </m:r>
+            </m:sub>
+          </m:sSub>
+          <m:r>
+            <w:rPr>
+              <w:rFonts w:ascii="Cambria Math" w:hAnsi="Cambria Math"/>
+            </w:rPr>
+            <m:t>+</m:t>
+          </m:r>
           <m:r>
             <m:rPr>
               <m:sty m:val="p"/>
@@ -3053,7 +3201,7 @@
             <w:rPr>
               <w:rFonts w:ascii="Cambria Math" w:hAnsi="Cambria Math"/>
             </w:rPr>
-            <m:t xml:space="preserve">ϵ   </m:t>
+            <m:t>ϵ   </m:t>
           </m:r>
           <m:d>
             <m:dPr>
@@ -3362,8 +3510,28 @@
             <w:rPr>
               <w:rFonts w:ascii="Cambria Math" w:eastAsiaTheme="minorEastAsia" w:hAnsi="Cambria Math"/>
             </w:rPr>
-            <m:t>ϵ   (2)</m:t>
+            <m:t>ϵ</m:t>
           </m:r>
+          <m:d>
+            <m:dPr>
+              <m:ctrlPr>
+                <w:rPr>
+                  <w:rFonts w:ascii="Cambria Math" w:eastAsiaTheme="minorEastAsia" w:hAnsi="Cambria Math"/>
+                </w:rPr>
+              </m:ctrlPr>
+            </m:dPr>
+            <m:e>
+              <m:r>
+                <m:rPr>
+                  <m:sty m:val="p"/>
+                </m:rPr>
+                <w:rPr>
+                  <w:rFonts w:ascii="Cambria Math" w:eastAsiaTheme="minorEastAsia" w:hAnsi="Cambria Math"/>
+                </w:rPr>
+                <m:t>2</m:t>
+              </m:r>
+            </m:e>
+          </m:d>
         </m:oMath>
       </m:oMathPara>
     </w:p>
@@ -4577,21 +4745,7 @@
         <w:rPr>
           <w:rFonts w:eastAsiaTheme="minorEastAsia"/>
         </w:rPr>
-        <w:t xml:space="preserve"> (nombre de </w:t>
-      </w:r>
-      <w:proofErr w:type="spellStart"/>
-      <w:r>
-        <w:rPr>
-          <w:rFonts w:eastAsiaTheme="minorEastAsia"/>
-        </w:rPr>
-        <w:t>noeurds</w:t>
-      </w:r>
-      <w:proofErr w:type="spellEnd"/>
-      <w:r>
-        <w:rPr>
-          <w:rFonts w:eastAsiaTheme="minorEastAsia"/>
-        </w:rPr>
-        <w:t>):</w:t>
+        <w:t xml:space="preserve"> (nombre de noeurds):</w:t>
       </w:r>
     </w:p>
     <w:p>
@@ -4755,10 +4909,155 @@
     </w:p>
     <w:p>
       <w:pPr>
+        <w:pStyle w:val="Titre4"/>
+        <w:rPr>
+          <w:rFonts w:eastAsiaTheme="minorEastAsia"/>
+        </w:rPr>
+      </w:pPr>
+      <w:r>
+        <w:rPr>
+          <w:rFonts w:eastAsiaTheme="minorEastAsia"/>
+        </w:rPr>
+        <w:t>Intérêt de la régression fonctionnelle</w:t>
+      </w:r>
+    </w:p>
+    <w:p>
+      <w:pPr>
+        <w:pStyle w:val="Sansinterligne"/>
+        <w:jc w:val="both"/>
+        <w:rPr>
+          <w:rFonts w:eastAsiaTheme="minorEastAsia"/>
+        </w:rPr>
+      </w:pPr>
+      <w:r>
+        <w:t>Les données NIRS sont des données en grande dimension puisqu’une absorbance est observée pour chaque longueur d’ondes d’un spectre</w:t>
+      </w:r>
+      <w:r>
+        <w:t xml:space="preserve">. </w:t>
+      </w:r>
+      <w:r>
+        <w:t xml:space="preserve">Dans le travail de thèse de M. </w:t>
+      </w:r>
+      <w:proofErr w:type="spellStart"/>
+      <w:r>
+        <w:t>Laurençon</w:t>
+      </w:r>
+      <w:proofErr w:type="spellEnd"/>
+      <w:r>
+        <w:t>, l</w:t>
+      </w:r>
+      <w:r>
+        <w:t xml:space="preserve">a prédiction d’un trait phénotypique par les spectres a été réalisée à partir de modèle de régression. </w:t>
+      </w:r>
+      <w:r>
+        <w:t xml:space="preserve">Dans ce cas, l’instabilité des paramètres </w:t>
+      </w:r>
+      <m:oMath>
+        <m:r>
+          <m:rPr>
+            <m:sty m:val="p"/>
+          </m:rPr>
+          <w:rPr>
+            <w:rFonts w:ascii="Cambria Math" w:hAnsi="Cambria Math"/>
+          </w:rPr>
+          <m:t>β</m:t>
+        </m:r>
+      </m:oMath>
+      <w:r>
+        <w:rPr>
+          <w:rFonts w:eastAsiaTheme="minorEastAsia"/>
+        </w:rPr>
+        <w:t xml:space="preserve"> doit être géré en réduisant le nombre de dimension du modèle. </w:t>
+      </w:r>
+      <w:r>
+        <w:rPr>
+          <w:rFonts w:eastAsiaTheme="minorEastAsia"/>
+        </w:rPr>
+        <w:t xml:space="preserve">De plus, la relation entre </w:t>
+      </w:r>
+      <w:r>
+        <w:rPr>
+          <w:rFonts w:eastAsiaTheme="minorEastAsia"/>
+        </w:rPr>
+        <w:t xml:space="preserve">la variable réponse </w:t>
+      </w:r>
+      <w:r>
+        <w:rPr>
+          <w:rFonts w:eastAsiaTheme="minorEastAsia"/>
+        </w:rPr>
+        <w:t xml:space="preserve">(un trait phénotypique) </w:t>
+      </w:r>
+      <w:r>
+        <w:rPr>
+          <w:rFonts w:eastAsiaTheme="minorEastAsia"/>
+        </w:rPr>
+        <w:t>et l</w:t>
+      </w:r>
+      <w:r>
+        <w:rPr>
+          <w:rFonts w:eastAsiaTheme="minorEastAsia"/>
+        </w:rPr>
+        <w:t>es</w:t>
+      </w:r>
+      <w:r>
+        <w:rPr>
+          <w:rFonts w:eastAsiaTheme="minorEastAsia"/>
+        </w:rPr>
+        <w:t xml:space="preserve"> variable</w:t>
+      </w:r>
+      <w:r>
+        <w:rPr>
+          <w:rFonts w:eastAsiaTheme="minorEastAsia"/>
+        </w:rPr>
+        <w:t>s</w:t>
+      </w:r>
+      <w:r>
+        <w:rPr>
+          <w:rFonts w:eastAsiaTheme="minorEastAsia"/>
+        </w:rPr>
+        <w:t xml:space="preserve"> explicative</w:t>
+      </w:r>
+      <w:r>
+        <w:rPr>
+          <w:rFonts w:eastAsiaTheme="minorEastAsia"/>
+        </w:rPr>
+        <w:t xml:space="preserve">s (les absorbances pour les différentes longueurs d’ondes) sont supposées linéaires. </w:t>
+      </w:r>
+    </w:p>
+    <w:p>
+      <w:pPr>
+        <w:pStyle w:val="Sansinterligne"/>
+        <w:jc w:val="both"/>
+        <w:rPr>
+          <w:rFonts w:eastAsiaTheme="minorEastAsia"/>
+        </w:rPr>
+      </w:pPr>
+    </w:p>
+    <w:p>
+      <w:pPr>
+        <w:pStyle w:val="Sansinterligne"/>
+        <w:jc w:val="both"/>
+      </w:pPr>
+      <w:r>
+        <w:rPr>
+          <w:rFonts w:eastAsiaTheme="minorEastAsia"/>
+        </w:rPr>
+        <w:t xml:space="preserve">La régression fonctionnelle permet d’outrepasser </w:t>
+      </w:r>
+      <w:r>
+        <w:rPr>
+          <w:rFonts w:eastAsiaTheme="minorEastAsia"/>
+        </w:rPr>
+        <w:t xml:space="preserve">la réduction de dimension et n’impose pas de lien linéaire entre la variable réponse et la variable explicative. </w:t>
+      </w:r>
+    </w:p>
+    <w:p>
+      <w:pPr>
         <w:pStyle w:val="Titre2"/>
         <w:jc w:val="both"/>
       </w:pPr>
       <w:r>
+        <w:lastRenderedPageBreak/>
         <w:t>Questions de recherche</w:t>
       </w:r>
     </w:p>
@@ -4856,7 +5155,6 @@
         <w:jc w:val="both"/>
       </w:pPr>
       <w:r>
-        <w:lastRenderedPageBreak/>
         <w:t>Bibliographie</w:t>
       </w:r>
     </w:p>
@@ -5350,36 +5648,491 @@
         <w:rPr>
           <w:rFonts w:cstheme="minorHAnsi"/>
         </w:rPr>
+        <w:br/>
+      </w:r>
+      <w:proofErr w:type="spellStart"/>
+      <w:r>
+        <w:rPr>
+          <w:rFonts w:cstheme="minorHAnsi"/>
+        </w:rPr>
+        <w:t>Growth</w:t>
+      </w:r>
+      <w:proofErr w:type="spellEnd"/>
+      <w:r>
+        <w:rPr>
+          <w:rFonts w:cstheme="minorHAnsi"/>
+        </w:rPr>
+        <w:t xml:space="preserve"> </w:t>
+      </w:r>
+      <w:proofErr w:type="spellStart"/>
+      <w:r>
+        <w:rPr>
+          <w:rFonts w:cstheme="minorHAnsi"/>
+        </w:rPr>
+        <w:t>season</w:t>
+      </w:r>
+      <w:proofErr w:type="spellEnd"/>
+      <w:r>
+        <w:rPr>
+          <w:rFonts w:cstheme="minorHAnsi"/>
+        </w:rPr>
+        <w:t>: Saison de croissance (2014-2015; 2015-2016; 2016-2017).</w:t>
+      </w:r>
+    </w:p>
+    <w:p>
+      <w:pPr>
+        <w:spacing w:line="240" w:lineRule="auto"/>
+        <w:jc w:val="both"/>
+        <w:rPr>
+          <w:rFonts w:cstheme="minorHAnsi"/>
+        </w:rPr>
+      </w:pPr>
+      <w:r>
+        <w:rPr>
+          <w:rFonts w:cstheme="minorHAnsi"/>
+        </w:rPr>
+        <w:br/>
+      </w:r>
+      <w:proofErr w:type="spellStart"/>
+      <w:r>
+        <w:rPr>
+          <w:rFonts w:cstheme="minorHAnsi"/>
+        </w:rPr>
+        <w:t>Growth</w:t>
+      </w:r>
+      <w:proofErr w:type="spellEnd"/>
+      <w:r>
+        <w:rPr>
+          <w:rFonts w:cstheme="minorHAnsi"/>
+        </w:rPr>
+        <w:t xml:space="preserve"> condition: Conditions de culture soit en champs soit en tunnel </w:t>
+      </w:r>
+    </w:p>
+    <w:p>
+      <w:pPr>
+        <w:spacing w:line="240" w:lineRule="auto"/>
+        <w:jc w:val="both"/>
+        <w:rPr>
+          <w:rFonts w:cstheme="minorHAnsi"/>
+        </w:rPr>
+      </w:pPr>
+      <w:r>
+        <w:rPr>
+          <w:rFonts w:cstheme="minorHAnsi"/>
+        </w:rPr>
+        <w:br/>
+        <w:t xml:space="preserve">N </w:t>
+      </w:r>
+      <w:proofErr w:type="spellStart"/>
+      <w:r>
+        <w:rPr>
+          <w:rFonts w:cstheme="minorHAnsi"/>
+        </w:rPr>
+        <w:t>regime</w:t>
+      </w:r>
+      <w:proofErr w:type="spellEnd"/>
+      <w:r>
+        <w:rPr>
+          <w:rFonts w:cstheme="minorHAnsi"/>
+        </w:rPr>
+        <w:t xml:space="preserve">: Fertilisation azoté apporté au stade de monté en graine. N+ désigne des apports azotés optimaux pour atteindre un </w:t>
+      </w:r>
+      <w:r>
+        <w:rPr>
+          <w:rFonts w:cstheme="minorHAnsi"/>
+        </w:rPr>
+        <w:t>rendement</w:t>
+      </w:r>
+      <w:r>
+        <w:rPr>
+          <w:rFonts w:cstheme="minorHAnsi"/>
+        </w:rPr>
+        <w:t xml:space="preserve"> de 3.5 t.ha-1 de graine de colza. N- désigne un apport sous-optimal de  80-100 kg.ha-1 d'azote</w:t>
+      </w:r>
+    </w:p>
+    <w:p>
+      <w:pPr>
+        <w:spacing w:line="240" w:lineRule="auto"/>
+        <w:jc w:val="both"/>
+        <w:rPr>
+          <w:rFonts w:cstheme="minorHAnsi"/>
+        </w:rPr>
+      </w:pPr>
+      <w:r>
+        <w:rPr>
+          <w:rFonts w:cstheme="minorHAnsi"/>
+        </w:rPr>
+        <w:br/>
+        <w:t xml:space="preserve">W </w:t>
+      </w:r>
+      <w:proofErr w:type="spellStart"/>
+      <w:r>
+        <w:rPr>
+          <w:rFonts w:cstheme="minorHAnsi"/>
+        </w:rPr>
+        <w:t>regime</w:t>
+      </w:r>
+      <w:proofErr w:type="spellEnd"/>
+      <w:r>
+        <w:rPr>
+          <w:rFonts w:cstheme="minorHAnsi"/>
+        </w:rPr>
+        <w:t xml:space="preserve">: Apports en eau </w:t>
+      </w:r>
+      <w:proofErr w:type="spellStart"/>
+      <w:r>
+        <w:rPr>
+          <w:rFonts w:cstheme="minorHAnsi"/>
+        </w:rPr>
+        <w:t>a</w:t>
+      </w:r>
+      <w:proofErr w:type="spellEnd"/>
+      <w:r>
+        <w:rPr>
+          <w:rFonts w:cstheme="minorHAnsi"/>
+        </w:rPr>
+        <w:t xml:space="preserve"> partir du stade de floraison. W+ indique un apport en eau optimal avec un potentiel en eau du substrat de -200 mbar. W- correspond à un apport en eau sous-optimal avec un potentiel en eau du substrat de -600 mbar. </w:t>
+      </w:r>
+    </w:p>
+    <w:p>
+      <w:pPr>
+        <w:spacing w:line="240" w:lineRule="auto"/>
+        <w:jc w:val="both"/>
+        <w:rPr>
+          <w:rFonts w:cstheme="minorHAnsi"/>
+        </w:rPr>
+      </w:pPr>
+      <w:r>
+        <w:rPr>
+          <w:rFonts w:cstheme="minorHAnsi"/>
+        </w:rPr>
+        <w:br/>
+        <w:t>Tissue: Tissus végétaux d'</w:t>
+      </w:r>
+      <w:proofErr w:type="spellStart"/>
+      <w:r>
+        <w:rPr>
+          <w:rFonts w:cstheme="minorHAnsi"/>
+        </w:rPr>
+        <w:t>ou</w:t>
+      </w:r>
+      <w:proofErr w:type="spellEnd"/>
+      <w:r>
+        <w:rPr>
+          <w:rFonts w:cstheme="minorHAnsi"/>
+        </w:rPr>
+        <w:t xml:space="preserve"> proviennent les échantillons dont les racines, les feuilles, les tiges, les fleurs et les gousses de graines.</w:t>
+      </w:r>
+    </w:p>
+    <w:p>
+      <w:pPr>
+        <w:spacing w:line="240" w:lineRule="auto"/>
+        <w:jc w:val="both"/>
+        <w:rPr>
+          <w:rFonts w:cstheme="minorHAnsi"/>
+        </w:rPr>
+      </w:pPr>
+      <w:r>
+        <w:rPr>
+          <w:rFonts w:cstheme="minorHAnsi"/>
+        </w:rPr>
+        <w:br/>
+        <w:t xml:space="preserve">BBCH dev. Stage: Stade de </w:t>
+      </w:r>
+      <w:r>
+        <w:rPr>
+          <w:rFonts w:cstheme="minorHAnsi"/>
+        </w:rPr>
+        <w:t>développement</w:t>
+      </w:r>
+      <w:r>
+        <w:rPr>
+          <w:rFonts w:cstheme="minorHAnsi"/>
+        </w:rPr>
+        <w:t xml:space="preserve"> d'</w:t>
+      </w:r>
+      <w:proofErr w:type="spellStart"/>
+      <w:r>
+        <w:rPr>
+          <w:rFonts w:cstheme="minorHAnsi"/>
+        </w:rPr>
+        <w:t>ou</w:t>
+      </w:r>
+      <w:proofErr w:type="spellEnd"/>
+      <w:r>
+        <w:rPr>
+          <w:rFonts w:cstheme="minorHAnsi"/>
+        </w:rPr>
+        <w:t xml:space="preserve"> </w:t>
+      </w:r>
+      <w:proofErr w:type="spellStart"/>
+      <w:r>
+        <w:rPr>
+          <w:rFonts w:cstheme="minorHAnsi"/>
+        </w:rPr>
+        <w:t>on</w:t>
+      </w:r>
+      <w:proofErr w:type="spellEnd"/>
+      <w:r>
+        <w:rPr>
+          <w:rFonts w:cstheme="minorHAnsi"/>
+        </w:rPr>
+        <w:t xml:space="preserve"> été prélevés les échantillons. </w:t>
+      </w:r>
+    </w:p>
+    <w:p>
+      <w:pPr>
+        <w:spacing w:line="240" w:lineRule="auto"/>
+        <w:jc w:val="both"/>
+        <w:rPr>
+          <w:rFonts w:cstheme="minorHAnsi"/>
+        </w:rPr>
+      </w:pPr>
+      <w:r>
+        <w:rPr>
+          <w:rFonts w:cstheme="minorHAnsi"/>
+        </w:rPr>
+        <w:t>15-19 stage = Plante possédant les 5 à 9 feuilles</w:t>
+      </w:r>
+    </w:p>
+    <w:p>
+      <w:pPr>
+        <w:spacing w:line="240" w:lineRule="auto"/>
+        <w:jc w:val="both"/>
+        <w:rPr>
+          <w:rFonts w:cstheme="minorHAnsi"/>
+        </w:rPr>
+      </w:pPr>
+      <w:r>
+        <w:rPr>
+          <w:rFonts w:cstheme="minorHAnsi"/>
+        </w:rPr>
+        <w:t xml:space="preserve">31-35 stage = Stade de montée en graine, la plante montre 1 à 5 </w:t>
+      </w:r>
+      <w:r>
+        <w:rPr>
+          <w:rFonts w:cstheme="minorHAnsi"/>
+        </w:rPr>
+        <w:t>entrenœuds</w:t>
+      </w:r>
+    </w:p>
+    <w:p>
+      <w:pPr>
+        <w:spacing w:line="240" w:lineRule="auto"/>
+        <w:jc w:val="both"/>
+        <w:rPr>
+          <w:rFonts w:cstheme="minorHAnsi"/>
+        </w:rPr>
+      </w:pPr>
+      <w:r>
+        <w:rPr>
+          <w:rFonts w:cstheme="minorHAnsi"/>
+        </w:rPr>
+        <w:t>55-59 stage = Production de l'inflorescence principale</w:t>
+      </w:r>
+    </w:p>
+    <w:p>
+      <w:pPr>
+        <w:spacing w:line="240" w:lineRule="auto"/>
+        <w:jc w:val="both"/>
+        <w:rPr>
+          <w:rFonts w:cstheme="minorHAnsi"/>
+        </w:rPr>
+      </w:pPr>
+      <w:r>
+        <w:rPr>
+          <w:rFonts w:cstheme="minorHAnsi"/>
+        </w:rPr>
+        <w:t>61-65 stage = Stade de floraison</w:t>
+      </w:r>
+    </w:p>
+    <w:p>
+      <w:pPr>
+        <w:spacing w:line="240" w:lineRule="auto"/>
+        <w:jc w:val="both"/>
+        <w:rPr>
+          <w:rFonts w:cstheme="minorHAnsi"/>
+        </w:rPr>
+      </w:pPr>
+      <w:r>
+        <w:rPr>
+          <w:rFonts w:cstheme="minorHAnsi"/>
+        </w:rPr>
+        <w:t xml:space="preserve">70-75 stage = </w:t>
+      </w:r>
+      <w:r>
+        <w:rPr>
+          <w:rFonts w:cstheme="minorHAnsi"/>
+        </w:rPr>
+        <w:t>Développement</w:t>
+      </w:r>
+      <w:r>
+        <w:rPr>
+          <w:rFonts w:cstheme="minorHAnsi"/>
+        </w:rPr>
+        <w:t xml:space="preserve"> des graines</w:t>
+      </w:r>
+    </w:p>
+    <w:p>
+      <w:pPr>
+        <w:spacing w:line="240" w:lineRule="auto"/>
+        <w:jc w:val="both"/>
+        <w:rPr>
+          <w:rFonts w:cstheme="minorHAnsi"/>
+        </w:rPr>
+      </w:pPr>
+      <w:r>
+        <w:rPr>
+          <w:rFonts w:cstheme="minorHAnsi"/>
+        </w:rPr>
+        <w:t>79-85 stage = Maturation des graines</w:t>
+      </w:r>
+    </w:p>
+    <w:p>
+      <w:pPr>
+        <w:spacing w:line="240" w:lineRule="auto"/>
+        <w:jc w:val="both"/>
+        <w:rPr>
+          <w:rFonts w:cstheme="minorHAnsi"/>
+        </w:rPr>
+      </w:pPr>
+      <w:r>
+        <w:rPr>
+          <w:rFonts w:cstheme="minorHAnsi"/>
+        </w:rPr>
+        <w:t xml:space="preserve">89-91 stage = Phase de </w:t>
+      </w:r>
+      <w:r>
+        <w:rPr>
+          <w:rFonts w:cstheme="minorHAnsi"/>
+        </w:rPr>
+        <w:t>sénescence</w:t>
+      </w:r>
+      <w:r>
+        <w:rPr>
+          <w:rFonts w:cstheme="minorHAnsi"/>
+        </w:rPr>
+        <w:t xml:space="preserve"> de la plante</w:t>
+      </w:r>
+    </w:p>
+    <w:p>
+      <w:pPr>
+        <w:spacing w:line="240" w:lineRule="auto"/>
+        <w:jc w:val="both"/>
+        <w:rPr>
+          <w:rFonts w:cstheme="minorHAnsi"/>
+        </w:rPr>
+      </w:pPr>
+      <w:r>
+        <w:rPr>
+          <w:rFonts w:cstheme="minorHAnsi"/>
+        </w:rPr>
+        <w:br/>
+        <w:t>N content (%DM): Contenu en azote dans l'échantillon en pourcentage de matière sèche.</w:t>
+      </w:r>
+    </w:p>
+    <w:p>
+      <w:pPr>
+        <w:spacing w:line="240" w:lineRule="auto"/>
+        <w:jc w:val="both"/>
+        <w:rPr>
+          <w:rFonts w:cstheme="minorHAnsi"/>
+        </w:rPr>
+      </w:pPr>
+      <w:r>
+        <w:rPr>
+          <w:rFonts w:cstheme="minorHAnsi"/>
+        </w:rPr>
+        <w:br/>
+      </w:r>
+      <w:proofErr w:type="spellStart"/>
+      <w:r>
+        <w:rPr>
+          <w:rFonts w:cstheme="minorHAnsi"/>
+        </w:rPr>
+        <w:t>N_model_set</w:t>
+      </w:r>
+      <w:proofErr w:type="spellEnd"/>
+      <w:r>
+        <w:rPr>
+          <w:rFonts w:cstheme="minorHAnsi"/>
+        </w:rPr>
+        <w:t xml:space="preserve">-type: Désigne des échantillons sélectionnés pour la calibration (Cal) ou la validation (Val) pour le modèle de prédiction de l'azote. </w:t>
+      </w:r>
+    </w:p>
+    <w:p>
+      <w:pPr>
+        <w:spacing w:line="240" w:lineRule="auto"/>
+        <w:jc w:val="both"/>
+        <w:rPr>
+          <w:rFonts w:cstheme="minorHAnsi"/>
+        </w:rPr>
+      </w:pPr>
+      <w:r>
+        <w:rPr>
+          <w:rFonts w:cstheme="minorHAnsi"/>
+        </w:rPr>
         <w:lastRenderedPageBreak/>
         <w:br/>
+        <w:t>C content (%DM): Contenu en carbone dans l'échantillon en pourcentage de matière sèche.</w:t>
+      </w:r>
+    </w:p>
+    <w:p>
+      <w:pPr>
+        <w:spacing w:line="240" w:lineRule="auto"/>
+        <w:jc w:val="both"/>
+        <w:rPr>
+          <w:rFonts w:cstheme="minorHAnsi"/>
+        </w:rPr>
+      </w:pPr>
+      <w:r>
+        <w:rPr>
+          <w:rFonts w:cstheme="minorHAnsi"/>
+        </w:rPr>
+        <w:br/>
       </w:r>
       <w:proofErr w:type="spellStart"/>
       <w:r>
         <w:rPr>
           <w:rFonts w:cstheme="minorHAnsi"/>
         </w:rPr>
-        <w:t>Growth</w:t>
+        <w:t>C_model_set</w:t>
       </w:r>
       <w:proofErr w:type="spellEnd"/>
       <w:r>
         <w:rPr>
           <w:rFonts w:cstheme="minorHAnsi"/>
         </w:rPr>
-        <w:t xml:space="preserve"> </w:t>
+        <w:t xml:space="preserve">-type: Désigne des échantillons sélectionnés pour la calibration (Cal) ou la validation (Val) pour le modèle de prédiction du carbone. </w:t>
+      </w:r>
+    </w:p>
+    <w:p>
+      <w:pPr>
+        <w:spacing w:line="240" w:lineRule="auto"/>
+        <w:jc w:val="both"/>
+        <w:rPr>
+          <w:rFonts w:cstheme="minorHAnsi"/>
+        </w:rPr>
+      </w:pPr>
+      <w:r>
+        <w:rPr>
+          <w:rFonts w:cstheme="minorHAnsi"/>
+        </w:rPr>
+        <w:br/>
       </w:r>
       <w:proofErr w:type="spellStart"/>
       <w:r>
         <w:rPr>
           <w:rFonts w:cstheme="minorHAnsi"/>
         </w:rPr>
-        <w:t>season</w:t>
+        <w:t>Spectra_acquisition_year</w:t>
       </w:r>
       <w:proofErr w:type="spellEnd"/>
       <w:r>
         <w:rPr>
           <w:rFonts w:cstheme="minorHAnsi"/>
         </w:rPr>
-        <w:t>: Saison de croissance (2014-2015; 2015-2016; 2016-2017).</w:t>
+        <w:t>: Années d'acquisition des spectres, ici 2027</w:t>
       </w:r>
     </w:p>
     <w:p>
@@ -5394,462 +6147,6 @@
         <w:rPr>
           <w:rFonts w:cstheme="minorHAnsi"/>
         </w:rPr>
-        <w:br/>
-      </w:r>
-      <w:proofErr w:type="spellStart"/>
-      <w:r>
-        <w:rPr>
-          <w:rFonts w:cstheme="minorHAnsi"/>
-        </w:rPr>
-        <w:t>Growth</w:t>
-      </w:r>
-      <w:proofErr w:type="spellEnd"/>
-      <w:r>
-        <w:rPr>
-          <w:rFonts w:cstheme="minorHAnsi"/>
-        </w:rPr>
-        <w:t xml:space="preserve"> condition: Conditions de culture soit en champs soit en tunnel </w:t>
-      </w:r>
-    </w:p>
-    <w:p>
-      <w:pPr>
-        <w:spacing w:line="240" w:lineRule="auto"/>
-        <w:jc w:val="both"/>
-        <w:rPr>
-          <w:rFonts w:cstheme="minorHAnsi"/>
-        </w:rPr>
-      </w:pPr>
-      <w:r>
-        <w:rPr>
-          <w:rFonts w:cstheme="minorHAnsi"/>
-        </w:rPr>
-        <w:br/>
-        <w:t xml:space="preserve">N </w:t>
-      </w:r>
-      <w:proofErr w:type="spellStart"/>
-      <w:r>
-        <w:rPr>
-          <w:rFonts w:cstheme="minorHAnsi"/>
-        </w:rPr>
-        <w:t>regime</w:t>
-      </w:r>
-      <w:proofErr w:type="spellEnd"/>
-      <w:r>
-        <w:rPr>
-          <w:rFonts w:cstheme="minorHAnsi"/>
-        </w:rPr>
-        <w:t xml:space="preserve">: Fertilisation azoté apporté au stade de monté en graine. N+ désigne des apports azotés optimaux pour atteindre un </w:t>
-      </w:r>
-      <w:r>
-        <w:rPr>
-          <w:rFonts w:cstheme="minorHAnsi"/>
-        </w:rPr>
-        <w:t>rendement</w:t>
-      </w:r>
-      <w:r>
-        <w:rPr>
-          <w:rFonts w:cstheme="minorHAnsi"/>
-        </w:rPr>
-        <w:t xml:space="preserve"> de 3.5 t.ha-1 de graine de colza. N- désigne un apport sous-optimal de  80-100 kg.ha-1 d'azote</w:t>
-      </w:r>
-    </w:p>
-    <w:p>
-      <w:pPr>
-        <w:spacing w:line="240" w:lineRule="auto"/>
-        <w:jc w:val="both"/>
-        <w:rPr>
-          <w:rFonts w:cstheme="minorHAnsi"/>
-        </w:rPr>
-      </w:pPr>
-      <w:r>
-        <w:rPr>
-          <w:rFonts w:cstheme="minorHAnsi"/>
-        </w:rPr>
-        <w:br/>
-        <w:t xml:space="preserve">W </w:t>
-      </w:r>
-      <w:proofErr w:type="spellStart"/>
-      <w:r>
-        <w:rPr>
-          <w:rFonts w:cstheme="minorHAnsi"/>
-        </w:rPr>
-        <w:t>regime</w:t>
-      </w:r>
-      <w:proofErr w:type="spellEnd"/>
-      <w:r>
-        <w:rPr>
-          <w:rFonts w:cstheme="minorHAnsi"/>
-        </w:rPr>
-        <w:t xml:space="preserve">: Apports en eau </w:t>
-      </w:r>
-      <w:proofErr w:type="spellStart"/>
-      <w:r>
-        <w:rPr>
-          <w:rFonts w:cstheme="minorHAnsi"/>
-        </w:rPr>
-        <w:t>a</w:t>
-      </w:r>
-      <w:proofErr w:type="spellEnd"/>
-      <w:r>
-        <w:rPr>
-          <w:rFonts w:cstheme="minorHAnsi"/>
-        </w:rPr>
-        <w:t xml:space="preserve"> partir du stade de floraison. W+ indique un apport en eau optimal avec un potentiel en eau du substrat de -200 mbar. W- correspond à un apport en eau sous-optimal avec un potentiel en eau du substrat de -600 mbar. </w:t>
-      </w:r>
-    </w:p>
-    <w:p>
-      <w:pPr>
-        <w:spacing w:line="240" w:lineRule="auto"/>
-        <w:jc w:val="both"/>
-        <w:rPr>
-          <w:rFonts w:cstheme="minorHAnsi"/>
-        </w:rPr>
-      </w:pPr>
-      <w:r>
-        <w:rPr>
-          <w:rFonts w:cstheme="minorHAnsi"/>
-        </w:rPr>
-        <w:br/>
-        <w:t>Tissue: Tissus végétaux d'</w:t>
-      </w:r>
-      <w:proofErr w:type="spellStart"/>
-      <w:r>
-        <w:rPr>
-          <w:rFonts w:cstheme="minorHAnsi"/>
-        </w:rPr>
-        <w:t>ou</w:t>
-      </w:r>
-      <w:proofErr w:type="spellEnd"/>
-      <w:r>
-        <w:rPr>
-          <w:rFonts w:cstheme="minorHAnsi"/>
-        </w:rPr>
-        <w:t xml:space="preserve"> proviennent les échantillons dont les racines, les feuilles, les tiges, les fleurs et les gousses de graines.</w:t>
-      </w:r>
-    </w:p>
-    <w:p>
-      <w:pPr>
-        <w:spacing w:line="240" w:lineRule="auto"/>
-        <w:jc w:val="both"/>
-        <w:rPr>
-          <w:rFonts w:cstheme="minorHAnsi"/>
-        </w:rPr>
-      </w:pPr>
-      <w:r>
-        <w:rPr>
-          <w:rFonts w:cstheme="minorHAnsi"/>
-        </w:rPr>
-        <w:br/>
-        <w:t xml:space="preserve">BBCH dev. Stage: Stade de </w:t>
-      </w:r>
-      <w:r>
-        <w:rPr>
-          <w:rFonts w:cstheme="minorHAnsi"/>
-        </w:rPr>
-        <w:t>développement</w:t>
-      </w:r>
-      <w:r>
-        <w:rPr>
-          <w:rFonts w:cstheme="minorHAnsi"/>
-        </w:rPr>
-        <w:t xml:space="preserve"> d'</w:t>
-      </w:r>
-      <w:proofErr w:type="spellStart"/>
-      <w:r>
-        <w:rPr>
-          <w:rFonts w:cstheme="minorHAnsi"/>
-        </w:rPr>
-        <w:t>ou</w:t>
-      </w:r>
-      <w:proofErr w:type="spellEnd"/>
-      <w:r>
-        <w:rPr>
-          <w:rFonts w:cstheme="minorHAnsi"/>
-        </w:rPr>
-        <w:t xml:space="preserve"> </w:t>
-      </w:r>
-      <w:proofErr w:type="spellStart"/>
-      <w:r>
-        <w:rPr>
-          <w:rFonts w:cstheme="minorHAnsi"/>
-        </w:rPr>
-        <w:t>on</w:t>
-      </w:r>
-      <w:proofErr w:type="spellEnd"/>
-      <w:r>
-        <w:rPr>
-          <w:rFonts w:cstheme="minorHAnsi"/>
-        </w:rPr>
-        <w:t xml:space="preserve"> été prélevés les échantillons. </w:t>
-      </w:r>
-    </w:p>
-    <w:p>
-      <w:pPr>
-        <w:spacing w:line="240" w:lineRule="auto"/>
-        <w:jc w:val="both"/>
-        <w:rPr>
-          <w:rFonts w:cstheme="minorHAnsi"/>
-        </w:rPr>
-      </w:pPr>
-      <w:r>
-        <w:rPr>
-          <w:rFonts w:cstheme="minorHAnsi"/>
-        </w:rPr>
-        <w:t>15-19 stage = Plante possédant les 5 à 9 feuilles</w:t>
-      </w:r>
-    </w:p>
-    <w:p>
-      <w:pPr>
-        <w:spacing w:line="240" w:lineRule="auto"/>
-        <w:jc w:val="both"/>
-        <w:rPr>
-          <w:rFonts w:cstheme="minorHAnsi"/>
-        </w:rPr>
-      </w:pPr>
-      <w:r>
-        <w:rPr>
-          <w:rFonts w:cstheme="minorHAnsi"/>
-        </w:rPr>
-        <w:t xml:space="preserve">31-35 stage = Stade de montée en graine, la plante montre 1 à 5 </w:t>
-      </w:r>
-      <w:r>
-        <w:rPr>
-          <w:rFonts w:cstheme="minorHAnsi"/>
-        </w:rPr>
-        <w:t>entrenœuds</w:t>
-      </w:r>
-    </w:p>
-    <w:p>
-      <w:pPr>
-        <w:spacing w:line="240" w:lineRule="auto"/>
-        <w:jc w:val="both"/>
-        <w:rPr>
-          <w:rFonts w:cstheme="minorHAnsi"/>
-        </w:rPr>
-      </w:pPr>
-      <w:r>
-        <w:rPr>
-          <w:rFonts w:cstheme="minorHAnsi"/>
-        </w:rPr>
-        <w:t>55-59 stage = Production de l'inflorescence principale</w:t>
-      </w:r>
-    </w:p>
-    <w:p>
-      <w:pPr>
-        <w:spacing w:line="240" w:lineRule="auto"/>
-        <w:jc w:val="both"/>
-        <w:rPr>
-          <w:rFonts w:cstheme="minorHAnsi"/>
-        </w:rPr>
-      </w:pPr>
-      <w:r>
-        <w:rPr>
-          <w:rFonts w:cstheme="minorHAnsi"/>
-        </w:rPr>
-        <w:t>61-65 stage = Stade de floraison</w:t>
-      </w:r>
-    </w:p>
-    <w:p>
-      <w:pPr>
-        <w:spacing w:line="240" w:lineRule="auto"/>
-        <w:jc w:val="both"/>
-        <w:rPr>
-          <w:rFonts w:cstheme="minorHAnsi"/>
-        </w:rPr>
-      </w:pPr>
-      <w:r>
-        <w:rPr>
-          <w:rFonts w:cstheme="minorHAnsi"/>
-        </w:rPr>
-        <w:t xml:space="preserve">70-75 stage = </w:t>
-      </w:r>
-      <w:r>
-        <w:rPr>
-          <w:rFonts w:cstheme="minorHAnsi"/>
-        </w:rPr>
-        <w:t>Développement</w:t>
-      </w:r>
-      <w:r>
-        <w:rPr>
-          <w:rFonts w:cstheme="minorHAnsi"/>
-        </w:rPr>
-        <w:t xml:space="preserve"> des graines</w:t>
-      </w:r>
-    </w:p>
-    <w:p>
-      <w:pPr>
-        <w:spacing w:line="240" w:lineRule="auto"/>
-        <w:jc w:val="both"/>
-        <w:rPr>
-          <w:rFonts w:cstheme="minorHAnsi"/>
-        </w:rPr>
-      </w:pPr>
-      <w:r>
-        <w:rPr>
-          <w:rFonts w:cstheme="minorHAnsi"/>
-        </w:rPr>
-        <w:t>79-85 stage = Maturation des graines</w:t>
-      </w:r>
-    </w:p>
-    <w:p>
-      <w:pPr>
-        <w:spacing w:line="240" w:lineRule="auto"/>
-        <w:jc w:val="both"/>
-        <w:rPr>
-          <w:rFonts w:cstheme="minorHAnsi"/>
-        </w:rPr>
-      </w:pPr>
-      <w:r>
-        <w:rPr>
-          <w:rFonts w:cstheme="minorHAnsi"/>
-        </w:rPr>
-        <w:t xml:space="preserve">89-91 stage = Phase de </w:t>
-      </w:r>
-      <w:r>
-        <w:rPr>
-          <w:rFonts w:cstheme="minorHAnsi"/>
-        </w:rPr>
-        <w:t>sénescence</w:t>
-      </w:r>
-      <w:r>
-        <w:rPr>
-          <w:rFonts w:cstheme="minorHAnsi"/>
-        </w:rPr>
-        <w:t xml:space="preserve"> de la plante</w:t>
-      </w:r>
-    </w:p>
-    <w:p>
-      <w:pPr>
-        <w:spacing w:line="240" w:lineRule="auto"/>
-        <w:jc w:val="both"/>
-        <w:rPr>
-          <w:rFonts w:cstheme="minorHAnsi"/>
-        </w:rPr>
-      </w:pPr>
-      <w:r>
-        <w:rPr>
-          <w:rFonts w:cstheme="minorHAnsi"/>
-        </w:rPr>
-        <w:br/>
-        <w:t>N content (%DM): Contenu en azote dans l'échantillon en pourcentage de matière sèche.</w:t>
-      </w:r>
-    </w:p>
-    <w:p>
-      <w:pPr>
-        <w:spacing w:line="240" w:lineRule="auto"/>
-        <w:jc w:val="both"/>
-        <w:rPr>
-          <w:rFonts w:cstheme="minorHAnsi"/>
-        </w:rPr>
-      </w:pPr>
-      <w:r>
-        <w:rPr>
-          <w:rFonts w:cstheme="minorHAnsi"/>
-        </w:rPr>
-        <w:br/>
-      </w:r>
-      <w:proofErr w:type="spellStart"/>
-      <w:r>
-        <w:rPr>
-          <w:rFonts w:cstheme="minorHAnsi"/>
-        </w:rPr>
-        <w:t>N_model_set</w:t>
-      </w:r>
-      <w:proofErr w:type="spellEnd"/>
-      <w:r>
-        <w:rPr>
-          <w:rFonts w:cstheme="minorHAnsi"/>
-        </w:rPr>
-        <w:t xml:space="preserve">-type: Désigne des échantillons sélectionnés pour la calibration (Cal) ou la validation (Val) pour le modèle de prédiction de l'azote. </w:t>
-      </w:r>
-    </w:p>
-    <w:p>
-      <w:pPr>
-        <w:spacing w:line="240" w:lineRule="auto"/>
-        <w:jc w:val="both"/>
-        <w:rPr>
-          <w:rFonts w:cstheme="minorHAnsi"/>
-        </w:rPr>
-      </w:pPr>
-      <w:r>
-        <w:rPr>
-          <w:rFonts w:cstheme="minorHAnsi"/>
-        </w:rPr>
-        <w:br/>
-        <w:t>C content (%DM): Contenu en carbone dans l'échantillon en pourcentage de matière sèche.</w:t>
-      </w:r>
-    </w:p>
-    <w:p>
-      <w:pPr>
-        <w:spacing w:line="240" w:lineRule="auto"/>
-        <w:jc w:val="both"/>
-        <w:rPr>
-          <w:rFonts w:cstheme="minorHAnsi"/>
-        </w:rPr>
-      </w:pPr>
-      <w:r>
-        <w:rPr>
-          <w:rFonts w:cstheme="minorHAnsi"/>
-        </w:rPr>
-        <w:br/>
-      </w:r>
-      <w:proofErr w:type="spellStart"/>
-      <w:r>
-        <w:rPr>
-          <w:rFonts w:cstheme="minorHAnsi"/>
-        </w:rPr>
-        <w:t>C_model_set</w:t>
-      </w:r>
-      <w:proofErr w:type="spellEnd"/>
-      <w:r>
-        <w:rPr>
-          <w:rFonts w:cstheme="minorHAnsi"/>
-        </w:rPr>
-        <w:t xml:space="preserve">-type: Désigne des échantillons sélectionnés pour la calibration (Cal) ou la validation (Val) pour le modèle de prédiction du carbone. </w:t>
-      </w:r>
-    </w:p>
-    <w:p>
-      <w:pPr>
-        <w:spacing w:line="240" w:lineRule="auto"/>
-        <w:jc w:val="both"/>
-        <w:rPr>
-          <w:rFonts w:cstheme="minorHAnsi"/>
-        </w:rPr>
-      </w:pPr>
-      <w:r>
-        <w:rPr>
-          <w:rFonts w:cstheme="minorHAnsi"/>
-        </w:rPr>
-        <w:br/>
-      </w:r>
-      <w:proofErr w:type="spellStart"/>
-      <w:r>
-        <w:rPr>
-          <w:rFonts w:cstheme="minorHAnsi"/>
-        </w:rPr>
-        <w:t>Spectra_acquisition_year</w:t>
-      </w:r>
-      <w:proofErr w:type="spellEnd"/>
-      <w:r>
-        <w:rPr>
-          <w:rFonts w:cstheme="minorHAnsi"/>
-        </w:rPr>
-        <w:t>: Années d'acquisition des spectres, ici 2027</w:t>
-      </w:r>
-    </w:p>
-    <w:p>
-      <w:pPr>
-        <w:spacing w:line="240" w:lineRule="auto"/>
-        <w:jc w:val="both"/>
-        <w:rPr>
-          <w:rFonts w:cstheme="minorHAnsi"/>
-        </w:rPr>
-      </w:pPr>
-      <w:r>
-        <w:rPr>
-          <w:rFonts w:cstheme="minorHAnsi"/>
-        </w:rPr>
-        <w:lastRenderedPageBreak/>
         <w:br/>
       </w:r>
       <w:proofErr w:type="spellStart"/>

</xml_diff>